<commit_message>
docs: final report second pass -- stale numbers (tests 2,233 / web 403, real-bid precision on the summary card, statements that contradicted 3.1), round-1 rules applied to the remaining pages (no sources, file names, experiment codes or dates; plain terms), still 9 pages, Word copy rebuilt
Co-Authored-By: Claude Opus 5.5 <noreply@anthropic.com>
Claude-Session: https://claude.ai/code/session_01MWZuim6g1FHWWvZRErzHrn
</commit_message>
<xml_diff>
--- a/outputs/final-report.docx
+++ b/outputs/final-report.docx
@@ -148,9 +148,9 @@
         </w:tblCellMar>
       </w:tblPr>
       <w:tblGrid>
-        <w:gridCol w:w="2237"/>
-        <w:gridCol w:w="3557"/>
-        <w:gridCol w:w="4522"/>
+        <w:gridCol w:w="2025"/>
+        <w:gridCol w:w="3512"/>
+        <w:gridCol w:w="4780"/>
       </w:tblGrid>
       <w:tr>
         <w:trPr>
@@ -159,7 +159,7 @@
         </w:trPr>
         <w:tc>
           <w:tcPr>
-            <w:tcW w:w="2237" w:type="dxa"/>
+            <w:tcW w:w="2025" w:type="dxa"/>
             <w:shd w:val="clear" w:color="auto" w:fill="F1F3F5"/>
           </w:tcPr>
           <w:p>
@@ -179,7 +179,7 @@
         </w:tc>
         <w:tc>
           <w:tcPr>
-            <w:tcW w:w="3557" w:type="dxa"/>
+            <w:tcW w:w="3512" w:type="dxa"/>
             <w:shd w:val="clear" w:color="auto" w:fill="F1F3F5"/>
           </w:tcPr>
           <w:p>
@@ -199,7 +199,7 @@
         </w:tc>
         <w:tc>
           <w:tcPr>
-            <w:tcW w:w="4522" w:type="dxa"/>
+            <w:tcW w:w="4780" w:type="dxa"/>
             <w:shd w:val="clear" w:color="auto" w:fill="F1F3F5"/>
           </w:tcPr>
           <w:p>
@@ -224,7 +224,7 @@
         </w:trPr>
         <w:tc>
           <w:tcPr>
-            <w:tcW w:w="2237" w:type="dxa"/>
+            <w:tcW w:w="2025" w:type="dxa"/>
           </w:tcPr>
           <w:p>
             <w:pPr>
@@ -241,24 +241,24 @@
         </w:tc>
         <w:tc>
           <w:tcPr>
-            <w:tcW w:w="3557" w:type="dxa"/>
-          </w:tcPr>
-          <w:p>
-            <w:pPr>
-              <w:pStyle w:val="TWCell"/>
-            </w:pPr>
-            <w:r>
-              <w:rPr>
-                <w:sz w:val="17"/>
-                <w:szCs w:val="17"/>
-              </w:rPr>
-              <w:t xml:space="preserve">100·200·300명에서 빈자리·제약 위반 없이 안 A~D, 운영 중 K 비교</w:t>
-            </w:r>
-          </w:p>
-        </w:tc>
-        <w:tc>
-          <w:tcPr>
-            <w:tcW w:w="4522" w:type="dxa"/>
+            <w:tcW w:w="3512" w:type="dxa"/>
+          </w:tcPr>
+          <w:p>
+            <w:pPr>
+              <w:pStyle w:val="TWCell"/>
+            </w:pPr>
+            <w:r>
+              <w:rPr>
+                <w:sz w:val="17"/>
+                <w:szCs w:val="17"/>
+              </w:rPr>
+              <w:t xml:space="preserve">100·200·300명에서 빈자리·제약 위반 없이 안 A~D, 신규 사업 편성 K 비교</w:t>
+            </w:r>
+          </w:p>
+        </w:tc>
+        <w:tc>
+          <w:tcPr>
+            <w:tcW w:w="4780" w:type="dxa"/>
           </w:tcPr>
           <w:p>
             <w:pPr>
@@ -278,7 +278,7 @@
                 <w:sz w:val="17"/>
                 <w:szCs w:val="17"/>
               </w:rPr>
-              <w:t xml:space="preserve"> — 12개 안 모두 빈자리 0·위반 0, 운영 중 18행(K 0~5) 모두 최선 증명(3.1·3.2)</w:t>
+              <w:t xml:space="preserve"> — 12개 안 모두 빈자리 0·위반 0, 신규 사업 편성 18가지(3개 규모 × 옮길 인원 K 0~5) 모두 최적 확인(3.1·3.2)</w:t>
             </w:r>
           </w:p>
         </w:tc>
@@ -289,7 +289,7 @@
         </w:trPr>
         <w:tc>
           <w:tcPr>
-            <w:tcW w:w="2237" w:type="dxa"/>
+            <w:tcW w:w="2025" w:type="dxa"/>
           </w:tcPr>
           <w:p>
             <w:pPr>
@@ -306,24 +306,24 @@
         </w:tc>
         <w:tc>
           <w:tcPr>
-            <w:tcW w:w="3557" w:type="dxa"/>
-          </w:tcPr>
-          <w:p>
-            <w:pPr>
-              <w:pStyle w:val="TWCell"/>
-            </w:pPr>
-            <w:r>
-              <w:rPr>
-                <w:sz w:val="17"/>
-                <w:szCs w:val="17"/>
-              </w:rPr>
-              <w:t xml:space="preserve">독립 검증을 통과한 해만 출력, 정답 대조, 최적과의 거리 표시</w:t>
-            </w:r>
-          </w:p>
-        </w:tc>
-        <w:tc>
-          <w:tcPr>
-            <w:tcW w:w="4522" w:type="dxa"/>
+            <w:tcW w:w="3512" w:type="dxa"/>
+          </w:tcPr>
+          <w:p>
+            <w:pPr>
+              <w:pStyle w:val="TWCell"/>
+            </w:pPr>
+            <w:r>
+              <w:rPr>
+                <w:sz w:val="17"/>
+                <w:szCs w:val="17"/>
+              </w:rPr>
+              <w:t xml:space="preserve">독립 검증을 통과한 해만 출력, 정답 대조, 이론상 최대치와의 거리 표시</w:t>
+            </w:r>
+          </w:p>
+        </w:tc>
+        <w:tc>
+          <w:tcPr>
+            <w:tcW w:w="4780" w:type="dxa"/>
           </w:tcPr>
           <w:p>
             <w:pPr>
@@ -343,7 +343,7 @@
                 <w:sz w:val="17"/>
                 <w:szCs w:val="17"/>
               </w:rPr>
-              <w:t xml:space="preserve"> — 정답 대조 13/13, 모든 반환 해 독립 검증, 증명 상한과의 거리를 화면·PDF에(3.7)</w:t>
+              <w:t xml:space="preserve"> — 정답 대조 13/13, 모든 계산 결과 독립 검증, 이론상 최대치와의 거리를 화면·PDF에(3.7)</w:t>
             </w:r>
           </w:p>
         </w:tc>
@@ -354,7 +354,7 @@
         </w:trPr>
         <w:tc>
           <w:tcPr>
-            <w:tcW w:w="2237" w:type="dxa"/>
+            <w:tcW w:w="2025" w:type="dxa"/>
           </w:tcPr>
           <w:p>
             <w:pPr>
@@ -371,7 +371,7 @@
         </w:tc>
         <w:tc>
           <w:tcPr>
-            <w:tcW w:w="3557" w:type="dxa"/>
+            <w:tcW w:w="3512" w:type="dxa"/>
           </w:tcPr>
           <w:p>
             <w:pPr>
@@ -388,7 +388,7 @@
         </w:tc>
         <w:tc>
           <w:tcPr>
-            <w:tcW w:w="4522" w:type="dxa"/>
+            <w:tcW w:w="4780" w:type="dxa"/>
           </w:tcPr>
           <w:p>
             <w:pPr>
@@ -963,7 +963,7 @@
                 <w:sz w:val="26"/>
                 <w:szCs w:val="26"/>
               </w:rPr>
-              <w:t xml:space="preserve">99% · 1.00</w:t>
+              <w:t xml:space="preserve">99% · 0.78</w:t>
             </w:r>
           </w:p>
           <w:p>
@@ -975,7 +975,7 @@
                 <w:sz w:val="16"/>
                 <w:szCs w:val="16"/>
               </w:rPr>
-              <w:t xml:space="preserve">AI로 효율화 — 인사팀 소명 글이 기계 검사를 통과한 비율 99%(처음 보는 데이터 100%), 발주 자료에서 필요 기술을 찾는 정밀도 1.00(AI 없이 규칙 0.93), 낯선 기술 이름 정리 1위 정답 95%(문자열 비교 27%)(3.3·3.6)</w:t>
+              <w:t xml:space="preserve">AI로 효율화 — 인사팀 소명 글이 기계 검사를 통과한 비율 99%(처음 보는 데이터 100%), 실제 공공 발주 자료 10편에서 필요 기술을 고른 정밀도 0.78(AI 없는 규칙 0.32), 낯선 기술 이름 정리 1위 정답 95%(문자열 비교 27%)(3.3·3.6)</w:t>
             </w:r>
           </w:p>
         </w:tc>
@@ -2801,7 +2801,7 @@
         <w:t xml:space="preserve">사람이 다 읽을 수 없는 글을 읽고, 근거 글을 쓰고, 부서장의 말을 사전 말로 옮기는</w:t>
       </w:r>
       <w:r>
-        <w:t xml:space="preserve"> 곳에만 쓰고, 같은 일을 AI 없이(규칙·사전·문자열) 할 때와 나란히 쟀다. 판정 기준은 측정 전에 커밋했다.</w:t>
+        <w:t xml:space="preserve"> 곳에만 쓰고, 같은 일을 AI 없이(규칙·사전·문자열) 할 때와 나란히 쟀다. 판정 기준은 측정 전에 먼저 정해 고정했다.</w:t>
       </w:r>
     </w:p>
     <w:tbl>
@@ -2825,10 +2825,10 @@
         </w:tblCellMar>
       </w:tblPr>
       <w:tblGrid>
-        <w:gridCol w:w="1500"/>
-        <w:gridCol w:w="2974"/>
-        <w:gridCol w:w="4931"/>
-        <w:gridCol w:w="911"/>
+        <w:gridCol w:w="1529"/>
+        <w:gridCol w:w="3773"/>
+        <w:gridCol w:w="4111"/>
+        <w:gridCol w:w="903"/>
       </w:tblGrid>
       <w:tr>
         <w:trPr>
@@ -2837,7 +2837,7 @@
         </w:trPr>
         <w:tc>
           <w:tcPr>
-            <w:tcW w:w="1500" w:type="dxa"/>
+            <w:tcW w:w="1529" w:type="dxa"/>
             <w:shd w:val="clear" w:color="auto" w:fill="F1F3F5"/>
           </w:tcPr>
           <w:p>
@@ -2857,7 +2857,7 @@
         </w:tc>
         <w:tc>
           <w:tcPr>
-            <w:tcW w:w="2974" w:type="dxa"/>
+            <w:tcW w:w="3773" w:type="dxa"/>
             <w:shd w:val="clear" w:color="auto" w:fill="F1F3F5"/>
           </w:tcPr>
           <w:p>
@@ -2877,7 +2877,7 @@
         </w:tc>
         <w:tc>
           <w:tcPr>
-            <w:tcW w:w="4931" w:type="dxa"/>
+            <w:tcW w:w="4111" w:type="dxa"/>
             <w:shd w:val="clear" w:color="auto" w:fill="F1F3F5"/>
           </w:tcPr>
           <w:p>
@@ -2897,7 +2897,7 @@
         </w:tc>
         <w:tc>
           <w:tcPr>
-            <w:tcW w:w="911" w:type="dxa"/>
+            <w:tcW w:w="903" w:type="dxa"/>
             <w:shd w:val="clear" w:color="auto" w:fill="F1F3F5"/>
           </w:tcPr>
           <w:p>
@@ -2922,7 +2922,7 @@
         </w:trPr>
         <w:tc>
           <w:tcPr>
-            <w:tcW w:w="1500" w:type="dxa"/>
+            <w:tcW w:w="1529" w:type="dxa"/>
           </w:tcPr>
           <w:p>
             <w:pPr>
@@ -2939,7 +2939,7 @@
         </w:tc>
         <w:tc>
           <w:tcPr>
-            <w:tcW w:w="2974" w:type="dxa"/>
+            <w:tcW w:w="3773" w:type="dxa"/>
           </w:tcPr>
           <w:p>
             <w:pPr>
@@ -2956,7 +2956,7 @@
         </w:tc>
         <w:tc>
           <w:tcPr>
-            <w:tcW w:w="4931" w:type="dxa"/>
+            <w:tcW w:w="4111" w:type="dxa"/>
           </w:tcPr>
           <w:p>
             <w:pPr>
@@ -3005,7 +3005,7 @@
         </w:tc>
         <w:tc>
           <w:tcPr>
-            <w:tcW w:w="911" w:type="dxa"/>
+            <w:tcW w:w="903" w:type="dxa"/>
           </w:tcPr>
           <w:p>
             <w:pPr>
@@ -3027,7 +3027,7 @@
         </w:trPr>
         <w:tc>
           <w:tcPr>
-            <w:tcW w:w="1500" w:type="dxa"/>
+            <w:tcW w:w="1529" w:type="dxa"/>
           </w:tcPr>
           <w:p>
             <w:pPr>
@@ -3044,7 +3044,7 @@
         </w:tc>
         <w:tc>
           <w:tcPr>
-            <w:tcW w:w="2974" w:type="dxa"/>
+            <w:tcW w:w="3773" w:type="dxa"/>
           </w:tcPr>
           <w:p>
             <w:pPr>
@@ -3061,7 +3061,7 @@
         </w:tc>
         <w:tc>
           <w:tcPr>
-            <w:tcW w:w="4931" w:type="dxa"/>
+            <w:tcW w:w="4111" w:type="dxa"/>
           </w:tcPr>
           <w:p>
             <w:pPr>
@@ -3094,7 +3094,7 @@
         </w:tc>
         <w:tc>
           <w:tcPr>
-            <w:tcW w:w="911" w:type="dxa"/>
+            <w:tcW w:w="903" w:type="dxa"/>
           </w:tcPr>
           <w:p>
             <w:pPr>
@@ -3116,7 +3116,7 @@
         </w:trPr>
         <w:tc>
           <w:tcPr>
-            <w:tcW w:w="1500" w:type="dxa"/>
+            <w:tcW w:w="1529" w:type="dxa"/>
           </w:tcPr>
           <w:p>
             <w:pPr>
@@ -3133,7 +3133,7 @@
         </w:tc>
         <w:tc>
           <w:tcPr>
-            <w:tcW w:w="2974" w:type="dxa"/>
+            <w:tcW w:w="3773" w:type="dxa"/>
           </w:tcPr>
           <w:p>
             <w:pPr>
@@ -3150,7 +3150,7 @@
         </w:tc>
         <w:tc>
           <w:tcPr>
-            <w:tcW w:w="4931" w:type="dxa"/>
+            <w:tcW w:w="4111" w:type="dxa"/>
           </w:tcPr>
           <w:p>
             <w:pPr>
@@ -3167,7 +3167,7 @@
         </w:tc>
         <w:tc>
           <w:tcPr>
-            <w:tcW w:w="911" w:type="dxa"/>
+            <w:tcW w:w="903" w:type="dxa"/>
           </w:tcPr>
           <w:p>
             <w:pPr>
@@ -3189,7 +3189,7 @@
         </w:trPr>
         <w:tc>
           <w:tcPr>
-            <w:tcW w:w="1500" w:type="dxa"/>
+            <w:tcW w:w="1529" w:type="dxa"/>
           </w:tcPr>
           <w:p>
             <w:pPr>
@@ -3206,7 +3206,7 @@
         </w:tc>
         <w:tc>
           <w:tcPr>
-            <w:tcW w:w="2974" w:type="dxa"/>
+            <w:tcW w:w="3773" w:type="dxa"/>
           </w:tcPr>
           <w:p>
             <w:pPr>
@@ -3232,7 +3232,7 @@
         </w:tc>
         <w:tc>
           <w:tcPr>
-            <w:tcW w:w="4931" w:type="dxa"/>
+            <w:tcW w:w="4111" w:type="dxa"/>
           </w:tcPr>
           <w:p>
             <w:pPr>
@@ -3265,7 +3265,7 @@
         </w:tc>
         <w:tc>
           <w:tcPr>
-            <w:tcW w:w="911" w:type="dxa"/>
+            <w:tcW w:w="903" w:type="dxa"/>
           </w:tcPr>
           <w:p>
             <w:pPr>
@@ -3287,7 +3287,7 @@
         </w:trPr>
         <w:tc>
           <w:tcPr>
-            <w:tcW w:w="1500" w:type="dxa"/>
+            <w:tcW w:w="1529" w:type="dxa"/>
           </w:tcPr>
           <w:p>
             <w:pPr>
@@ -3304,7 +3304,7 @@
         </w:tc>
         <w:tc>
           <w:tcPr>
-            <w:tcW w:w="2974" w:type="dxa"/>
+            <w:tcW w:w="3773" w:type="dxa"/>
           </w:tcPr>
           <w:p>
             <w:pPr>
@@ -3321,7 +3321,7 @@
         </w:tc>
         <w:tc>
           <w:tcPr>
-            <w:tcW w:w="4931" w:type="dxa"/>
+            <w:tcW w:w="4111" w:type="dxa"/>
           </w:tcPr>
           <w:p>
             <w:pPr>
@@ -3379,7 +3379,7 @@
         </w:tc>
         <w:tc>
           <w:tcPr>
-            <w:tcW w:w="911" w:type="dxa"/>
+            <w:tcW w:w="903" w:type="dxa"/>
           </w:tcPr>
           <w:p>
             <w:pPr>
@@ -3401,7 +3401,7 @@
         </w:trPr>
         <w:tc>
           <w:tcPr>
-            <w:tcW w:w="1500" w:type="dxa"/>
+            <w:tcW w:w="1529" w:type="dxa"/>
           </w:tcPr>
           <w:p>
             <w:pPr>
@@ -3418,24 +3418,40 @@
         </w:tc>
         <w:tc>
           <w:tcPr>
-            <w:tcW w:w="2974" w:type="dxa"/>
-          </w:tcPr>
-          <w:p>
-            <w:pPr>
-              <w:pStyle w:val="TWCell"/>
-            </w:pPr>
-            <w:r>
-              <w:rPr>
-                <w:sz w:val="17"/>
-                <w:szCs w:val="17"/>
-              </w:rPr>
-              <w:t xml:space="preserve">부서장이 RFP를 읽고 기술을 하나씩 고름. 규칙(사전 이름 + 문장 말)은 현행 시스템 언급을 요구로 뽑기도 함 — 정밀도 0.93, 경력 83%·인원 77% 일치</w:t>
-            </w:r>
-          </w:p>
-        </w:tc>
-        <w:tc>
-          <w:tcPr>
-            <w:tcW w:w="4931" w:type="dxa"/>
+            <w:tcW w:w="3773" w:type="dxa"/>
+          </w:tcPr>
+          <w:p>
+            <w:pPr>
+              <w:pStyle w:val="TWCell"/>
+            </w:pPr>
+            <w:r>
+              <w:rPr>
+                <w:sz w:val="17"/>
+                <w:szCs w:val="17"/>
+              </w:rPr>
+              <w:t xml:space="preserve">부서장이 RFP를 읽고 기술을 하나씩 고름. 규칙(사전 이름 + 문장 말)은 기술 적용 계획표 같은 양식 목록·현행 시스템까지 요구로 뽑는다 — 실제 공공 자료 10편 정밀도 </w:t>
+            </w:r>
+            <w:r>
+              <w:rPr>
+                <w:b/>
+                <w:bCs/>
+                <w:sz w:val="17"/>
+                <w:szCs w:val="17"/>
+              </w:rPr>
+              <w:t xml:space="preserve">0.32</w:t>
+            </w:r>
+            <w:r>
+              <w:rPr>
+                <w:sz w:val="17"/>
+                <w:szCs w:val="17"/>
+              </w:rPr>
+              <w:t xml:space="preserve">, 요구 아닌 언급의 99%(144/145)를 요구로</w:t>
+            </w:r>
+          </w:p>
+        </w:tc>
+        <w:tc>
+          <w:tcPr>
+            <w:tcW w:w="4111" w:type="dxa"/>
           </w:tcPr>
           <w:p>
             <w:pPr>
@@ -3455,47 +3471,31 @@
                 <w:sz w:val="17"/>
                 <w:szCs w:val="17"/>
               </w:rPr>
-              <w:t xml:space="preserve">1.00</w:t>
-            </w:r>
-            <w:r>
-              <w:rPr>
-                <w:sz w:val="17"/>
-                <w:szCs w:val="17"/>
-              </w:rPr>
-              <w:t xml:space="preserve">·재현율 0.99, 현행·연계 언급 오검출 </w:t>
-            </w:r>
-            <w:r>
-              <w:rPr>
-                <w:b/>
-                <w:bCs/>
-                <w:sz w:val="17"/>
-                <w:szCs w:val="17"/>
-              </w:rPr>
-              <w:t xml:space="preserve">0</w:t>
-            </w:r>
-            <w:r>
-              <w:rPr>
-                <w:sz w:val="17"/>
-                <w:szCs w:val="17"/>
-              </w:rPr>
-              <w:t xml:space="preserve">, 경력 98%·인원 100%, 편당 6초·$0.001(사내 대리 GLM 정밀도 0.93). 8만 자 자료는 나눠 동시에 읽음. 근거 말과 함께 제안 → 사람이 고침</w:t>
-            </w:r>
-          </w:p>
-        </w:tc>
-        <w:tc>
-          <w:tcPr>
-            <w:tcW w:w="911" w:type="dxa"/>
-          </w:tcPr>
-          <w:p>
-            <w:pPr>
-              <w:pStyle w:val="TWCell"/>
-            </w:pPr>
-            <w:r>
-              <w:rPr>
-                <w:sz w:val="17"/>
-                <w:szCs w:val="17"/>
-              </w:rPr>
-              <w:t xml:space="preserve">자료 18편</w:t>
+              <w:t xml:space="preserve">0.78</w:t>
+            </w:r>
+            <w:r>
+              <w:rPr>
+                <w:sz w:val="17"/>
+                <w:szCs w:val="17"/>
+              </w:rPr>
+              <w:t xml:space="preserve">(3회 0.74~0.86)·재현율 0.88, 요구 아닌 언급 11%, 과업으로만 드러난 기술도 42~67%(규칙 8%), 편당 13초·$0.005(사내 대리 GLM 0.65·74초). 가상 18편은 1.00(규칙 0.93). 근거와 함께 제안 → 사람이 고침</w:t>
+            </w:r>
+          </w:p>
+        </w:tc>
+        <w:tc>
+          <w:tcPr>
+            <w:tcW w:w="903" w:type="dxa"/>
+          </w:tcPr>
+          <w:p>
+            <w:pPr>
+              <w:pStyle w:val="TWCell"/>
+            </w:pPr>
+            <w:r>
+              <w:rPr>
+                <w:sz w:val="17"/>
+                <w:szCs w:val="17"/>
+              </w:rPr>
+              <w:t xml:space="preserve">실제 10편 + 가상 18편</w:t>
             </w:r>
           </w:p>
         </w:tc>
@@ -3506,7 +3506,7 @@
         </w:trPr>
         <w:tc>
           <w:tcPr>
-            <w:tcW w:w="1500" w:type="dxa"/>
+            <w:tcW w:w="1529" w:type="dxa"/>
           </w:tcPr>
           <w:p>
             <w:pPr>
@@ -3523,35 +3523,35 @@
         </w:tc>
         <w:tc>
           <w:tcPr>
-            <w:tcW w:w="2974" w:type="dxa"/>
-          </w:tcPr>
-          <w:p>
-            <w:pPr>
-              <w:pStyle w:val="TWCell"/>
-            </w:pPr>
-            <w:r>
-              <w:rPr>
-                <w:sz w:val="17"/>
-                <w:szCs w:val="17"/>
-              </w:rPr>
-              <w:t xml:space="preserve">공고문을 보며 사업명·기간·예산을 손으로 적고 자료를 다 읽는다. 규칙은 "사업명:" 같은 표지가 있을 때만 — 가상 7편은 규칙도 7/7(쉬운 세트)</w:t>
-            </w:r>
-          </w:p>
-        </w:tc>
-        <w:tc>
-          <w:tcPr>
-            <w:tcW w:w="4931" w:type="dxa"/>
-          </w:tcPr>
-          <w:p>
-            <w:pPr>
-              <w:pStyle w:val="TWCell"/>
-            </w:pPr>
-            <w:r>
-              <w:rPr>
-                <w:sz w:val="17"/>
-                <w:szCs w:val="17"/>
-              </w:rPr>
-              <w:t xml:space="preserve">실제 공고문의 계약기간 "계약체결일 ~ 11월 13일"을 </w:t>
+            <w:tcW w:w="3773" w:type="dxa"/>
+          </w:tcPr>
+          <w:p>
+            <w:pPr>
+              <w:pStyle w:val="TWCell"/>
+            </w:pPr>
+            <w:r>
+              <w:rPr>
+                <w:sz w:val="17"/>
+                <w:szCs w:val="17"/>
+              </w:rPr>
+              <w:t xml:space="preserve">손으로 적고 다 읽는다. 규칙은 "사업명:" 같은 표지가 있을 때만(가상 7편은 규칙도 7/7)</w:t>
+            </w:r>
+          </w:p>
+        </w:tc>
+        <w:tc>
+          <w:tcPr>
+            <w:tcW w:w="4111" w:type="dxa"/>
+          </w:tcPr>
+          <w:p>
+            <w:pPr>
+              <w:pStyle w:val="TWCell"/>
+            </w:pPr>
+            <w:r>
+              <w:rPr>
+                <w:sz w:val="17"/>
+                <w:szCs w:val="17"/>
+              </w:rPr>
+              <w:t xml:space="preserve">계약기간 "계약체결일 ~ 11월 13일"을 </w:t>
             </w:r>
             <w:r>
               <w:rPr>
@@ -3567,24 +3567,24 @@
                 <w:sz w:val="17"/>
                 <w:szCs w:val="17"/>
               </w:rPr>
-              <w:t xml:space="preserve">로 셈(규칙은 못 함)·표지 없는 사업명도 찾음 — 근거로 확인 못 한 값은 "확인 필요". 요약은 자료마다 과업·기간·예산·인력·평가·유의 사항, 근거·숫자 검사로 항목을 거름(완전한 차단은 아님), 편당 5~14초</w:t>
-            </w:r>
-          </w:p>
-        </w:tc>
-        <w:tc>
-          <w:tcPr>
-            <w:tcW w:w="911" w:type="dxa"/>
-          </w:tcPr>
-          <w:p>
-            <w:pPr>
-              <w:pStyle w:val="TWCell"/>
-            </w:pPr>
-            <w:r>
-              <w:rPr>
-                <w:sz w:val="17"/>
-                <w:szCs w:val="17"/>
-              </w:rPr>
-              <w:t xml:space="preserve">가상 7편 + 실제 공고 자료</w:t>
+              <w:t xml:space="preserve">로 셈(규칙 못 함) — 확인 못 한 값은 "확인 필요". 요약은 근거·숫자 검사로 항목을 거름(완전 차단 아님), 편당 5~14초</w:t>
+            </w:r>
+          </w:p>
+        </w:tc>
+        <w:tc>
+          <w:tcPr>
+            <w:tcW w:w="903" w:type="dxa"/>
+          </w:tcPr>
+          <w:p>
+            <w:pPr>
+              <w:pStyle w:val="TWCell"/>
+            </w:pPr>
+            <w:r>
+              <w:rPr>
+                <w:sz w:val="17"/>
+                <w:szCs w:val="17"/>
+              </w:rPr>
+              <w:t xml:space="preserve">가상 7편 + 실제 공고</w:t>
             </w:r>
           </w:p>
         </w:tc>
@@ -3736,31 +3736,18 @@
         <w:rPr>
           <w:color w:val="5B6168"/>
         </w:rPr>
-        <w:t xml:space="preserve">새 세 기능은 AI가 말·이름·자료를 사전 개념으로 옮기기만 하고(사람 정보는 보내지 않음), 추천은 기존 계산이, 결정은 사람이 한다. 표본이 작아 구간이 넓다(요청 48문장 정밀도 95% 구간 0.84~0.97). 발주 자료 18편 중 11편은 규칙과 같은 사람이 쓴 가상 자료다. 시연은 나라장터에 공개된 공공 입찰 자료(사전규격 R26BD00208180 · 산안공고 제2026-68호의 공고문·제안요청서)로 했다 — 민간 기업의 RFI·RFP는 초청한 업체에만 보내는 비공개 문서라 구할 수 없다. 이 연구 용역 자료(계약 조건까지 7편)에는 기술별 경력·인원 요건이 없어 AI가 과업 내용에서 기술을 추정하고 화면이 "추정"으로 표시한다(위 정답표 측정과 섞지 않음). 근거 </w:t>
-      </w:r>
-      <w:r>
-        <w:rPr>
-          <w:rFonts w:ascii="Consolas" w:hAnsi="Consolas" w:eastAsia="Malgun Gothic" w:cs="Consolas"/>
-          <w:color w:val="5B6168"/>
-        </w:rPr>
-        <w:t xml:space="preserve">rehearsal/results/</w:t>
-      </w:r>
+        <w:t xml:space="preserve">새 세 기능은 AI가 말·이름·자료를 사전 개념으로 옮기기만 하고(사람 정보는 보내지 않음), 추천은 기존 계산이, 결정은 사람이 한다. 표본이 작아 구간이 넓다(요청 48문장 정밀도 95% 구간 0.84~0.97). 발주 자료 가상 18편 중 11편은 규칙과 같은 사람이 쓴 자료다. 실제 공공 자료 10편(나라장터)은 정답을 개발 측이 읽고 AI 실행 전에 고정했고, 정답 전에 AI 결과를 본 시연 자료 한 편을 빼도 같다. 시연은 나라장터에 공개된 공공 입찰 자료(사전규격 R26BD00208180 · 산안공고 제2026-68호의 공고문·제안요청서)로 했다 — 민간 기업의 RFI·RFP는 초청한 업체에만 보내는 비공개 문서라 구할 수 없다. 이 연구 용역 자료(계약 조건까지 7편)에는 기술별 경력·인원 요건이 없어 AI가 과업 내용에서 기술을 추정하고 화면이 "추정"으로 표시한다(위 정답표 측정과 섞지 않음). 정밀도 = 고른 것 중 정답인 비율, 재현율 = 정답 중 찾아낸 비율.</w:t>
+      </w:r>
+    </w:p>
+    <w:p>
+      <w:pPr>
+        <w:pStyle w:val="TWMuted"/>
+      </w:pPr>
       <w:r>
         <w:rPr>
           <w:color w:val="5B6168"/>
         </w:rPr>
-        <w:t xml:space="preserve"> request-parse·skill-mapping·rfp-read.</w:t>
-      </w:r>
-    </w:p>
-    <w:p>
-      <w:pPr>
-        <w:pStyle w:val="TWMuted"/>
-      </w:pPr>
-      <w:r>
-        <w:rPr>
-          <w:color w:val="5B6168"/>
-        </w:rPr>
-        <w:t xml:space="preserve">E5·E6·E7c(3.4·3.6)는 10-12 데이터(예전 투입 방식) 기준이다 — 외부 AI 비용 때문에 다시 재지 않았다. 3.5의 판정 정확도(E4)는 평가 글이 그대로라 지금도 맞고, 배치 영향은 10-19에 다시 쟀다.</w:t>
+        <w:t xml:space="preserve">LLM 직접 배치(3.4)와 교체 설명·소명 글(3.6)은 전일 투입 규칙을 넣기 전 데이터로 잰 값이다(외부 AI 비용 때문에 다시 재지 않음). 평가 글 판정(3.5)은 글이 같아 그대로 맞고, 배치에 미치는 영향은 지금 데이터로 다시 쟀다.</w:t>
       </w:r>
     </w:p>
     <w:p>
@@ -3768,12 +3755,12 @@
         <w:pStyle w:val="Heading2"/>
       </w:pPr>
       <w:r>
-        <w:t xml:space="preserve">3.4 AI에게 맡기지 않는 곳 — LLM 직접 배치 (E6)</w:t>
-      </w:r>
-    </w:p>
-    <w:p>
-      <w:r>
-        <w:t xml:space="preserve">외부 LLM(gpt-6-luna, 추론 high)에게 같은 규칙·목적을 설명하고 배치를 받아 서비스 평가기로 채점했다. 20명·사업 4에서는 솔버의 89~94%였지만, 50명은 원자료만 주면 위반(점수 제공·1회 수정 시 69.6%), 100명은 위반 또는 </w:t>
+        <w:t xml:space="preserve">3.4 AI에게 맡기지 않는 곳 — LLM 직접 배치</w:t>
+      </w:r>
+    </w:p>
+    <w:p>
+      <w:r>
+        <w:t xml:space="preserve">외부 LLM(gpt-6-luna, 추론 high)에게 같은 규칙·목적을 설명하고 배치를 받아, 최적화 엔진(솔버)의 결과와 같은 채점 기준으로 비교했다. 20명·사업 4에서는 솔버의 89~94%였지만, 50명은 원자료만 주면 위반(점수 제공·1회 수정 시 69.6%), 100명은 위반 또는 </w:t>
       </w:r>
       <w:r>
         <w:rPr>
@@ -3793,16 +3780,7 @@
         <w:t xml:space="preserve">배치 결정은 솔버가, AI는 읽기·쓰기를</w:t>
       </w:r>
       <w:r>
-        <w:t xml:space="preserve"> 맡는 구조의 근거(</w:t>
-      </w:r>
-      <w:r>
-        <w:rPr>
-          <w:rFonts w:ascii="Consolas" w:hAnsi="Consolas" w:eastAsia="Malgun Gothic" w:cs="Consolas"/>
-        </w:rPr>
-        <w:t xml:space="preserve">rehearsal/results/llm-vs-solver.html</w:t>
-      </w:r>
-      <w:r>
-        <w:t xml:space="preserve">).</w:t>
+        <w:t xml:space="preserve"> 맡는 구조의 근거.</w:t>
       </w:r>
     </w:p>
     <w:p>
@@ -3810,7 +3788,7 @@
         <w:pStyle w:val="Heading2"/>
       </w:pPr>
       <w:r>
-        <w:t xml:space="preserve">3.5 평가 글은 AI가 읽어야 한다 — 판정 방식 비교(E4)와 배치에 미치는 영향</w:t>
+        <w:t xml:space="preserve">3.5 평가 글은 AI가 읽어야 한다 — 판정 방식 비교와 배치에 미치는 영향</w:t>
       </w:r>
     </w:p>
     <w:p>
@@ -4431,7 +4409,7 @@
         <w:rPr>
           <w:color w:val="5B6168"/>
         </w:rPr>
-        <w:t xml:space="preserve">① 시연 원문 무작위 300건 중 "직설형 평가자"·"항목보다 독한 글" 34건. ② 항목대로 쓴 글에서 숨은 부정을 찾는 시험. 판정 기준은 측정 전에 커밋했다.</w:t>
+        <w:t xml:space="preserve">① 시연 원문 무작위 300건 중 "직설형 평가자"·"항목보다 독한 글" 34건. ② 항목대로 쓴 글에서 숨은 부정을 찾는 시험. 판정 기준은 측정 전에 먼저 정해 고정했다.</w:t>
       </w:r>
     </w:p>
     <w:p>
@@ -4443,16 +4421,7 @@
         <w:t xml:space="preserve">판정 차이는 배치 결정까지 바꾼다.</w:t>
       </w:r>
       <w:r>
-        <w:t xml:space="preserve"> 같은 시연 묶음을 규칙 판정과 AI 판정으로 각각 만들어 안 A를 서비스와 같은 설정(시드 4개·안 A 허용 차이 1%)으로 풀었다(</w:t>
-      </w:r>
-      <w:r>
-        <w:rPr>
-          <w:rFonts w:ascii="Consolas" w:hAnsi="Consolas" w:eastAsia="Malgun Gothic" w:cs="Consolas"/>
-        </w:rPr>
-        <w:t xml:space="preserve">rehearsal/ai_effect.py</w:t>
-      </w:r>
-      <w:r>
-        <w:t xml:space="preserve">).</w:t>
+        <w:t xml:space="preserve"> 같은 가상 조직을 규칙 판정과 AI 판정으로 각각 채점해, 서비스와 같은 설정으로 프로젝트 인력 배치를 풀었다.</w:t>
       </w:r>
     </w:p>
     <w:tbl>
@@ -4996,20 +4965,7 @@
         <w:rPr>
           <w:color w:val="5B6168"/>
         </w:rPr>
-        <w:t xml:space="preserve">규칙으로 판정하면 서로 나쁘게 쓴 사이가 "궁합 좋은 상위 200쌍"에 들어가 함께 배치될수록 점수를 받는다. AI 판정은 세 규모 모두 그런 사이를 보상에서 뺐다. 팀 협업 점수는 AI가 읽은 평가로 다시 채점한 값, 두 안 모두 위반 0(10-19 다시 잼, </w:t>
-      </w:r>
-      <w:r>
-        <w:rPr>
-          <w:rFonts w:ascii="Consolas" w:hAnsi="Consolas" w:eastAsia="Malgun Gothic" w:cs="Consolas"/>
-          <w:color w:val="5B6168"/>
-        </w:rPr>
-        <w:t xml:space="preserve">rehearsal/results/ai-effect.json</w:t>
-      </w:r>
-      <w:r>
-        <w:rPr>
-          <w:color w:val="5B6168"/>
-        </w:rPr>
-        <w:t xml:space="preserve">).</w:t>
+        <w:t xml:space="preserve">규칙으로 판정하면 서로 나쁘게 쓴 사이가 "궁합 좋은 상위 200쌍"에 들어가 함께 배치될수록 점수를 받는다. AI 판정은 세 규모 모두 그런 사이를 보상에서 뺐다. 팀 협업 점수는 두 배치를 모두 AI가 읽은 평가로 다시 채점한 값이고, 두 배치 모두 규칙 위반은 없다.</w:t>
       </w:r>
     </w:p>
     <w:p>
@@ -5041,9 +4997,9 @@
         </w:tblCellMar>
       </w:tblPr>
       <w:tblGrid>
-        <w:gridCol w:w="1360"/>
-        <w:gridCol w:w="2930"/>
-        <w:gridCol w:w="3825"/>
+        <w:gridCol w:w="912"/>
+        <w:gridCol w:w="2819"/>
+        <w:gridCol w:w="4384"/>
         <w:gridCol w:w="2200"/>
       </w:tblGrid>
       <w:tr>
@@ -5053,7 +5009,7 @@
         </w:trPr>
         <w:tc>
           <w:tcPr>
-            <w:tcW w:w="1360" w:type="dxa"/>
+            <w:tcW w:w="912" w:type="dxa"/>
             <w:shd w:val="clear" w:color="auto" w:fill="F1F3F5"/>
           </w:tcPr>
           <w:p>
@@ -5073,7 +5029,7 @@
         </w:tc>
         <w:tc>
           <w:tcPr>
-            <w:tcW w:w="2930" w:type="dxa"/>
+            <w:tcW w:w="2819" w:type="dxa"/>
             <w:shd w:val="clear" w:color="auto" w:fill="F1F3F5"/>
           </w:tcPr>
           <w:p>
@@ -5093,7 +5049,7 @@
         </w:tc>
         <w:tc>
           <w:tcPr>
-            <w:tcW w:w="3825" w:type="dxa"/>
+            <w:tcW w:w="4384" w:type="dxa"/>
             <w:shd w:val="clear" w:color="auto" w:fill="F1F3F5"/>
           </w:tcPr>
           <w:p>
@@ -5139,24 +5095,24 @@
         </w:trPr>
         <w:tc>
           <w:tcPr>
-            <w:tcW w:w="1360" w:type="dxa"/>
-          </w:tcPr>
-          <w:p>
-            <w:pPr>
-              <w:pStyle w:val="TWCell"/>
-            </w:pPr>
-            <w:r>
-              <w:rPr>
-                <w:sz w:val="17"/>
-                <w:szCs w:val="17"/>
-              </w:rPr>
-              <w:t xml:space="preserve">교체 설명(E5)</w:t>
-            </w:r>
-          </w:p>
-        </w:tc>
-        <w:tc>
-          <w:tcPr>
-            <w:tcW w:w="2930" w:type="dxa"/>
+            <w:tcW w:w="912" w:type="dxa"/>
+          </w:tcPr>
+          <w:p>
+            <w:pPr>
+              <w:pStyle w:val="TWCell"/>
+            </w:pPr>
+            <w:r>
+              <w:rPr>
+                <w:sz w:val="17"/>
+                <w:szCs w:val="17"/>
+              </w:rPr>
+              <w:t xml:space="preserve">교체 설명</w:t>
+            </w:r>
+          </w:p>
+        </w:tc>
+        <w:tc>
+          <w:tcPr>
+            <w:tcW w:w="2819" w:type="dxa"/>
           </w:tcPr>
           <w:p>
             <w:pPr>
@@ -5173,7 +5129,7 @@
         </w:tc>
         <w:tc>
           <w:tcPr>
-            <w:tcW w:w="3825" w:type="dxa"/>
+            <w:tcW w:w="4384" w:type="dxa"/>
           </w:tcPr>
           <w:p>
             <w:pPr>
@@ -5229,24 +5185,24 @@
         </w:trPr>
         <w:tc>
           <w:tcPr>
-            <w:tcW w:w="1360" w:type="dxa"/>
-          </w:tcPr>
-          <w:p>
-            <w:pPr>
-              <w:pStyle w:val="TWCell"/>
-            </w:pPr>
-            <w:r>
-              <w:rPr>
-                <w:sz w:val="17"/>
-                <w:szCs w:val="17"/>
-              </w:rPr>
-              <w:t xml:space="preserve">인사팀 소명 글(E7c)</w:t>
-            </w:r>
-          </w:p>
-        </w:tc>
-        <w:tc>
-          <w:tcPr>
-            <w:tcW w:w="2930" w:type="dxa"/>
+            <w:tcW w:w="912" w:type="dxa"/>
+          </w:tcPr>
+          <w:p>
+            <w:pPr>
+              <w:pStyle w:val="TWCell"/>
+            </w:pPr>
+            <w:r>
+              <w:rPr>
+                <w:sz w:val="17"/>
+                <w:szCs w:val="17"/>
+              </w:rPr>
+              <w:t xml:space="preserve">인사팀 소명 글</w:t>
+            </w:r>
+          </w:p>
+        </w:tc>
+        <w:tc>
+          <w:tcPr>
+            <w:tcW w:w="2819" w:type="dxa"/>
           </w:tcPr>
           <w:p>
             <w:pPr>
@@ -5263,7 +5219,7 @@
         </w:tc>
         <w:tc>
           <w:tcPr>
-            <w:tcW w:w="3825" w:type="dxa"/>
+            <w:tcW w:w="4384" w:type="dxa"/>
           </w:tcPr>
           <w:p>
             <w:pPr>
@@ -5306,7 +5262,7 @@
                 <w:sz w:val="17"/>
                 <w:szCs w:val="17"/>
               </w:rPr>
-              <w:t xml:space="preserve">(225/225). 주입 오류 </w:t>
+              <w:t xml:space="preserve">(225/225). 일부러 틀리게 넣은 사실 </w:t>
             </w:r>
             <w:r>
               <w:rPr>
@@ -5322,7 +5278,7 @@
                 <w:sz w:val="17"/>
                 <w:szCs w:val="17"/>
               </w:rPr>
-              <w:t xml:space="preserve"> 검출, 채택 글 무결성 837/837</w:t>
+              <w:t xml:space="preserve"> 검출, 내보낸 글의 숫자·사실이 원자료와 모두 일치(837/837)</w:t>
             </w:r>
           </w:p>
         </w:tc>
@@ -5351,24 +5307,24 @@
         </w:trPr>
         <w:tc>
           <w:tcPr>
-            <w:tcW w:w="1360" w:type="dxa"/>
-          </w:tcPr>
-          <w:p>
-            <w:pPr>
-              <w:pStyle w:val="TWCell"/>
-            </w:pPr>
-            <w:r>
-              <w:rPr>
-                <w:sz w:val="17"/>
-                <w:szCs w:val="17"/>
-              </w:rPr>
-              <w:t xml:space="preserve">소명 요약(10-20)</w:t>
-            </w:r>
-          </w:p>
-        </w:tc>
-        <w:tc>
-          <w:tcPr>
-            <w:tcW w:w="2930" w:type="dxa"/>
+            <w:tcW w:w="912" w:type="dxa"/>
+          </w:tcPr>
+          <w:p>
+            <w:pPr>
+              <w:pStyle w:val="TWCell"/>
+            </w:pPr>
+            <w:r>
+              <w:rPr>
+                <w:sz w:val="17"/>
+                <w:szCs w:val="17"/>
+              </w:rPr>
+              <w:t xml:space="preserve">소명 세 문장 요약</w:t>
+            </w:r>
+          </w:p>
+        </w:tc>
+        <w:tc>
+          <w:tcPr>
+            <w:tcW w:w="2819" w:type="dxa"/>
           </w:tcPr>
           <w:p>
             <w:pPr>
@@ -5385,7 +5341,7 @@
         </w:tc>
         <w:tc>
           <w:tcPr>
-            <w:tcW w:w="3825" w:type="dxa"/>
+            <w:tcW w:w="4384" w:type="dxa"/>
           </w:tcPr>
           <w:p>
             <w:pPr>
@@ -5412,7 +5368,7 @@
                 <w:sz w:val="17"/>
                 <w:szCs w:val="17"/>
               </w:rPr>
-              <w:t xml:space="preserve">, 걸리면 규칙 요약(7.4%), 무결성 실패 0(10-22 다시 잼)</w:t>
+              <w:t xml:space="preserve">, 걸리면 규칙 요약(7.4%), 사실 불일치 0</w:t>
             </w:r>
           </w:p>
         </w:tc>
@@ -5441,7 +5397,7 @@
         </w:trPr>
         <w:tc>
           <w:tcPr>
-            <w:tcW w:w="1360" w:type="dxa"/>
+            <w:tcW w:w="912" w:type="dxa"/>
           </w:tcPr>
           <w:p>
             <w:pPr>
@@ -5458,7 +5414,7 @@
         </w:tc>
         <w:tc>
           <w:tcPr>
-            <w:tcW w:w="2930" w:type="dxa"/>
+            <w:tcW w:w="2819" w:type="dxa"/>
           </w:tcPr>
           <w:p>
             <w:pPr>
@@ -5475,7 +5431,7 @@
         </w:tc>
         <w:tc>
           <w:tcPr>
-            <w:tcW w:w="3825" w:type="dxa"/>
+            <w:tcW w:w="4384" w:type="dxa"/>
           </w:tcPr>
           <w:p>
             <w:pPr>
@@ -5531,85 +5487,7 @@
         <w:rPr>
           <w:color w:val="5B6168"/>
         </w:rPr>
-        <w:t xml:space="preserve">(사내 서버를 쓸 수 없어 GLM-5.3-Flash로 가정): 돌려 말한 부정 검출 89% → 52%, 교체 설명 바로 사용 93% → 97%·3.5 → 10.3초, 처음 보는 소명 채택 100% → 97.3%·8 → 60초 — 전환 때 더 큰 모델·대기 상한(40 → 300초) 조정이 필요하다. 서비스는 외부 AI로 운영하고(사용자 결정 10-11), 실데이터는 사내 주소이거나 관리자가 명시 허용했을 때만 AI를 부른다. 판정 기준은 측정 전에 커밋했다(사전 등록). 출처: </w:t>
-      </w:r>
-      <w:r>
-        <w:rPr>
-          <w:rFonts w:ascii="Consolas" w:hAnsi="Consolas" w:eastAsia="Malgun Gothic" w:cs="Consolas"/>
-          <w:color w:val="5B6168"/>
-        </w:rPr>
-        <w:t xml:space="preserve">outputs/review-judge-comparison.html</w:t>
-      </w:r>
-      <w:r>
-        <w:rPr>
-          <w:color w:val="5B6168"/>
-        </w:rPr>
-        <w:t xml:space="preserve">, </w:t>
-      </w:r>
-      <w:r>
-        <w:rPr>
-          <w:rFonts w:ascii="Consolas" w:hAnsi="Consolas" w:eastAsia="Malgun Gothic" w:cs="Consolas"/>
-          <w:color w:val="5B6168"/>
-        </w:rPr>
-        <w:t xml:space="preserve">rehearsal/results/ai-effect.json</w:t>
-      </w:r>
-      <w:r>
-        <w:rPr>
-          <w:color w:val="5B6168"/>
-        </w:rPr>
-        <w:t xml:space="preserve">, </w:t>
-      </w:r>
-      <w:r>
-        <w:rPr>
-          <w:rFonts w:ascii="Consolas" w:hAnsi="Consolas" w:eastAsia="Malgun Gothic" w:cs="Consolas"/>
-          <w:color w:val="5B6168"/>
-        </w:rPr>
-        <w:t xml:space="preserve">outputs/briefing-llm-comparison.html</w:t>
-      </w:r>
-      <w:r>
-        <w:rPr>
-          <w:color w:val="5B6168"/>
-        </w:rPr>
-        <w:t xml:space="preserve">, </w:t>
-      </w:r>
-      <w:r>
-        <w:rPr>
-          <w:rFonts w:ascii="Consolas" w:hAnsi="Consolas" w:eastAsia="Malgun Gothic" w:cs="Consolas"/>
-          <w:color w:val="5B6168"/>
-        </w:rPr>
-        <w:t xml:space="preserve">rehearsal/results/justify-scale-e7c.html</w:t>
-      </w:r>
-      <w:r>
-        <w:rPr>
-          <w:color w:val="5B6168"/>
-        </w:rPr>
-        <w:t xml:space="preserve">, </w:t>
-      </w:r>
-      <w:r>
-        <w:rPr>
-          <w:rFonts w:ascii="Consolas" w:hAnsi="Consolas" w:eastAsia="Malgun Gothic" w:cs="Consolas"/>
-          <w:color w:val="5B6168"/>
-        </w:rPr>
-        <w:t xml:space="preserve">rehearsal/results/justify-summary.json</w:t>
-      </w:r>
-      <w:r>
-        <w:rPr>
-          <w:color w:val="5B6168"/>
-        </w:rPr>
-        <w:t xml:space="preserve">, </w:t>
-      </w:r>
-      <w:r>
-        <w:rPr>
-          <w:rFonts w:ascii="Consolas" w:hAnsi="Consolas" w:eastAsia="Malgun Gothic" w:cs="Consolas"/>
-          <w:color w:val="5B6168"/>
-        </w:rPr>
-        <w:t xml:space="preserve">rehearsal/results/skill-dictionary.html</w:t>
-      </w:r>
-      <w:r>
-        <w:rPr>
-          <w:color w:val="5B6168"/>
-        </w:rPr>
-        <w:t xml:space="preserve">.</w:t>
+        <w:t xml:space="preserve">(사내 서버를 쓸 수 없어 GLM-5.3-Flash로 가정): 돌려 말한 부정 검출 89% → 52%, 교체 설명 바로 사용 93% → 97%·3.5 → 10.3초, 처음 보는 소명 채택 100% → 97.3%·8 → 60초 — 전환 때 더 큰 모델·대기 상한(40 → 300초) 조정이 필요하다. 서비스는 외부 AI로 운영하고, 실데이터는 사내 주소이거나 관리자가 명시 허용했을 때만 AI를 부른다. 모든 측정은 판정 기준을 측정 전에 먼저 정해 고정했다(사전 등록).</w:t>
       </w:r>
     </w:p>
     <w:p>
@@ -5641,9 +5519,9 @@
         </w:tblCellMar>
       </w:tblPr>
       <w:tblGrid>
-        <w:gridCol w:w="1299"/>
-        <w:gridCol w:w="4093"/>
-        <w:gridCol w:w="4924"/>
+        <w:gridCol w:w="1259"/>
+        <w:gridCol w:w="4564"/>
+        <w:gridCol w:w="4493"/>
       </w:tblGrid>
       <w:tr>
         <w:trPr>
@@ -5652,7 +5530,7 @@
         </w:trPr>
         <w:tc>
           <w:tcPr>
-            <w:tcW w:w="1299" w:type="dxa"/>
+            <w:tcW w:w="1259" w:type="dxa"/>
             <w:shd w:val="clear" w:color="auto" w:fill="F1F3F5"/>
           </w:tcPr>
           <w:p>
@@ -5672,7 +5550,7 @@
         </w:tc>
         <w:tc>
           <w:tcPr>
-            <w:tcW w:w="4093" w:type="dxa"/>
+            <w:tcW w:w="4564" w:type="dxa"/>
             <w:shd w:val="clear" w:color="auto" w:fill="F1F3F5"/>
           </w:tcPr>
           <w:p>
@@ -5692,7 +5570,7 @@
         </w:tc>
         <w:tc>
           <w:tcPr>
-            <w:tcW w:w="4924" w:type="dxa"/>
+            <w:tcW w:w="4493" w:type="dxa"/>
             <w:shd w:val="clear" w:color="auto" w:fill="F1F3F5"/>
           </w:tcPr>
           <w:p>
@@ -5717,7 +5595,7 @@
         </w:trPr>
         <w:tc>
           <w:tcPr>
-            <w:tcW w:w="1299" w:type="dxa"/>
+            <w:tcW w:w="1259" w:type="dxa"/>
           </w:tcPr>
           <w:p>
             <w:pPr>
@@ -5734,7 +5612,7 @@
         </w:tc>
         <w:tc>
           <w:tcPr>
-            <w:tcW w:w="4093" w:type="dxa"/>
+            <w:tcW w:w="4564" w:type="dxa"/>
           </w:tcPr>
           <w:p>
             <w:pPr>
@@ -5759,18 +5637,18 @@
         </w:tc>
         <w:tc>
           <w:tcPr>
-            <w:tcW w:w="4924" w:type="dxa"/>
-          </w:tcPr>
-          <w:p>
-            <w:pPr>
-              <w:pStyle w:val="TWCell"/>
-            </w:pPr>
-            <w:r>
-              <w:rPr>
-                <w:sz w:val="17"/>
-                <w:szCs w:val="17"/>
-              </w:rPr>
-              <w:t xml:space="preserve">2,140 passed · 1 skipped / E2E 21 passed / 웹 367 passed(10-23)</w:t>
+            <w:tcW w:w="4493" w:type="dxa"/>
+          </w:tcPr>
+          <w:p>
+            <w:pPr>
+              <w:pStyle w:val="TWCell"/>
+            </w:pPr>
+            <w:r>
+              <w:rPr>
+                <w:sz w:val="17"/>
+                <w:szCs w:val="17"/>
+              </w:rPr>
+              <w:t xml:space="preserve">2,233개 통과 · 1개 건너뜀 / 전 과정 E2E 21개 통과 / 웹 403개 통과</w:t>
             </w:r>
           </w:p>
         </w:tc>
@@ -5781,52 +5659,52 @@
         </w:trPr>
         <w:tc>
           <w:tcPr>
-            <w:tcW w:w="1299" w:type="dxa"/>
-          </w:tcPr>
-          <w:p>
-            <w:pPr>
-              <w:pStyle w:val="TWCell"/>
-            </w:pPr>
-            <w:r>
-              <w:rPr>
-                <w:sz w:val="17"/>
-                <w:szCs w:val="17"/>
-              </w:rPr>
-              <w:t xml:space="preserve">정답 대조(Phase 0)</w:t>
-            </w:r>
-          </w:p>
-        </w:tc>
-        <w:tc>
-          <w:tcPr>
-            <w:tcW w:w="4093" w:type="dxa"/>
-          </w:tcPr>
-          <w:p>
-            <w:pPr>
-              <w:pStyle w:val="TWCell"/>
-            </w:pPr>
-            <w:r>
-              <w:rPr>
-                <w:sz w:val="17"/>
-                <w:szCs w:val="17"/>
-              </w:rPr>
-              <w:t xml:space="preserve">작은 사례를 사람 조합 완전 열거 + LP로 푼 정답과 비교(제품 MILP 코드를 읽지 않는 별도 구현), 예산·가용률을 늘리면 점수가 줄지 않는지 등</w:t>
-            </w:r>
-          </w:p>
-        </w:tc>
-        <w:tc>
-          <w:tcPr>
-            <w:tcW w:w="4924" w:type="dxa"/>
-          </w:tcPr>
-          <w:p>
-            <w:pPr>
-              <w:pStyle w:val="TWCell"/>
-            </w:pPr>
-            <w:r>
-              <w:rPr>
-                <w:sz w:val="17"/>
-                <w:szCs w:val="17"/>
-              </w:rPr>
-              <w:t xml:space="preserve">13/13 통과(정답 대조 9/9 차이 0 — 전일 투입·동시 수행 허용 사례 2개 포함, 단조성 2/2 …). 모델을 바꿀 때마다 다시 돌림</w:t>
+            <w:tcW w:w="1259" w:type="dxa"/>
+          </w:tcPr>
+          <w:p>
+            <w:pPr>
+              <w:pStyle w:val="TWCell"/>
+            </w:pPr>
+            <w:r>
+              <w:rPr>
+                <w:sz w:val="17"/>
+                <w:szCs w:val="17"/>
+              </w:rPr>
+              <w:t xml:space="preserve">정답 대조</w:t>
+            </w:r>
+          </w:p>
+        </w:tc>
+        <w:tc>
+          <w:tcPr>
+            <w:tcW w:w="4564" w:type="dxa"/>
+          </w:tcPr>
+          <w:p>
+            <w:pPr>
+              <w:pStyle w:val="TWCell"/>
+            </w:pPr>
+            <w:r>
+              <w:rPr>
+                <w:sz w:val="17"/>
+                <w:szCs w:val="17"/>
+              </w:rPr>
+              <w:t xml:space="preserve">작은 사례는 가능한 사람 조합을 모두 따져 정답을 구하고(제품 계산 코드를 쓰지 않는 별도 구현) 결과와 비교, 예산·가용률을 늘리면 점수가 줄지 않는지 등</w:t>
+            </w:r>
+          </w:p>
+        </w:tc>
+        <w:tc>
+          <w:tcPr>
+            <w:tcW w:w="4493" w:type="dxa"/>
+          </w:tcPr>
+          <w:p>
+            <w:pPr>
+              <w:pStyle w:val="TWCell"/>
+            </w:pPr>
+            <w:r>
+              <w:rPr>
+                <w:sz w:val="17"/>
+                <w:szCs w:val="17"/>
+              </w:rPr>
+              <w:t xml:space="preserve">13/13 통과(정답 대조 9/9 차이 0 — 전일 투입·동시 수행 허용 사례 포함). 모델을 바꿀 때마다 다시 돌림</w:t>
             </w:r>
           </w:p>
         </w:tc>
@@ -5837,52 +5715,52 @@
         </w:trPr>
         <w:tc>
           <w:tcPr>
-            <w:tcW w:w="1299" w:type="dxa"/>
-          </w:tcPr>
-          <w:p>
-            <w:pPr>
-              <w:pStyle w:val="TWCell"/>
-            </w:pPr>
-            <w:r>
-              <w:rPr>
-                <w:sz w:val="17"/>
-                <w:szCs w:val="17"/>
-              </w:rPr>
-              <w:t xml:space="preserve">솔버 비교(Phase 1)</w:t>
-            </w:r>
-          </w:p>
-        </w:tc>
-        <w:tc>
-          <w:tcPr>
-            <w:tcW w:w="4093" w:type="dxa"/>
-          </w:tcPr>
-          <w:p>
-            <w:pPr>
-              <w:pStyle w:val="TWCell"/>
-            </w:pPr>
-            <w:r>
-              <w:rPr>
-                <w:sz w:val="17"/>
-                <w:szCs w:val="17"/>
-              </w:rPr>
-              <w:t xml:space="preserve">CBC·HiGHS·SCIP에 같은 동결 입력, 1스레드·케이스당 240초, 357칸(본평가 288칸 포함)</w:t>
-            </w:r>
-          </w:p>
-        </w:tc>
-        <w:tc>
-          <w:tcPr>
-            <w:tcW w:w="4924" w:type="dxa"/>
-          </w:tcPr>
-          <w:p>
-            <w:pPr>
-              <w:pStyle w:val="TWCell"/>
-            </w:pPr>
-            <w:r>
-              <w:rPr>
-                <w:sz w:val="17"/>
-                <w:szCs w:val="17"/>
-              </w:rPr>
-              <w:t xml:space="preserve">정답 사례 21건은 세 솔버 모두 통과. 나머지 솔버당 112건 중 시간 안 완료 HiGHS 79 · SCIP 75 · CBC 22(CBC는 상한을 내지 않아 품질 확인 불가) → HiGHS 채택</w:t>
+            <w:tcW w:w="1259" w:type="dxa"/>
+          </w:tcPr>
+          <w:p>
+            <w:pPr>
+              <w:pStyle w:val="TWCell"/>
+            </w:pPr>
+            <w:r>
+              <w:rPr>
+                <w:sz w:val="17"/>
+                <w:szCs w:val="17"/>
+              </w:rPr>
+              <w:t xml:space="preserve">솔버 비교</w:t>
+            </w:r>
+          </w:p>
+        </w:tc>
+        <w:tc>
+          <w:tcPr>
+            <w:tcW w:w="4564" w:type="dxa"/>
+          </w:tcPr>
+          <w:p>
+            <w:pPr>
+              <w:pStyle w:val="TWCell"/>
+            </w:pPr>
+            <w:r>
+              <w:rPr>
+                <w:sz w:val="17"/>
+                <w:szCs w:val="17"/>
+              </w:rPr>
+              <w:t xml:space="preserve">오픈소스 솔버 CBC·HiGHS·SCIP에 같은 입력·같은 조건(1스레드, 문제당 240초)으로 357번 풀이</w:t>
+            </w:r>
+          </w:p>
+        </w:tc>
+        <w:tc>
+          <w:tcPr>
+            <w:tcW w:w="4493" w:type="dxa"/>
+          </w:tcPr>
+          <w:p>
+            <w:pPr>
+              <w:pStyle w:val="TWCell"/>
+            </w:pPr>
+            <w:r>
+              <w:rPr>
+                <w:sz w:val="17"/>
+                <w:szCs w:val="17"/>
+              </w:rPr>
+              <w:t xml:space="preserve">정답 사례 21건은 세 솔버 모두 통과. 나머지 솔버당 112건 중 시간 안 완료 HiGHS 79 · SCIP 75 · CBC 22(CBC는 이론상 최대치를 내지 않아 품질 확인 불가) → HiGHS 채택</w:t>
             </w:r>
           </w:p>
         </w:tc>
@@ -5893,7 +5771,7 @@
         </w:trPr>
         <w:tc>
           <w:tcPr>
-            <w:tcW w:w="1299" w:type="dxa"/>
+            <w:tcW w:w="1259" w:type="dxa"/>
           </w:tcPr>
           <w:p>
             <w:pPr>
@@ -5910,24 +5788,24 @@
         </w:tc>
         <w:tc>
           <w:tcPr>
-            <w:tcW w:w="4093" w:type="dxa"/>
-          </w:tcPr>
-          <w:p>
-            <w:pPr>
-              <w:pStyle w:val="TWCell"/>
-            </w:pPr>
-            <w:r>
-              <w:rPr>
-                <w:sz w:val="17"/>
-                <w:szCs w:val="17"/>
-              </w:rPr>
-              <w:t xml:space="preserve">솔버의 모든 반환 해를 원자료로 다시 계산(6.4)</w:t>
-            </w:r>
-          </w:p>
-        </w:tc>
-        <w:tc>
-          <w:tcPr>
-            <w:tcW w:w="4924" w:type="dxa"/>
+            <w:tcW w:w="4564" w:type="dxa"/>
+          </w:tcPr>
+          <w:p>
+            <w:pPr>
+              <w:pStyle w:val="TWCell"/>
+            </w:pPr>
+            <w:r>
+              <w:rPr>
+                <w:sz w:val="17"/>
+                <w:szCs w:val="17"/>
+              </w:rPr>
+              <w:t xml:space="preserve">솔버가 낸 모든 결과를 원자료로 다시 계산(6.4)</w:t>
+            </w:r>
+          </w:p>
+        </w:tc>
+        <w:tc>
+          <w:tcPr>
+            <w:tcW w:w="4493" w:type="dxa"/>
           </w:tcPr>
           <w:p>
             <w:pPr>
@@ -5949,7 +5827,7 @@
         </w:trPr>
         <w:tc>
           <w:tcPr>
-            <w:tcW w:w="1299" w:type="dxa"/>
+            <w:tcW w:w="1259" w:type="dxa"/>
           </w:tcPr>
           <w:p>
             <w:pPr>
@@ -5966,7 +5844,7 @@
         </w:tc>
         <w:tc>
           <w:tcPr>
-            <w:tcW w:w="4093" w:type="dxa"/>
+            <w:tcW w:w="4564" w:type="dxa"/>
           </w:tcPr>
           <w:p>
             <w:pPr>
@@ -5983,7 +5861,7 @@
         </w:tc>
         <w:tc>
           <w:tcPr>
-            <w:tcW w:w="4924" w:type="dxa"/>
+            <w:tcW w:w="4493" w:type="dxa"/>
           </w:tcPr>
           <w:p>
             <w:pPr>
@@ -6005,7 +5883,7 @@
         </w:trPr>
         <w:tc>
           <w:tcPr>
-            <w:tcW w:w="1299" w:type="dxa"/>
+            <w:tcW w:w="1259" w:type="dxa"/>
           </w:tcPr>
           <w:p>
             <w:pPr>
@@ -6022,7 +5900,7 @@
         </w:tc>
         <w:tc>
           <w:tcPr>
-            <w:tcW w:w="4093" w:type="dxa"/>
+            <w:tcW w:w="4564" w:type="dxa"/>
           </w:tcPr>
           <w:p>
             <w:pPr>
@@ -6039,18 +5917,18 @@
         </w:tc>
         <w:tc>
           <w:tcPr>
-            <w:tcW w:w="4924" w:type="dxa"/>
-          </w:tcPr>
-          <w:p>
-            <w:pPr>
-              <w:pStyle w:val="TWCell"/>
-            </w:pPr>
-            <w:r>
-              <w:rPr>
-                <w:sz w:val="17"/>
-                <w:szCs w:val="17"/>
-              </w:rPr>
-              <w:t xml:space="preserve">전체 감사 27건 수정(10-12), 최종 점검 2건 수정, 전일 투입 재설계 리뷰 4라운드(Codex 2 · Codex 한도 소진 중 Claude Opus 대체 2), 10-21~23 변경은 Codex 한도 소진으로 Claude 자체 리뷰</w:t>
+            <w:tcW w:w="4493" w:type="dxa"/>
+          </w:tcPr>
+          <w:p>
+            <w:pPr>
+              <w:pStyle w:val="TWCell"/>
+            </w:pPr>
+            <w:r>
+              <w:rPr>
+                <w:sz w:val="17"/>
+                <w:szCs w:val="17"/>
+              </w:rPr>
+              <w:t xml:space="preserve">전체 감사에서 27건, 최종 점검에서 2건을 찾아 고침. Codex 사용 한도가 찼을 때는 Claude Opus가 같은 범위를 리뷰</w:t>
             </w:r>
           </w:p>
         </w:tc>
@@ -6085,7 +5963,7 @@
         <w:t xml:space="preserve">계산 결과를 얼마나 믿어도 되는지 함께 보여 준다.</w:t>
       </w:r>
       <w:r>
-        <w:t xml:space="preserve"> 모든 결과에 "규칙 위반 없음 확인", "최선 증명" 또는 "최적값이 이 해보다 최대 몇 % 높을 수 있음", "시간 한도 도달·사용자가 멈춤·기록에서 연 결과"를 붙이고, 교체 점수는 "참고값 · 재최적화 아님"으로 밝힌다. PDF의 이 문구도 서버 서명이 맞을 때만 찍힌다.</w:t>
+        <w:t xml:space="preserve"> 모든 결과에 "규칙 위반 없음 확인", "최선 증명"(더 나은 배치가 없음을 계산으로 확인) 또는 "최적값이 이 해보다 최대 몇 % 높을 수 있음", "시간 한도 도달·사용자가 멈춤·기록에서 연 결과"를 붙이고, 교체 점수는 "참고값 · 재최적화 아님"으로 밝힌다. PDF의 이 문구도 서버 서명이 맞을 때만 찍힌다.</w:t>
       </w:r>
     </w:p>
     <w:p>
@@ -6123,7 +6001,7 @@
         <w:t xml:space="preserve">규칙을 측정으로 정했다.</w:t>
       </w:r>
       <w:r>
-        <w:t xml:space="preserve"> 보상 쌍 수·익숙한 쌍 기준·감점 방식·솔버·소명 글 방식을 대안과 같은 데이터로 비교하고, 판정 기준을 측정 전에 커밋했다(7장).</w:t>
+        <w:t xml:space="preserve"> 보상 쌍 수·익숙한 쌍 기준·감점 방식·솔버·소명 글 방식을 대안과 같은 데이터로 비교하고, 판정 기준을 측정 전에 먼저 정해 고정했다(7장).</w:t>
       </w:r>
     </w:p>
     <w:p>
@@ -6170,7 +6048,7 @@
         <w:t xml:space="preserve">NOT_CALIBRATED</w:t>
       </w:r>
       <w:r>
-        <w:t xml:space="preserve">로 표시하고, 가상 성과로 효과를 "입증"하는 것은 순환 검증이라 하지 않았다. 대안 C가 A보다 조금 높은 것처럼 직관에 어긋나는 결과도 그대로 둔다.</w:t>
+        <w:t xml:space="preserve">로 표시하고, 가상 성과로 효과를 "입증"하는 것은 순환 검증이라 하지 않았다. 100명 최선안이 시간 한도에서 멈춰 2.5% 여지가 남은 것, LLM이 20명에서는 솔버의 89~94%까지 낸 것처럼 불리하거나 애매한 결과도 그대로 적는다.</w:t>
       </w:r>
     </w:p>
     <w:p>
@@ -6208,7 +6086,7 @@
         <w:t xml:space="preserve">AI로 개발 과정 자체를 운영했다.</w:t>
       </w:r>
       <w:r>
-        <w:t xml:space="preserve"> Claude 두 계정과 Codex가 파일 소유 영역을 나눠 병행 개발하고(작업 분담표·인수인계 기록), 변경은 커밋 전에 독립 리뷰를 받았다. 리뷰 지적은 실패하는 시험으로 먼저 고정하고, 측정은 판정 기준을 먼저 커밋했다 — 12주 동안 커밋 약 610개, 시험 2,140개.</w:t>
+        <w:t xml:space="preserve"> Claude 두 계정과 Codex가 파일 소유 영역을 나눠 병행 개발하고(작업 분담표·인수인계 기록), 변경은 반영 전에 독립 리뷰를 받았다. 리뷰 지적은 실패하는 시험으로 먼저 고정하고, 측정은 판정 기준을 먼저 고정했다 — 약 12주 동안 코드 변경 기록(커밋) 약 660건, 자동 시험 2,233개.</w:t>
       </w:r>
     </w:p>
     <w:p>
@@ -8270,7 +8148,7 @@
         <w:t xml:space="preserve">전일 투입</w:t>
       </w:r>
       <w:r>
-        <w:t xml:space="preserve">이라 투입률 변수가 없다, 예전 투입률 방식은 설정에 남김), </w:t>
+        <w:t xml:space="preserve">이라 투입률 변수가 없다), </w:t>
       </w:r>
       <w:r>
         <w:rPr>
@@ -8346,7 +8224,7 @@
         <w:t xml:space="preserve">F</w:t>
       </w:r>
       <w:r>
-        <w:t xml:space="preserve"> = 익숙한 쌍(최근 36개월 중 12개월 이상 같은 사업)을 감점해 오래 붙어 다닌 사이만 몰리는 팀을 흩는다 — 지금 같은 진행 사업에 함께 있는 두 사람은 그 사업에서 감점하지 않는다(사용자 결정 10-19).</w:t>
+        <w:t xml:space="preserve"> = 익숙한 쌍(최근 36개월 중 12개월 이상 같은 사업)을 감점해 오래 붙어 다닌 사이만 몰리는 팀을 흩는다 — 지금 같은 진행 사업에 함께 있는 두 사람은 그 사업에서 감점하지 않는다.</w:t>
       </w:r>
     </w:p>
     <w:p>
@@ -8411,10 +8289,10 @@
           <w:b/>
           <w:bCs/>
         </w:rPr>
-        <w:t xml:space="preserve">허용 차이 0</w:t>
-      </w:r>
-      <w:r>
-        <w:t xml:space="preserve">으로 풀어 최선을 증명한다.</w:t>
+        <w:t xml:space="preserve">허용 오차 0</w:t>
+      </w:r>
+      <w:r>
+        <w:t xml:space="preserve">으로 풀어 최적임을 확인한다.</w:t>
       </w:r>
     </w:p>
     <w:p>
@@ -8480,7 +8358,7 @@
         <w:t xml:space="preserve">시드 포트폴리오</w:t>
       </w:r>
       <w:r>
-        <w:t xml:space="preserve">: 같은 모델을 시드만 바꾼 HiGHS 프로세스 4개로 동시에 풀어 가장 좋은 해를 고른다(1시드면 조밀한 데이터에서 대안이 품질 하한에 걸려 안 A만 나오기도 했다). 모델은 시작 뒤 전용 파이프로 넘긴다 — 시작 인자로 넘기면 자식이 시작 중 죽을 때 부모가 멈췄다(실측).</w:t>
+        <w:t xml:space="preserve">: 같은 모델을 시작점(시드)만 바꾼 HiGHS 4개로 동시에 풀어 가장 좋은 해를 고른다 — 한 갈래만 풀면 조건이 빽빽한 데이터에서 서로 다른 대안이 잘 나오지 않는다.</w:t>
       </w:r>
     </w:p>
     <w:p>
@@ -8496,10 +8374,10 @@
           <w:b/>
           <w:bCs/>
         </w:rPr>
-        <w:t xml:space="preserve">증명 상한</w:t>
-      </w:r>
-      <w:r>
-        <w:t xml:space="preserve">을 함께 기록해 "최적값이 최대 몇 % 높을 수 있음"으로 보여 준다. 전일 투입 권장 한도 100명 30초·200명 60초·300명 90초, 12개월은 ×4(측정 기반, 관리자 설정).</w:t>
+        <w:t xml:space="preserve">이론상 최대치</w:t>
+      </w:r>
+      <w:r>
+        <w:t xml:space="preserve">(솔버가 증명한 상한)를 함께 기록해 "최적값이 최대 몇 % 높을 수 있음"으로 보여 준다. 전일 투입 권장 한도 100명 30초·200명 60초·300명 90초, 12개월은 ×4(측정 기반, 관리자 설정).</w:t>
       </w:r>
     </w:p>
     <w:p>
@@ -8557,7 +8435,7 @@
         </w:numPr>
       </w:pPr>
       <w:r>
-        <w:t xml:space="preserve">솔버가 낸 원시 해를 제품 MILP 코드와 별개로 다시 계산한다: 결측·NaN·범위·0/1, 월별 가용률·월 예산·등급 정원·동시 사업, 쌍 범위, 목적 4항, 그리고 화면에 내보낼 명단. 검증할 수 없는 값을 0으로 채우지 않는다.</w:t>
+        <w:t xml:space="preserve">솔버가 낸 결과를 제품 MILP 코드와 별개로 다시 계산한다: 결측·NaN·범위·0/1, 월별 가용률·월 예산·등급 정원·동시 사업, 쌍 범위, 목적 4항, 그리고 화면에 내보낼 명단. 검증할 수 없는 값을 0으로 채우지 않는다.</w:t>
       </w:r>
     </w:p>
     <w:p>
@@ -9025,7 +8903,7 @@
         <w:rPr>
           <w:color w:val="5B6168"/>
         </w:rPr>
-        <w:t xml:space="preserve">소명 글은 처음에 자유 문장 + 금지어 목록으로 시작했으나 검토 때마다 뚫려, "AI는 사실 번호와 정해진 연결 말만 고르고 문장의 사실 부분은 서버가 채운다"로 바꿨다(E7b 94.7% → E7c 99.0%).</w:t>
+        <w:t xml:space="preserve">소명 글은 "AI가 자유롭게 쓰고 금지어로 거르는" 방식과 비교해 골랐다 — 금지어 방식은 검토 때마다 빠져나가는 문장이 나와, AI는 사실 번호와 정해진 연결 말만 고르고 문장의 사실 부분은 서버가 채우게 했다(검사 통과 94.7% → 99.0%).</w:t>
       </w:r>
     </w:p>
     <w:p>
@@ -9140,10 +9018,10 @@
         </w:tblCellMar>
       </w:tblPr>
       <w:tblGrid>
-        <w:gridCol w:w="1422"/>
-        <w:gridCol w:w="2378"/>
-        <w:gridCol w:w="4296"/>
-        <w:gridCol w:w="2220"/>
+        <w:gridCol w:w="1405"/>
+        <w:gridCol w:w="2337"/>
+        <w:gridCol w:w="4396"/>
+        <w:gridCol w:w="2178"/>
       </w:tblGrid>
       <w:tr>
         <w:trPr>
@@ -9152,7 +9030,7 @@
         </w:trPr>
         <w:tc>
           <w:tcPr>
-            <w:tcW w:w="1422" w:type="dxa"/>
+            <w:tcW w:w="1405" w:type="dxa"/>
             <w:shd w:val="clear" w:color="auto" w:fill="F1F3F5"/>
           </w:tcPr>
           <w:p>
@@ -9172,7 +9050,7 @@
         </w:tc>
         <w:tc>
           <w:tcPr>
-            <w:tcW w:w="2378" w:type="dxa"/>
+            <w:tcW w:w="2337" w:type="dxa"/>
             <w:shd w:val="clear" w:color="auto" w:fill="F1F3F5"/>
           </w:tcPr>
           <w:p>
@@ -9192,7 +9070,7 @@
         </w:tc>
         <w:tc>
           <w:tcPr>
-            <w:tcW w:w="4296" w:type="dxa"/>
+            <w:tcW w:w="4396" w:type="dxa"/>
             <w:shd w:val="clear" w:color="auto" w:fill="F1F3F5"/>
           </w:tcPr>
           <w:p>
@@ -9212,7 +9090,7 @@
         </w:tc>
         <w:tc>
           <w:tcPr>
-            <w:tcW w:w="2220" w:type="dxa"/>
+            <w:tcW w:w="2178" w:type="dxa"/>
             <w:shd w:val="clear" w:color="auto" w:fill="F1F3F5"/>
           </w:tcPr>
           <w:p>
@@ -9237,7 +9115,7 @@
         </w:trPr>
         <w:tc>
           <w:tcPr>
-            <w:tcW w:w="1422" w:type="dxa"/>
+            <w:tcW w:w="1405" w:type="dxa"/>
           </w:tcPr>
           <w:p>
             <w:pPr>
@@ -9254,7 +9132,7 @@
         </w:tc>
         <w:tc>
           <w:tcPr>
-            <w:tcW w:w="2378" w:type="dxa"/>
+            <w:tcW w:w="2337" w:type="dxa"/>
           </w:tcPr>
           <w:p>
             <w:pPr>
@@ -9271,24 +9149,24 @@
         </w:tc>
         <w:tc>
           <w:tcPr>
-            <w:tcW w:w="4296" w:type="dxa"/>
-          </w:tcPr>
-          <w:p>
-            <w:pPr>
-              <w:pStyle w:val="TWCell"/>
-            </w:pPr>
-            <w:r>
-              <w:rPr>
-                <w:sz w:val="17"/>
-                <w:szCs w:val="17"/>
-              </w:rPr>
-              <w:t xml:space="preserve">솔버당 112건 중 시간 안 완료 22 · 75 · 79(CBC는 품질 확인 불가). 규모 리허설에서 CBC는 세 규모 모두 최선 1% 안에 못 듦</w:t>
-            </w:r>
-          </w:p>
-        </w:tc>
-        <w:tc>
-          <w:tcPr>
-            <w:tcW w:w="2220" w:type="dxa"/>
+            <w:tcW w:w="4396" w:type="dxa"/>
+          </w:tcPr>
+          <w:p>
+            <w:pPr>
+              <w:pStyle w:val="TWCell"/>
+            </w:pPr>
+            <w:r>
+              <w:rPr>
+                <w:sz w:val="17"/>
+                <w:szCs w:val="17"/>
+              </w:rPr>
+              <w:t xml:space="preserve">솔버당 112건 중 시간 안 완료 22 · 75 · 79(CBC는 품질 확인 불가). 100·200·300명 실제 규모에서 CBC는 세 규모 모두 이론상 최대치 1% 안에 못 듦</w:t>
+            </w:r>
+          </w:p>
+        </w:tc>
+        <w:tc>
+          <w:tcPr>
+            <w:tcW w:w="2178" w:type="dxa"/>
           </w:tcPr>
           <w:p>
             <w:pPr>
@@ -9310,7 +9188,7 @@
         </w:trPr>
         <w:tc>
           <w:tcPr>
-            <w:tcW w:w="1422" w:type="dxa"/>
+            <w:tcW w:w="1405" w:type="dxa"/>
           </w:tcPr>
           <w:p>
             <w:pPr>
@@ -9327,7 +9205,7 @@
         </w:tc>
         <w:tc>
           <w:tcPr>
-            <w:tcW w:w="2378" w:type="dxa"/>
+            <w:tcW w:w="2337" w:type="dxa"/>
           </w:tcPr>
           <w:p>
             <w:pPr>
@@ -9344,7 +9222,7 @@
         </w:tc>
         <w:tc>
           <w:tcPr>
-            <w:tcW w:w="4296" w:type="dxa"/>
+            <w:tcW w:w="4396" w:type="dxa"/>
           </w:tcPr>
           <w:p>
             <w:pPr>
@@ -9361,7 +9239,7 @@
         </w:tc>
         <w:tc>
           <w:tcPr>
-            <w:tcW w:w="2220" w:type="dxa"/>
+            <w:tcW w:w="2178" w:type="dxa"/>
           </w:tcPr>
           <w:p>
             <w:pPr>
@@ -9383,7 +9261,7 @@
         </w:trPr>
         <w:tc>
           <w:tcPr>
-            <w:tcW w:w="1422" w:type="dxa"/>
+            <w:tcW w:w="1405" w:type="dxa"/>
           </w:tcPr>
           <w:p>
             <w:pPr>
@@ -9400,7 +9278,7 @@
         </w:tc>
         <w:tc>
           <w:tcPr>
-            <w:tcW w:w="2378" w:type="dxa"/>
+            <w:tcW w:w="2337" w:type="dxa"/>
           </w:tcPr>
           <w:p>
             <w:pPr>
@@ -9417,7 +9295,7 @@
         </w:tc>
         <w:tc>
           <w:tcPr>
-            <w:tcW w:w="4296" w:type="dxa"/>
+            <w:tcW w:w="4396" w:type="dxa"/>
           </w:tcPr>
           <w:p>
             <w:pPr>
@@ -9434,7 +9312,7 @@
         </w:tc>
         <w:tc>
           <w:tcPr>
-            <w:tcW w:w="2220" w:type="dxa"/>
+            <w:tcW w:w="2178" w:type="dxa"/>
           </w:tcPr>
           <w:p>
             <w:pPr>
@@ -9456,7 +9334,7 @@
         </w:trPr>
         <w:tc>
           <w:tcPr>
-            <w:tcW w:w="1422" w:type="dxa"/>
+            <w:tcW w:w="1405" w:type="dxa"/>
           </w:tcPr>
           <w:p>
             <w:pPr>
@@ -9473,7 +9351,7 @@
         </w:tc>
         <w:tc>
           <w:tcPr>
-            <w:tcW w:w="2378" w:type="dxa"/>
+            <w:tcW w:w="2337" w:type="dxa"/>
           </w:tcPr>
           <w:p>
             <w:pPr>
@@ -9490,7 +9368,7 @@
         </w:tc>
         <w:tc>
           <w:tcPr>
-            <w:tcW w:w="4296" w:type="dxa"/>
+            <w:tcW w:w="4396" w:type="dxa"/>
           </w:tcPr>
           <w:p>
             <w:pPr>
@@ -9507,7 +9385,7 @@
         </w:tc>
         <w:tc>
           <w:tcPr>
-            <w:tcW w:w="2220" w:type="dxa"/>
+            <w:tcW w:w="2178" w:type="dxa"/>
           </w:tcPr>
           <w:p>
             <w:pPr>
@@ -9529,7 +9407,7 @@
         </w:trPr>
         <w:tc>
           <w:tcPr>
-            <w:tcW w:w="1422" w:type="dxa"/>
+            <w:tcW w:w="1405" w:type="dxa"/>
           </w:tcPr>
           <w:p>
             <w:pPr>
@@ -9546,7 +9424,7 @@
         </w:tc>
         <w:tc>
           <w:tcPr>
-            <w:tcW w:w="2378" w:type="dxa"/>
+            <w:tcW w:w="2337" w:type="dxa"/>
           </w:tcPr>
           <w:p>
             <w:pPr>
@@ -9563,24 +9441,24 @@
         </w:tc>
         <w:tc>
           <w:tcPr>
-            <w:tcW w:w="4296" w:type="dxa"/>
-          </w:tcPr>
-          <w:p>
-            <w:pPr>
-              <w:pStyle w:val="TWCell"/>
-            </w:pPr>
-            <w:r>
-              <w:rPr>
-                <w:sz w:val="17"/>
-                <w:szCs w:val="17"/>
-              </w:rPr>
-              <w:t xml:space="preserve">나누기는 잘 풀수록 쪼개기가 늘고, 상한·감점은 쪼개기를 못 막았다. 전일 투입은 1분 안 최선 증명(3.1)</w:t>
-            </w:r>
-          </w:p>
-        </w:tc>
-        <w:tc>
-          <w:tcPr>
-            <w:tcW w:w="2220" w:type="dxa"/>
+            <w:tcW w:w="4396" w:type="dxa"/>
+          </w:tcPr>
+          <w:p>
+            <w:pPr>
+              <w:pStyle w:val="TWCell"/>
+            </w:pPr>
+            <w:r>
+              <w:rPr>
+                <w:sz w:val="17"/>
+                <w:szCs w:val="17"/>
+              </w:rPr>
+              <w:t xml:space="preserve">나누기는 잘 풀수록 쪼개기가 늘고, 상한·감점은 쪼개기를 못 막았다. 전일 투입은 쪼개기가 없고 300명도 92초에 이론상 최대치 0.9% 안(3.1)</w:t>
+            </w:r>
+          </w:p>
+        </w:tc>
+        <w:tc>
+          <w:tcPr>
+            <w:tcW w:w="2178" w:type="dxa"/>
           </w:tcPr>
           <w:p>
             <w:pPr>
@@ -9602,7 +9480,7 @@
         </w:trPr>
         <w:tc>
           <w:tcPr>
-            <w:tcW w:w="1422" w:type="dxa"/>
+            <w:tcW w:w="1405" w:type="dxa"/>
           </w:tcPr>
           <w:p>
             <w:pPr>
@@ -9619,7 +9497,7 @@
         </w:tc>
         <w:tc>
           <w:tcPr>
-            <w:tcW w:w="2378" w:type="dxa"/>
+            <w:tcW w:w="2337" w:type="dxa"/>
           </w:tcPr>
           <w:p>
             <w:pPr>
@@ -9636,7 +9514,7 @@
         </w:tc>
         <w:tc>
           <w:tcPr>
-            <w:tcW w:w="4296" w:type="dxa"/>
+            <w:tcW w:w="4396" w:type="dxa"/>
           </w:tcPr>
           <w:p>
             <w:pPr>
@@ -9653,7 +9531,7 @@
         </w:tc>
         <w:tc>
           <w:tcPr>
-            <w:tcW w:w="2220" w:type="dxa"/>
+            <w:tcW w:w="2178" w:type="dxa"/>
           </w:tcPr>
           <w:p>
             <w:pPr>
@@ -9675,7 +9553,7 @@
         </w:trPr>
         <w:tc>
           <w:tcPr>
-            <w:tcW w:w="1422" w:type="dxa"/>
+            <w:tcW w:w="1405" w:type="dxa"/>
           </w:tcPr>
           <w:p>
             <w:pPr>
@@ -9692,7 +9570,7 @@
         </w:tc>
         <w:tc>
           <w:tcPr>
-            <w:tcW w:w="2378" w:type="dxa"/>
+            <w:tcW w:w="2337" w:type="dxa"/>
           </w:tcPr>
           <w:p>
             <w:pPr>
@@ -9709,7 +9587,7 @@
         </w:tc>
         <w:tc>
           <w:tcPr>
-            <w:tcW w:w="4296" w:type="dxa"/>
+            <w:tcW w:w="4396" w:type="dxa"/>
           </w:tcPr>
           <w:p>
             <w:pPr>
@@ -9726,7 +9604,7 @@
         </w:tc>
         <w:tc>
           <w:tcPr>
-            <w:tcW w:w="2220" w:type="dxa"/>
+            <w:tcW w:w="2178" w:type="dxa"/>
           </w:tcPr>
           <w:p>
             <w:pPr>
@@ -9748,7 +9626,7 @@
         </w:trPr>
         <w:tc>
           <w:tcPr>
-            <w:tcW w:w="1422" w:type="dxa"/>
+            <w:tcW w:w="1405" w:type="dxa"/>
           </w:tcPr>
           <w:p>
             <w:pPr>
@@ -9765,7 +9643,7 @@
         </w:tc>
         <w:tc>
           <w:tcPr>
-            <w:tcW w:w="2378" w:type="dxa"/>
+            <w:tcW w:w="2337" w:type="dxa"/>
           </w:tcPr>
           <w:p>
             <w:pPr>
@@ -9782,7 +9660,7 @@
         </w:tc>
         <w:tc>
           <w:tcPr>
-            <w:tcW w:w="4296" w:type="dxa"/>
+            <w:tcW w:w="4396" w:type="dxa"/>
           </w:tcPr>
           <w:p>
             <w:pPr>
@@ -9799,7 +9677,7 @@
         </w:tc>
         <w:tc>
           <w:tcPr>
-            <w:tcW w:w="2220" w:type="dxa"/>
+            <w:tcW w:w="2178" w:type="dxa"/>
           </w:tcPr>
           <w:p>
             <w:pPr>
@@ -9821,7 +9699,7 @@
         </w:trPr>
         <w:tc>
           <w:tcPr>
-            <w:tcW w:w="1422" w:type="dxa"/>
+            <w:tcW w:w="1405" w:type="dxa"/>
           </w:tcPr>
           <w:p>
             <w:pPr>
@@ -9838,7 +9716,7 @@
         </w:tc>
         <w:tc>
           <w:tcPr>
-            <w:tcW w:w="2378" w:type="dxa"/>
+            <w:tcW w:w="2337" w:type="dxa"/>
           </w:tcPr>
           <w:p>
             <w:pPr>
@@ -9855,7 +9733,7 @@
         </w:tc>
         <w:tc>
           <w:tcPr>
-            <w:tcW w:w="4296" w:type="dxa"/>
+            <w:tcW w:w="4396" w:type="dxa"/>
           </w:tcPr>
           <w:p>
             <w:pPr>
@@ -9872,7 +9750,7 @@
         </w:tc>
         <w:tc>
           <w:tcPr>
-            <w:tcW w:w="2220" w:type="dxa"/>
+            <w:tcW w:w="2178" w:type="dxa"/>
           </w:tcPr>
           <w:p>
             <w:pPr>
@@ -9894,7 +9772,7 @@
         </w:trPr>
         <w:tc>
           <w:tcPr>
-            <w:tcW w:w="1422" w:type="dxa"/>
+            <w:tcW w:w="1405" w:type="dxa"/>
           </w:tcPr>
           <w:p>
             <w:pPr>
@@ -9911,7 +9789,7 @@
         </w:tc>
         <w:tc>
           <w:tcPr>
-            <w:tcW w:w="2378" w:type="dxa"/>
+            <w:tcW w:w="2337" w:type="dxa"/>
           </w:tcPr>
           <w:p>
             <w:pPr>
@@ -9928,7 +9806,7 @@
         </w:tc>
         <w:tc>
           <w:tcPr>
-            <w:tcW w:w="4296" w:type="dxa"/>
+            <w:tcW w:w="4396" w:type="dxa"/>
           </w:tcPr>
           <w:p>
             <w:pPr>
@@ -9945,7 +9823,7 @@
         </w:tc>
         <w:tc>
           <w:tcPr>
-            <w:tcW w:w="2220" w:type="dxa"/>
+            <w:tcW w:w="2178" w:type="dxa"/>
           </w:tcPr>
           <w:p>
             <w:pPr>
@@ -9967,7 +9845,7 @@
         </w:trPr>
         <w:tc>
           <w:tcPr>
-            <w:tcW w:w="1422" w:type="dxa"/>
+            <w:tcW w:w="1405" w:type="dxa"/>
           </w:tcPr>
           <w:p>
             <w:pPr>
@@ -9984,7 +9862,7 @@
         </w:tc>
         <w:tc>
           <w:tcPr>
-            <w:tcW w:w="2378" w:type="dxa"/>
+            <w:tcW w:w="2337" w:type="dxa"/>
           </w:tcPr>
           <w:p>
             <w:pPr>
@@ -10001,7 +9879,7 @@
         </w:tc>
         <w:tc>
           <w:tcPr>
-            <w:tcW w:w="4296" w:type="dxa"/>
+            <w:tcW w:w="4396" w:type="dxa"/>
           </w:tcPr>
           <w:p>
             <w:pPr>
@@ -10018,7 +9896,7 @@
         </w:tc>
         <w:tc>
           <w:tcPr>
-            <w:tcW w:w="2220" w:type="dxa"/>
+            <w:tcW w:w="2178" w:type="dxa"/>
           </w:tcPr>
           <w:p>
             <w:pPr>
@@ -10048,46 +9926,7 @@
         <w:rPr>
           <w:color w:val="5B6168"/>
         </w:rPr>
-        <w:t xml:space="preserve">각 결정은 사용자 확인을 거쳤다. 측정 문서는 </w:t>
-      </w:r>
-      <w:r>
-        <w:rPr>
-          <w:rFonts w:ascii="Consolas" w:hAnsi="Consolas" w:eastAsia="Malgun Gothic" w:cs="Consolas"/>
-          <w:color w:val="5B6168"/>
-        </w:rPr>
-        <w:t xml:space="preserve">rehearsal/results/</w:t>
-      </w:r>
-      <w:r>
-        <w:rPr>
-          <w:color w:val="5B6168"/>
-        </w:rPr>
-        <w:t xml:space="preserve">·</w:t>
-      </w:r>
-      <w:r>
-        <w:rPr>
-          <w:rFonts w:ascii="Consolas" w:hAnsi="Consolas" w:eastAsia="Malgun Gothic" w:cs="Consolas"/>
-          <w:color w:val="5B6168"/>
-        </w:rPr>
-        <w:t xml:space="preserve">docs/demo-notes.md</w:t>
-      </w:r>
-      <w:r>
-        <w:rPr>
-          <w:color w:val="5B6168"/>
-        </w:rPr>
-        <w:t xml:space="preserve">·</w:t>
-      </w:r>
-      <w:r>
-        <w:rPr>
-          <w:rFonts w:ascii="Consolas" w:hAnsi="Consolas" w:eastAsia="Malgun Gothic" w:cs="Consolas"/>
-          <w:color w:val="5B6168"/>
-        </w:rPr>
-        <w:t xml:space="preserve">docs/skill-score-decision.md</w:t>
-      </w:r>
-      <w:r>
-        <w:rPr>
-          <w:color w:val="5B6168"/>
-        </w:rPr>
-        <w:t xml:space="preserve">. 하위 기술 인정 70%는 근거 데이터가 없는 가정값이다.</w:t>
+        <w:t xml:space="preserve">각 결정은 사용자 확인을 거쳤다. 하위 기술 인정 70%는 근거 데이터가 없는 가정값이다.</w:t>
       </w:r>
     </w:p>
     <w:p>
@@ -10127,10 +9966,10 @@
         </w:tblCellMar>
       </w:tblPr>
       <w:tblGrid>
-        <w:gridCol w:w="1749"/>
-        <w:gridCol w:w="1725"/>
-        <w:gridCol w:w="1874"/>
-        <w:gridCol w:w="4969"/>
+        <w:gridCol w:w="1718"/>
+        <w:gridCol w:w="1696"/>
+        <w:gridCol w:w="1829"/>
+        <w:gridCol w:w="5073"/>
       </w:tblGrid>
       <w:tr>
         <w:trPr>
@@ -10139,7 +9978,7 @@
         </w:trPr>
         <w:tc>
           <w:tcPr>
-            <w:tcW w:w="1749" w:type="dxa"/>
+            <w:tcW w:w="1718" w:type="dxa"/>
             <w:shd w:val="clear" w:color="auto" w:fill="F1F3F5"/>
           </w:tcPr>
           <w:p>
@@ -10159,7 +9998,7 @@
         </w:tc>
         <w:tc>
           <w:tcPr>
-            <w:tcW w:w="1725" w:type="dxa"/>
+            <w:tcW w:w="1696" w:type="dxa"/>
             <w:shd w:val="clear" w:color="auto" w:fill="F1F3F5"/>
           </w:tcPr>
           <w:p>
@@ -10179,7 +10018,7 @@
         </w:tc>
         <w:tc>
           <w:tcPr>
-            <w:tcW w:w="1874" w:type="dxa"/>
+            <w:tcW w:w="1829" w:type="dxa"/>
             <w:shd w:val="clear" w:color="auto" w:fill="F1F3F5"/>
           </w:tcPr>
           <w:p>
@@ -10199,7 +10038,7 @@
         </w:tc>
         <w:tc>
           <w:tcPr>
-            <w:tcW w:w="4969" w:type="dxa"/>
+            <w:tcW w:w="5073" w:type="dxa"/>
             <w:shd w:val="clear" w:color="auto" w:fill="F1F3F5"/>
           </w:tcPr>
           <w:p>
@@ -10224,7 +10063,7 @@
         </w:trPr>
         <w:tc>
           <w:tcPr>
-            <w:tcW w:w="1749" w:type="dxa"/>
+            <w:tcW w:w="1718" w:type="dxa"/>
           </w:tcPr>
           <w:p>
             <w:pPr>
@@ -10241,7 +10080,7 @@
         </w:tc>
         <w:tc>
           <w:tcPr>
-            <w:tcW w:w="1725" w:type="dxa"/>
+            <w:tcW w:w="1696" w:type="dxa"/>
           </w:tcPr>
           <w:p>
             <w:pPr>
@@ -10258,7 +10097,7 @@
         </w:tc>
         <w:tc>
           <w:tcPr>
-            <w:tcW w:w="1874" w:type="dxa"/>
+            <w:tcW w:w="1829" w:type="dxa"/>
           </w:tcPr>
           <w:p>
             <w:pPr>
@@ -10275,18 +10114,18 @@
         </w:tc>
         <w:tc>
           <w:tcPr>
-            <w:tcW w:w="4969" w:type="dxa"/>
-          </w:tcPr>
-          <w:p>
-            <w:pPr>
-              <w:pStyle w:val="TWCell"/>
-            </w:pPr>
-            <w:r>
-              <w:rPr>
-                <w:sz w:val="17"/>
-                <w:szCs w:val="17"/>
-              </w:rPr>
-              <w:t xml:space="preserve">조건을 모두 지키는 안 4개를 10분 안에 비교(300명 4.2분 · 연간 100명 5.4분), 최선과의 거리까지 표시</w:t>
+            <w:tcW w:w="5073" w:type="dxa"/>
+          </w:tcPr>
+          <w:p>
+            <w:pPr>
+              <w:pStyle w:val="TWCell"/>
+            </w:pPr>
+            <w:r>
+              <w:rPr>
+                <w:sz w:val="17"/>
+                <w:szCs w:val="17"/>
+              </w:rPr>
+              <w:t xml:space="preserve">조건을 모두 지키는 안 4개를 10분 안에 비교(300명 4.2분 · 연간 100명 5.4분), 이론상 최대치와의 거리까지 표시</w:t>
             </w:r>
           </w:p>
         </w:tc>
@@ -10297,7 +10136,7 @@
         </w:trPr>
         <w:tc>
           <w:tcPr>
-            <w:tcW w:w="1749" w:type="dxa"/>
+            <w:tcW w:w="1718" w:type="dxa"/>
           </w:tcPr>
           <w:p>
             <w:pPr>
@@ -10314,7 +10153,7 @@
         </w:tc>
         <w:tc>
           <w:tcPr>
-            <w:tcW w:w="1725" w:type="dxa"/>
+            <w:tcW w:w="1696" w:type="dxa"/>
           </w:tcPr>
           <w:p>
             <w:pPr>
@@ -10331,7 +10170,7 @@
         </w:tc>
         <w:tc>
           <w:tcPr>
-            <w:tcW w:w="1874" w:type="dxa"/>
+            <w:tcW w:w="1829" w:type="dxa"/>
           </w:tcPr>
           <w:p>
             <w:pPr>
@@ -10348,18 +10187,18 @@
         </w:tc>
         <w:tc>
           <w:tcPr>
-            <w:tcW w:w="4969" w:type="dxa"/>
-          </w:tcPr>
-          <w:p>
-            <w:pPr>
-              <w:pStyle w:val="TWCell"/>
-            </w:pPr>
-            <w:r>
-              <w:rPr>
-                <w:sz w:val="17"/>
-                <w:szCs w:val="17"/>
-              </w:rPr>
-              <w:t xml:space="preserve">"몇 명만 옮기면 되나"를 K=0~5 모두 최선 증명으로, 300명도 전체 약 66초(K 하나당 34초 안, 3.2)</w:t>
+            <w:tcW w:w="5073" w:type="dxa"/>
+          </w:tcPr>
+          <w:p>
+            <w:pPr>
+              <w:pStyle w:val="TWCell"/>
+            </w:pPr>
+            <w:r>
+              <w:rPr>
+                <w:sz w:val="17"/>
+                <w:szCs w:val="17"/>
+              </w:rPr>
+              <w:t xml:space="preserve">"몇 명만 옮기면 되나"를 K=0~5 모두 최적 확인으로, 300명도 전체 약 66초(K 하나당 34초 안, 3.2)</w:t>
             </w:r>
           </w:p>
         </w:tc>
@@ -10370,7 +10209,7 @@
         </w:trPr>
         <w:tc>
           <w:tcPr>
-            <w:tcW w:w="1749" w:type="dxa"/>
+            <w:tcW w:w="1718" w:type="dxa"/>
           </w:tcPr>
           <w:p>
             <w:pPr>
@@ -10387,7 +10226,7 @@
         </w:tc>
         <w:tc>
           <w:tcPr>
-            <w:tcW w:w="1725" w:type="dxa"/>
+            <w:tcW w:w="1696" w:type="dxa"/>
           </w:tcPr>
           <w:p>
             <w:pPr>
@@ -10404,7 +10243,7 @@
         </w:tc>
         <w:tc>
           <w:tcPr>
-            <w:tcW w:w="1874" w:type="dxa"/>
+            <w:tcW w:w="1829" w:type="dxa"/>
           </w:tcPr>
           <w:p>
             <w:pPr>
@@ -10421,7 +10260,7 @@
         </w:tc>
         <w:tc>
           <w:tcPr>
-            <w:tcW w:w="4969" w:type="dxa"/>
+            <w:tcW w:w="5073" w:type="dxa"/>
           </w:tcPr>
           <w:p>
             <w:pPr>
@@ -10443,7 +10282,7 @@
         </w:trPr>
         <w:tc>
           <w:tcPr>
-            <w:tcW w:w="1749" w:type="dxa"/>
+            <w:tcW w:w="1718" w:type="dxa"/>
           </w:tcPr>
           <w:p>
             <w:pPr>
@@ -10460,7 +10299,7 @@
         </w:tc>
         <w:tc>
           <w:tcPr>
-            <w:tcW w:w="1725" w:type="dxa"/>
+            <w:tcW w:w="1696" w:type="dxa"/>
           </w:tcPr>
           <w:p>
             <w:pPr>
@@ -10477,7 +10316,7 @@
         </w:tc>
         <w:tc>
           <w:tcPr>
-            <w:tcW w:w="1874" w:type="dxa"/>
+            <w:tcW w:w="1829" w:type="dxa"/>
           </w:tcPr>
           <w:p>
             <w:pPr>
@@ -10494,7 +10333,7 @@
         </w:tc>
         <w:tc>
           <w:tcPr>
-            <w:tcW w:w="4969" w:type="dxa"/>
+            <w:tcW w:w="5073" w:type="dxa"/>
           </w:tcPr>
           <w:p>
             <w:pPr>
@@ -10540,7 +10379,7 @@
         <w:t xml:space="preserve">솔버 라이선스 0원</w:t>
       </w:r>
       <w:r>
-        <w:t xml:space="preserve"> — 오픈소스 HiGHS로 300명 안 A를 최선 대비 0.9% 안에서 푼다(92초). 상용 솔버 무료판은 변수 2,000개 제한이라 100명 모델도 넘는다.</w:t>
+        <w:t xml:space="preserve"> — 오픈소스 HiGHS로 300명 최선안을 이론상 최대치 0.9% 안까지 92초에 푼다. 상용 솔버 무료판은 변수 2,000개 제한이라 100명 모델도 넘는다.</w:t>
       </w:r>
     </w:p>
     <w:p>
@@ -10625,11 +10464,11 @@
         </w:tblCellMar>
       </w:tblPr>
       <w:tblGrid>
-        <w:gridCol w:w="1849"/>
-        <w:gridCol w:w="1893"/>
-        <w:gridCol w:w="1690"/>
+        <w:gridCol w:w="1570"/>
+        <w:gridCol w:w="1824"/>
+        <w:gridCol w:w="1833"/>
         <w:gridCol w:w="1646"/>
-        <w:gridCol w:w="3238"/>
+        <w:gridCol w:w="3441"/>
       </w:tblGrid>
       <w:tr>
         <w:trPr>
@@ -10638,7 +10477,7 @@
         </w:trPr>
         <w:tc>
           <w:tcPr>
-            <w:tcW w:w="1849" w:type="dxa"/>
+            <w:tcW w:w="1570" w:type="dxa"/>
             <w:shd w:val="clear" w:color="auto" w:fill="F1F3F5"/>
           </w:tcPr>
           <w:p>
@@ -10658,7 +10497,7 @@
         </w:tc>
         <w:tc>
           <w:tcPr>
-            <w:tcW w:w="1893" w:type="dxa"/>
+            <w:tcW w:w="1824" w:type="dxa"/>
             <w:shd w:val="clear" w:color="auto" w:fill="F1F3F5"/>
           </w:tcPr>
           <w:p>
@@ -10678,7 +10517,7 @@
         </w:tc>
         <w:tc>
           <w:tcPr>
-            <w:tcW w:w="1690" w:type="dxa"/>
+            <w:tcW w:w="1833" w:type="dxa"/>
             <w:shd w:val="clear" w:color="auto" w:fill="F1F3F5"/>
           </w:tcPr>
           <w:p>
@@ -10719,7 +10558,7 @@
         </w:tc>
         <w:tc>
           <w:tcPr>
-            <w:tcW w:w="3238" w:type="dxa"/>
+            <w:tcW w:w="3441" w:type="dxa"/>
             <w:shd w:val="clear" w:color="auto" w:fill="F1F3F5"/>
           </w:tcPr>
           <w:p>
@@ -10744,7 +10583,7 @@
         </w:trPr>
         <w:tc>
           <w:tcPr>
-            <w:tcW w:w="1849" w:type="dxa"/>
+            <w:tcW w:w="1570" w:type="dxa"/>
           </w:tcPr>
           <w:p>
             <w:pPr>
@@ -10761,7 +10600,7 @@
         </w:tc>
         <w:tc>
           <w:tcPr>
-            <w:tcW w:w="1893" w:type="dxa"/>
+            <w:tcW w:w="1824" w:type="dxa"/>
           </w:tcPr>
           <w:p>
             <w:pPr>
@@ -10778,7 +10617,7 @@
         </w:tc>
         <w:tc>
           <w:tcPr>
-            <w:tcW w:w="1690" w:type="dxa"/>
+            <w:tcW w:w="1833" w:type="dxa"/>
           </w:tcPr>
           <w:p>
             <w:pPr>
@@ -10813,7 +10652,7 @@
         </w:tc>
         <w:tc>
           <w:tcPr>
-            <w:tcW w:w="3238" w:type="dxa"/>
+            <w:tcW w:w="3441" w:type="dxa"/>
           </w:tcPr>
           <w:p>
             <w:pPr>
@@ -10835,7 +10674,7 @@
         </w:trPr>
         <w:tc>
           <w:tcPr>
-            <w:tcW w:w="1849" w:type="dxa"/>
+            <w:tcW w:w="1570" w:type="dxa"/>
           </w:tcPr>
           <w:p>
             <w:pPr>
@@ -10852,7 +10691,7 @@
         </w:tc>
         <w:tc>
           <w:tcPr>
-            <w:tcW w:w="1893" w:type="dxa"/>
+            <w:tcW w:w="1824" w:type="dxa"/>
           </w:tcPr>
           <w:p>
             <w:pPr>
@@ -10869,7 +10708,7 @@
         </w:tc>
         <w:tc>
           <w:tcPr>
-            <w:tcW w:w="1690" w:type="dxa"/>
+            <w:tcW w:w="1833" w:type="dxa"/>
           </w:tcPr>
           <w:p>
             <w:pPr>
@@ -10904,7 +10743,7 @@
         </w:tc>
         <w:tc>
           <w:tcPr>
-            <w:tcW w:w="3238" w:type="dxa"/>
+            <w:tcW w:w="3441" w:type="dxa"/>
           </w:tcPr>
           <w:p>
             <w:pPr>
@@ -10941,7 +10780,7 @@
         </w:trPr>
         <w:tc>
           <w:tcPr>
-            <w:tcW w:w="1849" w:type="dxa"/>
+            <w:tcW w:w="1570" w:type="dxa"/>
           </w:tcPr>
           <w:p>
             <w:pPr>
@@ -10958,7 +10797,7 @@
         </w:tc>
         <w:tc>
           <w:tcPr>
-            <w:tcW w:w="1893" w:type="dxa"/>
+            <w:tcW w:w="1824" w:type="dxa"/>
           </w:tcPr>
           <w:p>
             <w:pPr>
@@ -10975,7 +10814,7 @@
         </w:tc>
         <w:tc>
           <w:tcPr>
-            <w:tcW w:w="1690" w:type="dxa"/>
+            <w:tcW w:w="1833" w:type="dxa"/>
           </w:tcPr>
           <w:p>
             <w:pPr>
@@ -11010,7 +10849,7 @@
         </w:tc>
         <w:tc>
           <w:tcPr>
-            <w:tcW w:w="3238" w:type="dxa"/>
+            <w:tcW w:w="3441" w:type="dxa"/>
           </w:tcPr>
           <w:p>
             <w:pPr>
@@ -11032,52 +10871,52 @@
         </w:trPr>
         <w:tc>
           <w:tcPr>
-            <w:tcW w:w="1849" w:type="dxa"/>
-          </w:tcPr>
-          <w:p>
-            <w:pPr>
-              <w:pStyle w:val="TWCell"/>
-            </w:pPr>
-            <w:r>
-              <w:rPr>
-                <w:sz w:val="17"/>
-                <w:szCs w:val="17"/>
-              </w:rPr>
-              <w:t xml:space="preserve">발주 자료 한 편 → 사업 정보·필요 기술(제안요청서 1.7만 자 예)</w:t>
-            </w:r>
-          </w:p>
-        </w:tc>
-        <w:tc>
-          <w:tcPr>
-            <w:tcW w:w="1893" w:type="dxa"/>
-          </w:tcPr>
-          <w:p>
-            <w:pPr>
-              <w:pStyle w:val="TWCell"/>
-            </w:pPr>
-            <w:r>
-              <w:rPr>
-                <w:sz w:val="17"/>
-                <w:szCs w:val="17"/>
-              </w:rPr>
-              <w:t xml:space="preserve">정독 20~36분 + 기술 고르기·양식 10~20분【가정】 → 약 30~55분</w:t>
-            </w:r>
-          </w:p>
-        </w:tc>
-        <w:tc>
-          <w:tcPr>
-            <w:tcW w:w="1690" w:type="dxa"/>
-          </w:tcPr>
-          <w:p>
-            <w:pPr>
-              <w:pStyle w:val="TWCell"/>
-            </w:pPr>
-            <w:r>
-              <w:rPr>
-                <w:sz w:val="17"/>
-                <w:szCs w:val="17"/>
-              </w:rPr>
-              <w:t xml:space="preserve">AI 읽기 약 30초 + 근거 보고 확인 5~10분【가정】</w:t>
+            <w:tcW w:w="1570" w:type="dxa"/>
+          </w:tcPr>
+          <w:p>
+            <w:pPr>
+              <w:pStyle w:val="TWCell"/>
+            </w:pPr>
+            <w:r>
+              <w:rPr>
+                <w:sz w:val="17"/>
+                <w:szCs w:val="17"/>
+              </w:rPr>
+              <w:t xml:space="preserve">발주 자료 → 필요 기술(실제 10편, 평균 3.7만 음절)</w:t>
+            </w:r>
+          </w:p>
+        </w:tc>
+        <w:tc>
+          <w:tcPr>
+            <w:tcW w:w="1824" w:type="dxa"/>
+          </w:tcPr>
+          <w:p>
+            <w:pPr>
+              <w:pStyle w:val="TWCell"/>
+            </w:pPr>
+            <w:r>
+              <w:rPr>
+                <w:sz w:val="17"/>
+                <w:szCs w:val="17"/>
+              </w:rPr>
+              <w:t xml:space="preserve">읽고 고르기 편당 약 40분~2.4시간</w:t>
+            </w:r>
+          </w:p>
+        </w:tc>
+        <w:tc>
+          <w:tcPr>
+            <w:tcW w:w="1833" w:type="dxa"/>
+          </w:tcPr>
+          <w:p>
+            <w:pPr>
+              <w:pStyle w:val="TWCell"/>
+            </w:pPr>
+            <w:r>
+              <w:rPr>
+                <w:sz w:val="17"/>
+                <w:szCs w:val="17"/>
+              </w:rPr>
+              <w:t xml:space="preserve">AI 13초 + 확인 5~10분【가정】</w:t>
             </w:r>
           </w:p>
         </w:tc>
@@ -11095,24 +10934,24 @@
                 <w:sz w:val="17"/>
                 <w:szCs w:val="17"/>
               </w:rPr>
-              <w:t xml:space="preserve">약 70~85%</w:t>
-            </w:r>
-          </w:p>
-        </w:tc>
-        <w:tc>
-          <w:tcPr>
-            <w:tcW w:w="3238" w:type="dxa"/>
-          </w:tcPr>
-          <w:p>
-            <w:pPr>
-              <w:pStyle w:val="TWCell"/>
-            </w:pPr>
-            <w:r>
-              <w:rPr>
-                <w:sz w:val="17"/>
-                <w:szCs w:val="17"/>
-              </w:rPr>
-              <w:t xml:space="preserve">묵독 분당 550음절(쉬운 단문 상한)【관찰】~300음절(기술 문서 정독)【가정】 × 이 자료 한글 10,710음절, AI 시간은 실측(3.3)</w:t>
+              <w:t xml:space="preserve">약 73~97%</w:t>
+            </w:r>
+          </w:p>
+        </w:tc>
+        <w:tc>
+          <w:tcPr>
+            <w:tcW w:w="3441" w:type="dxa"/>
+          </w:tcPr>
+          <w:p>
+            <w:pPr>
+              <w:pStyle w:val="TWCell"/>
+            </w:pPr>
+            <w:r>
+              <w:rPr>
+                <w:sz w:val="17"/>
+                <w:szCs w:val="17"/>
+              </w:rPr>
+              <w:t xml:space="preserve">글의 40%를 분당 550음절【관찰】~전부를 300음절【가정】 + 고르기 10~20분, AI는 실측(3.3)</w:t>
             </w:r>
           </w:p>
         </w:tc>
@@ -11123,7 +10962,7 @@
         </w:trPr>
         <w:tc>
           <w:tcPr>
-            <w:tcW w:w="1849" w:type="dxa"/>
+            <w:tcW w:w="1570" w:type="dxa"/>
           </w:tcPr>
           <w:p>
             <w:pPr>
@@ -11140,7 +10979,7 @@
         </w:tc>
         <w:tc>
           <w:tcPr>
-            <w:tcW w:w="1893" w:type="dxa"/>
+            <w:tcW w:w="1824" w:type="dxa"/>
           </w:tcPr>
           <w:p>
             <w:pPr>
@@ -11157,7 +10996,7 @@
         </w:tc>
         <w:tc>
           <w:tcPr>
-            <w:tcW w:w="1690" w:type="dxa"/>
+            <w:tcW w:w="1833" w:type="dxa"/>
           </w:tcPr>
           <w:p>
             <w:pPr>
@@ -11192,7 +11031,7 @@
         </w:tc>
         <w:tc>
           <w:tcPr>
-            <w:tcW w:w="3238" w:type="dxa"/>
+            <w:tcW w:w="3441" w:type="dxa"/>
           </w:tcPr>
           <w:p>
             <w:pPr>
@@ -11249,7 +11088,7 @@
         <w:t xml:space="preserve">차별점</w:t>
       </w:r>
       <w:r>
-        <w:t xml:space="preserve">: ① SI의 등급 정원·월 예산·휴직·협업 이력을 현업 규칙(전일 투입·사람 단위 동시 수행·등급 대체) 그대로 하나의 최적화와 확정 규칙으로 풀고, 증명 상한과 독립 검증으로 "얼마나 믿어도 되는지"까지 보인다. ② 가장 잦은 "최소 인원 이동 재편성"을 최선 증명으로 푼다. ③ AI는 검사받는 부품이라 설명 글을 자동화하면서도 근거를 대조한다.</w:t>
+        <w:t xml:space="preserve">: ① SI의 등급 정원·월 예산·휴직·협업 이력을 현업 규칙(전일 투입·사람 단위 동시 수행·등급 대체) 그대로 하나의 최적화와 확정 규칙으로 풀고, 이론상 최대치와 독립 검증으로 "얼마나 믿어도 되는지"까지 보인다. ② 가장 잦은 "최소 인원 이동 재편성"을 최적임을 확인하며 푼다. ③ AI는 검사받는 부품이라 설명 글을 자동화하면서도 근거를 대조한다.</w:t>
       </w:r>
     </w:p>
     <w:p>
@@ -11316,16 +11155,7 @@
         <w:t xml:space="preserve">효과 입증 경로</w:t>
       </w:r>
       <w:r>
-        <w:t xml:space="preserve">(실제 도입 시): 과거 성과 점검 도구(</w:t>
-      </w:r>
-      <w:r>
-        <w:rPr>
-          <w:rFonts w:ascii="Consolas" w:hAnsi="Consolas" w:eastAsia="Malgun Gothic" w:cs="Consolas"/>
-        </w:rPr>
-        <w:t xml:space="preserve">core/evaluate/outcome_check.py</w:t>
-      </w:r>
-      <w:r>
-        <w:t xml:space="preserve">)와 계산 버전 관리로, 성과가 쌓이면 계수를 보정한다.</w:t>
+        <w:t xml:space="preserve">(실제 도입 시): 과거 성과 점검 도구와 계산 버전 관리로, 성과가 쌓이면 계수를 보정한다.</w:t>
       </w:r>
     </w:p>
     <w:p>
@@ -11471,7 +11301,7 @@
                 <w:sz w:val="18"/>
                 <w:szCs w:val="18"/>
               </w:rPr>
-              <w:t xml:space="preserve">AI 전후 측정은 가상 데이터·문장이고(요청 48문장은 구간이 넓다), 8.3의 시간은 추정이다. 발주 자료의 사업 정보 채우기는 AI가 앞 4만 자만 읽고(사업명·기간·예산은 앞머리에 있다), 필요 기술 읽기·요약은 20만 자까지 나눠 읽는다. 요약 검사는 근거 없는 항목을 거를 뿐 모두 막지는 못한다. 월 예산 환산(1점 = 1만 원)은 가정이다.</w:t>
+              <w:t xml:space="preserve">AI 전후 측정은 발주 자료(실제 공공 10편)를 빼면 가상 데이터·문장이고(요청 48문장은 구간이 넓다), 8.3의 시간은 추정이다. 발주 자료의 사업 정보 채우기는 AI가 앞 4만 자만 읽고(사업명·기간·예산은 앞머리에 있다), 필요 기술 읽기·요약은 20만 자까지 나눠 읽는다. 요약 검사는 근거 없는 항목을 거를 뿐 모두 막지는 못한다. 월 예산 환산(1점 = 1만 원)은 가정이다.</w:t>
             </w:r>
           </w:p>
           <w:p>
@@ -11503,7 +11333,7 @@
         <w:pStyle w:val="Heading1"/>
       </w:pPr>
       <w:r>
-        <w:t xml:space="preserve">부록. 재현 방법과 근거 파일</w:t>
+        <w:t xml:space="preserve">부록. 재현 방법</w:t>
       </w:r>
     </w:p>
     <w:p>
@@ -11516,7 +11346,7 @@
           <w:sz w:val="16"/>
           <w:szCs w:val="16"/>
         </w:rPr>
-        <w:t xml:space="preserve">uv sync &amp;&amp; scripts/run_poc.sh   # 실행 → http://127.0.0.1:8000 · 시험: uv run --group benchmark pytest -q (2,140 passed)</w:t>
+        <w:t xml:space="preserve">uv sync &amp;&amp; scripts/run_poc.sh   # 실행 → http://127.0.0.1:8000 · 시험: uv run --group benchmark pytest -q (2,233개 통과)</w:t>
       </w:r>
     </w:p>
     <w:sectPr>

</xml_diff>

<commit_message>
docs: final report third pass -- no code paths in the diagram or 6.6, shaded area cells in the tech stack, no video scene numbers, one-line AI-development note, 6.2/6.5 plus new 6.7 candidate recommendation and 6.8 bid-document reading, seven more design decisions in 7 (10 pages)
Co-Authored-By: Claude Opus 5.5 <noreply@anthropic.com>
Claude-Session: https://claude.ai/code/session_01MWZuim6g1FHWWvZRErzHrn
</commit_message>
<xml_diff>
--- a/outputs/final-report.docx
+++ b/outputs/final-report.docx
@@ -1044,7 +1044,7 @@
     </w:p>
     <w:p>
       <w:r>
-        <w:t xml:space="preserve">화면 흐름은 시연 영상이 순서대로 보여 준다 — 입력 검증·낯선 기술 이름 정리(D1), 연간 계획과 안 확정(D2·D4), 소명 글(D3), What-if(D5), 신규 사업 편성(D6), 긴급 투입·상황을 말로(D7), 인사팀 검토 자료·변경 보고서(D8), 300명·조직 기술 지도(D9). 여기에는 영상에 나오지 않거나 지나가는 기능과 확정 규칙만 적는다.</w:t>
+        <w:t xml:space="preserve">화면 흐름은 시연 영상이 순서대로 보여 준다 — 입력 검증·낯선 기술 이름 정리, 연간 계획과 안 확정, 소명 글, What-if, 신규 사업 편성, 긴급 투입·상황을 말로, 인사팀 검토 자료·변경 보고서, 300명 조직·조직 기술 지도. 여기에는 영상에 나오지 않거나 지나가는 기능과 확정 규칙만 적는다.</w:t>
       </w:r>
     </w:p>
     <w:tbl>
@@ -6083,10 +6083,10 @@
           <w:b/>
           <w:bCs/>
         </w:rPr>
-        <w:t xml:space="preserve">AI로 개발 과정 자체를 운영했다.</w:t>
-      </w:r>
-      <w:r>
-        <w:t xml:space="preserve"> Claude 두 계정과 Codex가 파일 소유 영역을 나눠 병행 개발하고(작업 분담표·인수인계 기록), 변경은 반영 전에 독립 리뷰를 받았다. 리뷰 지적은 실패하는 시험으로 먼저 고정하고, 측정은 판정 기준을 먼저 고정했다 — 약 12주 동안 코드 변경 기록(커밋) 약 660건, 자동 시험 2,233개.</w:t>
+        <w:t xml:space="preserve">AI로 개발했다.</w:t>
+      </w:r>
+      <w:r>
+        <w:t xml:space="preserve"> Claude 두 계정과 Codex가 맡은 영역을 나눠 함께 개발했다.</w:t>
       </w:r>
     </w:p>
     <w:p>
@@ -6178,24 +6178,6 @@
               </w:rPr>
               <w:t xml:space="preserve"> 사람·단가표·기술 경력·업무 이력·월별 가용·사업·등급/기술 요구·동료 평가·현재 배치 등 14종</w:t>
             </w:r>
-            <w:r>
-              <w:rPr>
-                <w:rFonts w:ascii="Consolas" w:hAnsi="Consolas" w:eastAsia="Malgun Gothic" w:cs="Consolas"/>
-                <w:color w:val="5B6168"/>
-                <w:sz w:val="14"/>
-                <w:szCs w:val="14"/>
-              </w:rPr>
-              <w:br/>
-            </w:r>
-            <w:r>
-              <w:rPr>
-                <w:rFonts w:ascii="Consolas" w:hAnsi="Consolas" w:eastAsia="Malgun Gothic" w:cs="Consolas"/>
-                <w:color w:val="5B6168"/>
-                <w:sz w:val="14"/>
-                <w:szCs w:val="14"/>
-              </w:rPr>
-              <w:t xml:space="preserve">core/ingest</w:t>
-            </w:r>
           </w:p>
           <w:p>
             <w:pPr>
@@ -6218,24 +6200,6 @@
                 <w:szCs w:val="16"/>
               </w:rPr>
               <w:t xml:space="preserve"> 오류 파일·줄·칸, 경력 개월 → 대리 레벨, 기술 이름 사전 정규화·하위 기술 인정</w:t>
-            </w:r>
-            <w:r>
-              <w:rPr>
-                <w:rFonts w:ascii="Consolas" w:hAnsi="Consolas" w:eastAsia="Malgun Gothic" w:cs="Consolas"/>
-                <w:color w:val="5B6168"/>
-                <w:sz w:val="14"/>
-                <w:szCs w:val="14"/>
-              </w:rPr>
-              <w:br/>
-            </w:r>
-            <w:r>
-              <w:rPr>
-                <w:rFonts w:ascii="Consolas" w:hAnsi="Consolas" w:eastAsia="Malgun Gothic" w:cs="Consolas"/>
-                <w:color w:val="5B6168"/>
-                <w:sz w:val="14"/>
-                <w:szCs w:val="14"/>
-              </w:rPr>
-              <w:t xml:space="preserve">core/ingest/loader·skills</w:t>
             </w:r>
           </w:p>
         </w:tc>
@@ -6289,24 +6253,6 @@
               </w:rPr>
               <w:t xml:space="preserve"> 누가 누구와 몇 달 일했나, 익숙한 쌍</w:t>
             </w:r>
-            <w:r>
-              <w:rPr>
-                <w:rFonts w:ascii="Consolas" w:hAnsi="Consolas" w:eastAsia="Malgun Gothic" w:cs="Consolas"/>
-                <w:color w:val="5B6168"/>
-                <w:sz w:val="14"/>
-                <w:szCs w:val="14"/>
-              </w:rPr>
-              <w:br/>
-            </w:r>
-            <w:r>
-              <w:rPr>
-                <w:rFonts w:ascii="Consolas" w:hAnsi="Consolas" w:eastAsia="Malgun Gothic" w:cs="Consolas"/>
-                <w:color w:val="5B6168"/>
-                <w:sz w:val="14"/>
-                <w:szCs w:val="14"/>
-              </w:rPr>
-              <w:t xml:space="preserve">core/graph/memory_graph</w:t>
-            </w:r>
           </w:p>
           <w:p>
             <w:pPr>
@@ -6329,24 +6275,6 @@
               </w:rPr>
               <w:t xml:space="preserve"> 동료 평가 원문·인정 경력(SQLite)</w:t>
             </w:r>
-            <w:r>
-              <w:rPr>
-                <w:rFonts w:ascii="Consolas" w:hAnsi="Consolas" w:eastAsia="Malgun Gothic" w:cs="Consolas"/>
-                <w:color w:val="5B6168"/>
-                <w:sz w:val="14"/>
-                <w:szCs w:val="14"/>
-              </w:rPr>
-              <w:br/>
-            </w:r>
-            <w:r>
-              <w:rPr>
-                <w:rFonts w:ascii="Consolas" w:hAnsi="Consolas" w:eastAsia="Malgun Gothic" w:cs="Consolas"/>
-                <w:color w:val="5B6168"/>
-                <w:sz w:val="14"/>
-                <w:szCs w:val="14"/>
-              </w:rPr>
-              <w:t xml:space="preserve">core/graph/sqlite_store</w:t>
-            </w:r>
           </w:p>
           <w:p>
             <w:pPr>
@@ -6368,24 +6296,6 @@
                 <w:szCs w:val="16"/>
               </w:rPr>
               <w:t xml:space="preserve"> 사업·기술·사람 사실, 기술 지도</w:t>
-            </w:r>
-            <w:r>
-              <w:rPr>
-                <w:rFonts w:ascii="Consolas" w:hAnsi="Consolas" w:eastAsia="Malgun Gothic" w:cs="Consolas"/>
-                <w:color w:val="5B6168"/>
-                <w:sz w:val="14"/>
-                <w:szCs w:val="14"/>
-              </w:rPr>
-              <w:br/>
-            </w:r>
-            <w:r>
-              <w:rPr>
-                <w:rFonts w:ascii="Consolas" w:hAnsi="Consolas" w:eastAsia="Malgun Gothic" w:cs="Consolas"/>
-                <w:color w:val="5B6168"/>
-                <w:sz w:val="14"/>
-                <w:szCs w:val="14"/>
-              </w:rPr>
-              <w:t xml:space="preserve">core/kg</w:t>
             </w:r>
           </w:p>
         </w:tc>
@@ -6439,24 +6349,6 @@
               </w:rPr>
               <w:t xml:space="preserve"> 기술 적합 S · 협업 C</w:t>
             </w:r>
-            <w:r>
-              <w:rPr>
-                <w:rFonts w:ascii="Consolas" w:hAnsi="Consolas" w:eastAsia="Malgun Gothic" w:cs="Consolas"/>
-                <w:color w:val="5B6168"/>
-                <w:sz w:val="14"/>
-                <w:szCs w:val="14"/>
-              </w:rPr>
-              <w:br/>
-            </w:r>
-            <w:r>
-              <w:rPr>
-                <w:rFonts w:ascii="Consolas" w:hAnsi="Consolas" w:eastAsia="Malgun Gothic" w:cs="Consolas"/>
-                <w:color w:val="5B6168"/>
-                <w:sz w:val="14"/>
-                <w:szCs w:val="14"/>
-              </w:rPr>
-              <w:t xml:space="preserve">core/scoring</w:t>
-            </w:r>
           </w:p>
           <w:p>
             <w:pPr>
@@ -6479,24 +6371,6 @@
               </w:rPr>
               <w:t xml:space="preserve"> HiGHS 시드 포트폴리오 · 대안 · 운영 중 K</w:t>
             </w:r>
-            <w:r>
-              <w:rPr>
-                <w:rFonts w:ascii="Consolas" w:hAnsi="Consolas" w:eastAsia="Malgun Gothic" w:cs="Consolas"/>
-                <w:color w:val="5B6168"/>
-                <w:sz w:val="14"/>
-                <w:szCs w:val="14"/>
-              </w:rPr>
-              <w:br/>
-            </w:r>
-            <w:r>
-              <w:rPr>
-                <w:rFonts w:ascii="Consolas" w:hAnsi="Consolas" w:eastAsia="Malgun Gothic" w:cs="Consolas"/>
-                <w:color w:val="5B6168"/>
-                <w:sz w:val="14"/>
-                <w:szCs w:val="14"/>
-              </w:rPr>
-              <w:t xml:space="preserve">core/optimize</w:t>
-            </w:r>
           </w:p>
           <w:p>
             <w:pPr>
@@ -6519,24 +6393,6 @@
                 <w:szCs w:val="16"/>
               </w:rPr>
               <w:t xml:space="preserve"> 원자료로 재계산, 모든 배치를 같은 기준으로 채점</w:t>
-            </w:r>
-            <w:r>
-              <w:rPr>
-                <w:rFonts w:ascii="Consolas" w:hAnsi="Consolas" w:eastAsia="Malgun Gothic" w:cs="Consolas"/>
-                <w:color w:val="5B6168"/>
-                <w:sz w:val="14"/>
-                <w:szCs w:val="14"/>
-              </w:rPr>
-              <w:br/>
-            </w:r>
-            <w:r>
-              <w:rPr>
-                <w:rFonts w:ascii="Consolas" w:hAnsi="Consolas" w:eastAsia="Malgun Gothic" w:cs="Consolas"/>
-                <w:color w:val="5B6168"/>
-                <w:sz w:val="14"/>
-                <w:szCs w:val="14"/>
-              </w:rPr>
-              <w:t xml:space="preserve">validation · core/evaluate</w:t>
             </w:r>
           </w:p>
         </w:tc>
@@ -6591,24 +6447,6 @@
               </w:rPr>
               <w:t xml:space="preserve"> 극성 → C</w:t>
             </w:r>
-            <w:r>
-              <w:rPr>
-                <w:rFonts w:ascii="Consolas" w:hAnsi="Consolas" w:eastAsia="Malgun Gothic" w:cs="Consolas"/>
-                <w:color w:val="5B6168"/>
-                <w:sz w:val="14"/>
-                <w:szCs w:val="14"/>
-              </w:rPr>
-              <w:br/>
-            </w:r>
-            <w:r>
-              <w:rPr>
-                <w:rFonts w:ascii="Consolas" w:hAnsi="Consolas" w:eastAsia="Malgun Gothic" w:cs="Consolas"/>
-                <w:color w:val="5B6168"/>
-                <w:sz w:val="14"/>
-                <w:szCs w:val="14"/>
-              </w:rPr>
-              <w:t xml:space="preserve">api/review_judge</w:t>
-            </w:r>
           </w:p>
           <w:p>
             <w:pPr>
@@ -6632,24 +6470,6 @@
               </w:rPr>
               <w:t xml:space="preserve"> + 인용 원문 대조</w:t>
             </w:r>
-            <w:r>
-              <w:rPr>
-                <w:rFonts w:ascii="Consolas" w:hAnsi="Consolas" w:eastAsia="Malgun Gothic" w:cs="Consolas"/>
-                <w:color w:val="5B6168"/>
-                <w:sz w:val="14"/>
-                <w:szCs w:val="14"/>
-              </w:rPr>
-              <w:br/>
-            </w:r>
-            <w:r>
-              <w:rPr>
-                <w:rFonts w:ascii="Consolas" w:hAnsi="Consolas" w:eastAsia="Malgun Gothic" w:cs="Consolas"/>
-                <w:color w:val="5B6168"/>
-                <w:sz w:val="14"/>
-                <w:szCs w:val="14"/>
-              </w:rPr>
-              <w:t xml:space="preserve">api/rag/briefing</w:t>
-            </w:r>
           </w:p>
           <w:p>
             <w:pPr>
@@ -6672,24 +6492,6 @@
                 <w:szCs w:val="16"/>
               </w:rPr>
               <w:t xml:space="preserve"> + 사실·문법 검사</w:t>
-            </w:r>
-            <w:r>
-              <w:rPr>
-                <w:rFonts w:ascii="Consolas" w:hAnsi="Consolas" w:eastAsia="Malgun Gothic" w:cs="Consolas"/>
-                <w:color w:val="5B6168"/>
-                <w:sz w:val="14"/>
-                <w:szCs w:val="14"/>
-              </w:rPr>
-              <w:br/>
-            </w:r>
-            <w:r>
-              <w:rPr>
-                <w:rFonts w:ascii="Consolas" w:hAnsi="Consolas" w:eastAsia="Malgun Gothic" w:cs="Consolas"/>
-                <w:color w:val="5B6168"/>
-                <w:sz w:val="14"/>
-                <w:szCs w:val="14"/>
-              </w:rPr>
-              <w:t xml:space="preserve">core/kg/justify</w:t>
             </w:r>
           </w:p>
         </w:tc>
@@ -6743,24 +6545,6 @@
               </w:rPr>
               <w:t xml:space="preserve"> 최적화(SSE)·교체·운영 중·소명·작업 데이터 판(등록·확정 미리 계산·확정·취소)·검토 자료·설정, 결과 서명</w:t>
             </w:r>
-            <w:r>
-              <w:rPr>
-                <w:rFonts w:ascii="Consolas" w:hAnsi="Consolas" w:eastAsia="Malgun Gothic" w:cs="Consolas"/>
-                <w:color w:val="5B6168"/>
-                <w:sz w:val="14"/>
-                <w:szCs w:val="14"/>
-              </w:rPr>
-              <w:br/>
-            </w:r>
-            <w:r>
-              <w:rPr>
-                <w:rFonts w:ascii="Consolas" w:hAnsi="Consolas" w:eastAsia="Malgun Gothic" w:cs="Consolas"/>
-                <w:color w:val="5B6168"/>
-                <w:sz w:val="14"/>
-                <w:szCs w:val="14"/>
-              </w:rPr>
-              <w:t xml:space="preserve">api/</w:t>
-            </w:r>
           </w:p>
           <w:p>
             <w:pPr>
@@ -6783,24 +6567,6 @@
               </w:rPr>
               <w:t xml:space="preserve"> React · TypeScript</w:t>
             </w:r>
-            <w:r>
-              <w:rPr>
-                <w:rFonts w:ascii="Consolas" w:hAnsi="Consolas" w:eastAsia="Malgun Gothic" w:cs="Consolas"/>
-                <w:color w:val="5B6168"/>
-                <w:sz w:val="14"/>
-                <w:szCs w:val="14"/>
-              </w:rPr>
-              <w:br/>
-            </w:r>
-            <w:r>
-              <w:rPr>
-                <w:rFonts w:ascii="Consolas" w:hAnsi="Consolas" w:eastAsia="Malgun Gothic" w:cs="Consolas"/>
-                <w:color w:val="5B6168"/>
-                <w:sz w:val="14"/>
-                <w:szCs w:val="14"/>
-              </w:rPr>
-              <w:t xml:space="preserve">web/</w:t>
-            </w:r>
           </w:p>
           <w:p>
             <w:pPr>
@@ -6822,24 +6588,6 @@
                 <w:szCs w:val="16"/>
               </w:rPr>
               <w:t xml:space="preserve"> 서명 확인 → 서버 재계산 → Chromium 출력</w:t>
-            </w:r>
-            <w:r>
-              <w:rPr>
-                <w:rFonts w:ascii="Consolas" w:hAnsi="Consolas" w:eastAsia="Malgun Gothic" w:cs="Consolas"/>
-                <w:color w:val="5B6168"/>
-                <w:sz w:val="14"/>
-                <w:szCs w:val="14"/>
-              </w:rPr>
-              <w:br/>
-            </w:r>
-            <w:r>
-              <w:rPr>
-                <w:rFonts w:ascii="Consolas" w:hAnsi="Consolas" w:eastAsia="Malgun Gothic" w:cs="Consolas"/>
-                <w:color w:val="5B6168"/>
-                <w:sz w:val="14"/>
-                <w:szCs w:val="14"/>
-              </w:rPr>
-              <w:t xml:space="preserve">api/pdf</w:t>
             </w:r>
           </w:p>
         </w:tc>
@@ -6903,16 +6651,17 @@
         <w:tc>
           <w:tcPr>
             <w:tcW w:w="930" w:type="dxa"/>
-            <w:shd w:val="clear" w:color="auto" w:fill="F1F3F5"/>
-          </w:tcPr>
-          <w:p>
-            <w:pPr>
-              <w:pStyle w:val="TWCell"/>
-            </w:pPr>
-            <w:r>
-              <w:rPr>
-                <w:b/>
-                <w:bCs/>
+            <w:shd w:val="clear" w:color="auto" w:fill="EEF2F6"/>
+          </w:tcPr>
+          <w:p>
+            <w:pPr>
+              <w:pStyle w:val="TWCell"/>
+            </w:pPr>
+            <w:r>
+              <w:rPr>
+                <w:b/>
+                <w:bCs/>
+                <w:color w:val="2F5F8A"/>
                 <w:sz w:val="17"/>
                 <w:szCs w:val="17"/>
               </w:rPr>
@@ -6943,16 +6692,17 @@
         <w:tc>
           <w:tcPr>
             <w:tcW w:w="1145" w:type="dxa"/>
-            <w:shd w:val="clear" w:color="auto" w:fill="F1F3F5"/>
-          </w:tcPr>
-          <w:p>
-            <w:pPr>
-              <w:pStyle w:val="TWCell"/>
-            </w:pPr>
-            <w:r>
-              <w:rPr>
-                <w:b/>
-                <w:bCs/>
+            <w:shd w:val="clear" w:color="auto" w:fill="EEF2F6"/>
+          </w:tcPr>
+          <w:p>
+            <w:pPr>
+              <w:pStyle w:val="TWCell"/>
+            </w:pPr>
+            <w:r>
+              <w:rPr>
+                <w:b/>
+                <w:bCs/>
+                <w:color w:val="2F5F8A"/>
                 <w:sz w:val="17"/>
                 <w:szCs w:val="17"/>
               </w:rPr>
@@ -6988,13 +6738,17 @@
         <w:tc>
           <w:tcPr>
             <w:tcW w:w="930" w:type="dxa"/>
-          </w:tcPr>
-          <w:p>
-            <w:pPr>
-              <w:pStyle w:val="TWCell"/>
-            </w:pPr>
-            <w:r>
-              <w:rPr>
+            <w:shd w:val="clear" w:color="auto" w:fill="EEF2F6"/>
+          </w:tcPr>
+          <w:p>
+            <w:pPr>
+              <w:pStyle w:val="TWCell"/>
+            </w:pPr>
+            <w:r>
+              <w:rPr>
+                <w:b/>
+                <w:bCs/>
+                <w:color w:val="2F5F8A"/>
                 <w:sz w:val="17"/>
                 <w:szCs w:val="17"/>
               </w:rPr>
@@ -7022,13 +6776,17 @@
         <w:tc>
           <w:tcPr>
             <w:tcW w:w="1145" w:type="dxa"/>
-          </w:tcPr>
-          <w:p>
-            <w:pPr>
-              <w:pStyle w:val="TWCell"/>
-            </w:pPr>
-            <w:r>
-              <w:rPr>
+            <w:shd w:val="clear" w:color="auto" w:fill="EEF2F6"/>
+          </w:tcPr>
+          <w:p>
+            <w:pPr>
+              <w:pStyle w:val="TWCell"/>
+            </w:pPr>
+            <w:r>
+              <w:rPr>
+                <w:b/>
+                <w:bCs/>
+                <w:color w:val="2F5F8A"/>
                 <w:sz w:val="17"/>
                 <w:szCs w:val="17"/>
               </w:rPr>
@@ -7061,13 +6819,17 @@
         <w:tc>
           <w:tcPr>
             <w:tcW w:w="930" w:type="dxa"/>
-          </w:tcPr>
-          <w:p>
-            <w:pPr>
-              <w:pStyle w:val="TWCell"/>
-            </w:pPr>
-            <w:r>
-              <w:rPr>
+            <w:shd w:val="clear" w:color="auto" w:fill="EEF2F6"/>
+          </w:tcPr>
+          <w:p>
+            <w:pPr>
+              <w:pStyle w:val="TWCell"/>
+            </w:pPr>
+            <w:r>
+              <w:rPr>
+                <w:b/>
+                <w:bCs/>
+                <w:color w:val="2F5F8A"/>
                 <w:sz w:val="17"/>
                 <w:szCs w:val="17"/>
               </w:rPr>
@@ -7095,13 +6857,17 @@
         <w:tc>
           <w:tcPr>
             <w:tcW w:w="1145" w:type="dxa"/>
-          </w:tcPr>
-          <w:p>
-            <w:pPr>
-              <w:pStyle w:val="TWCell"/>
-            </w:pPr>
-            <w:r>
-              <w:rPr>
+            <w:shd w:val="clear" w:color="auto" w:fill="EEF2F6"/>
+          </w:tcPr>
+          <w:p>
+            <w:pPr>
+              <w:pStyle w:val="TWCell"/>
+            </w:pPr>
+            <w:r>
+              <w:rPr>
+                <w:b/>
+                <w:bCs/>
+                <w:color w:val="2F5F8A"/>
                 <w:sz w:val="17"/>
                 <w:szCs w:val="17"/>
               </w:rPr>
@@ -7134,13 +6900,17 @@
         <w:tc>
           <w:tcPr>
             <w:tcW w:w="930" w:type="dxa"/>
-          </w:tcPr>
-          <w:p>
-            <w:pPr>
-              <w:pStyle w:val="TWCell"/>
-            </w:pPr>
-            <w:r>
-              <w:rPr>
+            <w:shd w:val="clear" w:color="auto" w:fill="EEF2F6"/>
+          </w:tcPr>
+          <w:p>
+            <w:pPr>
+              <w:pStyle w:val="TWCell"/>
+            </w:pPr>
+            <w:r>
+              <w:rPr>
+                <w:b/>
+                <w:bCs/>
+                <w:color w:val="2F5F8A"/>
                 <w:sz w:val="17"/>
                 <w:szCs w:val="17"/>
               </w:rPr>
@@ -7168,13 +6938,17 @@
         <w:tc>
           <w:tcPr>
             <w:tcW w:w="1145" w:type="dxa"/>
-          </w:tcPr>
-          <w:p>
-            <w:pPr>
-              <w:pStyle w:val="TWCell"/>
-            </w:pPr>
-            <w:r>
-              <w:rPr>
+            <w:shd w:val="clear" w:color="auto" w:fill="EEF2F6"/>
+          </w:tcPr>
+          <w:p>
+            <w:pPr>
+              <w:pStyle w:val="TWCell"/>
+            </w:pPr>
+            <w:r>
+              <w:rPr>
+                <w:b/>
+                <w:bCs/>
+                <w:color w:val="2F5F8A"/>
                 <w:sz w:val="17"/>
                 <w:szCs w:val="17"/>
               </w:rPr>
@@ -7207,13 +6981,17 @@
         <w:tc>
           <w:tcPr>
             <w:tcW w:w="930" w:type="dxa"/>
-          </w:tcPr>
-          <w:p>
-            <w:pPr>
-              <w:pStyle w:val="TWCell"/>
-            </w:pPr>
-            <w:r>
-              <w:rPr>
+            <w:shd w:val="clear" w:color="auto" w:fill="EEF2F6"/>
+          </w:tcPr>
+          <w:p>
+            <w:pPr>
+              <w:pStyle w:val="TWCell"/>
+            </w:pPr>
+            <w:r>
+              <w:rPr>
+                <w:b/>
+                <w:bCs/>
+                <w:color w:val="2F5F8A"/>
                 <w:sz w:val="17"/>
                 <w:szCs w:val="17"/>
               </w:rPr>
@@ -7241,13 +7019,17 @@
         <w:tc>
           <w:tcPr>
             <w:tcW w:w="1145" w:type="dxa"/>
-          </w:tcPr>
-          <w:p>
-            <w:pPr>
-              <w:pStyle w:val="TWCell"/>
-            </w:pPr>
-            <w:r>
-              <w:rPr>
+            <w:shd w:val="clear" w:color="auto" w:fill="EEF2F6"/>
+          </w:tcPr>
+          <w:p>
+            <w:pPr>
+              <w:pStyle w:val="TWCell"/>
+            </w:pPr>
+            <w:r>
+              <w:rPr>
+                <w:b/>
+                <w:bCs/>
+                <w:color w:val="2F5F8A"/>
                 <w:sz w:val="17"/>
                 <w:szCs w:val="17"/>
               </w:rPr>
@@ -8336,6 +8118,25 @@
     </w:p>
     <w:p>
       <w:pPr>
+        <w:pStyle w:val="TWList"/>
+        <w:numPr>
+          <w:ilvl w:val="0"/>
+          <w:numId w:val="1"/>
+        </w:numPr>
+      </w:pPr>
+      <w:r>
+        <w:rPr>
+          <w:b/>
+          <w:bCs/>
+        </w:rPr>
+        <w:t xml:space="preserve">무르기와 기록</w:t>
+      </w:r>
+      <w:r>
+        <w:t xml:space="preserve">: 마지막 판부터 되돌리기와 별도로, 특정 확정 한 건만 지금 판 위에서 거꾸로 적용해 취소한다(그 뒤 바뀐 칸·고정한 배치는 건너뛰고, 원래 사업으로 돌려보내면 위반이 생기는 사람은 대기로 둔다). 모든 판 변경은 지우지 않는 변경 기록에 남아 기간을 골라 보고서 PDF로 묶이고, 사람이 새로 들어간 사업마다 인사팀 검토 자료가 생긴다 — 시스템 사실(원래 사업이 잃는 것·메움·등급 대체와 예산 증액 사유)은 만들 때 계산해 잠그고, 결론은 부서장이 쓴다.</w:t>
+      </w:r>
+    </w:p>
+    <w:p>
+      <w:pPr>
         <w:pStyle w:val="Heading2"/>
       </w:pPr>
       <w:r>
@@ -8491,10 +8292,10 @@
         </w:tblCellMar>
       </w:tblPr>
       <w:tblGrid>
-        <w:gridCol w:w="1532"/>
-        <w:gridCol w:w="3600"/>
-        <w:gridCol w:w="3792"/>
-        <w:gridCol w:w="1392"/>
+        <w:gridCol w:w="1525"/>
+        <w:gridCol w:w="3678"/>
+        <w:gridCol w:w="3730"/>
+        <w:gridCol w:w="1384"/>
       </w:tblGrid>
       <w:tr>
         <w:trPr>
@@ -8503,7 +8304,7 @@
         </w:trPr>
         <w:tc>
           <w:tcPr>
-            <w:tcW w:w="1532" w:type="dxa"/>
+            <w:tcW w:w="1525" w:type="dxa"/>
             <w:shd w:val="clear" w:color="auto" w:fill="F1F3F5"/>
           </w:tcPr>
           <w:p>
@@ -8523,7 +8324,7 @@
         </w:tc>
         <w:tc>
           <w:tcPr>
-            <w:tcW w:w="3600" w:type="dxa"/>
+            <w:tcW w:w="3678" w:type="dxa"/>
             <w:shd w:val="clear" w:color="auto" w:fill="F1F3F5"/>
           </w:tcPr>
           <w:p>
@@ -8543,7 +8344,7 @@
         </w:tc>
         <w:tc>
           <w:tcPr>
-            <w:tcW w:w="3792" w:type="dxa"/>
+            <w:tcW w:w="3730" w:type="dxa"/>
             <w:shd w:val="clear" w:color="auto" w:fill="F1F3F5"/>
           </w:tcPr>
           <w:p>
@@ -8563,7 +8364,7 @@
         </w:tc>
         <w:tc>
           <w:tcPr>
-            <w:tcW w:w="1392" w:type="dxa"/>
+            <w:tcW w:w="1384" w:type="dxa"/>
             <w:shd w:val="clear" w:color="auto" w:fill="F1F3F5"/>
           </w:tcPr>
           <w:p>
@@ -8588,7 +8389,7 @@
         </w:trPr>
         <w:tc>
           <w:tcPr>
-            <w:tcW w:w="1532" w:type="dxa"/>
+            <w:tcW w:w="1525" w:type="dxa"/>
           </w:tcPr>
           <w:p>
             <w:pPr>
@@ -8605,7 +8406,7 @@
         </w:tc>
         <w:tc>
           <w:tcPr>
-            <w:tcW w:w="3600" w:type="dxa"/>
+            <w:tcW w:w="3678" w:type="dxa"/>
           </w:tcPr>
           <w:p>
             <w:pPr>
@@ -8622,7 +8423,7 @@
         </w:tc>
         <w:tc>
           <w:tcPr>
-            <w:tcW w:w="3792" w:type="dxa"/>
+            <w:tcW w:w="3730" w:type="dxa"/>
           </w:tcPr>
           <w:p>
             <w:pPr>
@@ -8639,7 +8440,7 @@
         </w:tc>
         <w:tc>
           <w:tcPr>
-            <w:tcW w:w="1392" w:type="dxa"/>
+            <w:tcW w:w="1384" w:type="dxa"/>
           </w:tcPr>
           <w:p>
             <w:pPr>
@@ -8661,7 +8462,7 @@
         </w:trPr>
         <w:tc>
           <w:tcPr>
-            <w:tcW w:w="1532" w:type="dxa"/>
+            <w:tcW w:w="1525" w:type="dxa"/>
           </w:tcPr>
           <w:p>
             <w:pPr>
@@ -8678,7 +8479,7 @@
         </w:tc>
         <w:tc>
           <w:tcPr>
-            <w:tcW w:w="3600" w:type="dxa"/>
+            <w:tcW w:w="3678" w:type="dxa"/>
           </w:tcPr>
           <w:p>
             <w:pPr>
@@ -8695,7 +8496,7 @@
         </w:tc>
         <w:tc>
           <w:tcPr>
-            <w:tcW w:w="3792" w:type="dxa"/>
+            <w:tcW w:w="3730" w:type="dxa"/>
           </w:tcPr>
           <w:p>
             <w:pPr>
@@ -8712,7 +8513,7 @@
         </w:tc>
         <w:tc>
           <w:tcPr>
-            <w:tcW w:w="1392" w:type="dxa"/>
+            <w:tcW w:w="1384" w:type="dxa"/>
           </w:tcPr>
           <w:p>
             <w:pPr>
@@ -8734,7 +8535,7 @@
         </w:trPr>
         <w:tc>
           <w:tcPr>
-            <w:tcW w:w="1532" w:type="dxa"/>
+            <w:tcW w:w="1525" w:type="dxa"/>
           </w:tcPr>
           <w:p>
             <w:pPr>
@@ -8751,7 +8552,7 @@
         </w:tc>
         <w:tc>
           <w:tcPr>
-            <w:tcW w:w="3600" w:type="dxa"/>
+            <w:tcW w:w="3678" w:type="dxa"/>
           </w:tcPr>
           <w:p>
             <w:pPr>
@@ -8783,7 +8584,7 @@
         </w:tc>
         <w:tc>
           <w:tcPr>
-            <w:tcW w:w="3792" w:type="dxa"/>
+            <w:tcW w:w="3730" w:type="dxa"/>
           </w:tcPr>
           <w:p>
             <w:pPr>
@@ -8800,7 +8601,7 @@
         </w:tc>
         <w:tc>
           <w:tcPr>
-            <w:tcW w:w="1392" w:type="dxa"/>
+            <w:tcW w:w="1384" w:type="dxa"/>
           </w:tcPr>
           <w:p>
             <w:pPr>
@@ -8822,7 +8623,7 @@
         </w:trPr>
         <w:tc>
           <w:tcPr>
-            <w:tcW w:w="1532" w:type="dxa"/>
+            <w:tcW w:w="1525" w:type="dxa"/>
           </w:tcPr>
           <w:p>
             <w:pPr>
@@ -8839,7 +8640,7 @@
         </w:tc>
         <w:tc>
           <w:tcPr>
-            <w:tcW w:w="3600" w:type="dxa"/>
+            <w:tcW w:w="3678" w:type="dxa"/>
           </w:tcPr>
           <w:p>
             <w:pPr>
@@ -8856,7 +8657,7 @@
         </w:tc>
         <w:tc>
           <w:tcPr>
-            <w:tcW w:w="3792" w:type="dxa"/>
+            <w:tcW w:w="3730" w:type="dxa"/>
           </w:tcPr>
           <w:p>
             <w:pPr>
@@ -8873,7 +8674,7 @@
         </w:tc>
         <w:tc>
           <w:tcPr>
-            <w:tcW w:w="1392" w:type="dxa"/>
+            <w:tcW w:w="1384" w:type="dxa"/>
           </w:tcPr>
           <w:p>
             <w:pPr>
@@ -8885,6 +8686,79 @@
                 <w:szCs w:val="17"/>
               </w:rPr>
               <w:t xml:space="preserve">사전 별칭 찾기·문자열 후보</w:t>
+            </w:r>
+          </w:p>
+        </w:tc>
+      </w:tr>
+      <w:tr>
+        <w:trPr>
+          <w:cantSplit/>
+        </w:trPr>
+        <w:tc>
+          <w:tcPr>
+            <w:tcW w:w="1525" w:type="dxa"/>
+          </w:tcPr>
+          <w:p>
+            <w:pPr>
+              <w:pStyle w:val="TWCell"/>
+            </w:pPr>
+            <w:r>
+              <w:rPr>
+                <w:sz w:val="17"/>
+                <w:szCs w:val="17"/>
+              </w:rPr>
+              <w:t xml:space="preserve">발주 자료 읽기</w:t>
+            </w:r>
+          </w:p>
+        </w:tc>
+        <w:tc>
+          <w:tcPr>
+            <w:tcW w:w="3678" w:type="dxa"/>
+          </w:tcPr>
+          <w:p>
+            <w:pPr>
+              <w:pStyle w:val="TWCell"/>
+            </w:pPr>
+            <w:r>
+              <w:rPr>
+                <w:sz w:val="17"/>
+                <w:szCs w:val="17"/>
+              </w:rPr>
+              <w:t xml:space="preserve">필요 기술(필수·우대·요구가 아닌 언급), 사업 정보, 자료 요약을 근거 말과 함께 제안(6.8)</w:t>
+            </w:r>
+          </w:p>
+        </w:tc>
+        <w:tc>
+          <w:tcPr>
+            <w:tcW w:w="3730" w:type="dxa"/>
+          </w:tcPr>
+          <w:p>
+            <w:pPr>
+              <w:pStyle w:val="TWCell"/>
+            </w:pPr>
+            <w:r>
+              <w:rPr>
+                <w:sz w:val="17"/>
+                <w:szCs w:val="17"/>
+              </w:rPr>
+              <w:t xml:space="preserve">사전에 있는 개념인지, 근거 말이 원문 그 자리에 있는지, 금액·날짜·숫자가 근거 말과 맞는지</w:t>
+            </w:r>
+          </w:p>
+        </w:tc>
+        <w:tc>
+          <w:tcPr>
+            <w:tcW w:w="1384" w:type="dxa"/>
+          </w:tcPr>
+          <w:p>
+            <w:pPr>
+              <w:pStyle w:val="TWCell"/>
+            </w:pPr>
+            <w:r>
+              <w:rPr>
+                <w:sz w:val="17"/>
+                <w:szCs w:val="17"/>
+              </w:rPr>
+              <w:t xml:space="preserve">사전 별칭 + 문장 말 규칙</w:t>
             </w:r>
           </w:p>
         </w:tc>
@@ -8977,16 +8851,199 @@
         <w:t xml:space="preserve">지식 그래프</w:t>
       </w:r>
       <w:r>
-        <w:t xml:space="preserve">(</w:t>
-      </w:r>
+        <w:t xml:space="preserve">: 사업·요구 기술·팀원·협업·후보 비교·규칙 준수를 사실로 만들어 소명 글에 쓰고, 기술마다 공급·수요를 모아 조직 기술 지도를 만든다. 저장 기술은 측정으로 골랐다(인메모리 그래프 + SQLite, 7장).</w:t>
+      </w:r>
+    </w:p>
+    <w:p>
+      <w:pPr>
+        <w:pStyle w:val="Heading2"/>
+      </w:pPr>
+      <w:r>
+        <w:t xml:space="preserve">6.7 후보 추천 — 신규 사업 편성·긴급 투입</w:t>
+      </w:r>
+    </w:p>
+    <w:p>
+      <w:pPr>
+        <w:pStyle w:val="TWList"/>
+        <w:numPr>
+          <w:ilvl w:val="0"/>
+          <w:numId w:val="1"/>
+        </w:numPr>
+      </w:pPr>
       <w:r>
         <w:rPr>
-          <w:rFonts w:ascii="Consolas" w:hAnsi="Consolas" w:eastAsia="Malgun Gothic" w:cs="Consolas"/>
+          <w:b/>
+          <w:bCs/>
         </w:rPr>
-        <w:t xml:space="preserve">core/kg</w:t>
-      </w:r>
-      <w:r>
-        <w:t xml:space="preserve">): 사업·요구 기술·팀원·협업·후보 비교·규칙 준수를 사실로 만들어 소명 글에 쓰고, 기술마다 공급·수요를 모아 조직 기술 지도를 만든다. 저장 기술은 측정으로 골랐다(Neo4j 우위 0/20 → 제거, RDF 추론은 가중 부분 인정을 표현하지 못해 인메모리 그래프 유지).</w:t>
+        <w:t xml:space="preserve">후보와 채점</w:t>
+      </w:r>
+      <w:r>
+        <w:t xml:space="preserve">: 후보는 대기 인력, 지금 사업이 신규 사업 시작 전에 모두 끝나는 인력, 다른 사업에서 빼 올 인력이다. 후보마다 그 사람을 넣은 전체 배치를 평가기로 다시 채점해 기술 적합·협업 변화, 메운 자리, 원래 사업이 잃는 자리를 나눠 보인다. 협업 점수는 두 사람 사이 값이라 "이 사업 팀원 누구와 +0.17"처럼 쌍으로 보인다. 진행 사업에 붙는 추가 과제는 그 사업 팀원을 맨 위에 보인다.</w:t>
+      </w:r>
+    </w:p>
+    <w:p>
+      <w:pPr>
+        <w:pStyle w:val="TWList"/>
+        <w:numPr>
+          <w:ilvl w:val="0"/>
+          <w:numId w:val="1"/>
+        </w:numPr>
+      </w:pPr>
+      <w:r>
+        <w:rPr>
+          <w:b/>
+          <w:bCs/>
+        </w:rPr>
+        <w:t xml:space="preserve">고른 사람을 팀원으로</w:t>
+      </w:r>
+      <w:r>
+        <w:t xml:space="preserve">: 부서장이 한 명을 넣으면 그 사람을 팀원으로 쳐서 나머지 후보를 다시 매기고, 등급별 자리·요구 기술 충족·새 위반을 미리 보인다. 데이터는 확정 때만 바뀌고, 확정은 미리 보기와 같은 판정을 다시 거친다.</w:t>
+      </w:r>
+    </w:p>
+    <w:p>
+      <w:pPr>
+        <w:pStyle w:val="TWList"/>
+        <w:numPr>
+          <w:ilvl w:val="0"/>
+          <w:numId w:val="1"/>
+        </w:numPr>
+      </w:pPr>
+      <w:r>
+        <w:rPr>
+          <w:b/>
+          <w:bCs/>
+        </w:rPr>
+        <w:t xml:space="preserve">자동 편성</w:t>
+      </w:r>
+      <w:r>
+        <w:t xml:space="preserve">: 옮길 수 있는 인원 K = 0~5마다 허용 오차 0으로 풀어(3.2) 몇 명을 옮기면 무엇이 좋아지는지 나란히 보인다.</w:t>
+      </w:r>
+    </w:p>
+    <w:p>
+      <w:pPr>
+        <w:pStyle w:val="TWList"/>
+        <w:numPr>
+          <w:ilvl w:val="0"/>
+          <w:numId w:val="1"/>
+        </w:numPr>
+      </w:pPr>
+      <w:r>
+        <w:rPr>
+          <w:b/>
+          <w:bCs/>
+        </w:rPr>
+        <w:t xml:space="preserve">긴급 투입</w:t>
+      </w:r>
+      <w:r>
+        <w:t xml:space="preserve">: 상황 글을 요구 기술로 옮긴 뒤(6.5) 후보 순위와 최선 조합(허용 오차 0, 최대 600초)을 함께 낸다. 프로젝트 동시 수행 허용이 필요한 후보는 따로 보이고, 빼 온 자리는 같은 확정에서 메우거나 "메우지 않음"을 정한다. 밤사이 AI 없이 진행 사업마다 바로 넣을 수 있는 상위 5명을 계산해 둔다.</w:t>
+      </w:r>
+    </w:p>
+    <w:p>
+      <w:pPr>
+        <w:pStyle w:val="TWList"/>
+        <w:numPr>
+          <w:ilvl w:val="0"/>
+          <w:numId w:val="1"/>
+        </w:numPr>
+      </w:pPr>
+      <w:r>
+        <w:t xml:space="preserve">육아휴직 등으로 사업 기간에 투입할 수 없는 사람은 사유와 함께 보이되 고를 수 없다.</w:t>
+      </w:r>
+    </w:p>
+    <w:p>
+      <w:pPr>
+        <w:pStyle w:val="Heading2"/>
+      </w:pPr>
+      <w:r>
+        <w:t xml:space="preserve">6.8 발주 자료 읽기</w:t>
+      </w:r>
+    </w:p>
+    <w:p>
+      <w:pPr>
+        <w:pStyle w:val="TWList"/>
+        <w:numPr>
+          <w:ilvl w:val="0"/>
+          <w:numId w:val="1"/>
+        </w:numPr>
+      </w:pPr>
+      <w:r>
+        <w:rPr>
+          <w:b/>
+          <w:bCs/>
+        </w:rPr>
+        <w:t xml:space="preserve">글자 뽑기</w:t>
+      </w:r>
+      <w:r>
+        <w:t xml:space="preserve">: PDF·HWP(옛 한글)·HWPX·DOCX·PPTX·XLSX. 옛 한글은 추가 라이브러리 없이 문서 구조와 압축 본문을 직접 읽는다. 남이 만든 파일이라 별도 프로세스에서 20초 제한·동시 2개로 열고, 파일 크기(20MiB)·압축 해제량·읽기량에 상한을 두며, 배포용·암호 문서는 이유와 함께 거절한다.</w:t>
+      </w:r>
+    </w:p>
+    <w:p>
+      <w:pPr>
+        <w:pStyle w:val="TWList"/>
+        <w:numPr>
+          <w:ilvl w:val="0"/>
+          <w:numId w:val="1"/>
+        </w:numPr>
+      </w:pPr>
+      <w:r>
+        <w:rPr>
+          <w:b/>
+          <w:bCs/>
+        </w:rPr>
+        <w:t xml:space="preserve">긴 자료</w:t>
+      </w:r>
+      <w:r>
+        <w:t xml:space="preserve">: 20만 자(PDF 200쪽)까지 읽는다. 목차 경계에서 4만 자 이하 조각(최대 8개)으로 나눠 동시에 AI에 보내고 조각마다 제목 경로를 붙인다. 상한에서 잘리면 화면에 "앞부분만 읽었다"를 띄운다.</w:t>
+      </w:r>
+    </w:p>
+    <w:p>
+      <w:pPr>
+        <w:pStyle w:val="TWList"/>
+        <w:numPr>
+          <w:ilvl w:val="0"/>
+          <w:numId w:val="1"/>
+        </w:numPr>
+      </w:pPr>
+      <w:r>
+        <w:rPr>
+          <w:b/>
+          <w:bCs/>
+        </w:rPr>
+        <w:t xml:space="preserve">필요 기술</w:t>
+      </w:r>
+      <w:r>
+        <w:t xml:space="preserve">: 사전 개념으로 옮기며 필수·우대와 "자료에 나오지만 요구가 아닌 언급"(현행 시스템·연계 대상)을 나누고, 경력·인원은 자료에 적혔을 때만 읽는다. 항목마다 근거 말이 원문 그 자리에 있는지 확인한다.</w:t>
+      </w:r>
+    </w:p>
+    <w:p>
+      <w:pPr>
+        <w:pStyle w:val="TWList"/>
+        <w:numPr>
+          <w:ilvl w:val="0"/>
+          <w:numId w:val="1"/>
+        </w:numPr>
+      </w:pPr>
+      <w:r>
+        <w:rPr>
+          <w:b/>
+          <w:bCs/>
+        </w:rPr>
+        <w:t xml:space="preserve">사업 정보·요약</w:t>
+      </w:r>
+      <w:r>
+        <w:t xml:space="preserve">: 공고문 앞부분에서 사업명·기간·총 사업비·공고번호·마감을 읽는다(금액은 "1억 2천 5백만원"처럼 덩어리째 읽고 애매하면 버림, 계산으로 낸 기간은 "AI 계산" 표시). 요약은 과업·기간·예산·인력·평가·유의 사항 칸마다 근거 말과 숫자를 원문과 맞춰 거른다.</w:t>
+      </w:r>
+    </w:p>
+    <w:p>
+      <w:pPr>
+        <w:pStyle w:val="TWList"/>
+        <w:numPr>
+          <w:ilvl w:val="0"/>
+          <w:numId w:val="1"/>
+        </w:numPr>
+      </w:pPr>
+      <w:r>
+        <w:t xml:space="preserve">결과는 모두 제안이다. 읽기 전에 자료를 보내는 곳(회사 밖이면 경고)을 알리고, 경력·인원이 적힌 필수만 미리 체크하며 나머지는 사람이 고른다.</w:t>
       </w:r>
     </w:p>
     <w:p>
@@ -9018,10 +9075,10 @@
         </w:tblCellMar>
       </w:tblPr>
       <w:tblGrid>
-        <w:gridCol w:w="1405"/>
-        <w:gridCol w:w="2337"/>
-        <w:gridCol w:w="4396"/>
-        <w:gridCol w:w="2178"/>
+        <w:gridCol w:w="1350"/>
+        <w:gridCol w:w="2273"/>
+        <w:gridCol w:w="4451"/>
+        <w:gridCol w:w="2242"/>
       </w:tblGrid>
       <w:tr>
         <w:trPr>
@@ -9030,7 +9087,7 @@
         </w:trPr>
         <w:tc>
           <w:tcPr>
-            <w:tcW w:w="1405" w:type="dxa"/>
+            <w:tcW w:w="1350" w:type="dxa"/>
             <w:shd w:val="clear" w:color="auto" w:fill="F1F3F5"/>
           </w:tcPr>
           <w:p>
@@ -9050,7 +9107,7 @@
         </w:tc>
         <w:tc>
           <w:tcPr>
-            <w:tcW w:w="2337" w:type="dxa"/>
+            <w:tcW w:w="2273" w:type="dxa"/>
             <w:shd w:val="clear" w:color="auto" w:fill="F1F3F5"/>
           </w:tcPr>
           <w:p>
@@ -9070,7 +9127,7 @@
         </w:tc>
         <w:tc>
           <w:tcPr>
-            <w:tcW w:w="4396" w:type="dxa"/>
+            <w:tcW w:w="4451" w:type="dxa"/>
             <w:shd w:val="clear" w:color="auto" w:fill="F1F3F5"/>
           </w:tcPr>
           <w:p>
@@ -9090,7 +9147,7 @@
         </w:tc>
         <w:tc>
           <w:tcPr>
-            <w:tcW w:w="2178" w:type="dxa"/>
+            <w:tcW w:w="2242" w:type="dxa"/>
             <w:shd w:val="clear" w:color="auto" w:fill="F1F3F5"/>
           </w:tcPr>
           <w:p>
@@ -9115,7 +9172,7 @@
         </w:trPr>
         <w:tc>
           <w:tcPr>
-            <w:tcW w:w="1405" w:type="dxa"/>
+            <w:tcW w:w="1350" w:type="dxa"/>
           </w:tcPr>
           <w:p>
             <w:pPr>
@@ -9132,7 +9189,7 @@
         </w:tc>
         <w:tc>
           <w:tcPr>
-            <w:tcW w:w="2337" w:type="dxa"/>
+            <w:tcW w:w="2273" w:type="dxa"/>
           </w:tcPr>
           <w:p>
             <w:pPr>
@@ -9149,7 +9206,7 @@
         </w:tc>
         <w:tc>
           <w:tcPr>
-            <w:tcW w:w="4396" w:type="dxa"/>
+            <w:tcW w:w="4451" w:type="dxa"/>
           </w:tcPr>
           <w:p>
             <w:pPr>
@@ -9166,7 +9223,7 @@
         </w:tc>
         <w:tc>
           <w:tcPr>
-            <w:tcW w:w="2178" w:type="dxa"/>
+            <w:tcW w:w="2242" w:type="dxa"/>
           </w:tcPr>
           <w:p>
             <w:pPr>
@@ -9188,7 +9245,7 @@
         </w:trPr>
         <w:tc>
           <w:tcPr>
-            <w:tcW w:w="1405" w:type="dxa"/>
+            <w:tcW w:w="1350" w:type="dxa"/>
           </w:tcPr>
           <w:p>
             <w:pPr>
@@ -9205,7 +9262,7 @@
         </w:tc>
         <w:tc>
           <w:tcPr>
-            <w:tcW w:w="2337" w:type="dxa"/>
+            <w:tcW w:w="2273" w:type="dxa"/>
           </w:tcPr>
           <w:p>
             <w:pPr>
@@ -9222,7 +9279,7 @@
         </w:tc>
         <w:tc>
           <w:tcPr>
-            <w:tcW w:w="4396" w:type="dxa"/>
+            <w:tcW w:w="4451" w:type="dxa"/>
           </w:tcPr>
           <w:p>
             <w:pPr>
@@ -9239,7 +9296,7 @@
         </w:tc>
         <w:tc>
           <w:tcPr>
-            <w:tcW w:w="2178" w:type="dxa"/>
+            <w:tcW w:w="2242" w:type="dxa"/>
           </w:tcPr>
           <w:p>
             <w:pPr>
@@ -9261,7 +9318,7 @@
         </w:trPr>
         <w:tc>
           <w:tcPr>
-            <w:tcW w:w="1405" w:type="dxa"/>
+            <w:tcW w:w="1350" w:type="dxa"/>
           </w:tcPr>
           <w:p>
             <w:pPr>
@@ -9278,7 +9335,7 @@
         </w:tc>
         <w:tc>
           <w:tcPr>
-            <w:tcW w:w="2337" w:type="dxa"/>
+            <w:tcW w:w="2273" w:type="dxa"/>
           </w:tcPr>
           <w:p>
             <w:pPr>
@@ -9295,7 +9352,7 @@
         </w:tc>
         <w:tc>
           <w:tcPr>
-            <w:tcW w:w="4396" w:type="dxa"/>
+            <w:tcW w:w="4451" w:type="dxa"/>
           </w:tcPr>
           <w:p>
             <w:pPr>
@@ -9312,7 +9369,7 @@
         </w:tc>
         <w:tc>
           <w:tcPr>
-            <w:tcW w:w="2178" w:type="dxa"/>
+            <w:tcW w:w="2242" w:type="dxa"/>
           </w:tcPr>
           <w:p>
             <w:pPr>
@@ -9334,7 +9391,7 @@
         </w:trPr>
         <w:tc>
           <w:tcPr>
-            <w:tcW w:w="1405" w:type="dxa"/>
+            <w:tcW w:w="1350" w:type="dxa"/>
           </w:tcPr>
           <w:p>
             <w:pPr>
@@ -9351,7 +9408,7 @@
         </w:tc>
         <w:tc>
           <w:tcPr>
-            <w:tcW w:w="2337" w:type="dxa"/>
+            <w:tcW w:w="2273" w:type="dxa"/>
           </w:tcPr>
           <w:p>
             <w:pPr>
@@ -9368,7 +9425,7 @@
         </w:tc>
         <w:tc>
           <w:tcPr>
-            <w:tcW w:w="4396" w:type="dxa"/>
+            <w:tcW w:w="4451" w:type="dxa"/>
           </w:tcPr>
           <w:p>
             <w:pPr>
@@ -9385,7 +9442,7 @@
         </w:tc>
         <w:tc>
           <w:tcPr>
-            <w:tcW w:w="2178" w:type="dxa"/>
+            <w:tcW w:w="2242" w:type="dxa"/>
           </w:tcPr>
           <w:p>
             <w:pPr>
@@ -9407,7 +9464,7 @@
         </w:trPr>
         <w:tc>
           <w:tcPr>
-            <w:tcW w:w="1405" w:type="dxa"/>
+            <w:tcW w:w="1350" w:type="dxa"/>
           </w:tcPr>
           <w:p>
             <w:pPr>
@@ -9424,7 +9481,7 @@
         </w:tc>
         <w:tc>
           <w:tcPr>
-            <w:tcW w:w="2337" w:type="dxa"/>
+            <w:tcW w:w="2273" w:type="dxa"/>
           </w:tcPr>
           <w:p>
             <w:pPr>
@@ -9441,7 +9498,7 @@
         </w:tc>
         <w:tc>
           <w:tcPr>
-            <w:tcW w:w="4396" w:type="dxa"/>
+            <w:tcW w:w="4451" w:type="dxa"/>
           </w:tcPr>
           <w:p>
             <w:pPr>
@@ -9458,7 +9515,7 @@
         </w:tc>
         <w:tc>
           <w:tcPr>
-            <w:tcW w:w="2178" w:type="dxa"/>
+            <w:tcW w:w="2242" w:type="dxa"/>
           </w:tcPr>
           <w:p>
             <w:pPr>
@@ -9480,7 +9537,7 @@
         </w:trPr>
         <w:tc>
           <w:tcPr>
-            <w:tcW w:w="1405" w:type="dxa"/>
+            <w:tcW w:w="1350" w:type="dxa"/>
           </w:tcPr>
           <w:p>
             <w:pPr>
@@ -9497,7 +9554,7 @@
         </w:tc>
         <w:tc>
           <w:tcPr>
-            <w:tcW w:w="2337" w:type="dxa"/>
+            <w:tcW w:w="2273" w:type="dxa"/>
           </w:tcPr>
           <w:p>
             <w:pPr>
@@ -9514,7 +9571,7 @@
         </w:tc>
         <w:tc>
           <w:tcPr>
-            <w:tcW w:w="4396" w:type="dxa"/>
+            <w:tcW w:w="4451" w:type="dxa"/>
           </w:tcPr>
           <w:p>
             <w:pPr>
@@ -9531,7 +9588,7 @@
         </w:tc>
         <w:tc>
           <w:tcPr>
-            <w:tcW w:w="2178" w:type="dxa"/>
+            <w:tcW w:w="2242" w:type="dxa"/>
           </w:tcPr>
           <w:p>
             <w:pPr>
@@ -9553,69 +9610,69 @@
         </w:trPr>
         <w:tc>
           <w:tcPr>
-            <w:tcW w:w="1405" w:type="dxa"/>
-          </w:tcPr>
-          <w:p>
-            <w:pPr>
-              <w:pStyle w:val="TWCell"/>
-            </w:pPr>
-            <w:r>
-              <w:rPr>
-                <w:sz w:val="17"/>
-                <w:szCs w:val="17"/>
-              </w:rPr>
-              <w:t xml:space="preserve">평가 글 판정</w:t>
-            </w:r>
-          </w:p>
-        </w:tc>
-        <w:tc>
-          <w:tcPr>
-            <w:tcW w:w="2337" w:type="dxa"/>
-          </w:tcPr>
-          <w:p>
-            <w:pPr>
-              <w:pStyle w:val="TWCell"/>
-            </w:pPr>
-            <w:r>
-              <w:rPr>
-                <w:sz w:val="17"/>
-                <w:szCs w:val="17"/>
-              </w:rPr>
-              <w:t xml:space="preserve">규칙(항목만) · Jev · GLM-5.3-Flash · OpenAI</w:t>
-            </w:r>
-          </w:p>
-        </w:tc>
-        <w:tc>
-          <w:tcPr>
-            <w:tcW w:w="4396" w:type="dxa"/>
-          </w:tcPr>
-          <w:p>
-            <w:pPr>
-              <w:pStyle w:val="TWCell"/>
-            </w:pPr>
-            <w:r>
-              <w:rPr>
-                <w:sz w:val="17"/>
-                <w:szCs w:val="17"/>
-              </w:rPr>
-              <w:t xml:space="preserve">규칙은 글에 쓴 부정을, 감성 점수 API는 돌려 말한 지적을, 사내 후보는 그 절반을 놓친다. 규칙이면 나쁘게 쓴 사이가 협업 보상에 든다(3.5)</w:t>
-            </w:r>
-          </w:p>
-        </w:tc>
-        <w:tc>
-          <w:tcPr>
-            <w:tcW w:w="2178" w:type="dxa"/>
-          </w:tcPr>
-          <w:p>
-            <w:pPr>
-              <w:pStyle w:val="TWCell"/>
-            </w:pPr>
-            <w:r>
-              <w:rPr>
-                <w:sz w:val="17"/>
-                <w:szCs w:val="17"/>
-              </w:rPr>
-              <w:t xml:space="preserve">LLM(OpenAI) 판정</w:t>
+            <w:tcW w:w="1350" w:type="dxa"/>
+          </w:tcPr>
+          <w:p>
+            <w:pPr>
+              <w:pStyle w:val="TWCell"/>
+            </w:pPr>
+            <w:r>
+              <w:rPr>
+                <w:sz w:val="17"/>
+                <w:szCs w:val="17"/>
+              </w:rPr>
+              <w:t xml:space="preserve">신규 사업 편성의 허용 오차</w:t>
+            </w:r>
+          </w:p>
+        </w:tc>
+        <w:tc>
+          <w:tcPr>
+            <w:tcW w:w="2273" w:type="dxa"/>
+          </w:tcPr>
+          <w:p>
+            <w:pPr>
+              <w:pStyle w:val="TWCell"/>
+            </w:pPr>
+            <w:r>
+              <w:rPr>
+                <w:sz w:val="17"/>
+                <w:szCs w:val="17"/>
+              </w:rPr>
+              <w:t xml:space="preserve">5% · 0</w:t>
+            </w:r>
+          </w:p>
+        </w:tc>
+        <w:tc>
+          <w:tcPr>
+            <w:tcW w:w="4451" w:type="dxa"/>
+          </w:tcPr>
+          <w:p>
+            <w:pPr>
+              <w:pStyle w:val="TWCell"/>
+            </w:pPr>
+            <w:r>
+              <w:rPr>
+                <w:sz w:val="17"/>
+                <w:szCs w:val="17"/>
+              </w:rPr>
+              <w:t xml:space="preserve">빈자리 감점(자리당 100점)이 섞인 목적에서 5%는 1~2명 이동의 개선(1~2점)을 통째로 가려, "다른 사업에서 빼 오기를 허용한 쪽이 더 나쁜" 모순이 나왔다</w:t>
+            </w:r>
+          </w:p>
+        </w:tc>
+        <w:tc>
+          <w:tcPr>
+            <w:tcW w:w="2242" w:type="dxa"/>
+          </w:tcPr>
+          <w:p>
+            <w:pPr>
+              <w:pStyle w:val="TWCell"/>
+            </w:pPr>
+            <w:r>
+              <w:rPr>
+                <w:sz w:val="17"/>
+                <w:szCs w:val="17"/>
+              </w:rPr>
+              <w:t xml:space="preserve">허용 오차 0(K마다 최적 확인)</w:t>
             </w:r>
           </w:p>
         </w:tc>
@@ -9626,69 +9683,69 @@
         </w:trPr>
         <w:tc>
           <w:tcPr>
-            <w:tcW w:w="1405" w:type="dxa"/>
-          </w:tcPr>
-          <w:p>
-            <w:pPr>
-              <w:pStyle w:val="TWCell"/>
-            </w:pPr>
-            <w:r>
-              <w:rPr>
-                <w:sz w:val="17"/>
-                <w:szCs w:val="17"/>
-              </w:rPr>
-              <w:t xml:space="preserve">소명 글 방식</w:t>
-            </w:r>
-          </w:p>
-        </w:tc>
-        <w:tc>
-          <w:tcPr>
-            <w:tcW w:w="2337" w:type="dxa"/>
-          </w:tcPr>
-          <w:p>
-            <w:pPr>
-              <w:pStyle w:val="TWCell"/>
-            </w:pPr>
-            <w:r>
-              <w:rPr>
-                <w:sz w:val="17"/>
-                <w:szCs w:val="17"/>
-              </w:rPr>
-              <w:t xml:space="preserve">정해진 틀(템플릿) · GraphRAG</w:t>
-            </w:r>
-          </w:p>
-        </w:tc>
-        <w:tc>
-          <w:tcPr>
-            <w:tcW w:w="4396" w:type="dxa"/>
-          </w:tcPr>
-          <w:p>
-            <w:pPr>
-              <w:pStyle w:val="TWCell"/>
-            </w:pPr>
-            <w:r>
-              <w:rPr>
-                <w:sz w:val="17"/>
-                <w:szCs w:val="17"/>
-              </w:rPr>
-              <w:t xml:space="preserve">근거 오류는 둘 다 0, 읽기 쉬운 쪽으로 — 템플릿은 실패 시 대체 글로 유지</w:t>
-            </w:r>
-          </w:p>
-        </w:tc>
-        <w:tc>
-          <w:tcPr>
-            <w:tcW w:w="2178" w:type="dxa"/>
-          </w:tcPr>
-          <w:p>
-            <w:pPr>
-              <w:pStyle w:val="TWCell"/>
-            </w:pPr>
-            <w:r>
-              <w:rPr>
-                <w:sz w:val="17"/>
-                <w:szCs w:val="17"/>
-              </w:rPr>
-              <w:t xml:space="preserve">GraphRAG</w:t>
+            <w:tcW w:w="1350" w:type="dxa"/>
+          </w:tcPr>
+          <w:p>
+            <w:pPr>
+              <w:pStyle w:val="TWCell"/>
+            </w:pPr>
+            <w:r>
+              <w:rPr>
+                <w:sz w:val="17"/>
+                <w:szCs w:val="17"/>
+              </w:rPr>
+              <w:t xml:space="preserve">그래프 저장소</w:t>
+            </w:r>
+          </w:p>
+        </w:tc>
+        <w:tc>
+          <w:tcPr>
+            <w:tcW w:w="2273" w:type="dxa"/>
+          </w:tcPr>
+          <w:p>
+            <w:pPr>
+              <w:pStyle w:val="TWCell"/>
+            </w:pPr>
+            <w:r>
+              <w:rPr>
+                <w:sz w:val="17"/>
+                <w:szCs w:val="17"/>
+              </w:rPr>
+              <w:t xml:space="preserve">Neo4j(처음 설계) · RDF 추론 · 인메모리 그래프</w:t>
+            </w:r>
+          </w:p>
+        </w:tc>
+        <w:tc>
+          <w:tcPr>
+            <w:tcW w:w="4451" w:type="dxa"/>
+          </w:tcPr>
+          <w:p>
+            <w:pPr>
+              <w:pStyle w:val="TWCell"/>
+            </w:pPr>
+            <w:r>
+              <w:rPr>
+                <w:sz w:val="17"/>
+                <w:szCs w:val="17"/>
+              </w:rPr>
+              <w:t xml:space="preserve">설명용 질의 5종 비교 20번 중 Neo4j가 나은 경우 0, 속도는 메모리 &lt; SQLite &lt; Neo4j. RDF 추론은 "하위 기술 경력 70% 인정" 같은 가중 계산을 표현하지 못한다</w:t>
+            </w:r>
+          </w:p>
+        </w:tc>
+        <w:tc>
+          <w:tcPr>
+            <w:tcW w:w="2242" w:type="dxa"/>
+          </w:tcPr>
+          <w:p>
+            <w:pPr>
+              <w:pStyle w:val="TWCell"/>
+            </w:pPr>
+            <w:r>
+              <w:rPr>
+                <w:sz w:val="17"/>
+                <w:szCs w:val="17"/>
+              </w:rPr>
+              <w:t xml:space="preserve">인메모리 그래프 + SQLite 근거 색인</w:t>
             </w:r>
           </w:p>
         </w:tc>
@@ -9699,69 +9756,69 @@
         </w:trPr>
         <w:tc>
           <w:tcPr>
-            <w:tcW w:w="1405" w:type="dxa"/>
-          </w:tcPr>
-          <w:p>
-            <w:pPr>
-              <w:pStyle w:val="TWCell"/>
-            </w:pPr>
-            <w:r>
-              <w:rPr>
-                <w:sz w:val="17"/>
-                <w:szCs w:val="17"/>
-              </w:rPr>
-              <w:t xml:space="preserve">숙련도 표현</w:t>
-            </w:r>
-          </w:p>
-        </w:tc>
-        <w:tc>
-          <w:tcPr>
-            <w:tcW w:w="2337" w:type="dxa"/>
-          </w:tcPr>
-          <w:p>
-            <w:pPr>
-              <w:pStyle w:val="TWCell"/>
-            </w:pPr>
-            <w:r>
-              <w:rPr>
-                <w:sz w:val="17"/>
-                <w:szCs w:val="17"/>
-              </w:rPr>
-              <w:t xml:space="preserve">경력 개월 비율 직접 사용</w:t>
-            </w:r>
-          </w:p>
-        </w:tc>
-        <w:tc>
-          <w:tcPr>
-            <w:tcW w:w="4396" w:type="dxa"/>
-          </w:tcPr>
-          <w:p>
-            <w:pPr>
-              <w:pStyle w:val="TWCell"/>
-            </w:pPr>
-            <w:r>
-              <w:rPr>
-                <w:sz w:val="17"/>
-                <w:szCs w:val="17"/>
-              </w:rPr>
-              <w:t xml:space="preserve">가상 데이터로는 우열을 가릴 수 없고 바꾸는 비용이 큼</w:t>
-            </w:r>
-          </w:p>
-        </w:tc>
-        <w:tc>
-          <w:tcPr>
-            <w:tcW w:w="2178" w:type="dxa"/>
-          </w:tcPr>
-          <w:p>
-            <w:pPr>
-              <w:pStyle w:val="TWCell"/>
-            </w:pPr>
-            <w:r>
-              <w:rPr>
-                <w:sz w:val="17"/>
-                <w:szCs w:val="17"/>
-              </w:rPr>
-              <w:t xml:space="preserve">대리 레벨 유지</w:t>
+            <w:tcW w:w="1350" w:type="dxa"/>
+          </w:tcPr>
+          <w:p>
+            <w:pPr>
+              <w:pStyle w:val="TWCell"/>
+            </w:pPr>
+            <w:r>
+              <w:rPr>
+                <w:sz w:val="17"/>
+                <w:szCs w:val="17"/>
+              </w:rPr>
+              <w:t xml:space="preserve">평가 글 판정</w:t>
+            </w:r>
+          </w:p>
+        </w:tc>
+        <w:tc>
+          <w:tcPr>
+            <w:tcW w:w="2273" w:type="dxa"/>
+          </w:tcPr>
+          <w:p>
+            <w:pPr>
+              <w:pStyle w:val="TWCell"/>
+            </w:pPr>
+            <w:r>
+              <w:rPr>
+                <w:sz w:val="17"/>
+                <w:szCs w:val="17"/>
+              </w:rPr>
+              <w:t xml:space="preserve">규칙(항목만) · Jev · GLM-5.3-Flash · OpenAI</w:t>
+            </w:r>
+          </w:p>
+        </w:tc>
+        <w:tc>
+          <w:tcPr>
+            <w:tcW w:w="4451" w:type="dxa"/>
+          </w:tcPr>
+          <w:p>
+            <w:pPr>
+              <w:pStyle w:val="TWCell"/>
+            </w:pPr>
+            <w:r>
+              <w:rPr>
+                <w:sz w:val="17"/>
+                <w:szCs w:val="17"/>
+              </w:rPr>
+              <w:t xml:space="preserve">규칙은 글에 쓴 부정을, 감성 점수 API는 돌려 말한 지적을, 사내 후보는 그 절반을 놓친다. 규칙이면 나쁘게 쓴 사이가 협업 보상에 든다(3.5)</w:t>
+            </w:r>
+          </w:p>
+        </w:tc>
+        <w:tc>
+          <w:tcPr>
+            <w:tcW w:w="2242" w:type="dxa"/>
+          </w:tcPr>
+          <w:p>
+            <w:pPr>
+              <w:pStyle w:val="TWCell"/>
+            </w:pPr>
+            <w:r>
+              <w:rPr>
+                <w:sz w:val="17"/>
+                <w:szCs w:val="17"/>
+              </w:rPr>
+              <w:t xml:space="preserve">LLM(OpenAI) 판정</w:t>
             </w:r>
           </w:p>
         </w:tc>
@@ -9772,69 +9829,69 @@
         </w:trPr>
         <w:tc>
           <w:tcPr>
-            <w:tcW w:w="1405" w:type="dxa"/>
-          </w:tcPr>
-          <w:p>
-            <w:pPr>
-              <w:pStyle w:val="TWCell"/>
-            </w:pPr>
-            <w:r>
-              <w:rPr>
-                <w:sz w:val="17"/>
-                <w:szCs w:val="17"/>
-              </w:rPr>
-              <w:t xml:space="preserve">자리와 다른 등급을 넣을 때</w:t>
-            </w:r>
-          </w:p>
-        </w:tc>
-        <w:tc>
-          <w:tcPr>
-            <w:tcW w:w="2337" w:type="dxa"/>
-          </w:tcPr>
-          <w:p>
-            <w:pPr>
-              <w:pStyle w:val="TWCell"/>
-            </w:pPr>
-            <w:r>
-              <w:rPr>
-                <w:sz w:val="17"/>
-                <w:szCs w:val="17"/>
-              </w:rPr>
-              <w:t xml:space="preserve">확정 막기 · 정원을 말없이 늘리기 · 대체 + 사유</w:t>
-            </w:r>
-          </w:p>
-        </w:tc>
-        <w:tc>
-          <w:tcPr>
-            <w:tcW w:w="4396" w:type="dxa"/>
-          </w:tcPr>
-          <w:p>
-            <w:pPr>
-              <w:pStyle w:val="TWCell"/>
-            </w:pPr>
-            <w:r>
-              <w:rPr>
-                <w:sz w:val="17"/>
-                <w:szCs w:val="17"/>
-              </w:rPr>
-              <w:t xml:space="preserve">막으면 현장 관행(중급 대신 초급, 중급이 없어 고급)을 못 담고, 말없이 늘리면 부족 신호와 판단 근거가 사라진다</w:t>
-            </w:r>
-          </w:p>
-        </w:tc>
-        <w:tc>
-          <w:tcPr>
-            <w:tcW w:w="2178" w:type="dxa"/>
-          </w:tcPr>
-          <w:p>
-            <w:pPr>
-              <w:pStyle w:val="TWCell"/>
-            </w:pPr>
-            <w:r>
-              <w:rPr>
-                <w:sz w:val="17"/>
-                <w:szCs w:val="17"/>
-              </w:rPr>
-              <w:t xml:space="preserve">사용자 결정: 위·아래 허용, 사유 필수, 넘친 예산 증액</w:t>
+            <w:tcW w:w="1350" w:type="dxa"/>
+          </w:tcPr>
+          <w:p>
+            <w:pPr>
+              <w:pStyle w:val="TWCell"/>
+            </w:pPr>
+            <w:r>
+              <w:rPr>
+                <w:sz w:val="17"/>
+                <w:szCs w:val="17"/>
+              </w:rPr>
+              <w:t xml:space="preserve">상황 글 → 요구 기술</w:t>
+            </w:r>
+          </w:p>
+        </w:tc>
+        <w:tc>
+          <w:tcPr>
+            <w:tcW w:w="2273" w:type="dxa"/>
+          </w:tcPr>
+          <w:p>
+            <w:pPr>
+              <w:pStyle w:val="TWCell"/>
+            </w:pPr>
+            <w:r>
+              <w:rPr>
+                <w:sz w:val="17"/>
+                <w:szCs w:val="17"/>
+              </w:rPr>
+              <w:t xml:space="preserve">사전 이름 찾기 · AI</w:t>
+            </w:r>
+          </w:p>
+        </w:tc>
+        <w:tc>
+          <w:tcPr>
+            <w:tcW w:w="4451" w:type="dxa"/>
+          </w:tcPr>
+          <w:p>
+            <w:pPr>
+              <w:pStyle w:val="TWCell"/>
+            </w:pPr>
+            <w:r>
+              <w:rPr>
+                <w:sz w:val="17"/>
+                <w:szCs w:val="17"/>
+              </w:rPr>
+              <w:t xml:space="preserve">사전 찾기는 재현율 83.6%, 일로만 설명한 요구는 0% — AI는 100%(3.3)</w:t>
+            </w:r>
+          </w:p>
+        </w:tc>
+        <w:tc>
+          <w:tcPr>
+            <w:tcW w:w="2242" w:type="dxa"/>
+          </w:tcPr>
+          <w:p>
+            <w:pPr>
+              <w:pStyle w:val="TWCell"/>
+            </w:pPr>
+            <w:r>
+              <w:rPr>
+                <w:sz w:val="17"/>
+                <w:szCs w:val="17"/>
+              </w:rPr>
+              <w:t xml:space="preserve">AI가 사전 개념으로 옮기고 서버가 검사, 사람 정보는 보내지 않음</w:t>
             </w:r>
           </w:p>
         </w:tc>
@@ -9845,7 +9902,518 @@
         </w:trPr>
         <w:tc>
           <w:tcPr>
-            <w:tcW w:w="1405" w:type="dxa"/>
+            <w:tcW w:w="1350" w:type="dxa"/>
+          </w:tcPr>
+          <w:p>
+            <w:pPr>
+              <w:pStyle w:val="TWCell"/>
+            </w:pPr>
+            <w:r>
+              <w:rPr>
+                <w:sz w:val="17"/>
+                <w:szCs w:val="17"/>
+              </w:rPr>
+              <w:t xml:space="preserve">발주 자료 → 필요 기술</w:t>
+            </w:r>
+          </w:p>
+        </w:tc>
+        <w:tc>
+          <w:tcPr>
+            <w:tcW w:w="2273" w:type="dxa"/>
+          </w:tcPr>
+          <w:p>
+            <w:pPr>
+              <w:pStyle w:val="TWCell"/>
+            </w:pPr>
+            <w:r>
+              <w:rPr>
+                <w:sz w:val="17"/>
+                <w:szCs w:val="17"/>
+              </w:rPr>
+              <w:t xml:space="preserve">규칙(사전 + 문장 말) · AI 자동 반영 · AI 제안 + 사람 확인</w:t>
+            </w:r>
+          </w:p>
+        </w:tc>
+        <w:tc>
+          <w:tcPr>
+            <w:tcW w:w="4451" w:type="dxa"/>
+          </w:tcPr>
+          <w:p>
+            <w:pPr>
+              <w:pStyle w:val="TWCell"/>
+            </w:pPr>
+            <w:r>
+              <w:rPr>
+                <w:sz w:val="17"/>
+                <w:szCs w:val="17"/>
+              </w:rPr>
+              <w:t xml:space="preserve">실제 공공 자료 10편 정밀도 규칙 0.32 · AI 0.78(3.3) — AI도 틀린 기술을 고르므로 자동 반영은 위험하다</w:t>
+            </w:r>
+          </w:p>
+        </w:tc>
+        <w:tc>
+          <w:tcPr>
+            <w:tcW w:w="2242" w:type="dxa"/>
+          </w:tcPr>
+          <w:p>
+            <w:pPr>
+              <w:pStyle w:val="TWCell"/>
+            </w:pPr>
+            <w:r>
+              <w:rPr>
+                <w:sz w:val="17"/>
+                <w:szCs w:val="17"/>
+              </w:rPr>
+              <w:t xml:space="preserve">근거 말과 함께 제안, 사람이 체크</w:t>
+            </w:r>
+          </w:p>
+        </w:tc>
+      </w:tr>
+      <w:tr>
+        <w:trPr>
+          <w:cantSplit/>
+        </w:trPr>
+        <w:tc>
+          <w:tcPr>
+            <w:tcW w:w="1350" w:type="dxa"/>
+          </w:tcPr>
+          <w:p>
+            <w:pPr>
+              <w:pStyle w:val="TWCell"/>
+            </w:pPr>
+            <w:r>
+              <w:rPr>
+                <w:sz w:val="17"/>
+                <w:szCs w:val="17"/>
+              </w:rPr>
+              <w:t xml:space="preserve">긴 발주 자료</w:t>
+            </w:r>
+          </w:p>
+        </w:tc>
+        <w:tc>
+          <w:tcPr>
+            <w:tcW w:w="2273" w:type="dxa"/>
+          </w:tcPr>
+          <w:p>
+            <w:pPr>
+              <w:pStyle w:val="TWCell"/>
+            </w:pPr>
+            <w:r>
+              <w:rPr>
+                <w:sz w:val="17"/>
+                <w:szCs w:val="17"/>
+              </w:rPr>
+              <w:t xml:space="preserve">앞 4만 자만 · 나눠 동시에 읽기</w:t>
+            </w:r>
+          </w:p>
+        </w:tc>
+        <w:tc>
+          <w:tcPr>
+            <w:tcW w:w="4451" w:type="dxa"/>
+          </w:tcPr>
+          <w:p>
+            <w:pPr>
+              <w:pStyle w:val="TWCell"/>
+            </w:pPr>
+            <w:r>
+              <w:rPr>
+                <w:sz w:val="17"/>
+                <w:szCs w:val="17"/>
+              </w:rPr>
+              <w:t xml:space="preserve">8.3만 자 가상 자료에서 요약 항목 26개 중 13개가 4만 자 뒤에 있었다. 사업명·기간·예산은 공고문 앞머리에 있다</w:t>
+            </w:r>
+          </w:p>
+        </w:tc>
+        <w:tc>
+          <w:tcPr>
+            <w:tcW w:w="2242" w:type="dxa"/>
+          </w:tcPr>
+          <w:p>
+            <w:pPr>
+              <w:pStyle w:val="TWCell"/>
+            </w:pPr>
+            <w:r>
+              <w:rPr>
+                <w:sz w:val="17"/>
+                <w:szCs w:val="17"/>
+              </w:rPr>
+              <w:t xml:space="preserve">필요 기술·요약은 나눠 읽기, 정보 채우기는 앞부분만</w:t>
+            </w:r>
+          </w:p>
+        </w:tc>
+      </w:tr>
+      <w:tr>
+        <w:trPr>
+          <w:cantSplit/>
+        </w:trPr>
+        <w:tc>
+          <w:tcPr>
+            <w:tcW w:w="1350" w:type="dxa"/>
+          </w:tcPr>
+          <w:p>
+            <w:pPr>
+              <w:pStyle w:val="TWCell"/>
+            </w:pPr>
+            <w:r>
+              <w:rPr>
+                <w:sz w:val="17"/>
+                <w:szCs w:val="17"/>
+              </w:rPr>
+              <w:t xml:space="preserve">낯선 기술 이름 정리</w:t>
+            </w:r>
+          </w:p>
+        </w:tc>
+        <w:tc>
+          <w:tcPr>
+            <w:tcW w:w="2273" w:type="dxa"/>
+          </w:tcPr>
+          <w:p>
+            <w:pPr>
+              <w:pStyle w:val="TWCell"/>
+            </w:pPr>
+            <w:r>
+              <w:rPr>
+                <w:sz w:val="17"/>
+                <w:szCs w:val="17"/>
+              </w:rPr>
+              <w:t xml:space="preserve">문자열 유사도 · AI 자동 합치기 · AI 후보 + 관리자 승인</w:t>
+            </w:r>
+          </w:p>
+        </w:tc>
+        <w:tc>
+          <w:tcPr>
+            <w:tcW w:w="4451" w:type="dxa"/>
+          </w:tcPr>
+          <w:p>
+            <w:pPr>
+              <w:pStyle w:val="TWCell"/>
+            </w:pPr>
+            <w:r>
+              <w:rPr>
+                <w:sz w:val="17"/>
+                <w:szCs w:val="17"/>
+              </w:rPr>
+              <w:t xml:space="preserve">1위 정답 문자열 27% · AI 95%(3.3) — 남은 5%와 Java↔JavaScript 같은 헷갈리는 짝 때문에 자동 승인은 두지 않음</w:t>
+            </w:r>
+          </w:p>
+        </w:tc>
+        <w:tc>
+          <w:tcPr>
+            <w:tcW w:w="2242" w:type="dxa"/>
+          </w:tcPr>
+          <w:p>
+            <w:pPr>
+              <w:pStyle w:val="TWCell"/>
+            </w:pPr>
+            <w:r>
+              <w:rPr>
+                <w:sz w:val="17"/>
+                <w:szCs w:val="17"/>
+              </w:rPr>
+              <w:t xml:space="preserve">후보 3개 중 관리자 승인</w:t>
+            </w:r>
+          </w:p>
+        </w:tc>
+      </w:tr>
+      <w:tr>
+        <w:trPr>
+          <w:cantSplit/>
+        </w:trPr>
+        <w:tc>
+          <w:tcPr>
+            <w:tcW w:w="1350" w:type="dxa"/>
+          </w:tcPr>
+          <w:p>
+            <w:pPr>
+              <w:pStyle w:val="TWCell"/>
+            </w:pPr>
+            <w:r>
+              <w:rPr>
+                <w:sz w:val="17"/>
+                <w:szCs w:val="17"/>
+              </w:rPr>
+              <w:t xml:space="preserve">소명 글 방식</w:t>
+            </w:r>
+          </w:p>
+        </w:tc>
+        <w:tc>
+          <w:tcPr>
+            <w:tcW w:w="2273" w:type="dxa"/>
+          </w:tcPr>
+          <w:p>
+            <w:pPr>
+              <w:pStyle w:val="TWCell"/>
+            </w:pPr>
+            <w:r>
+              <w:rPr>
+                <w:sz w:val="17"/>
+                <w:szCs w:val="17"/>
+              </w:rPr>
+              <w:t xml:space="preserve">정해진 틀(템플릿) · GraphRAG</w:t>
+            </w:r>
+          </w:p>
+        </w:tc>
+        <w:tc>
+          <w:tcPr>
+            <w:tcW w:w="4451" w:type="dxa"/>
+          </w:tcPr>
+          <w:p>
+            <w:pPr>
+              <w:pStyle w:val="TWCell"/>
+            </w:pPr>
+            <w:r>
+              <w:rPr>
+                <w:sz w:val="17"/>
+                <w:szCs w:val="17"/>
+              </w:rPr>
+              <w:t xml:space="preserve">근거 오류는 둘 다 0, 읽기 쉬운 쪽으로 — 템플릿은 실패 시 대체 글로 유지</w:t>
+            </w:r>
+          </w:p>
+        </w:tc>
+        <w:tc>
+          <w:tcPr>
+            <w:tcW w:w="2242" w:type="dxa"/>
+          </w:tcPr>
+          <w:p>
+            <w:pPr>
+              <w:pStyle w:val="TWCell"/>
+            </w:pPr>
+            <w:r>
+              <w:rPr>
+                <w:sz w:val="17"/>
+                <w:szCs w:val="17"/>
+              </w:rPr>
+              <w:t xml:space="preserve">GraphRAG</w:t>
+            </w:r>
+          </w:p>
+        </w:tc>
+      </w:tr>
+      <w:tr>
+        <w:trPr>
+          <w:cantSplit/>
+        </w:trPr>
+        <w:tc>
+          <w:tcPr>
+            <w:tcW w:w="1350" w:type="dxa"/>
+          </w:tcPr>
+          <w:p>
+            <w:pPr>
+              <w:pStyle w:val="TWCell"/>
+            </w:pPr>
+            <w:r>
+              <w:rPr>
+                <w:sz w:val="17"/>
+                <w:szCs w:val="17"/>
+              </w:rPr>
+              <w:t xml:space="preserve">숙련도 표현</w:t>
+            </w:r>
+          </w:p>
+        </w:tc>
+        <w:tc>
+          <w:tcPr>
+            <w:tcW w:w="2273" w:type="dxa"/>
+          </w:tcPr>
+          <w:p>
+            <w:pPr>
+              <w:pStyle w:val="TWCell"/>
+            </w:pPr>
+            <w:r>
+              <w:rPr>
+                <w:sz w:val="17"/>
+                <w:szCs w:val="17"/>
+              </w:rPr>
+              <w:t xml:space="preserve">경력 개월 비율 직접 사용</w:t>
+            </w:r>
+          </w:p>
+        </w:tc>
+        <w:tc>
+          <w:tcPr>
+            <w:tcW w:w="4451" w:type="dxa"/>
+          </w:tcPr>
+          <w:p>
+            <w:pPr>
+              <w:pStyle w:val="TWCell"/>
+            </w:pPr>
+            <w:r>
+              <w:rPr>
+                <w:sz w:val="17"/>
+                <w:szCs w:val="17"/>
+              </w:rPr>
+              <w:t xml:space="preserve">가상 데이터로는 우열을 가릴 수 없고 바꾸는 비용이 큼</w:t>
+            </w:r>
+          </w:p>
+        </w:tc>
+        <w:tc>
+          <w:tcPr>
+            <w:tcW w:w="2242" w:type="dxa"/>
+          </w:tcPr>
+          <w:p>
+            <w:pPr>
+              <w:pStyle w:val="TWCell"/>
+            </w:pPr>
+            <w:r>
+              <w:rPr>
+                <w:sz w:val="17"/>
+                <w:szCs w:val="17"/>
+              </w:rPr>
+              <w:t xml:space="preserve">대리 레벨 유지</w:t>
+            </w:r>
+          </w:p>
+        </w:tc>
+      </w:tr>
+      <w:tr>
+        <w:trPr>
+          <w:cantSplit/>
+        </w:trPr>
+        <w:tc>
+          <w:tcPr>
+            <w:tcW w:w="1350" w:type="dxa"/>
+          </w:tcPr>
+          <w:p>
+            <w:pPr>
+              <w:pStyle w:val="TWCell"/>
+            </w:pPr>
+            <w:r>
+              <w:rPr>
+                <w:sz w:val="17"/>
+                <w:szCs w:val="17"/>
+              </w:rPr>
+              <w:t xml:space="preserve">자리와 다른 등급을 넣을 때</w:t>
+            </w:r>
+          </w:p>
+        </w:tc>
+        <w:tc>
+          <w:tcPr>
+            <w:tcW w:w="2273" w:type="dxa"/>
+          </w:tcPr>
+          <w:p>
+            <w:pPr>
+              <w:pStyle w:val="TWCell"/>
+            </w:pPr>
+            <w:r>
+              <w:rPr>
+                <w:sz w:val="17"/>
+                <w:szCs w:val="17"/>
+              </w:rPr>
+              <w:t xml:space="preserve">확정 막기 · 정원을 말없이 늘리기 · 대체 + 사유</w:t>
+            </w:r>
+          </w:p>
+        </w:tc>
+        <w:tc>
+          <w:tcPr>
+            <w:tcW w:w="4451" w:type="dxa"/>
+          </w:tcPr>
+          <w:p>
+            <w:pPr>
+              <w:pStyle w:val="TWCell"/>
+            </w:pPr>
+            <w:r>
+              <w:rPr>
+                <w:sz w:val="17"/>
+                <w:szCs w:val="17"/>
+              </w:rPr>
+              <w:t xml:space="preserve">막으면 현장 관행(중급 대신 초급, 중급이 없어 고급)을 못 담고, 말없이 늘리면 부족 신호와 판단 근거가 사라진다</w:t>
+            </w:r>
+          </w:p>
+        </w:tc>
+        <w:tc>
+          <w:tcPr>
+            <w:tcW w:w="2242" w:type="dxa"/>
+          </w:tcPr>
+          <w:p>
+            <w:pPr>
+              <w:pStyle w:val="TWCell"/>
+            </w:pPr>
+            <w:r>
+              <w:rPr>
+                <w:sz w:val="17"/>
+                <w:szCs w:val="17"/>
+              </w:rPr>
+              <w:t xml:space="preserve">사용자 결정: 위·아래 허용, 사유 필수, 넘친 예산 증액</w:t>
+            </w:r>
+          </w:p>
+        </w:tc>
+      </w:tr>
+      <w:tr>
+        <w:trPr>
+          <w:cantSplit/>
+        </w:trPr>
+        <w:tc>
+          <w:tcPr>
+            <w:tcW w:w="1350" w:type="dxa"/>
+          </w:tcPr>
+          <w:p>
+            <w:pPr>
+              <w:pStyle w:val="TWCell"/>
+            </w:pPr>
+            <w:r>
+              <w:rPr>
+                <w:sz w:val="17"/>
+                <w:szCs w:val="17"/>
+              </w:rPr>
+              <w:t xml:space="preserve">확정 무르기</w:t>
+            </w:r>
+          </w:p>
+        </w:tc>
+        <w:tc>
+          <w:tcPr>
+            <w:tcW w:w="2273" w:type="dxa"/>
+          </w:tcPr>
+          <w:p>
+            <w:pPr>
+              <w:pStyle w:val="TWCell"/>
+            </w:pPr>
+            <w:r>
+              <w:rPr>
+                <w:sz w:val="17"/>
+                <w:szCs w:val="17"/>
+              </w:rPr>
+              <w:t xml:space="preserve">마지막 판부터 되돌리기만 · 그 확정 한 건만 취소</w:t>
+            </w:r>
+          </w:p>
+        </w:tc>
+        <w:tc>
+          <w:tcPr>
+            <w:tcW w:w="4451" w:type="dxa"/>
+          </w:tcPr>
+          <w:p>
+            <w:pPr>
+              <w:pStyle w:val="TWCell"/>
+            </w:pPr>
+            <w:r>
+              <w:rPr>
+                <w:sz w:val="17"/>
+                <w:szCs w:val="17"/>
+              </w:rPr>
+              <w:t xml:space="preserve">되돌리기만 있으면 그 뒤에 한 다른 확정까지 함께 사라진다</w:t>
+            </w:r>
+          </w:p>
+        </w:tc>
+        <w:tc>
+          <w:tcPr>
+            <w:tcW w:w="2242" w:type="dxa"/>
+          </w:tcPr>
+          <w:p>
+            <w:pPr>
+              <w:pStyle w:val="TWCell"/>
+            </w:pPr>
+            <w:r>
+              <w:rPr>
+                <w:sz w:val="17"/>
+                <w:szCs w:val="17"/>
+              </w:rPr>
+              <w:t xml:space="preserve">둘 다(취소는 지금 판 위에서 거꾸로 적용)</w:t>
+            </w:r>
+          </w:p>
+        </w:tc>
+      </w:tr>
+      <w:tr>
+        <w:trPr>
+          <w:cantSplit/>
+        </w:trPr>
+        <w:tc>
+          <w:tcPr>
+            <w:tcW w:w="1350" w:type="dxa"/>
           </w:tcPr>
           <w:p>
             <w:pPr>
@@ -9862,7 +10430,7 @@
         </w:tc>
         <w:tc>
           <w:tcPr>
-            <w:tcW w:w="2337" w:type="dxa"/>
+            <w:tcW w:w="2273" w:type="dxa"/>
           </w:tcPr>
           <w:p>
             <w:pPr>
@@ -9879,7 +10447,7 @@
         </w:tc>
         <w:tc>
           <w:tcPr>
-            <w:tcW w:w="4396" w:type="dxa"/>
+            <w:tcW w:w="4451" w:type="dxa"/>
           </w:tcPr>
           <w:p>
             <w:pPr>
@@ -9896,7 +10464,7 @@
         </w:tc>
         <w:tc>
           <w:tcPr>
-            <w:tcW w:w="2178" w:type="dxa"/>
+            <w:tcW w:w="2242" w:type="dxa"/>
           </w:tcPr>
           <w:p>
             <w:pPr>

</xml_diff>

<commit_message>
docs: final report 1.5 'the decision is the equation's, its values come from AI' -- which values come from text (requirements, skill names, peer reviews), what AI does, what it costs without AI, and which values need no AI; 5.1 diagram, 2 summary card, 3.3 lead, 3.4, 4 and 8.4 point to it; duplicate 1.4 principle row dropped, a shorter 2.1 lead, and the 3.3 and 8.3 tables split by row so it stays at 10 pages; PDF and Word rebuilt
Co-Authored-By: Claude Opus 5.5 <noreply@anthropic.com>
Claude-Session: https://claude.ai/code/session_01XiJnTNFVeV2BokGGcyeQom
</commit_message>
<xml_diff>
--- a/outputs/final-report.docx
+++ b/outputs/final-report.docx
@@ -717,50 +717,145 @@
           </w:p>
         </w:tc>
       </w:tr>
-      <w:tr>
-        <w:trPr>
-          <w:cantSplit/>
-        </w:trPr>
-        <w:tc>
-          <w:tcPr>
-            <w:tcW w:w="2099" w:type="dxa"/>
-          </w:tcPr>
-          <w:p>
-            <w:pPr>
-              <w:pStyle w:val="TWCell"/>
-            </w:pPr>
-            <w:r>
-              <w:rPr>
-                <w:sz w:val="17"/>
-                <w:szCs w:val="17"/>
-              </w:rPr>
-              <w:t xml:space="preserve">지킨 원칙</w:t>
-            </w:r>
-          </w:p>
-        </w:tc>
-        <w:tc>
-          <w:tcPr>
-            <w:tcW w:w="8218" w:type="dxa"/>
-          </w:tcPr>
-          <w:p>
-            <w:pPr>
-              <w:pStyle w:val="TWCell"/>
-            </w:pPr>
-            <w:r>
-              <w:rPr>
-                <w:sz w:val="17"/>
-                <w:szCs w:val="17"/>
-              </w:rPr>
-              <w:t xml:space="preserve">목표 수치를 위해 생성기·계수를 고치지 않는다. 가상 성과로 모델의 효과를 "입증"하지 않는다(자기가 만든 규칙을 다시 찾는 순환이므로)</w:t>
-            </w:r>
-          </w:p>
-        </w:tc>
-      </w:tr>
     </w:tbl>
     <w:p>
       <w:pPr>
         <w:pStyle w:val="TWAfterTable"/>
       </w:pPr>
+    </w:p>
+    <w:p>
+      <w:pPr>
+        <w:pStyle w:val="Heading2"/>
+      </w:pPr>
+      <w:r>
+        <w:t xml:space="preserve">1.5 접근 — 결정은 방정식이, 방정식에 들어갈 값은 AI가</w:t>
+      </w:r>
+    </w:p>
+    <w:p>
+      <w:r>
+        <w:t xml:space="preserve">프로젝트 인력 배치는 생성형 AI가 아니라 </w:t>
+      </w:r>
+      <w:r>
+        <w:rPr>
+          <w:b/>
+          <w:bCs/>
+        </w:rPr>
+        <w:t xml:space="preserve">수학 최적화(방정식 + 솔버)</w:t>
+      </w:r>
+      <w:r>
+        <w:t xml:space="preserve">가 정한다 — 조건을 모두 지키는 최선의 배치는 방정식이 더 정확하다(LLM에게 직접 맡기면 최적화 결과의 55%, 3.4). 다만 방정식에 들어갈 값 일부는 </w:t>
+      </w:r>
+      <w:r>
+        <w:rPr>
+          <w:b/>
+          <w:bCs/>
+        </w:rPr>
+        <w:t xml:space="preserve">글</w:t>
+      </w:r>
+      <w:r>
+        <w:t xml:space="preserve">에 있어, 그 값과 결과의 근거 글을 AI가 만든다.</w:t>
+      </w:r>
+    </w:p>
+    <w:p>
+      <w:pPr>
+        <w:pStyle w:val="TWList"/>
+        <w:numPr>
+          <w:ilvl w:val="0"/>
+          <w:numId w:val="1"/>
+        </w:numPr>
+      </w:pPr>
+      <w:r>
+        <w:rPr>
+          <w:b/>
+          <w:bCs/>
+        </w:rPr>
+        <w:t xml:space="preserve">사업의 요구 기술·인원·기간·예산</w:t>
+      </w:r>
+      <w:r>
+        <w:t xml:space="preserve"> ← 발주 자료, 부서장의 말: AI가 사전 개념으로 옮겨 근거와 함께 제안하고 사람이 체크한다. AI가 없으면 자료를 다 읽고 고른다(편당 40분~2.4시간, 추정 · 규칙은 정밀도 0.32, 3.3).</w:t>
+      </w:r>
+    </w:p>
+    <w:p>
+      <w:pPr>
+        <w:pStyle w:val="TWList"/>
+        <w:numPr>
+          <w:ilvl w:val="0"/>
+          <w:numId w:val="1"/>
+        </w:numPr>
+      </w:pPr>
+      <w:r>
+        <w:rPr>
+          <w:b/>
+          <w:bCs/>
+        </w:rPr>
+        <w:t xml:space="preserve">사람의 기술 경력</w:t>
+      </w:r>
+      <w:r>
+        <w:t xml:space="preserve"> ← 제각각인 기술 이름: AI가 사전 후보 3개와 이유를 내고 관리자가 승인한다(없으면 손으로, 300개 약 5시간, 추정).</w:t>
+      </w:r>
+    </w:p>
+    <w:p>
+      <w:pPr>
+        <w:pStyle w:val="TWList"/>
+        <w:numPr>
+          <w:ilvl w:val="0"/>
+          <w:numId w:val="1"/>
+        </w:numPr>
+      </w:pPr>
+      <w:r>
+        <w:rPr>
+          <w:b/>
+          <w:bCs/>
+        </w:rPr>
+        <w:t xml:space="preserve">협업 점수의 평가 몫(0.6)</w:t>
+      </w:r>
+      <w:r>
+        <w:t xml:space="preserve"> ← 동료 평가 글: AI가 글의 좋고 나쁨을 판정한다. AI가 없으면 다 읽는다(300명 약 33시간, 추정 · 항목만 세면 혹평의 88%를 놓친다, 3.5).</w:t>
+      </w:r>
+    </w:p>
+    <w:p>
+      <w:pPr>
+        <w:pStyle w:val="TWList"/>
+        <w:numPr>
+          <w:ilvl w:val="0"/>
+          <w:numId w:val="1"/>
+        </w:numPr>
+      </w:pPr>
+      <w:r>
+        <w:rPr>
+          <w:b/>
+          <w:bCs/>
+        </w:rPr>
+        <w:t xml:space="preserve">가용률·경력 개월·함께 일한 개월</w:t>
+      </w:r>
+      <w:r>
+        <w:t xml:space="preserve">(인사 시스템)과 </w:t>
+      </w:r>
+      <w:r>
+        <w:rPr>
+          <w:b/>
+          <w:bCs/>
+        </w:rPr>
+        <w:t xml:space="preserve">등록된 사업의 정원·예산</w:t>
+      </w:r>
+      <w:r>
+        <w:t xml:space="preserve">은 숫자 그대로 쓴다 — AI를 쓰지 않는다.</w:t>
+      </w:r>
+    </w:p>
+    <w:p>
+      <w:r>
+        <w:t xml:space="preserve">AI 없이도 돌아가지만(규칙 대체) 규칙으로 채운 값은 크게 틀리고 </w:t>
+      </w:r>
+      <w:r>
+        <w:rPr>
+          <w:b/>
+          <w:bCs/>
+        </w:rPr>
+        <w:t xml:space="preserve">틀린 값도 최적화는 그대로 최적으로 푼다</w:t>
+      </w:r>
+      <w:r>
+        <w:t xml:space="preserve"> — 규칙 판정이면 100명에서 서로 나쁘게 평가한 28쌍이 협업 보상을 받았다(AI 0쌍, 3.5). 그래서 AI 결과는 사전·원문과 대조하고, 요구 기술·기술 이름은 사람이 고른 것만 넣는다(6.5).</w:t>
+      </w:r>
     </w:p>
     <w:p>
       <w:pPr>
@@ -1016,14 +1111,14 @@
                 <w:sz w:val="16"/>
                 <w:szCs w:val="16"/>
               </w:rPr>
-              <w:t xml:space="preserve">배치는 최적화 엔진이, AI는 글 읽기·쓰기를</w:t>
+              <w:t xml:space="preserve">배치는 최적화 엔진이, 그 입력값은 AI가</w:t>
             </w:r>
             <w:r>
               <w:rPr>
                 <w:sz w:val="16"/>
                 <w:szCs w:val="16"/>
               </w:rPr>
-              <w:t xml:space="preserve"> 맡도록 나눴다(3.4·3.7)</w:t>
+              <w:t xml:space="preserve"> 만든다(1.5·3.4·3.7)</w:t>
             </w:r>
           </w:p>
         </w:tc>
@@ -1044,7 +1139,7 @@
     </w:p>
     <w:p>
       <w:r>
-        <w:t xml:space="preserve">화면 흐름은 시연 영상이 순서대로 보여 준다 — 입력 검증·낯선 기술 이름 정리, 연간 계획과 안 확정, 소명 글, What-if, 신규 사업 편성, 긴급 투입·상황을 말로, 인사팀 검토 자료·변경 보고서, 300명 조직·조직 기술 지도. 여기에는 영상에 나오지 않거나 지나가는 기능과 확정 규칙만 적는다.</w:t>
+        <w:t xml:space="preserve">화면 흐름(입력 검증부터 신규 사업 편성·긴급 투입·인사팀 검토 자료·300명 조직까지)은 시연 영상이 보여 주므로, 여기에는 영상에 나오지 않거나 지나가는 기능과 확정 규칙만 적는다.</w:t>
       </w:r>
     </w:p>
     <w:tbl>
@@ -2791,17 +2886,7 @@
     </w:p>
     <w:p>
       <w:r>
-        <w:t xml:space="preserve">AI는 배치를 정하지 않는다(3.4). </w:t>
-      </w:r>
-      <w:r>
-        <w:rPr>
-          <w:b/>
-          <w:bCs/>
-        </w:rPr>
-        <w:t xml:space="preserve">사람이 다 읽을 수 없는 글을 읽고, 근거 글을 쓰고, 부서장의 말을 사전 말로 옮기는</w:t>
-      </w:r>
-      <w:r>
-        <w:t xml:space="preserve"> 곳에만 쓰고, 같은 일을 AI 없이(규칙·사전·문자열) 할 때와 나란히 쟀다. 판정 기준은 측정 전에 먼저 정해 고정했다.</w:t>
+        <w:t xml:space="preserve">1.5의 값을 AI가 만드는 일을, 같은 일을 AI 없이(규칙·사전·문자열) 할 때와 나란히 쟀다. 판정 기준은 측정 전에 먼저 정해 고정했다.</w:t>
       </w:r>
     </w:p>
     <w:tbl>
@@ -3777,10 +3862,10 @@
           <w:b/>
           <w:bCs/>
         </w:rPr>
-        <w:t xml:space="preserve">배치 결정은 솔버가, AI는 읽기·쓰기를</w:t>
-      </w:r>
-      <w:r>
-        <w:t xml:space="preserve"> 맡는 구조의 근거.</w:t>
+        <w:t xml:space="preserve">배치는 방정식이, 그 값은 AI가</w:t>
+      </w:r>
+      <w:r>
+        <w:t xml:space="preserve"> 만드는 구조(1.5)의 근거.</w:t>
       </w:r>
     </w:p>
     <w:p>
@@ -5979,10 +6064,10 @@
           <w:b/>
           <w:bCs/>
         </w:rPr>
-        <w:t xml:space="preserve">생성형 AI를 "검사받는 부품"으로 썼다.</w:t>
-      </w:r>
-      <w:r>
-        <w:t xml:space="preserve"> 결정은 최적화가, 읽기와 쓰기는 AI가 맡는다는 경계를 실험으로 정했다 — LLM 직접 배치(3.4)는 규모가 커지면 무너지고, 평가 글 판정(3.5)은 규칙으로는 안 된다. AI 글은 기계 검사를 통과해야 나가고(소명 글은 사실 번호와 연결 말만 고르고, 교체 설명은 인용을 원문과 대조), 걸리면 규칙 기반 글로 대신한다.</w:t>
+        <w:t xml:space="preserve">생성형 AI를 방정식의 값과 근거 글을 만드는 "검사받는 부품"으로 썼다(1.5).</w:t>
+      </w:r>
+      <w:r>
+        <w:t xml:space="preserve"> 결과는 기계 검사를 통과해야 쓰인다.</w:t>
       </w:r>
     </w:p>
     <w:p>
@@ -6438,14 +6523,14 @@
                 <w:sz w:val="16"/>
                 <w:szCs w:val="16"/>
               </w:rPr>
-              <w:t xml:space="preserve">평가 글 판정</w:t>
+              <w:t xml:space="preserve">방정식의 값</w:t>
             </w:r>
             <w:r>
               <w:rPr>
                 <w:sz w:val="16"/>
                 <w:szCs w:val="16"/>
               </w:rPr>
-              <w:t xml:space="preserve"> 극성 → C</w:t>
+              <w:t xml:space="preserve"> 평가 글 → 협업 점수 C, 발주 자료·상황 글 → 요구 기술(사람 체크), 기술 이름 → 사전(관리자 승인)</w:t>
             </w:r>
           </w:p>
           <w:p>
@@ -6606,7 +6691,7 @@
         <w:rPr>
           <w:color w:val="5B6168"/>
         </w:rPr>
-        <w:t xml:space="preserve">흐름: 입력이 검증을 통과하면 활성 데이터가 바뀌고, 점수·그래프를 만든 뒤 MILP를 푼다. 솔버의 해는 독립 검증을 통과해야 API가 내보내고, AI 글은 각 검사기를 통과해야 내보낸다(실패 시 규칙 기반 글).</w:t>
+        <w:t xml:space="preserve">흐름: 숫자는 검증을 거쳐 그대로, 글에서 나오는 값은 AI가 만들고 검사(요구 기술·기술 이름은 사람 확인까지)를 거쳐 들어간다(1.5). 점수·그래프를 만든 뒤 MILP를 풀고, 솔버의 해는 독립 검증을, AI 글은 각 검사기를 통과해야 내보낸다(실패 시 규칙).</w:t>
       </w:r>
     </w:p>
     <w:p>
@@ -11656,7 +11741,7 @@
         <w:t xml:space="preserve">차별점</w:t>
       </w:r>
       <w:r>
-        <w:t xml:space="preserve">: ① SI의 등급 정원·월 예산·휴직·협업 이력을 현업 규칙(전일 투입·사람 단위 동시 수행·등급 대체) 그대로 하나의 최적화와 확정 규칙으로 풀고, 이론상 최대치와 독립 검증으로 "얼마나 믿어도 되는지"까지 보인다. ② 가장 잦은 "최소 인원 이동 재편성"을 최적임을 확인하며 푼다. ③ AI는 검사받는 부품이라 설명 글을 자동화하면서도 근거를 대조한다.</w:t>
+        <w:t xml:space="preserve">: ① SI의 등급 정원·월 예산·휴직·협업 이력을 현업 규칙(전일 투입·사람 단위 동시 수행·등급 대체) 그대로 하나의 최적화와 확정 규칙으로 풀고, 이론상 최대치와 독립 검증으로 "얼마나 믿어도 되는지"까지 보인다. ② 가장 잦은 "최소 인원 이동 재편성"을 최적임을 확인하며 푼다. ③ AI는 사람이 손으로 채우던 방정식의 값과 근거 글을 만드는 검사받는 부품이다(1.5).</w:t>
       </w:r>
     </w:p>
     <w:p>

</xml_diff>

<commit_message>
docs: final report second-round edits -- 1.3 says why company data was not loaded (no HR permission at the PoC stage) and that the forms and peer-review layout follow the real ones, 1.5 says what people would have to do without AI and drops the no-AI values line, section 2 becomes a question-by-question table with the number explained in place (the 0.9% as the gap to a ceiling score no placement can pass), appendix removed; 3.1 table split with its header kept on the first row and the example box and diagram kept whole, still 10 pages; PDF and Word rebuilt
Co-Authored-By: Claude Opus 5.5 <noreply@anthropic.com>
Claude-Session: https://claude.ai/code/session_01XiJnTNFVeV2BokGGcyeQom
</commit_message>
<xml_diff>
--- a/outputs/final-report.docx
+++ b/outputs/final-report.docx
@@ -436,17 +436,17 @@
         </w:numPr>
       </w:pPr>
       <w:r>
-        <w:t xml:space="preserve">PoC·과제 제출용이다. </w:t>
+        <w:t xml:space="preserve">PoC 단계로, 인사팀으로부터 인력 정보와 실행 프로젝트 정보를 받는 것을 허가받지 못해 </w:t>
       </w:r>
       <w:r>
         <w:rPr>
           <w:b/>
           <w:bCs/>
         </w:rPr>
-        <w:t xml:space="preserve">실제 인사 자료는 적재하지 않았다</w:t>
-      </w:r>
-      <w:r>
-        <w:t xml:space="preserve">(적재 불가). 입력 형식은 실제 인사 자료의 항목과 규칙을 받아 설계했고, 개발·검증·시연은 같은 형식의 가상 데이터로 했다.</w:t>
+        <w:t xml:space="preserve">실제 회사 자료는 적재하지 못했다</w:t>
+      </w:r>
+      <w:r>
+        <w:t xml:space="preserve">. 하지만 입력 양식(인력·사업·업무 이력·기술 경력 등 14종)과 동료 평가 구성(체크 항목 + 서술 글)은 실제 자료와 유사하게 설계했고, 개발·검증·시연은 그 형식으로 만든 가상 데이터로 했다.</w:t>
       </w:r>
     </w:p>
     <w:p>
@@ -772,7 +772,7 @@
         <w:t xml:space="preserve">사업의 요구 기술·인원·기간·예산</w:t>
       </w:r>
       <w:r>
-        <w:t xml:space="preserve"> ← 발주 자료, 부서장의 말: AI가 사전 개념으로 옮겨 근거와 함께 제안하고 사람이 체크한다. AI가 없으면 자료를 다 읽고 고른다(편당 40분~2.4시간, 추정 · 규칙은 정밀도 0.32, 3.3).</w:t>
+        <w:t xml:space="preserve"> ← 발주 자료, 부서장의 말: AI가 사전 개념으로 옮겨 근거와 함께 제안하고 사람이 체크한다. AI가 없으면 부서장이 자료를 다 읽고 골라야 한다(편당 40분~2.4시간, 추정 · 규칙은 정밀도 0.32, 3.3).</w:t>
       </w:r>
     </w:p>
     <w:p>
@@ -791,7 +791,7 @@
         <w:t xml:space="preserve">사람의 기술 경력</w:t>
       </w:r>
       <w:r>
-        <w:t xml:space="preserve"> ← 제각각인 기술 이름: AI가 사전 후보 3개와 이유를 내고 관리자가 승인한다(없으면 손으로, 300개 약 5시간, 추정).</w:t>
+        <w:t xml:space="preserve"> ← 제각각인 기술 이름: AI가 사전 후보 3개와 이유를 내고 관리자가 승인한다. AI가 없으면 이름마다 손으로 맞춰야 한다(300개 약 5시간, 추정).</w:t>
       </w:r>
     </w:p>
     <w:p>
@@ -810,36 +810,7 @@
         <w:t xml:space="preserve">협업 점수의 평가 몫(0.6)</w:t>
       </w:r>
       <w:r>
-        <w:t xml:space="preserve"> ← 동료 평가 글: AI가 글의 좋고 나쁨을 판정한다. AI가 없으면 다 읽는다(300명 약 33시간, 추정 · 항목만 세면 혹평의 88%를 놓친다, 3.5).</w:t>
-      </w:r>
-    </w:p>
-    <w:p>
-      <w:pPr>
-        <w:pStyle w:val="TWList"/>
-        <w:numPr>
-          <w:ilvl w:val="0"/>
-          <w:numId w:val="1"/>
-        </w:numPr>
-      </w:pPr>
-      <w:r>
-        <w:rPr>
-          <w:b/>
-          <w:bCs/>
-        </w:rPr>
-        <w:t xml:space="preserve">가용률·경력 개월·함께 일한 개월</w:t>
-      </w:r>
-      <w:r>
-        <w:t xml:space="preserve">(인사 시스템)과 </w:t>
-      </w:r>
-      <w:r>
-        <w:rPr>
-          <w:b/>
-          <w:bCs/>
-        </w:rPr>
-        <w:t xml:space="preserve">등록된 사업의 정원·예산</w:t>
-      </w:r>
-      <w:r>
-        <w:t xml:space="preserve">은 숫자 그대로 쓴다 — AI를 쓰지 않는다.</w:t>
+        <w:t xml:space="preserve"> ← 동료 평가 글: AI가 글의 좋고 나쁨을 판정한다. AI가 없으면 사람이 다 읽고 판정해야 한다(300명 약 33시간, 추정 · 항목만 세면 혹평의 88%를 놓친다, 3.5).</w:t>
       </w:r>
     </w:p>
     <w:p>
@@ -854,7 +825,7 @@
         <w:t xml:space="preserve">틀린 값도 최적화는 그대로 최적으로 푼다</w:t>
       </w:r>
       <w:r>
-        <w:t xml:space="preserve"> — 규칙 판정이면 100명에서 서로 나쁘게 평가한 28쌍이 협업 보상을 받았다(AI 0쌍, 3.5). 그래서 AI 결과는 사전·원문과 대조하고, 요구 기술·기술 이름은 사람이 고른 것만 넣는다(6.5).</w:t>
+        <w:t xml:space="preserve">(2장 넷째 줄). 그래서 AI 결과는 사전·원문과 대조하고, 요구 기술·기술 이름은 사람이 고른 것만 넣는다(6.5).</w:t>
       </w:r>
     </w:p>
     <w:p>
@@ -867,7 +838,7 @@
     </w:p>
     <w:p>
       <w:r>
-        <w:t xml:space="preserve">아래 수치는 모두 실제 SI 조직을 본뜬 </w:t>
+        <w:t xml:space="preserve">3장 결과를 질문별로 먼저 요약했다. 수치는 모두 실제 SI 조직을 본뜬 </w:t>
       </w:r>
       <w:r>
         <w:rPr>
@@ -877,7 +848,17 @@
         <w:t xml:space="preserve">가상 조직 데이터</w:t>
       </w:r>
       <w:r>
-        <w:t xml:space="preserve">(100·200·300명, 계획 기간 6개월, 시연 영상은 100명)로 잰 값이다. "배치 점수"는 사람과 사업 요구 기술이 맞는 정도(기술 적합)와 함께 일한 경험·평가(협업)를 합친 점수로, 모든 배치를 같은 기준으로 채점했다.</w:t>
+        <w:t xml:space="preserve">(100·200·300명, 계획 6개월, 시연 영상은 100명)로 잰 값이고, </w:t>
+      </w:r>
+      <w:r>
+        <w:rPr>
+          <w:b/>
+          <w:bCs/>
+        </w:rPr>
+        <w:t xml:space="preserve">"프로젝트 인력 배치 점수"</w:t>
+      </w:r>
+      <w:r>
+        <w:t xml:space="preserve">는 사람과 사업 요구 기술이 맞는 정도(기술 적합)와 함께 일한 경험·평가(협업)를 합친 점수다.</w:t>
       </w:r>
     </w:p>
     <w:tbl>
@@ -901,107 +882,93 @@
         </w:tblCellMar>
       </w:tblPr>
       <w:tblGrid>
-        <w:gridCol w:w="3439"/>
-        <w:gridCol w:w="3439"/>
-        <w:gridCol w:w="3439"/>
+        <w:gridCol w:w="1754"/>
+        <w:gridCol w:w="1134"/>
+        <w:gridCol w:w="6603"/>
+        <w:gridCol w:w="825"/>
       </w:tblGrid>
       <w:tr>
         <w:trPr>
           <w:cantSplit/>
+          <w:tblHeader/>
         </w:trPr>
         <w:tc>
           <w:tcPr>
-            <w:tcW w:w="1666" w:type="pct"/>
-          </w:tcPr>
-          <w:p>
-            <w:pPr>
-              <w:pStyle w:val="TWCell"/>
-            </w:pPr>
-            <w:r>
-              <w:rPr>
-                <w:b/>
-                <w:bCs/>
-                <w:color w:val="2F5F8A"/>
-                <w:sz w:val="26"/>
-                <w:szCs w:val="26"/>
-              </w:rPr>
-              <w:t xml:space="preserve">+5~13%</w:t>
-            </w:r>
-          </w:p>
-          <w:p>
-            <w:pPr>
-              <w:pStyle w:val="TWCell"/>
-            </w:pPr>
-            <w:r>
-              <w:rPr>
-                <w:sz w:val="16"/>
-                <w:szCs w:val="16"/>
-              </w:rPr>
-              <w:t xml:space="preserve">최적화 엔진이 짠 프로젝트 인력 배치가 같은 시간을 쓴 규칙 기반 자동 배치(휴리스틱)보다 배치 점수가 높다(100·200·300명). 휴리스틱은 100·300명에서 빈자리 1·3석을 남겼고, 최적화는 모든 규모에서 빈자리·규칙 위반 0(3.1)</w:t>
-            </w:r>
-          </w:p>
-        </w:tc>
-        <w:tc>
-          <w:tcPr>
-            <w:tcW w:w="1666" w:type="pct"/>
-          </w:tcPr>
-          <w:p>
-            <w:pPr>
-              <w:pStyle w:val="TWCell"/>
-            </w:pPr>
-            <w:r>
-              <w:rPr>
-                <w:b/>
-                <w:bCs/>
-                <w:color w:val="2F5F8A"/>
-                <w:sz w:val="26"/>
-                <w:szCs w:val="26"/>
-              </w:rPr>
-              <w:t xml:space="preserve">0.9%</w:t>
-            </w:r>
-          </w:p>
-          <w:p>
-            <w:pPr>
-              <w:pStyle w:val="TWCell"/>
-            </w:pPr>
-            <w:r>
-              <w:rPr>
-                <w:sz w:val="16"/>
-                <w:szCs w:val="16"/>
-              </w:rPr>
-              <w:t xml:space="preserve">300명 조직 최선안이 이론상 최대치에서 떨어진 정도 — 계산 엔진이 92초 만에 "이보다 0.9% 넘게 좋은 배치는 없다"를 증명했다(3.1)</w:t>
-            </w:r>
-          </w:p>
-        </w:tc>
-        <w:tc>
-          <w:tcPr>
-            <w:tcW w:w="1666" w:type="pct"/>
-          </w:tcPr>
-          <w:p>
-            <w:pPr>
-              <w:pStyle w:val="TWCell"/>
-            </w:pPr>
-            <w:r>
-              <w:rPr>
-                <w:b/>
-                <w:bCs/>
-                <w:color w:val="2F5F8A"/>
-                <w:sz w:val="26"/>
-                <w:szCs w:val="26"/>
-              </w:rPr>
-              <w:t xml:space="preserve">0석 · +2.8%</w:t>
-            </w:r>
-          </w:p>
-          <w:p>
-            <w:pPr>
-              <w:pStyle w:val="TWCell"/>
-            </w:pPr>
-            <w:r>
-              <w:rPr>
-                <w:sz w:val="16"/>
-                <w:szCs w:val="16"/>
-              </w:rPr>
-              <w:t xml:space="preserve">신규 사업 편성(100명): 아무도 옮기지 않아도 빈자리 없이 채우고, 진행 중인 다른 사업에서 최대 5명까지 옮기면 배치 품질 +2.8%. 0~5명 모든 경우가 계산상 최적임을 확인(3.2)</w:t>
+            <w:tcW w:w="1754" w:type="dxa"/>
+            <w:shd w:val="clear" w:color="auto" w:fill="F1F3F5"/>
+          </w:tcPr>
+          <w:p>
+            <w:pPr>
+              <w:pStyle w:val="TWCell"/>
+            </w:pPr>
+            <w:r>
+              <w:rPr>
+                <w:b/>
+                <w:bCs/>
+                <w:sz w:val="17"/>
+                <w:szCs w:val="17"/>
+              </w:rPr>
+              <w:t xml:space="preserve">질문</w:t>
+            </w:r>
+          </w:p>
+        </w:tc>
+        <w:tc>
+          <w:tcPr>
+            <w:tcW w:w="1134" w:type="dxa"/>
+            <w:shd w:val="clear" w:color="auto" w:fill="F1F3F5"/>
+          </w:tcPr>
+          <w:p>
+            <w:pPr>
+              <w:pStyle w:val="TWCell"/>
+            </w:pPr>
+            <w:r>
+              <w:rPr>
+                <w:b/>
+                <w:bCs/>
+                <w:sz w:val="17"/>
+                <w:szCs w:val="17"/>
+              </w:rPr>
+              <w:t xml:space="preserve">핵심 숫자</w:t>
+            </w:r>
+          </w:p>
+        </w:tc>
+        <w:tc>
+          <w:tcPr>
+            <w:tcW w:w="6603" w:type="dxa"/>
+            <w:shd w:val="clear" w:color="auto" w:fill="F1F3F5"/>
+          </w:tcPr>
+          <w:p>
+            <w:pPr>
+              <w:pStyle w:val="TWCell"/>
+            </w:pPr>
+            <w:r>
+              <w:rPr>
+                <w:b/>
+                <w:bCs/>
+                <w:sz w:val="17"/>
+                <w:szCs w:val="17"/>
+              </w:rPr>
+              <w:t xml:space="preserve">결과</w:t>
+            </w:r>
+          </w:p>
+        </w:tc>
+        <w:tc>
+          <w:tcPr>
+            <w:tcW w:w="825" w:type="dxa"/>
+            <w:shd w:val="clear" w:color="auto" w:fill="F1F3F5"/>
+          </w:tcPr>
+          <w:p>
+            <w:pPr>
+              <w:pStyle w:val="TWCell"/>
+            </w:pPr>
+            <w:r>
+              <w:rPr>
+                <w:b/>
+                <w:bCs/>
+                <w:sz w:val="17"/>
+                <w:szCs w:val="17"/>
+              </w:rPr>
+              <w:t xml:space="preserve">자세히</w:t>
             </w:r>
           </w:p>
         </w:tc>
@@ -1012,113 +979,434 @@
         </w:trPr>
         <w:tc>
           <w:tcPr>
-            <w:tcW w:w="1666" w:type="pct"/>
-          </w:tcPr>
-          <w:p>
-            <w:pPr>
-              <w:pStyle w:val="TWCell"/>
-            </w:pPr>
-            <w:r>
-              <w:rPr>
-                <w:b/>
-                <w:bCs/>
-                <w:color w:val="2F5F8A"/>
-                <w:sz w:val="26"/>
-                <w:szCs w:val="26"/>
-              </w:rPr>
-              <w:t xml:space="preserve">100% vs 12%</w:t>
-            </w:r>
-          </w:p>
-          <w:p>
-            <w:pPr>
-              <w:pStyle w:val="TWCell"/>
-            </w:pPr>
-            <w:r>
-              <w:rPr>
-                <w:sz w:val="16"/>
-                <w:szCs w:val="16"/>
-              </w:rPr>
-              <w:t xml:space="preserve">AI로 효율화 — 동료 평가 글에만 쓴 혹평(시험 글 34건)을 AI는 모두, 체크 항목만 세는 규칙은 4건만 찾았다. 그래서 100명 조직에서 서로 나쁘게 평가한 28쌍이 "궁합 좋은 쌍"으로 보상받던 문제가 0쌍이 됐다(3.5)</w:t>
-            </w:r>
-          </w:p>
-        </w:tc>
-        <w:tc>
-          <w:tcPr>
-            <w:tcW w:w="1666" w:type="pct"/>
-          </w:tcPr>
-          <w:p>
-            <w:pPr>
-              <w:pStyle w:val="TWCell"/>
-            </w:pPr>
-            <w:r>
-              <w:rPr>
-                <w:b/>
-                <w:bCs/>
-                <w:color w:val="2F5F8A"/>
-                <w:sz w:val="26"/>
-                <w:szCs w:val="26"/>
+            <w:tcW w:w="1754" w:type="dxa"/>
+          </w:tcPr>
+          <w:p>
+            <w:pPr>
+              <w:pStyle w:val="TWCell"/>
+            </w:pPr>
+            <w:r>
+              <w:rPr>
+                <w:sz w:val="17"/>
+                <w:szCs w:val="17"/>
+              </w:rPr>
+              <w:t xml:space="preserve">규칙으로 짠 배치보다 나은가?</w:t>
+            </w:r>
+          </w:p>
+        </w:tc>
+        <w:tc>
+          <w:tcPr>
+            <w:tcW w:w="1134" w:type="dxa"/>
+          </w:tcPr>
+          <w:p>
+            <w:pPr>
+              <w:pStyle w:val="TWCell"/>
+            </w:pPr>
+            <w:r>
+              <w:rPr>
+                <w:sz w:val="17"/>
+                <w:szCs w:val="17"/>
+              </w:rPr>
+              <w:t xml:space="preserve">+5~13%</w:t>
+            </w:r>
+          </w:p>
+        </w:tc>
+        <w:tc>
+          <w:tcPr>
+            <w:tcW w:w="6603" w:type="dxa"/>
+          </w:tcPr>
+          <w:p>
+            <w:pPr>
+              <w:pStyle w:val="TWCell"/>
+            </w:pPr>
+            <w:r>
+              <w:rPr>
+                <w:sz w:val="17"/>
+                <w:szCs w:val="17"/>
+              </w:rPr>
+              <w:t xml:space="preserve">같은 시간을 들인 규칙 기반 자동 배치(휴리스틱)보다 프로젝트 인력 배치 점수가 5~13% 더 높고, 빈자리·규칙 위반은 0이다(규칙은 빈자리 1~3석).</w:t>
+            </w:r>
+          </w:p>
+        </w:tc>
+        <w:tc>
+          <w:tcPr>
+            <w:tcW w:w="825" w:type="dxa"/>
+          </w:tcPr>
+          <w:p>
+            <w:pPr>
+              <w:pStyle w:val="TWCell"/>
+            </w:pPr>
+            <w:r>
+              <w:rPr>
+                <w:sz w:val="17"/>
+                <w:szCs w:val="17"/>
+              </w:rPr>
+              <w:t xml:space="preserve">3.1</w:t>
+            </w:r>
+          </w:p>
+        </w:tc>
+      </w:tr>
+      <w:tr>
+        <w:trPr>
+          <w:cantSplit/>
+        </w:trPr>
+        <w:tc>
+          <w:tcPr>
+            <w:tcW w:w="1754" w:type="dxa"/>
+          </w:tcPr>
+          <w:p>
+            <w:pPr>
+              <w:pStyle w:val="TWCell"/>
+            </w:pPr>
+            <w:r>
+              <w:rPr>
+                <w:sz w:val="17"/>
+                <w:szCs w:val="17"/>
+              </w:rPr>
+              <w:t xml:space="preserve">더 좋은 배치가 남아 있나?</w:t>
+            </w:r>
+          </w:p>
+        </w:tc>
+        <w:tc>
+          <w:tcPr>
+            <w:tcW w:w="1134" w:type="dxa"/>
+          </w:tcPr>
+          <w:p>
+            <w:pPr>
+              <w:pStyle w:val="TWCell"/>
+            </w:pPr>
+            <w:r>
+              <w:rPr>
+                <w:sz w:val="17"/>
+                <w:szCs w:val="17"/>
+              </w:rPr>
+              <w:t xml:space="preserve">0.9%</w:t>
+            </w:r>
+          </w:p>
+        </w:tc>
+        <w:tc>
+          <w:tcPr>
+            <w:tcW w:w="6603" w:type="dxa"/>
+          </w:tcPr>
+          <w:p>
+            <w:pPr>
+              <w:pStyle w:val="TWCell"/>
+            </w:pPr>
+            <w:r>
+              <w:rPr>
+                <w:sz w:val="17"/>
+                <w:szCs w:val="17"/>
+              </w:rPr>
+              <w:t xml:space="preserve">계산 엔진이 함께 구한 천장 점수(어떤 배치도 넘을 수 없는 이론상 최대치)와 300명 최선안의 차이가 0.9% — 더 좋은 배치가 있어도 최대 0.9% 높을 뿐이다.</w:t>
+            </w:r>
+          </w:p>
+        </w:tc>
+        <w:tc>
+          <w:tcPr>
+            <w:tcW w:w="825" w:type="dxa"/>
+          </w:tcPr>
+          <w:p>
+            <w:pPr>
+              <w:pStyle w:val="TWCell"/>
+            </w:pPr>
+            <w:r>
+              <w:rPr>
+                <w:sz w:val="17"/>
+                <w:szCs w:val="17"/>
+              </w:rPr>
+              <w:t xml:space="preserve">3.1</w:t>
+            </w:r>
+          </w:p>
+        </w:tc>
+      </w:tr>
+      <w:tr>
+        <w:trPr>
+          <w:cantSplit/>
+        </w:trPr>
+        <w:tc>
+          <w:tcPr>
+            <w:tcW w:w="1754" w:type="dxa"/>
+          </w:tcPr>
+          <w:p>
+            <w:pPr>
+              <w:pStyle w:val="TWCell"/>
+            </w:pPr>
+            <w:r>
+              <w:rPr>
+                <w:sz w:val="17"/>
+                <w:szCs w:val="17"/>
+              </w:rPr>
+              <w:t xml:space="preserve">신규 사업에 몇 명을 옮겨야 하나?</w:t>
+            </w:r>
+          </w:p>
+        </w:tc>
+        <w:tc>
+          <w:tcPr>
+            <w:tcW w:w="1134" w:type="dxa"/>
+          </w:tcPr>
+          <w:p>
+            <w:pPr>
+              <w:pStyle w:val="TWCell"/>
+            </w:pPr>
+            <w:r>
+              <w:rPr>
+                <w:sz w:val="17"/>
+                <w:szCs w:val="17"/>
+              </w:rPr>
+              <w:t xml:space="preserve">0명 · +2.8%</w:t>
+            </w:r>
+          </w:p>
+        </w:tc>
+        <w:tc>
+          <w:tcPr>
+            <w:tcW w:w="6603" w:type="dxa"/>
+          </w:tcPr>
+          <w:p>
+            <w:pPr>
+              <w:pStyle w:val="TWCell"/>
+            </w:pPr>
+            <w:r>
+              <w:rPr>
+                <w:sz w:val="17"/>
+                <w:szCs w:val="17"/>
+              </w:rPr>
+              <w:t xml:space="preserve">100명 조직에서 아무도 옮기지 않아도 신규 사업 빈자리를 모두 채우고, 진행 사업에서 최대 5명을 옮기면 점수가 2.8% 오른다(0~5명 모두 최적 확인).</w:t>
+            </w:r>
+          </w:p>
+        </w:tc>
+        <w:tc>
+          <w:tcPr>
+            <w:tcW w:w="825" w:type="dxa"/>
+          </w:tcPr>
+          <w:p>
+            <w:pPr>
+              <w:pStyle w:val="TWCell"/>
+            </w:pPr>
+            <w:r>
+              <w:rPr>
+                <w:sz w:val="17"/>
+                <w:szCs w:val="17"/>
+              </w:rPr>
+              <w:t xml:space="preserve">3.2</w:t>
+            </w:r>
+          </w:p>
+        </w:tc>
+      </w:tr>
+      <w:tr>
+        <w:trPr>
+          <w:cantSplit/>
+        </w:trPr>
+        <w:tc>
+          <w:tcPr>
+            <w:tcW w:w="1754" w:type="dxa"/>
+          </w:tcPr>
+          <w:p>
+            <w:pPr>
+              <w:pStyle w:val="TWCell"/>
+            </w:pPr>
+            <w:r>
+              <w:rPr>
+                <w:sz w:val="17"/>
+                <w:szCs w:val="17"/>
+              </w:rPr>
+              <w:t xml:space="preserve">AI가 없으면 무엇이 틀어지나?</w:t>
+            </w:r>
+          </w:p>
+        </w:tc>
+        <w:tc>
+          <w:tcPr>
+            <w:tcW w:w="1134" w:type="dxa"/>
+          </w:tcPr>
+          <w:p>
+            <w:pPr>
+              <w:pStyle w:val="TWCell"/>
+            </w:pPr>
+            <w:r>
+              <w:rPr>
+                <w:sz w:val="17"/>
+                <w:szCs w:val="17"/>
+              </w:rPr>
+              <w:t xml:space="preserve">28쌍 → 0</w:t>
+            </w:r>
+          </w:p>
+        </w:tc>
+        <w:tc>
+          <w:tcPr>
+            <w:tcW w:w="6603" w:type="dxa"/>
+          </w:tcPr>
+          <w:p>
+            <w:pPr>
+              <w:pStyle w:val="TWCell"/>
+            </w:pPr>
+            <w:r>
+              <w:rPr>
+                <w:sz w:val="17"/>
+                <w:szCs w:val="17"/>
+              </w:rPr>
+              <w:t xml:space="preserve">평가 글에만 쓴 혹평 34건을 AI는 모두, 항목만 세는 규칙은 4건 찾았다. 규칙 판정이면 서로 나쁘게 평가한 28쌍이 "궁합 좋은 쌍"으로 점수를 받는다(100명).</w:t>
+            </w:r>
+          </w:p>
+        </w:tc>
+        <w:tc>
+          <w:tcPr>
+            <w:tcW w:w="825" w:type="dxa"/>
+          </w:tcPr>
+          <w:p>
+            <w:pPr>
+              <w:pStyle w:val="TWCell"/>
+            </w:pPr>
+            <w:r>
+              <w:rPr>
+                <w:sz w:val="17"/>
+                <w:szCs w:val="17"/>
+              </w:rPr>
+              <w:t xml:space="preserve">3.5</w:t>
+            </w:r>
+          </w:p>
+        </w:tc>
+      </w:tr>
+      <w:tr>
+        <w:trPr>
+          <w:cantSplit/>
+        </w:trPr>
+        <w:tc>
+          <w:tcPr>
+            <w:tcW w:w="1754" w:type="dxa"/>
+          </w:tcPr>
+          <w:p>
+            <w:pPr>
+              <w:pStyle w:val="TWCell"/>
+            </w:pPr>
+            <w:r>
+              <w:rPr>
+                <w:sz w:val="17"/>
+                <w:szCs w:val="17"/>
+              </w:rPr>
+              <w:t xml:space="preserve">AI 결과를 믿을 수 있나?</w:t>
+            </w:r>
+          </w:p>
+        </w:tc>
+        <w:tc>
+          <w:tcPr>
+            <w:tcW w:w="1134" w:type="dxa"/>
+          </w:tcPr>
+          <w:p>
+            <w:pPr>
+              <w:pStyle w:val="TWCell"/>
+            </w:pPr>
+            <w:r>
+              <w:rPr>
+                <w:sz w:val="17"/>
+                <w:szCs w:val="17"/>
               </w:rPr>
               <w:t xml:space="preserve">99% · 0.78</w:t>
             </w:r>
           </w:p>
-          <w:p>
-            <w:pPr>
-              <w:pStyle w:val="TWCell"/>
-            </w:pPr>
-            <w:r>
-              <w:rPr>
-                <w:sz w:val="16"/>
-                <w:szCs w:val="16"/>
-              </w:rPr>
-              <w:t xml:space="preserve">AI로 효율화 — 인사팀 소명 글이 기계 검사를 통과한 비율 99%(처음 보는 데이터 100%), 실제 공공 발주 자료 10편에서 필요 기술을 고른 정밀도 0.78(AI 없는 규칙 0.32), 낯선 기술 이름 정리 1위 정답 95%(문자열 비교 27%)(3.3·3.6)</w:t>
-            </w:r>
-          </w:p>
-        </w:tc>
-        <w:tc>
-          <w:tcPr>
-            <w:tcW w:w="1666" w:type="pct"/>
-          </w:tcPr>
-          <w:p>
-            <w:pPr>
-              <w:pStyle w:val="TWCell"/>
-            </w:pPr>
-            <w:r>
-              <w:rPr>
-                <w:b/>
-                <w:bCs/>
-                <w:color w:val="2F5F8A"/>
-                <w:sz w:val="26"/>
-                <w:szCs w:val="26"/>
-              </w:rPr>
-              <w:t xml:space="preserve">최적 기술 탐색</w:t>
-            </w:r>
-          </w:p>
-          <w:p>
-            <w:pPr>
-              <w:pStyle w:val="TWCell"/>
-            </w:pPr>
-            <w:r>
-              <w:rPr>
-                <w:sz w:val="16"/>
-                <w:szCs w:val="16"/>
-              </w:rPr>
-              <w:t xml:space="preserve">솔버 3종(CBC·SCIP·HiGHS)을 같은 문제로 비교해 가장 많이 푼 HiGHS를 채택. LLM에게 100명 배치를 직접 맡기면 규칙을 어기거나 최적화 결과의 55% 품질에 그쳐, </w:t>
-            </w:r>
-            <w:r>
-              <w:rPr>
-                <w:b/>
-                <w:bCs/>
-                <w:sz w:val="16"/>
-                <w:szCs w:val="16"/>
-              </w:rPr>
-              <w:t xml:space="preserve">배치는 최적화 엔진이, 그 입력값은 AI가</w:t>
-            </w:r>
-            <w:r>
-              <w:rPr>
-                <w:sz w:val="16"/>
-                <w:szCs w:val="16"/>
-              </w:rPr>
-              <w:t xml:space="preserve"> 만든다(1.5·3.4·3.7)</w:t>
+        </w:tc>
+        <w:tc>
+          <w:tcPr>
+            <w:tcW w:w="6603" w:type="dxa"/>
+          </w:tcPr>
+          <w:p>
+            <w:pPr>
+              <w:pStyle w:val="TWCell"/>
+            </w:pPr>
+            <w:r>
+              <w:rPr>
+                <w:sz w:val="17"/>
+                <w:szCs w:val="17"/>
+              </w:rPr>
+              <w:t xml:space="preserve">소명 글 99%가 사실 검사 통과. 실제 공공 발주 자료에서 고른 필요 기술 중 맞은 비율 0.78(규칙 0.32), 낯선 기술 이름 첫 후보 정답 95%(글자 비교 27%).</w:t>
+            </w:r>
+          </w:p>
+        </w:tc>
+        <w:tc>
+          <w:tcPr>
+            <w:tcW w:w="825" w:type="dxa"/>
+          </w:tcPr>
+          <w:p>
+            <w:pPr>
+              <w:pStyle w:val="TWCell"/>
+            </w:pPr>
+            <w:r>
+              <w:rPr>
+                <w:sz w:val="17"/>
+                <w:szCs w:val="17"/>
+              </w:rPr>
+              <w:t xml:space="preserve">3.3 · 3.6</w:t>
+            </w:r>
+          </w:p>
+        </w:tc>
+      </w:tr>
+      <w:tr>
+        <w:trPr>
+          <w:cantSplit/>
+        </w:trPr>
+        <w:tc>
+          <w:tcPr>
+            <w:tcW w:w="1754" w:type="dxa"/>
+          </w:tcPr>
+          <w:p>
+            <w:pPr>
+              <w:pStyle w:val="TWCell"/>
+            </w:pPr>
+            <w:r>
+              <w:rPr>
+                <w:sz w:val="17"/>
+                <w:szCs w:val="17"/>
+              </w:rPr>
+              <w:t xml:space="preserve">배치 기술은 어떻게 골랐나?</w:t>
+            </w:r>
+          </w:p>
+        </w:tc>
+        <w:tc>
+          <w:tcPr>
+            <w:tcW w:w="1134" w:type="dxa"/>
+          </w:tcPr>
+          <w:p>
+            <w:pPr>
+              <w:pStyle w:val="TWCell"/>
+            </w:pPr>
+            <w:r>
+              <w:rPr>
+                <w:sz w:val="17"/>
+                <w:szCs w:val="17"/>
+              </w:rPr>
+              <w:t xml:space="preserve">HiGHS</w:t>
+            </w:r>
+          </w:p>
+        </w:tc>
+        <w:tc>
+          <w:tcPr>
+            <w:tcW w:w="6603" w:type="dxa"/>
+          </w:tcPr>
+          <w:p>
+            <w:pPr>
+              <w:pStyle w:val="TWCell"/>
+            </w:pPr>
+            <w:r>
+              <w:rPr>
+                <w:sz w:val="17"/>
+                <w:szCs w:val="17"/>
+              </w:rPr>
+              <w:t xml:space="preserve">솔버 3종을 같은 문제로 357번 풀어 가장 많이 푼 HiGHS를 골랐다. LLM에게 배치를 맡기면 규칙 위반 또는 최적화 결과의 55% — 배치는 최적화가, 입력값은 AI가(1.5).</w:t>
+            </w:r>
+          </w:p>
+        </w:tc>
+        <w:tc>
+          <w:tcPr>
+            <w:tcW w:w="825" w:type="dxa"/>
+          </w:tcPr>
+          <w:p>
+            <w:pPr>
+              <w:pStyle w:val="TWCell"/>
+            </w:pPr>
+            <w:r>
+              <w:rPr>
+                <w:sz w:val="17"/>
+                <w:szCs w:val="17"/>
+              </w:rPr>
+              <w:t xml:space="preserve">3.4 · 3.7</w:t>
             </w:r>
           </w:p>
         </w:tc>
@@ -1135,11 +1423,6 @@
       </w:pPr>
       <w:r>
         <w:t xml:space="preserve">2.1 구현 기능 — 영상에 나오지 않는 것 중심</w:t>
-      </w:r>
-    </w:p>
-    <w:p>
-      <w:r>
-        <w:t xml:space="preserve">화면 흐름(입력 검증부터 신규 사업 편성·긴급 투입·인사팀 검토 자료·300명 조직까지)은 시연 영상이 보여 주므로, 여기에는 영상에 나오지 않거나 지나가는 기능과 확정 규칙만 적는다.</w:t>
       </w:r>
     </w:p>
     <w:tbl>
@@ -3821,7 +4104,7 @@
         <w:rPr>
           <w:color w:val="5B6168"/>
         </w:rPr>
-        <w:t xml:space="preserve">새 세 기능은 AI가 말·이름·자료를 사전 개념으로 옮기기만 하고(사람 정보는 보내지 않음), 추천은 기존 계산이, 결정은 사람이 한다. 표본이 작아 구간이 넓다(요청 48문장 정밀도 95% 구간 0.84~0.97). 발주 자료 가상 18편 중 11편은 규칙과 같은 사람이 쓴 자료다. 실제 공공 자료 10편(나라장터)은 정답을 개발 측이 읽고 AI 실행 전에 고정했고, 정답 전에 AI 결과를 본 시연 자료 한 편을 빼도 같다. 시연은 나라장터에 공개된 공공 입찰 자료(사전규격 R26BD00208180 · 산안공고 제2026-68호의 공고문·제안요청서)로 했다 — 민간 기업의 RFI·RFP는 초청한 업체에만 보내는 비공개 문서라 구할 수 없다. 이 연구 용역 자료(계약 조건까지 7편)에는 기술별 경력·인원 요건이 없어 AI가 과업 내용에서 기술을 추정하고 화면이 "추정"으로 표시한다(위 정답표 측정과 섞지 않음). 정밀도 = 고른 것 중 정답인 비율, 재현율 = 정답 중 찾아낸 비율.</w:t>
+        <w:t xml:space="preserve">새 세 기능은 사람 정보를 AI에 보내지 않는다. 표본이 작아 구간이 넓다(요청 48문장 정밀도 95% 구간 0.84~0.97). 발주 자료 가상 18편 중 11편은 규칙과 같은 사람이 쓴 자료다. 실제 공공 자료 10편(나라장터)은 정답을 개발 측이 읽고 AI 실행 전에 고정했고, 정답 전에 AI 결과를 본 시연 자료 한 편을 빼도 같다. 시연은 나라장터에 공개된 공공 입찰 자료(사전규격 R26BD00208180 · 산안공고 제2026-68호의 공고문·제안요청서)로 했다 — 민간 기업의 RFI·RFP는 초청한 업체에만 보내는 비공개 문서라 구할 수 없다. 이 연구 용역 자료(계약 조건까지 7편)에는 기술별 경력·인원 요건이 없어 AI가 과업 내용에서 기술을 추정하고 화면이 "추정"으로 표시한다(위 정답표 측정과 섞지 않음). 정밀도 = 고른 것 중 정답인 비율, 재현율 = 정답 중 찾아낸 비율.</w:t>
       </w:r>
     </w:p>
     <w:p>
@@ -11980,27 +12263,6 @@
       <w:pPr>
         <w:pStyle w:val="TWAfterTable"/>
       </w:pPr>
-    </w:p>
-    <w:p>
-      <w:pPr>
-        <w:pStyle w:val="Heading1"/>
-      </w:pPr>
-      <w:r>
-        <w:t xml:space="preserve">부록. 재현 방법</w:t>
-      </w:r>
-    </w:p>
-    <w:p>
-      <w:pPr>
-        <w:shd w:val="clear" w:color="auto" w:fill="EEF2F6"/>
-      </w:pPr>
-      <w:r>
-        <w:rPr>
-          <w:rFonts w:ascii="Consolas" w:hAnsi="Consolas" w:eastAsia="Malgun Gothic" w:cs="Consolas"/>
-          <w:sz w:val="16"/>
-          <w:szCs w:val="16"/>
-        </w:rPr>
-        <w:t xml:space="preserve">uv sync &amp;&amp; scripts/run_poc.sh   # 실행 → http://127.0.0.1:8000 · 시험: uv run --group benchmark pytest -q (2,233개 통과)</w:t>
-      </w:r>
     </w:p>
     <w:sectPr>
       <w:pgSz w:w="11906" w:h="16838"/>

</xml_diff>

<commit_message>
docs: final report third-round edits -- 2.1 table ends every line in the noun form, 3.3 table names and cells in plain words (one row for reading bid documents on the 10 real notices, no '(new)' marks), 3.4 drops the sample-size aside, 3.6 table says what was measured and what the numbers mean, 3.7 removed (oracle check line moved to 6.4), section 4 keeps five points in a new order with the people-judgment point as accountability; GLM numbers gathered in the 3.6 in-house paragraph; still 10 pages, PDF and Word rebuilt
Co-Authored-By: Claude Opus 5.5 <noreply@anthropic.com>
Claude-Session: https://claude.ai/code/session_01XiJnTNFVeV2BokGGcyeQom
</commit_message>
<xml_diff>
--- a/outputs/final-report.docx
+++ b/outputs/final-report.docx
@@ -343,7 +343,7 @@
                 <w:sz w:val="17"/>
                 <w:szCs w:val="17"/>
               </w:rPr>
-              <w:t xml:space="preserve"> — 정답 대조 13/13, 모든 계산 결과 독립 검증, 이론상 최대치와의 거리를 화면·PDF에(3.7)</w:t>
+              <w:t xml:space="preserve"> — 정답 대조 13/13, 모든 계산 결과 독립 검증, 이론상 최대치와의 거리를 화면·PDF에(6.4)</w:t>
             </w:r>
           </w:p>
         </w:tc>
@@ -1406,7 +1406,7 @@
                 <w:sz w:val="17"/>
                 <w:szCs w:val="17"/>
               </w:rPr>
-              <w:t xml:space="preserve">3.4 · 3.7</w:t>
+              <w:t xml:space="preserve">3.4 · 7장</w:t>
             </w:r>
           </w:p>
         </w:tc>
@@ -1529,7 +1529,7 @@
                 <w:sz w:val="17"/>
                 <w:szCs w:val="17"/>
               </w:rPr>
-              <w:t xml:space="preserve">인사 시스템에서 매일 자동으로 받기(받기에 실패하면 지금 데이터 유지). 인력이 진행 중인 사업에서 쓰는 기술의 경력 개월은 달이 지나면 서비스가 자동으로 더한다. 한 번의 편성(데이터·설정·결과)을 파일 하나로 저장하고 다시 불러오기(불러올 때 지금 규칙으로 다시 검사)</w:t>
+              <w:t xml:space="preserve">인사 시스템에서 매일 자동으로 받기(받기에 실패하면 지금 데이터 유지). 인력이 진행 중인 사업에서 쓰는 기술의 경력 개월을 달이 지나면 서비스가 자동으로 더하기. 한 번의 편성(데이터·설정·결과)을 파일 하나로 저장하고 다시 불러오기(불러올 때 지금 규칙으로 다시 검사)</w:t>
             </w:r>
           </w:p>
         </w:tc>
@@ -1568,7 +1568,7 @@
                 <w:sz w:val="17"/>
                 <w:szCs w:val="17"/>
               </w:rPr>
-              <w:t xml:space="preserve">안이 하나 풀릴 때마다 바로 화면에 보이고, 계산 중에 멈출 수 있다. 밤사이 AI 없이 긴급 대기 명단·연간 계획·신규 사업 비교를 미리 계산해 둔다. 관리자 설정(계산 시간·익숙한 사이 기준 등)</w:t>
+              <w:t xml:space="preserve">안이 하나 풀릴 때마다 바로 화면에 표시, 계산 중 멈추기 가능. 밤사이 AI 없이 긴급 대기 명단·연간 계획·신규 사업 비교를 미리 계산. 관리자 설정(계산 시간·익숙한 사이 기준 등)</w:t>
             </w:r>
           </w:p>
         </w:tc>
@@ -1607,7 +1607,7 @@
                 <w:sz w:val="17"/>
                 <w:szCs w:val="17"/>
               </w:rPr>
-              <w:t xml:space="preserve">모든 확정은 데이터의 새 버전으로 남아 되돌릴 수 있고, 특정 확정 한 건만 골라 취소할 수도 있다. 새 규칙 위반이 생기거나 고정한 배치를 빼는 확정은 거절한다. 다른 등급으로 자리 채우기·예산 증액·빈자리 그대로 두기는 사유를 적어야 확정된다. 육아휴직 등으로 투입할 수 없는 인력은 사유와 함께 고를 수 없게 보인다</w:t>
+              <w:t xml:space="preserve">모든 확정을 데이터의 새 버전으로 남겨 되돌리기 가능, 특정 확정 한 건만 골라 취소도 가능. 새 규칙 위반이 생기거나 고정한 배치를 빼는 확정은 거절. 다른 등급으로 자리 채우기·예산 증액·빈자리 그대로 두기는 사유를 적어야 확정. 육아휴직 등으로 투입할 수 없는 인력은 사유와 함께 선택 불가로 표시</w:t>
             </w:r>
           </w:p>
         </w:tc>
@@ -1646,7 +1646,7 @@
                 <w:sz w:val="17"/>
                 <w:szCs w:val="17"/>
               </w:rPr>
-              <w:t xml:space="preserve">모든 변경을 지우지 않고 기록해 기간을 골라 보고서 PDF로 묶는다. 계산 결과에 위·변조 방지 서명을 붙이고 PDF는 서버가 다시 계산해 찍는다. 로그인, 실제 인사 자료일 때 동료 평가 원문을 화면·외부 AI에 보내지 않는 모드</w:t>
+              <w:t xml:space="preserve">모든 변경을 지우지 않고 기록해 기간을 골라 보고서 PDF로 묶기. 계산 결과에 위·변조 방지 서명을 붙이고 PDF는 서버가 다시 계산해 출력. 로그인, 실제 인사 자료일 때 동료 평가 원문을 화면·외부 AI에 보내지 않는 모드</w:t>
             </w:r>
           </w:p>
         </w:tc>
@@ -3193,10 +3193,10 @@
         </w:tblCellMar>
       </w:tblPr>
       <w:tblGrid>
-        <w:gridCol w:w="1529"/>
-        <w:gridCol w:w="3773"/>
-        <w:gridCol w:w="4111"/>
-        <w:gridCol w:w="903"/>
+        <w:gridCol w:w="1547"/>
+        <w:gridCol w:w="3342"/>
+        <w:gridCol w:w="4292"/>
+        <w:gridCol w:w="1134"/>
       </w:tblGrid>
       <w:tr>
         <w:trPr>
@@ -3205,7 +3205,7 @@
         </w:trPr>
         <w:tc>
           <w:tcPr>
-            <w:tcW w:w="1529" w:type="dxa"/>
+            <w:tcW w:w="1547" w:type="dxa"/>
             <w:shd w:val="clear" w:color="auto" w:fill="F1F3F5"/>
           </w:tcPr>
           <w:p>
@@ -3225,7 +3225,7 @@
         </w:tc>
         <w:tc>
           <w:tcPr>
-            <w:tcW w:w="3773" w:type="dxa"/>
+            <w:tcW w:w="3342" w:type="dxa"/>
             <w:shd w:val="clear" w:color="auto" w:fill="F1F3F5"/>
           </w:tcPr>
           <w:p>
@@ -3245,7 +3245,7 @@
         </w:tc>
         <w:tc>
           <w:tcPr>
-            <w:tcW w:w="4111" w:type="dxa"/>
+            <w:tcW w:w="4292" w:type="dxa"/>
             <w:shd w:val="clear" w:color="auto" w:fill="F1F3F5"/>
           </w:tcPr>
           <w:p>
@@ -3265,7 +3265,7 @@
         </w:tc>
         <w:tc>
           <w:tcPr>
-            <w:tcW w:w="903" w:type="dxa"/>
+            <w:tcW w:w="1134" w:type="dxa"/>
             <w:shd w:val="clear" w:color="auto" w:fill="F1F3F5"/>
           </w:tcPr>
           <w:p>
@@ -3290,7 +3290,7 @@
         </w:trPr>
         <w:tc>
           <w:tcPr>
-            <w:tcW w:w="1529" w:type="dxa"/>
+            <w:tcW w:w="1547" w:type="dxa"/>
           </w:tcPr>
           <w:p>
             <w:pPr>
@@ -3307,35 +3307,35 @@
         </w:tc>
         <w:tc>
           <w:tcPr>
-            <w:tcW w:w="3773" w:type="dxa"/>
-          </w:tcPr>
-          <w:p>
-            <w:pPr>
-              <w:pStyle w:val="TWCell"/>
-            </w:pPr>
-            <w:r>
-              <w:rPr>
-                <w:sz w:val="17"/>
-                <w:szCs w:val="17"/>
-              </w:rPr>
-              <w:t xml:space="preserve">체크 항목만 센다 — 글에만 쓴 혹평 12%(4/34) 검출, 서로 나쁘게 쓴 28쌍이 "궁합 좋은 쌍"으로 보상</w:t>
-            </w:r>
-          </w:p>
-        </w:tc>
-        <w:tc>
-          <w:tcPr>
-            <w:tcW w:w="4111" w:type="dxa"/>
-          </w:tcPr>
-          <w:p>
-            <w:pPr>
-              <w:pStyle w:val="TWCell"/>
-            </w:pPr>
-            <w:r>
-              <w:rPr>
-                <w:sz w:val="17"/>
-                <w:szCs w:val="17"/>
-              </w:rPr>
-              <w:t xml:space="preserve">글을 읽는다 — </w:t>
+            <w:tcW w:w="3342" w:type="dxa"/>
+          </w:tcPr>
+          <w:p>
+            <w:pPr>
+              <w:pStyle w:val="TWCell"/>
+            </w:pPr>
+            <w:r>
+              <w:rPr>
+                <w:sz w:val="17"/>
+                <w:szCs w:val="17"/>
+              </w:rPr>
+              <w:t xml:space="preserve">체크 항목만 센다 — 글에만 쓴 혹평을 12%(4/34)만 찾고, 서로 나쁘게 쓴 28쌍이 "궁합 좋은 쌍"으로 점수를 받음</w:t>
+            </w:r>
+          </w:p>
+        </w:tc>
+        <w:tc>
+          <w:tcPr>
+            <w:tcW w:w="4292" w:type="dxa"/>
+          </w:tcPr>
+          <w:p>
+            <w:pPr>
+              <w:pStyle w:val="TWCell"/>
+            </w:pPr>
+            <w:r>
+              <w:rPr>
+                <w:sz w:val="17"/>
+                <w:szCs w:val="17"/>
+              </w:rPr>
+              <w:t xml:space="preserve">글까지 읽는다 — 혹평 </w:t>
             </w:r>
             <w:r>
               <w:rPr>
@@ -3351,7 +3351,7 @@
                 <w:sz w:val="17"/>
                 <w:szCs w:val="17"/>
               </w:rPr>
-              <w:t xml:space="preserve">(34/34)·돌려 말한 지적 89%, 그런 쌍 </w:t>
+              <w:t xml:space="preserve">(34/34), 돌려 말한 지적 89%를 찾음. 그런 쌍 </w:t>
             </w:r>
             <w:r>
               <w:rPr>
@@ -3367,13 +3367,13 @@
                 <w:sz w:val="17"/>
                 <w:szCs w:val="17"/>
               </w:rPr>
-              <w:t xml:space="preserve">, 팀 협업 점수 +7~22%, 300명 4,012건 $0.32</w:t>
-            </w:r>
-          </w:p>
-        </w:tc>
-        <w:tc>
-          <w:tcPr>
-            <w:tcW w:w="903" w:type="dxa"/>
+              <w:t xml:space="preserve">, 팀 협업 점수 7~22% 상승. 300명 평가 글 4,012건 판정 $0.32</w:t>
+            </w:r>
+          </w:p>
+        </w:tc>
+        <w:tc>
+          <w:tcPr>
+            <w:tcW w:w="1134" w:type="dxa"/>
           </w:tcPr>
           <w:p>
             <w:pPr>
@@ -3395,52 +3395,68 @@
         </w:trPr>
         <w:tc>
           <w:tcPr>
-            <w:tcW w:w="1529" w:type="dxa"/>
-          </w:tcPr>
-          <w:p>
-            <w:pPr>
-              <w:pStyle w:val="TWCell"/>
-            </w:pPr>
-            <w:r>
-              <w:rPr>
-                <w:sz w:val="17"/>
-                <w:szCs w:val="17"/>
-              </w:rPr>
-              <w:t xml:space="preserve">"왜 이 팀인가" 글</w:t>
-            </w:r>
-          </w:p>
-        </w:tc>
-        <w:tc>
-          <w:tcPr>
-            <w:tcW w:w="3773" w:type="dxa"/>
-          </w:tcPr>
-          <w:p>
-            <w:pPr>
-              <w:pStyle w:val="TWCell"/>
-            </w:pPr>
-            <w:r>
-              <w:rPr>
-                <w:sz w:val="17"/>
-                <w:szCs w:val="17"/>
-              </w:rPr>
-              <w:t xml:space="preserve">사실 77줄(4,637자)을 늘어놓거나 사람이 쓴다</w:t>
-            </w:r>
-          </w:p>
-        </w:tc>
-        <w:tc>
-          <w:tcPr>
-            <w:tcW w:w="4111" w:type="dxa"/>
-          </w:tcPr>
-          <w:p>
-            <w:pPr>
-              <w:pStyle w:val="TWCell"/>
-            </w:pPr>
-            <w:r>
-              <w:rPr>
-                <w:sz w:val="17"/>
-                <w:szCs w:val="17"/>
-              </w:rPr>
-              <w:t xml:space="preserve">세 문장(231자) 요약 + 사실 번호 연결, 검사 통과 </w:t>
+            <w:tcW w:w="1547" w:type="dxa"/>
+          </w:tcPr>
+          <w:p>
+            <w:pPr>
+              <w:pStyle w:val="TWCell"/>
+            </w:pPr>
+            <w:r>
+              <w:rPr>
+                <w:sz w:val="17"/>
+                <w:szCs w:val="17"/>
+              </w:rPr>
+              <w:t xml:space="preserve">인사팀용 편성 근거 글("왜 이 팀인가")</w:t>
+            </w:r>
+          </w:p>
+        </w:tc>
+        <w:tc>
+          <w:tcPr>
+            <w:tcW w:w="3342" w:type="dxa"/>
+          </w:tcPr>
+          <w:p>
+            <w:pPr>
+              <w:pStyle w:val="TWCell"/>
+            </w:pPr>
+            <w:r>
+              <w:rPr>
+                <w:sz w:val="17"/>
+                <w:szCs w:val="17"/>
+              </w:rPr>
+              <w:t xml:space="preserve">정해진 틀로 근거 사실 77줄(4,637자)을 그대로 나열하거나, 사람이 직접 쓴다</w:t>
+            </w:r>
+          </w:p>
+        </w:tc>
+        <w:tc>
+          <w:tcPr>
+            <w:tcW w:w="4292" w:type="dxa"/>
+          </w:tcPr>
+          <w:p>
+            <w:pPr>
+              <w:pStyle w:val="TWCell"/>
+            </w:pPr>
+            <w:r>
+              <w:rPr>
+                <w:sz w:val="17"/>
+                <w:szCs w:val="17"/>
+              </w:rPr>
+              <w:t xml:space="preserve">결정에 필요한 사실과 불리한 사실을 골라 </w:t>
+            </w:r>
+            <w:r>
+              <w:rPr>
+                <w:b/>
+                <w:bCs/>
+                <w:sz w:val="17"/>
+                <w:szCs w:val="17"/>
+              </w:rPr>
+              <w:t xml:space="preserve">세 문장</w:t>
+            </w:r>
+            <w:r>
+              <w:rPr>
+                <w:sz w:val="17"/>
+                <w:szCs w:val="17"/>
+              </w:rPr>
+              <w:t xml:space="preserve">(231자)으로 요약, 문장마다 근거 사실 번호를 붙임. 숫자·사실 검사 통과 </w:t>
             </w:r>
             <w:r>
               <w:rPr>
@@ -3456,13 +3472,13 @@
                 <w:sz w:val="17"/>
                 <w:szCs w:val="17"/>
               </w:rPr>
-              <w:t xml:space="preserve">(처음 보는 데이터 100%), 편당 8초·$0.0009</w:t>
-            </w:r>
-          </w:p>
-        </w:tc>
-        <w:tc>
-          <w:tcPr>
-            <w:tcW w:w="903" w:type="dxa"/>
+              <w:t xml:space="preserve">(처음 보는 데이터 100%), 편당 8초</w:t>
+            </w:r>
+          </w:p>
+        </w:tc>
+        <w:tc>
+          <w:tcPr>
+            <w:tcW w:w="1134" w:type="dxa"/>
           </w:tcPr>
           <w:p>
             <w:pPr>
@@ -3484,58 +3500,74 @@
         </w:trPr>
         <w:tc>
           <w:tcPr>
-            <w:tcW w:w="1529" w:type="dxa"/>
-          </w:tcPr>
-          <w:p>
-            <w:pPr>
-              <w:pStyle w:val="TWCell"/>
-            </w:pPr>
-            <w:r>
-              <w:rPr>
-                <w:sz w:val="17"/>
-                <w:szCs w:val="17"/>
-              </w:rPr>
-              <w:t xml:space="preserve">교체 설명</w:t>
-            </w:r>
-          </w:p>
-        </w:tc>
-        <w:tc>
-          <w:tcPr>
-            <w:tcW w:w="3773" w:type="dxa"/>
-          </w:tcPr>
-          <w:p>
-            <w:pPr>
-              <w:pStyle w:val="TWCell"/>
-            </w:pPr>
-            <w:r>
-              <w:rPr>
-                <w:sz w:val="17"/>
-                <w:szCs w:val="17"/>
-              </w:rPr>
-              <w:t xml:space="preserve">점수 표만</w:t>
-            </w:r>
-          </w:p>
-        </w:tc>
-        <w:tc>
-          <w:tcPr>
-            <w:tcW w:w="4111" w:type="dxa"/>
-          </w:tcPr>
-          <w:p>
-            <w:pPr>
-              <w:pStyle w:val="TWCell"/>
-            </w:pPr>
-            <w:r>
-              <w:rPr>
-                <w:sz w:val="17"/>
-                <w:szCs w:val="17"/>
-              </w:rPr>
-              <w:t xml:space="preserve">동료 평가 원문 인용 설명 3.5초, 바로 사용 93%, 위반 교체 "보류" 18/20</w:t>
-            </w:r>
-          </w:p>
-        </w:tc>
-        <w:tc>
-          <w:tcPr>
-            <w:tcW w:w="903" w:type="dxa"/>
+            <w:tcW w:w="1547" w:type="dxa"/>
+          </w:tcPr>
+          <w:p>
+            <w:pPr>
+              <w:pStyle w:val="TWCell"/>
+            </w:pPr>
+            <w:r>
+              <w:rPr>
+                <w:sz w:val="17"/>
+                <w:szCs w:val="17"/>
+              </w:rPr>
+              <w:t xml:space="preserve">교체 설명(사람을 바꿔 볼 때)</w:t>
+            </w:r>
+          </w:p>
+        </w:tc>
+        <w:tc>
+          <w:tcPr>
+            <w:tcW w:w="3342" w:type="dxa"/>
+          </w:tcPr>
+          <w:p>
+            <w:pPr>
+              <w:pStyle w:val="TWCell"/>
+            </w:pPr>
+            <w:r>
+              <w:rPr>
+                <w:sz w:val="17"/>
+                <w:szCs w:val="17"/>
+              </w:rPr>
+              <w:t xml:space="preserve">교체 전후 점수 변화 숫자만 보여 준다 — 왜 그런지는 사람이 해석</w:t>
+            </w:r>
+          </w:p>
+        </w:tc>
+        <w:tc>
+          <w:tcPr>
+            <w:tcW w:w="4292" w:type="dxa"/>
+          </w:tcPr>
+          <w:p>
+            <w:pPr>
+              <w:pStyle w:val="TWCell"/>
+            </w:pPr>
+            <w:r>
+              <w:rPr>
+                <w:sz w:val="17"/>
+                <w:szCs w:val="17"/>
+              </w:rPr>
+              <w:t xml:space="preserve">점수가 왜 바뀌는지 동료 평가 원문을 인용해 글로 설명(3.5초). </w:t>
+            </w:r>
+            <w:r>
+              <w:rPr>
+                <w:b/>
+                <w:bCs/>
+                <w:sz w:val="17"/>
+                <w:szCs w:val="17"/>
+              </w:rPr>
+              <w:t xml:space="preserve">93%</w:t>
+            </w:r>
+            <w:r>
+              <w:rPr>
+                <w:sz w:val="17"/>
+                <w:szCs w:val="17"/>
+              </w:rPr>
+              <w:t xml:space="preserve">는 고치지 않고 그대로 쓸 수 있는 글</w:t>
+            </w:r>
+          </w:p>
+        </w:tc>
+        <w:tc>
+          <w:tcPr>
+            <w:tcW w:w="1134" w:type="dxa"/>
           </w:tcPr>
           <w:p>
             <w:pPr>
@@ -3557,35 +3589,35 @@
         </w:trPr>
         <w:tc>
           <w:tcPr>
-            <w:tcW w:w="1529" w:type="dxa"/>
-          </w:tcPr>
-          <w:p>
-            <w:pPr>
-              <w:pStyle w:val="TWCell"/>
-            </w:pPr>
-            <w:r>
-              <w:rPr>
-                <w:sz w:val="17"/>
-                <w:szCs w:val="17"/>
-              </w:rPr>
-              <w:t xml:space="preserve">긴급 상황을 말로(새)</w:t>
-            </w:r>
-          </w:p>
-        </w:tc>
-        <w:tc>
-          <w:tcPr>
-            <w:tcW w:w="3773" w:type="dxa"/>
-          </w:tcPr>
-          <w:p>
-            <w:pPr>
-              <w:pStyle w:val="TWCell"/>
-            </w:pPr>
-            <w:r>
-              <w:rPr>
-                <w:sz w:val="17"/>
-                <w:szCs w:val="17"/>
-              </w:rPr>
-              <w:t xml:space="preserve">사전 이름이 그대로 적힌 기술만 — 재현율 83.6%, 일로만 설명한 요구 </w:t>
+            <w:tcW w:w="1547" w:type="dxa"/>
+          </w:tcPr>
+          <w:p>
+            <w:pPr>
+              <w:pStyle w:val="TWCell"/>
+            </w:pPr>
+            <w:r>
+              <w:rPr>
+                <w:sz w:val="17"/>
+                <w:szCs w:val="17"/>
+              </w:rPr>
+              <w:t xml:space="preserve">긴급 상황을 말로 → 필요 기술</w:t>
+            </w:r>
+          </w:p>
+        </w:tc>
+        <w:tc>
+          <w:tcPr>
+            <w:tcW w:w="3342" w:type="dxa"/>
+          </w:tcPr>
+          <w:p>
+            <w:pPr>
+              <w:pStyle w:val="TWCell"/>
+            </w:pPr>
+            <w:r>
+              <w:rPr>
+                <w:sz w:val="17"/>
+                <w:szCs w:val="17"/>
+              </w:rPr>
+              <w:t xml:space="preserve">글에 기술 이름이 사전 그대로 적혀야만 찾는다 — 정답 기술의 83.6%, "새벽 적재가 실패"처럼 일로만 쓴 요구는 </w:t>
             </w:r>
             <w:r>
               <w:rPr>
@@ -3600,51 +3632,51 @@
         </w:tc>
         <w:tc>
           <w:tcPr>
-            <w:tcW w:w="4111" w:type="dxa"/>
-          </w:tcPr>
-          <w:p>
-            <w:pPr>
-              <w:pStyle w:val="TWCell"/>
-            </w:pPr>
-            <w:r>
-              <w:rPr>
-                <w:sz w:val="17"/>
-                <w:szCs w:val="17"/>
-              </w:rPr>
-              <w:t xml:space="preserve">재현율 </w:t>
-            </w:r>
-            <w:r>
-              <w:rPr>
-                <w:b/>
-                <w:bCs/>
-                <w:sz w:val="17"/>
-                <w:szCs w:val="17"/>
-              </w:rPr>
-              <w:t xml:space="preserve">100%</w:t>
-            </w:r>
-            <w:r>
-              <w:rPr>
-                <w:sz w:val="17"/>
-                <w:szCs w:val="17"/>
-              </w:rPr>
-              <w:t xml:space="preserve">(55/55)·정밀도 93%, 일로 설명한 요구 100%, 사람 특성 말 반영 0, 건당 $0.0005·2.5초</w:t>
-            </w:r>
-          </w:p>
-        </w:tc>
-        <w:tc>
-          <w:tcPr>
-            <w:tcW w:w="903" w:type="dxa"/>
-          </w:tcPr>
-          <w:p>
-            <w:pPr>
-              <w:pStyle w:val="TWCell"/>
-            </w:pPr>
-            <w:r>
-              <w:rPr>
-                <w:sz w:val="17"/>
-                <w:szCs w:val="17"/>
-              </w:rPr>
-              <w:t xml:space="preserve">요청 48문장</w:t>
+            <w:tcW w:w="4292" w:type="dxa"/>
+          </w:tcPr>
+          <w:p>
+            <w:pPr>
+              <w:pStyle w:val="TWCell"/>
+            </w:pPr>
+            <w:r>
+              <w:rPr>
+                <w:sz w:val="17"/>
+                <w:szCs w:val="17"/>
+              </w:rPr>
+              <w:t xml:space="preserve">정답 기술 </w:t>
+            </w:r>
+            <w:r>
+              <w:rPr>
+                <w:b/>
+                <w:bCs/>
+                <w:sz w:val="17"/>
+                <w:szCs w:val="17"/>
+              </w:rPr>
+              <w:t xml:space="preserve">55개 모두</w:t>
+            </w:r>
+            <w:r>
+              <w:rPr>
+                <w:sz w:val="17"/>
+                <w:szCs w:val="17"/>
+              </w:rPr>
+              <w:t xml:space="preserve"> 찾음(고른 것 중 맞은 비율 93%), 일로만 쓴 요구도 모두. 나이·성별 같은 사람 특성 말은 쓰지 않음(0건), 건당 2.5초</w:t>
+            </w:r>
+          </w:p>
+        </w:tc>
+        <w:tc>
+          <w:tcPr>
+            <w:tcW w:w="1134" w:type="dxa"/>
+          </w:tcPr>
+          <w:p>
+            <w:pPr>
+              <w:pStyle w:val="TWCell"/>
+            </w:pPr>
+            <w:r>
+              <w:rPr>
+                <w:sz w:val="17"/>
+                <w:szCs w:val="17"/>
+              </w:rPr>
+              <w:t xml:space="preserve">가상 요청 48문장</w:t>
             </w:r>
           </w:p>
         </w:tc>
@@ -3655,52 +3687,52 @@
         </w:trPr>
         <w:tc>
           <w:tcPr>
-            <w:tcW w:w="1529" w:type="dxa"/>
-          </w:tcPr>
-          <w:p>
-            <w:pPr>
-              <w:pStyle w:val="TWCell"/>
-            </w:pPr>
-            <w:r>
-              <w:rPr>
-                <w:sz w:val="17"/>
-                <w:szCs w:val="17"/>
-              </w:rPr>
-              <w:t xml:space="preserve">낯선 기술 이름(새)</w:t>
-            </w:r>
-          </w:p>
-        </w:tc>
-        <w:tc>
-          <w:tcPr>
-            <w:tcW w:w="3773" w:type="dxa"/>
-          </w:tcPr>
-          <w:p>
-            <w:pPr>
-              <w:pStyle w:val="TWCell"/>
-            </w:pPr>
-            <w:r>
-              <w:rPr>
-                <w:sz w:val="17"/>
-                <w:szCs w:val="17"/>
-              </w:rPr>
-              <w:t xml:space="preserve">문자열 유사도 — 실제 별칭 522개 1위 27%·후보 3개 안 54%, 잘못 합침 30</w:t>
-            </w:r>
-          </w:p>
-        </w:tc>
-        <w:tc>
-          <w:tcPr>
-            <w:tcW w:w="4111" w:type="dxa"/>
-          </w:tcPr>
-          <w:p>
-            <w:pPr>
-              <w:pStyle w:val="TWCell"/>
-            </w:pPr>
-            <w:r>
-              <w:rPr>
-                <w:sz w:val="17"/>
-                <w:szCs w:val="17"/>
-              </w:rPr>
-              <w:t xml:space="preserve">1위 </w:t>
+            <w:tcW w:w="1547" w:type="dxa"/>
+          </w:tcPr>
+          <w:p>
+            <w:pPr>
+              <w:pStyle w:val="TWCell"/>
+            </w:pPr>
+            <w:r>
+              <w:rPr>
+                <w:sz w:val="17"/>
+                <w:szCs w:val="17"/>
+              </w:rPr>
+              <w:t xml:space="preserve">낯선 기술 이름 정리</w:t>
+            </w:r>
+          </w:p>
+        </w:tc>
+        <w:tc>
+          <w:tcPr>
+            <w:tcW w:w="3342" w:type="dxa"/>
+          </w:tcPr>
+          <w:p>
+            <w:pPr>
+              <w:pStyle w:val="TWCell"/>
+            </w:pPr>
+            <w:r>
+              <w:rPr>
+                <w:sz w:val="17"/>
+                <w:szCs w:val="17"/>
+              </w:rPr>
+              <w:t xml:space="preserve">글자가 비슷한 이름을 찾는다 — 첫 후보가 맞은 비율 27%(3개 안 54%), 다른 기술로 잘못 합침 30건</w:t>
+            </w:r>
+          </w:p>
+        </w:tc>
+        <w:tc>
+          <w:tcPr>
+            <w:tcW w:w="4292" w:type="dxa"/>
+          </w:tcPr>
+          <w:p>
+            <w:pPr>
+              <w:pStyle w:val="TWCell"/>
+            </w:pPr>
+            <w:r>
+              <w:rPr>
+                <w:sz w:val="17"/>
+                <w:szCs w:val="17"/>
+              </w:rPr>
+              <w:t xml:space="preserve">첫 후보 </w:t>
             </w:r>
             <w:r>
               <w:rPr>
@@ -3716,7 +3748,7 @@
                 <w:sz w:val="17"/>
                 <w:szCs w:val="17"/>
               </w:rPr>
-              <w:t xml:space="preserve">·후보 3개 안 </w:t>
+              <w:t xml:space="preserve">(3개 안 </w:t>
             </w:r>
             <w:r>
               <w:rPr>
@@ -3732,7 +3764,7 @@
                 <w:sz w:val="17"/>
                 <w:szCs w:val="17"/>
               </w:rPr>
-              <w:t xml:space="preserve">, 잘못 합침 1, 기술 아님·새 기술 20개 합침 0. 정답대로 승인하면 틀린 기술 점수 34.7% → </w:t>
+              <w:t xml:space="preserve">), 잘못 합침 1건, 기술이 아니거나 새 기술인 이름 20개는 억지로 합치지 않음. 승인 뒤 틀린 기술 점수 34.7% → </w:t>
             </w:r>
             <w:r>
               <w:rPr>
@@ -3747,18 +3779,18 @@
         </w:tc>
         <w:tc>
           <w:tcPr>
-            <w:tcW w:w="903" w:type="dxa"/>
-          </w:tcPr>
-          <w:p>
-            <w:pPr>
-              <w:pStyle w:val="TWCell"/>
-            </w:pPr>
-            <w:r>
-              <w:rPr>
-                <w:sz w:val="17"/>
-                <w:szCs w:val="17"/>
-              </w:rPr>
-              <w:t xml:space="preserve">별칭 숨김 시험</w:t>
+            <w:tcW w:w="1134" w:type="dxa"/>
+          </w:tcPr>
+          <w:p>
+            <w:pPr>
+              <w:pStyle w:val="TWCell"/>
+            </w:pPr>
+            <w:r>
+              <w:rPr>
+                <w:sz w:val="17"/>
+                <w:szCs w:val="17"/>
+              </w:rPr>
+              <w:t xml:space="preserve">실제 별칭 522개(사전에서 숨김)</w:t>
             </w:r>
           </w:p>
         </w:tc>
@@ -3769,35 +3801,35 @@
         </w:trPr>
         <w:tc>
           <w:tcPr>
-            <w:tcW w:w="1529" w:type="dxa"/>
-          </w:tcPr>
-          <w:p>
-            <w:pPr>
-              <w:pStyle w:val="TWCell"/>
-            </w:pPr>
-            <w:r>
-              <w:rPr>
-                <w:sz w:val="17"/>
-                <w:szCs w:val="17"/>
-              </w:rPr>
-              <w:t xml:space="preserve">발주 자료 → 필요 기술(새)</w:t>
-            </w:r>
-          </w:p>
-        </w:tc>
-        <w:tc>
-          <w:tcPr>
-            <w:tcW w:w="3773" w:type="dxa"/>
-          </w:tcPr>
-          <w:p>
-            <w:pPr>
-              <w:pStyle w:val="TWCell"/>
-            </w:pPr>
-            <w:r>
-              <w:rPr>
-                <w:sz w:val="17"/>
-                <w:szCs w:val="17"/>
-              </w:rPr>
-              <w:t xml:space="preserve">부서장이 RFP를 읽고 기술을 하나씩 고름. 규칙(사전 이름 + 문장 말)은 기술 적용 계획표 같은 양식 목록·현행 시스템까지 요구로 뽑는다 — 실제 공공 자료 10편 정밀도 </w:t>
+            <w:tcW w:w="1547" w:type="dxa"/>
+          </w:tcPr>
+          <w:p>
+            <w:pPr>
+              <w:pStyle w:val="TWCell"/>
+            </w:pPr>
+            <w:r>
+              <w:rPr>
+                <w:sz w:val="17"/>
+                <w:szCs w:val="17"/>
+              </w:rPr>
+              <w:t xml:space="preserve">발주 자료 읽기(필요 기술·사업 정보·요약)</w:t>
+            </w:r>
+          </w:p>
+        </w:tc>
+        <w:tc>
+          <w:tcPr>
+            <w:tcW w:w="3342" w:type="dxa"/>
+          </w:tcPr>
+          <w:p>
+            <w:pPr>
+              <w:pStyle w:val="TWCell"/>
+            </w:pPr>
+            <w:r>
+              <w:rPr>
+                <w:sz w:val="17"/>
+                <w:szCs w:val="17"/>
+              </w:rPr>
+              <w:t xml:space="preserve">부서장이 자료를 다 읽고 기술을 고르고 사업 정보를 옮겨 적어야 한다. 규칙(사전 이름 + 문장 말)은 양식 목록·현행 시스템까지 요구로 뽑아 정밀도 </w:t>
             </w:r>
             <w:r>
               <w:rPr>
@@ -3813,24 +3845,24 @@
                 <w:sz w:val="17"/>
                 <w:szCs w:val="17"/>
               </w:rPr>
-              <w:t xml:space="preserve">, 요구 아닌 언급의 99%(144/145)를 요구로</w:t>
-            </w:r>
-          </w:p>
-        </w:tc>
-        <w:tc>
-          <w:tcPr>
-            <w:tcW w:w="4111" w:type="dxa"/>
-          </w:tcPr>
-          <w:p>
-            <w:pPr>
-              <w:pStyle w:val="TWCell"/>
-            </w:pPr>
-            <w:r>
-              <w:rPr>
-                <w:sz w:val="17"/>
-                <w:szCs w:val="17"/>
-              </w:rPr>
-              <w:t xml:space="preserve">정밀도 </w:t>
+              <w:t xml:space="preserve">(요구가 아닌 언급의 99%를 요구로)</w:t>
+            </w:r>
+          </w:p>
+        </w:tc>
+        <w:tc>
+          <w:tcPr>
+            <w:tcW w:w="4292" w:type="dxa"/>
+          </w:tcPr>
+          <w:p>
+            <w:pPr>
+              <w:pStyle w:val="TWCell"/>
+            </w:pPr>
+            <w:r>
+              <w:rPr>
+                <w:sz w:val="17"/>
+                <w:szCs w:val="17"/>
+              </w:rPr>
+              <w:t xml:space="preserve">필요 기술 정밀도 </w:t>
             </w:r>
             <w:r>
               <w:rPr>
@@ -3846,113 +3878,24 @@
                 <w:sz w:val="17"/>
                 <w:szCs w:val="17"/>
               </w:rPr>
-              <w:t xml:space="preserve">(3회 0.74~0.86)·재현율 0.88, 요구 아닌 언급 11%, 과업으로만 드러난 기술도 42~67%(규칙 8%), 편당 13초·$0.005(사내 대리 GLM 0.65·74초). 가상 18편은 1.00(규칙 0.93). 근거와 함께 제안 → 사람이 고침</w:t>
-            </w:r>
-          </w:p>
-        </w:tc>
-        <w:tc>
-          <w:tcPr>
-            <w:tcW w:w="903" w:type="dxa"/>
-          </w:tcPr>
-          <w:p>
-            <w:pPr>
-              <w:pStyle w:val="TWCell"/>
-            </w:pPr>
-            <w:r>
-              <w:rPr>
-                <w:sz w:val="17"/>
-                <w:szCs w:val="17"/>
-              </w:rPr>
-              <w:t xml:space="preserve">실제 10편 + 가상 18편</w:t>
-            </w:r>
-          </w:p>
-        </w:tc>
-      </w:tr>
-      <w:tr>
-        <w:trPr>
-          <w:cantSplit/>
-        </w:trPr>
-        <w:tc>
-          <w:tcPr>
-            <w:tcW w:w="1529" w:type="dxa"/>
-          </w:tcPr>
-          <w:p>
-            <w:pPr>
-              <w:pStyle w:val="TWCell"/>
-            </w:pPr>
-            <w:r>
-              <w:rPr>
-                <w:sz w:val="17"/>
-                <w:szCs w:val="17"/>
-              </w:rPr>
-              <w:t xml:space="preserve">발주 자료 → 사업 정보·요약(새)</w:t>
-            </w:r>
-          </w:p>
-        </w:tc>
-        <w:tc>
-          <w:tcPr>
-            <w:tcW w:w="3773" w:type="dxa"/>
-          </w:tcPr>
-          <w:p>
-            <w:pPr>
-              <w:pStyle w:val="TWCell"/>
-            </w:pPr>
-            <w:r>
-              <w:rPr>
-                <w:sz w:val="17"/>
-                <w:szCs w:val="17"/>
-              </w:rPr>
-              <w:t xml:space="preserve">손으로 적고 다 읽는다. 규칙은 "사업명:" 같은 표지가 있을 때만(가상 7편은 규칙도 7/7)</w:t>
-            </w:r>
-          </w:p>
-        </w:tc>
-        <w:tc>
-          <w:tcPr>
-            <w:tcW w:w="4111" w:type="dxa"/>
-          </w:tcPr>
-          <w:p>
-            <w:pPr>
-              <w:pStyle w:val="TWCell"/>
-            </w:pPr>
-            <w:r>
-              <w:rPr>
-                <w:sz w:val="17"/>
-                <w:szCs w:val="17"/>
-              </w:rPr>
-              <w:t xml:space="preserve">계약기간 "계약체결일 ~ 11월 13일"을 </w:t>
-            </w:r>
-            <w:r>
-              <w:rPr>
-                <w:b/>
-                <w:bCs/>
-                <w:sz w:val="17"/>
-                <w:szCs w:val="17"/>
-              </w:rPr>
-              <w:t xml:space="preserve">7개월</w:t>
-            </w:r>
-            <w:r>
-              <w:rPr>
-                <w:sz w:val="17"/>
-                <w:szCs w:val="17"/>
-              </w:rPr>
-              <w:t xml:space="preserve">로 셈(규칙 못 함) — 확인 못 한 값은 "확인 필요". 요약은 근거·숫자 검사로 항목을 거름(완전 차단 아님), 편당 5~14초</w:t>
-            </w:r>
-          </w:p>
-        </w:tc>
-        <w:tc>
-          <w:tcPr>
-            <w:tcW w:w="903" w:type="dxa"/>
-          </w:tcPr>
-          <w:p>
-            <w:pPr>
-              <w:pStyle w:val="TWCell"/>
-            </w:pPr>
-            <w:r>
-              <w:rPr>
-                <w:sz w:val="17"/>
-                <w:szCs w:val="17"/>
-              </w:rPr>
-              <w:t xml:space="preserve">가상 7편 + 실제 공고</w:t>
+              <w:t xml:space="preserve">(고른 것 중 맞은 비율, 3회 0.74~0.86)·재현율 0.88(정답 중 찾은 비율), 요구가 아닌 언급을 요구로 11%, 편당 13초. 사업 정보도 근거 말과 함께 채움(계약기간 "계약체결일 ~ 11월 13일" → 7개월, 규칙은 못 함). 결과는 제안, 사람이 고침</w:t>
+            </w:r>
+          </w:p>
+        </w:tc>
+        <w:tc>
+          <w:tcPr>
+            <w:tcW w:w="1134" w:type="dxa"/>
+          </w:tcPr>
+          <w:p>
+            <w:pPr>
+              <w:pStyle w:val="TWCell"/>
+            </w:pPr>
+            <w:r>
+              <w:rPr>
+                <w:sz w:val="17"/>
+                <w:szCs w:val="17"/>
+              </w:rPr>
+              <w:t xml:space="preserve">실제 공고 10편</w:t>
             </w:r>
           </w:p>
         </w:tc>
@@ -4138,7 +4081,7 @@
         <w:t xml:space="preserve">솔버의 55%</w:t>
       </w:r>
       <w:r>
-        <w:t xml:space="preserve">에 응답 6~11분(솔버 30.6초). 칸마다 2~3회라 표본은 작다. → </w:t>
+        <w:t xml:space="preserve">에 응답 6~11분(솔버 30.6초). → </w:t>
       </w:r>
       <w:r>
         <w:rPr>
@@ -5365,9 +5308,9 @@
         </w:tblCellMar>
       </w:tblPr>
       <w:tblGrid>
-        <w:gridCol w:w="912"/>
-        <w:gridCol w:w="2819"/>
-        <w:gridCol w:w="4384"/>
+        <w:gridCol w:w="1444"/>
+        <w:gridCol w:w="2785"/>
+        <w:gridCol w:w="3886"/>
         <w:gridCol w:w="2200"/>
       </w:tblGrid>
       <w:tr>
@@ -5377,7 +5320,7 @@
         </w:trPr>
         <w:tc>
           <w:tcPr>
-            <w:tcW w:w="912" w:type="dxa"/>
+            <w:tcW w:w="1444" w:type="dxa"/>
             <w:shd w:val="clear" w:color="auto" w:fill="F1F3F5"/>
           </w:tcPr>
           <w:p>
@@ -5397,7 +5340,7 @@
         </w:tc>
         <w:tc>
           <w:tcPr>
-            <w:tcW w:w="2819" w:type="dxa"/>
+            <w:tcW w:w="2785" w:type="dxa"/>
             <w:shd w:val="clear" w:color="auto" w:fill="F1F3F5"/>
           </w:tcPr>
           <w:p>
@@ -5411,13 +5354,13 @@
                 <w:sz w:val="17"/>
                 <w:szCs w:val="17"/>
               </w:rPr>
-              <w:t xml:space="preserve">측정</w:t>
-            </w:r>
-          </w:p>
-        </w:tc>
-        <w:tc>
-          <w:tcPr>
-            <w:tcW w:w="4384" w:type="dxa"/>
+              <w:t xml:space="preserve">무엇을 쟀나</w:t>
+            </w:r>
+          </w:p>
+        </w:tc>
+        <w:tc>
+          <w:tcPr>
+            <w:tcW w:w="3886" w:type="dxa"/>
             <w:shd w:val="clear" w:color="auto" w:fill="F1F3F5"/>
           </w:tcPr>
           <w:p>
@@ -5463,7 +5406,7 @@
         </w:trPr>
         <w:tc>
           <w:tcPr>
-            <w:tcW w:w="912" w:type="dxa"/>
+            <w:tcW w:w="1444" w:type="dxa"/>
           </w:tcPr>
           <w:p>
             <w:pPr>
@@ -5480,36 +5423,29 @@
         </w:tc>
         <w:tc>
           <w:tcPr>
-            <w:tcW w:w="2819" w:type="dxa"/>
-          </w:tcPr>
-          <w:p>
-            <w:pPr>
-              <w:pStyle w:val="TWCell"/>
-            </w:pPr>
-            <w:r>
-              <w:rPr>
-                <w:sz w:val="17"/>
-                <w:szCs w:val="17"/>
-              </w:rPr>
-              <w:t xml:space="preserve">운영 중 교체 100건</w:t>
-            </w:r>
-          </w:p>
-        </w:tc>
-        <w:tc>
-          <w:tcPr>
-            <w:tcW w:w="4384" w:type="dxa"/>
-          </w:tcPr>
-          <w:p>
-            <w:pPr>
-              <w:pStyle w:val="TWCell"/>
-            </w:pPr>
-            <w:r>
-              <w:rPr>
-                <w:sz w:val="17"/>
-                <w:szCs w:val="17"/>
-              </w:rPr>
-              <w:t xml:space="preserve">바로 사용 </w:t>
-            </w:r>
+            <w:tcW w:w="2785" w:type="dxa"/>
+          </w:tcPr>
+          <w:p>
+            <w:pPr>
+              <w:pStyle w:val="TWCell"/>
+            </w:pPr>
+            <w:r>
+              <w:rPr>
+                <w:sz w:val="17"/>
+                <w:szCs w:val="17"/>
+              </w:rPr>
+              <w:t xml:space="preserve">진행 중인 사업에서 사람을 바꿔 본 사례 100건에 AI가 쓴 설명</w:t>
+            </w:r>
+          </w:p>
+        </w:tc>
+        <w:tc>
+          <w:tcPr>
+            <w:tcW w:w="3886" w:type="dxa"/>
+          </w:tcPr>
+          <w:p>
+            <w:pPr>
+              <w:pStyle w:val="TWCell"/>
+            </w:pPr>
             <w:r>
               <w:rPr>
                 <w:b/>
@@ -5524,7 +5460,7 @@
                 <w:sz w:val="17"/>
                 <w:szCs w:val="17"/>
               </w:rPr>
-              <w:t xml:space="preserve">, 새 위반 교체의 "보류" 준수 90%(어긴 글은 규칙 설명으로 대체), 지시문 강화 뒤 보류 18/20·인정 경력 출처 9/10</w:t>
+              <w:t xml:space="preserve">는 고치지 않고 바로 쓸 수 있는 글. 규칙을 어기는 교체는 첫 문장을 "보류"로 쓰게 했고, 지시문을 고친 뒤 20건 중 18건이 지킴(어긴 글은 규칙으로 쓴 설명으로 바꿈)</w:t>
             </w:r>
           </w:p>
         </w:tc>
@@ -5553,7 +5489,7 @@
         </w:trPr>
         <w:tc>
           <w:tcPr>
-            <w:tcW w:w="912" w:type="dxa"/>
+            <w:tcW w:w="1444" w:type="dxa"/>
           </w:tcPr>
           <w:p>
             <w:pPr>
@@ -5570,35 +5506,35 @@
         </w:tc>
         <w:tc>
           <w:tcPr>
-            <w:tcW w:w="2819" w:type="dxa"/>
-          </w:tcPr>
-          <w:p>
-            <w:pPr>
-              <w:pStyle w:val="TWCell"/>
-            </w:pPr>
-            <w:r>
-              <w:rPr>
-                <w:sz w:val="17"/>
-                <w:szCs w:val="17"/>
-              </w:rPr>
-              <w:t xml:space="preserve">사업 × 3회 843편(조율 데이터 618 + 처음 보는 데이터 225), 사실을 일부러 틀리게 한 오류 주입</w:t>
-            </w:r>
-          </w:p>
-        </w:tc>
-        <w:tc>
-          <w:tcPr>
-            <w:tcW w:w="4384" w:type="dxa"/>
-          </w:tcPr>
-          <w:p>
-            <w:pPr>
-              <w:pStyle w:val="TWCell"/>
-            </w:pPr>
-            <w:r>
-              <w:rPr>
-                <w:sz w:val="17"/>
-                <w:szCs w:val="17"/>
-              </w:rPr>
-              <w:t xml:space="preserve">검사 통과 </w:t>
+            <w:tcW w:w="2785" w:type="dxa"/>
+          </w:tcPr>
+          <w:p>
+            <w:pPr>
+              <w:pStyle w:val="TWCell"/>
+            </w:pPr>
+            <w:r>
+              <w:rPr>
+                <w:sz w:val="17"/>
+                <w:szCs w:val="17"/>
+              </w:rPr>
+              <w:t xml:space="preserve">사업마다 3번씩 843편 — 지시문을 다듬은 데이터 618편 + 처음 보는 데이터 225편. 사실을 일부러 틀리게 넣어 검사기가 잡는지도 시험</w:t>
+            </w:r>
+          </w:p>
+        </w:tc>
+        <w:tc>
+          <w:tcPr>
+            <w:tcW w:w="3886" w:type="dxa"/>
+          </w:tcPr>
+          <w:p>
+            <w:pPr>
+              <w:pStyle w:val="TWCell"/>
+            </w:pPr>
+            <w:r>
+              <w:rPr>
+                <w:sz w:val="17"/>
+                <w:szCs w:val="17"/>
+              </w:rPr>
+              <w:t xml:space="preserve">숫자·사실·문법 기계 검사 통과 </w:t>
             </w:r>
             <w:r>
               <w:rPr>
@@ -5630,23 +5566,23 @@
                 <w:sz w:val="17"/>
                 <w:szCs w:val="17"/>
               </w:rPr>
-              <w:t xml:space="preserve">(225/225). 일부러 틀리게 넣은 사실 </w:t>
-            </w:r>
-            <w:r>
-              <w:rPr>
-                <w:b/>
-                <w:bCs/>
-                <w:sz w:val="17"/>
-                <w:szCs w:val="17"/>
-              </w:rPr>
-              <w:t xml:space="preserve">13,316/13,316</w:t>
-            </w:r>
-            <w:r>
-              <w:rPr>
-                <w:sz w:val="17"/>
-                <w:szCs w:val="17"/>
-              </w:rPr>
-              <w:t xml:space="preserve"> 검출, 내보낸 글의 숫자·사실이 원자료와 모두 일치(837/837)</w:t>
+              <w:t xml:space="preserve">(225/225). 일부러 틀린 사실 </w:t>
+            </w:r>
+            <w:r>
+              <w:rPr>
+                <w:b/>
+                <w:bCs/>
+                <w:sz w:val="17"/>
+                <w:szCs w:val="17"/>
+              </w:rPr>
+              <w:t xml:space="preserve">13,316개 모두</w:t>
+            </w:r>
+            <w:r>
+              <w:rPr>
+                <w:sz w:val="17"/>
+                <w:szCs w:val="17"/>
+              </w:rPr>
+              <w:t xml:space="preserve"> 잡음. 내보낸 글 837편의 숫자·사실이 원자료와 모두 일치</w:t>
             </w:r>
           </w:p>
         </w:tc>
@@ -5675,7 +5611,7 @@
         </w:trPr>
         <w:tc>
           <w:tcPr>
-            <w:tcW w:w="912" w:type="dxa"/>
+            <w:tcW w:w="1444" w:type="dxa"/>
           </w:tcPr>
           <w:p>
             <w:pPr>
@@ -5692,35 +5628,35 @@
         </w:tc>
         <w:tc>
           <w:tcPr>
-            <w:tcW w:w="2819" w:type="dxa"/>
-          </w:tcPr>
-          <w:p>
-            <w:pPr>
-              <w:pStyle w:val="TWCell"/>
-            </w:pPr>
-            <w:r>
-              <w:rPr>
-                <w:sz w:val="17"/>
-                <w:szCs w:val="17"/>
-              </w:rPr>
-              <w:t xml:space="preserve">229건, 세 문장·자리표시 2~4개·불리한 사실 하나 이상을 검사</w:t>
-            </w:r>
-          </w:p>
-        </w:tc>
-        <w:tc>
-          <w:tcPr>
-            <w:tcW w:w="4384" w:type="dxa"/>
-          </w:tcPr>
-          <w:p>
-            <w:pPr>
-              <w:pStyle w:val="TWCell"/>
-            </w:pPr>
-            <w:r>
-              <w:rPr>
-                <w:sz w:val="17"/>
-                <w:szCs w:val="17"/>
-              </w:rPr>
-              <w:t xml:space="preserve">AI 요약 채택 </w:t>
+            <w:tcW w:w="2785" w:type="dxa"/>
+          </w:tcPr>
+          <w:p>
+            <w:pPr>
+              <w:pStyle w:val="TWCell"/>
+            </w:pPr>
+            <w:r>
+              <w:rPr>
+                <w:sz w:val="17"/>
+                <w:szCs w:val="17"/>
+              </w:rPr>
+              <w:t xml:space="preserve">229건 — 세 문장인지, 근거 사실 2~4개를 인용하는지, 불리한 사실을 하나 이상 넣는지 검사</w:t>
+            </w:r>
+          </w:p>
+        </w:tc>
+        <w:tc>
+          <w:tcPr>
+            <w:tcW w:w="3886" w:type="dxa"/>
+          </w:tcPr>
+          <w:p>
+            <w:pPr>
+              <w:pStyle w:val="TWCell"/>
+            </w:pPr>
+            <w:r>
+              <w:rPr>
+                <w:sz w:val="17"/>
+                <w:szCs w:val="17"/>
+              </w:rPr>
+              <w:t xml:space="preserve">AI 요약을 그대로 쓴 비율 </w:t>
             </w:r>
             <w:r>
               <w:rPr>
@@ -5736,7 +5672,7 @@
                 <w:sz w:val="17"/>
                 <w:szCs w:val="17"/>
               </w:rPr>
-              <w:t xml:space="preserve">, 걸리면 규칙 요약(7.4%), 사실 불일치 0</w:t>
+              <w:t xml:space="preserve">, 나머지 7.4%는 검사에 걸려 규칙으로 만든 요약으로 대체, 사실 불일치 0</w:t>
             </w:r>
           </w:p>
         </w:tc>
@@ -5765,7 +5701,7 @@
         </w:trPr>
         <w:tc>
           <w:tcPr>
-            <w:tcW w:w="912" w:type="dxa"/>
+            <w:tcW w:w="1444" w:type="dxa"/>
           </w:tcPr>
           <w:p>
             <w:pPr>
@@ -5782,35 +5718,35 @@
         </w:tc>
         <w:tc>
           <w:tcPr>
-            <w:tcW w:w="2819" w:type="dxa"/>
-          </w:tcPr>
-          <w:p>
-            <w:pPr>
-              <w:pStyle w:val="TWCell"/>
-            </w:pPr>
-            <w:r>
-              <w:rPr>
-                <w:sz w:val="17"/>
-                <w:szCs w:val="17"/>
-              </w:rPr>
-              <w:t xml:space="preserve">기술 이름 절반을 별칭으로 바꾼 사본</w:t>
-            </w:r>
-          </w:p>
-        </w:tc>
-        <w:tc>
-          <w:tcPr>
-            <w:tcW w:w="4384" w:type="dxa"/>
-          </w:tcPr>
-          <w:p>
-            <w:pPr>
-              <w:pStyle w:val="TWCell"/>
-            </w:pPr>
-            <w:r>
-              <w:rPr>
-                <w:sz w:val="17"/>
-                <w:szCs w:val="17"/>
-              </w:rPr>
-              <w:t xml:space="preserve">사전을 쓰면 점수 차이 0, 없으면 쌍의 86%가 바뀌고 배치 57.8 → 49.1</w:t>
+            <w:tcW w:w="2785" w:type="dxa"/>
+          </w:tcPr>
+          <w:p>
+            <w:pPr>
+              <w:pStyle w:val="TWCell"/>
+            </w:pPr>
+            <w:r>
+              <w:rPr>
+                <w:sz w:val="17"/>
+                <w:szCs w:val="17"/>
+              </w:rPr>
+              <w:t xml:space="preserve">같은 데이터에서 기술 이름 절반을 다른 표기(별칭)로 바꾼 사본</w:t>
+            </w:r>
+          </w:p>
+        </w:tc>
+        <w:tc>
+          <w:tcPr>
+            <w:tcW w:w="3886" w:type="dxa"/>
+          </w:tcPr>
+          <w:p>
+            <w:pPr>
+              <w:pStyle w:val="TWCell"/>
+            </w:pPr>
+            <w:r>
+              <w:rPr>
+                <w:sz w:val="17"/>
+                <w:szCs w:val="17"/>
+              </w:rPr>
+              <w:t xml:space="preserve">사전을 쓰면 점수가 원본과 같다. 사전이 없으면 사람 쌍의 86%가 점수가 바뀌고, 배치 점수가 57.8 → 49.1로 떨어진다</w:t>
             </w:r>
           </w:p>
         </w:tc>
@@ -5855,457 +5791,8 @@
         <w:rPr>
           <w:color w:val="5B6168"/>
         </w:rPr>
-        <w:t xml:space="preserve">(사내 서버를 쓸 수 없어 GLM-5.3-Flash로 가정): 돌려 말한 부정 검출 89% → 52%, 교체 설명 바로 사용 93% → 97%·3.5 → 10.3초, 처음 보는 소명 채택 100% → 97.3%·8 → 60초 — 전환 때 더 큰 모델·대기 상한(40 → 300초) 조정이 필요하다. 서비스는 외부 AI로 운영하고, 실데이터는 사내 주소이거나 관리자가 명시 허용했을 때만 AI를 부른다. 모든 측정은 판정 기준을 측정 전에 먼저 정해 고정했다(사전 등록).</w:t>
-      </w:r>
-    </w:p>
-    <w:p>
-      <w:pPr>
-        <w:pStyle w:val="Heading2"/>
-      </w:pPr>
-      <w:r>
-        <w:t xml:space="preserve">3.7 정확성 검증</w:t>
-      </w:r>
-    </w:p>
-    <w:tbl>
-      <w:tblPr>
-        <w:tblStyle w:val="TWTable"/>
-        <w:tblW w:w="10318" w:type="dxa"/>
-        <w:tblBorders>
-          <w:top w:val="single" w:sz="4" w:space="0" w:color="D8DCE1"/>
-          <w:left w:val="single" w:sz="4" w:space="0" w:color="D8DCE1"/>
-          <w:bottom w:val="single" w:sz="4" w:space="0" w:color="D8DCE1"/>
-          <w:right w:val="single" w:sz="4" w:space="0" w:color="D8DCE1"/>
-          <w:insideH w:val="single" w:sz="4" w:space="0" w:color="D8DCE1"/>
-          <w:insideV w:val="single" w:sz="4" w:space="0" w:color="D8DCE1"/>
-        </w:tblBorders>
-        <w:tblLayout w:type="fixed"/>
-        <w:tblCellMar>
-          <w:top w:w="40" w:type="dxa"/>
-          <w:left w:w="90" w:type="dxa"/>
-          <w:bottom w:w="40" w:type="dxa"/>
-          <w:right w:w="90" w:type="dxa"/>
-        </w:tblCellMar>
-      </w:tblPr>
-      <w:tblGrid>
-        <w:gridCol w:w="1259"/>
-        <w:gridCol w:w="4564"/>
-        <w:gridCol w:w="4493"/>
-      </w:tblGrid>
-      <w:tr>
-        <w:trPr>
-          <w:cantSplit/>
-          <w:tblHeader/>
-        </w:trPr>
-        <w:tc>
-          <w:tcPr>
-            <w:tcW w:w="1259" w:type="dxa"/>
-            <w:shd w:val="clear" w:color="auto" w:fill="F1F3F5"/>
-          </w:tcPr>
-          <w:p>
-            <w:pPr>
-              <w:pStyle w:val="TWCell"/>
-            </w:pPr>
-            <w:r>
-              <w:rPr>
-                <w:b/>
-                <w:bCs/>
-                <w:sz w:val="17"/>
-                <w:szCs w:val="17"/>
-              </w:rPr>
-              <w:t xml:space="preserve">층</w:t>
-            </w:r>
-          </w:p>
-        </w:tc>
-        <w:tc>
-          <w:tcPr>
-            <w:tcW w:w="4564" w:type="dxa"/>
-            <w:shd w:val="clear" w:color="auto" w:fill="F1F3F5"/>
-          </w:tcPr>
-          <w:p>
-            <w:pPr>
-              <w:pStyle w:val="TWCell"/>
-            </w:pPr>
-            <w:r>
-              <w:rPr>
-                <w:b/>
-                <w:bCs/>
-                <w:sz w:val="17"/>
-                <w:szCs w:val="17"/>
-              </w:rPr>
-              <w:t xml:space="preserve">방법</w:t>
-            </w:r>
-          </w:p>
-        </w:tc>
-        <w:tc>
-          <w:tcPr>
-            <w:tcW w:w="4493" w:type="dxa"/>
-            <w:shd w:val="clear" w:color="auto" w:fill="F1F3F5"/>
-          </w:tcPr>
-          <w:p>
-            <w:pPr>
-              <w:pStyle w:val="TWCell"/>
-            </w:pPr>
-            <w:r>
-              <w:rPr>
-                <w:b/>
-                <w:bCs/>
-                <w:sz w:val="17"/>
-                <w:szCs w:val="17"/>
-              </w:rPr>
-              <w:t xml:space="preserve">결과</w:t>
-            </w:r>
-          </w:p>
-        </w:tc>
-      </w:tr>
-      <w:tr>
-        <w:trPr>
-          <w:cantSplit/>
-        </w:trPr>
-        <w:tc>
-          <w:tcPr>
-            <w:tcW w:w="1259" w:type="dxa"/>
-          </w:tcPr>
-          <w:p>
-            <w:pPr>
-              <w:pStyle w:val="TWCell"/>
-            </w:pPr>
-            <w:r>
-              <w:rPr>
-                <w:sz w:val="17"/>
-                <w:szCs w:val="17"/>
-              </w:rPr>
-              <w:t xml:space="preserve">자동 시험</w:t>
-            </w:r>
-          </w:p>
-        </w:tc>
-        <w:tc>
-          <w:tcPr>
-            <w:tcW w:w="4564" w:type="dxa"/>
-          </w:tcPr>
-          <w:p>
-            <w:pPr>
-              <w:pStyle w:val="TWCell"/>
-            </w:pPr>
-            <w:r>
-              <w:rPr>
-                <w:rFonts w:ascii="Consolas" w:hAnsi="Consolas" w:eastAsia="Malgun Gothic" w:cs="Consolas"/>
-                <w:sz w:val="17"/>
-                <w:szCs w:val="17"/>
-              </w:rPr>
-              <w:t xml:space="preserve">uv run --group benchmark pytest -q</w:t>
-            </w:r>
-            <w:r>
-              <w:rPr>
-                <w:sz w:val="17"/>
-                <w:szCs w:val="17"/>
-              </w:rPr>
-              <w:t xml:space="preserve">, 느린 전 과정 E2E, 웹 단위 시험·타입 검사</w:t>
-            </w:r>
-          </w:p>
-        </w:tc>
-        <w:tc>
-          <w:tcPr>
-            <w:tcW w:w="4493" w:type="dxa"/>
-          </w:tcPr>
-          <w:p>
-            <w:pPr>
-              <w:pStyle w:val="TWCell"/>
-            </w:pPr>
-            <w:r>
-              <w:rPr>
-                <w:sz w:val="17"/>
-                <w:szCs w:val="17"/>
-              </w:rPr>
-              <w:t xml:space="preserve">2,233개 통과 · 1개 건너뜀 / 전 과정 E2E 21개 통과 / 웹 403개 통과</w:t>
-            </w:r>
-          </w:p>
-        </w:tc>
-      </w:tr>
-      <w:tr>
-        <w:trPr>
-          <w:cantSplit/>
-        </w:trPr>
-        <w:tc>
-          <w:tcPr>
-            <w:tcW w:w="1259" w:type="dxa"/>
-          </w:tcPr>
-          <w:p>
-            <w:pPr>
-              <w:pStyle w:val="TWCell"/>
-            </w:pPr>
-            <w:r>
-              <w:rPr>
-                <w:sz w:val="17"/>
-                <w:szCs w:val="17"/>
-              </w:rPr>
-              <w:t xml:space="preserve">정답 대조</w:t>
-            </w:r>
-          </w:p>
-        </w:tc>
-        <w:tc>
-          <w:tcPr>
-            <w:tcW w:w="4564" w:type="dxa"/>
-          </w:tcPr>
-          <w:p>
-            <w:pPr>
-              <w:pStyle w:val="TWCell"/>
-            </w:pPr>
-            <w:r>
-              <w:rPr>
-                <w:sz w:val="17"/>
-                <w:szCs w:val="17"/>
-              </w:rPr>
-              <w:t xml:space="preserve">작은 사례는 가능한 사람 조합을 모두 따져 정답을 구하고(제품 계산 코드를 쓰지 않는 별도 구현) 결과와 비교, 예산·가용률을 늘리면 점수가 줄지 않는지 등</w:t>
-            </w:r>
-          </w:p>
-        </w:tc>
-        <w:tc>
-          <w:tcPr>
-            <w:tcW w:w="4493" w:type="dxa"/>
-          </w:tcPr>
-          <w:p>
-            <w:pPr>
-              <w:pStyle w:val="TWCell"/>
-            </w:pPr>
-            <w:r>
-              <w:rPr>
-                <w:sz w:val="17"/>
-                <w:szCs w:val="17"/>
-              </w:rPr>
-              <w:t xml:space="preserve">13/13 통과(정답 대조 9/9 차이 0 — 전일 투입·동시 수행 허용 사례 포함). 모델을 바꿀 때마다 다시 돌림</w:t>
-            </w:r>
-          </w:p>
-        </w:tc>
-      </w:tr>
-      <w:tr>
-        <w:trPr>
-          <w:cantSplit/>
-        </w:trPr>
-        <w:tc>
-          <w:tcPr>
-            <w:tcW w:w="1259" w:type="dxa"/>
-          </w:tcPr>
-          <w:p>
-            <w:pPr>
-              <w:pStyle w:val="TWCell"/>
-            </w:pPr>
-            <w:r>
-              <w:rPr>
-                <w:sz w:val="17"/>
-                <w:szCs w:val="17"/>
-              </w:rPr>
-              <w:t xml:space="preserve">솔버 비교</w:t>
-            </w:r>
-          </w:p>
-        </w:tc>
-        <w:tc>
-          <w:tcPr>
-            <w:tcW w:w="4564" w:type="dxa"/>
-          </w:tcPr>
-          <w:p>
-            <w:pPr>
-              <w:pStyle w:val="TWCell"/>
-            </w:pPr>
-            <w:r>
-              <w:rPr>
-                <w:sz w:val="17"/>
-                <w:szCs w:val="17"/>
-              </w:rPr>
-              <w:t xml:space="preserve">오픈소스 솔버 CBC·HiGHS·SCIP에 같은 입력·같은 조건(1스레드, 문제당 240초)으로 357번 풀이</w:t>
-            </w:r>
-          </w:p>
-        </w:tc>
-        <w:tc>
-          <w:tcPr>
-            <w:tcW w:w="4493" w:type="dxa"/>
-          </w:tcPr>
-          <w:p>
-            <w:pPr>
-              <w:pStyle w:val="TWCell"/>
-            </w:pPr>
-            <w:r>
-              <w:rPr>
-                <w:sz w:val="17"/>
-                <w:szCs w:val="17"/>
-              </w:rPr>
-              <w:t xml:space="preserve">정답 사례 21건은 세 솔버 모두 통과. 나머지 솔버당 112건 중 시간 안 완료 HiGHS 79 · SCIP 75 · CBC 22(CBC는 이론상 최대치를 내지 않아 품질 확인 불가) → HiGHS 채택</w:t>
-            </w:r>
-          </w:p>
-        </w:tc>
-      </w:tr>
-      <w:tr>
-        <w:trPr>
-          <w:cantSplit/>
-        </w:trPr>
-        <w:tc>
-          <w:tcPr>
-            <w:tcW w:w="1259" w:type="dxa"/>
-          </w:tcPr>
-          <w:p>
-            <w:pPr>
-              <w:pStyle w:val="TWCell"/>
-            </w:pPr>
-            <w:r>
-              <w:rPr>
-                <w:sz w:val="17"/>
-                <w:szCs w:val="17"/>
-              </w:rPr>
-              <w:t xml:space="preserve">실행 중 독립 검증</w:t>
-            </w:r>
-          </w:p>
-        </w:tc>
-        <w:tc>
-          <w:tcPr>
-            <w:tcW w:w="4564" w:type="dxa"/>
-          </w:tcPr>
-          <w:p>
-            <w:pPr>
-              <w:pStyle w:val="TWCell"/>
-            </w:pPr>
-            <w:r>
-              <w:rPr>
-                <w:sz w:val="17"/>
-                <w:szCs w:val="17"/>
-              </w:rPr>
-              <w:t xml:space="preserve">솔버가 낸 모든 결과를 원자료로 다시 계산(6.4)</w:t>
-            </w:r>
-          </w:p>
-        </w:tc>
-        <w:tc>
-          <w:tcPr>
-            <w:tcW w:w="4493" w:type="dxa"/>
-          </w:tcPr>
-          <w:p>
-            <w:pPr>
-              <w:pStyle w:val="TWCell"/>
-            </w:pPr>
-            <w:r>
-              <w:rPr>
-                <w:sz w:val="17"/>
-                <w:szCs w:val="17"/>
-              </w:rPr>
-              <w:t xml:space="preserve">통과한 해만 화면·PDF로. 불러온 편성 기록도 지금 규칙으로 다시 채점</w:t>
-            </w:r>
-          </w:p>
-        </w:tc>
-      </w:tr>
-      <w:tr>
-        <w:trPr>
-          <w:cantSplit/>
-        </w:trPr>
-        <w:tc>
-          <w:tcPr>
-            <w:tcW w:w="1259" w:type="dxa"/>
-          </w:tcPr>
-          <w:p>
-            <w:pPr>
-              <w:pStyle w:val="TWCell"/>
-            </w:pPr>
-            <w:r>
-              <w:rPr>
-                <w:sz w:val="17"/>
-                <w:szCs w:val="17"/>
-              </w:rPr>
-              <w:t xml:space="preserve">리허설·재현</w:t>
-            </w:r>
-          </w:p>
-        </w:tc>
-        <w:tc>
-          <w:tcPr>
-            <w:tcW w:w="4564" w:type="dxa"/>
-          </w:tcPr>
-          <w:p>
-            <w:pPr>
-              <w:pStyle w:val="TWCell"/>
-            </w:pPr>
-            <w:r>
-              <w:rPr>
-                <w:sz w:val="17"/>
-                <w:szCs w:val="17"/>
-              </w:rPr>
-              <w:t xml:space="preserve">실제 서버로 100/200/300명 전 과정, 시연 대본 최종 리허설, GitHub에서 새로 받은 복제본으로 설치·빌드·전체 시험</w:t>
-            </w:r>
-          </w:p>
-        </w:tc>
-        <w:tc>
-          <w:tcPr>
-            <w:tcW w:w="4493" w:type="dxa"/>
-          </w:tcPr>
-          <w:p>
-            <w:pPr>
-              <w:pStyle w:val="TWCell"/>
-            </w:pPr>
-            <w:r>
-              <w:rPr>
-                <w:sz w:val="17"/>
-                <w:szCs w:val="17"/>
-              </w:rPr>
-              <w:t xml:space="preserve">대본 숫자와 화면 일치. 시간에 따라 갈리던 시험 1개를 찾아 고침</w:t>
-            </w:r>
-          </w:p>
-        </w:tc>
-      </w:tr>
-      <w:tr>
-        <w:trPr>
-          <w:cantSplit/>
-        </w:trPr>
-        <w:tc>
-          <w:tcPr>
-            <w:tcW w:w="1259" w:type="dxa"/>
-          </w:tcPr>
-          <w:p>
-            <w:pPr>
-              <w:pStyle w:val="TWCell"/>
-            </w:pPr>
-            <w:r>
-              <w:rPr>
-                <w:sz w:val="17"/>
-                <w:szCs w:val="17"/>
-              </w:rPr>
-              <w:t xml:space="preserve">독립 코드 리뷰</w:t>
-            </w:r>
-          </w:p>
-        </w:tc>
-        <w:tc>
-          <w:tcPr>
-            <w:tcW w:w="4564" w:type="dxa"/>
-          </w:tcPr>
-          <w:p>
-            <w:pPr>
-              <w:pStyle w:val="TWCell"/>
-            </w:pPr>
-            <w:r>
-              <w:rPr>
-                <w:sz w:val="17"/>
-                <w:szCs w:val="17"/>
-              </w:rPr>
-              <w:t xml:space="preserve">변경마다 Codex 리뷰, 지적은 고치기 전 코드에서 실패하는 시험으로 고정</w:t>
-            </w:r>
-          </w:p>
-        </w:tc>
-        <w:tc>
-          <w:tcPr>
-            <w:tcW w:w="4493" w:type="dxa"/>
-          </w:tcPr>
-          <w:p>
-            <w:pPr>
-              <w:pStyle w:val="TWCell"/>
-            </w:pPr>
-            <w:r>
-              <w:rPr>
-                <w:sz w:val="17"/>
-                <w:szCs w:val="17"/>
-              </w:rPr>
-              <w:t xml:space="preserve">전체 감사에서 27건, 최종 점검에서 2건을 찾아 고침. Codex 사용 한도가 찼을 때는 Claude Opus가 같은 범위를 리뷰</w:t>
-            </w:r>
-          </w:p>
-        </w:tc>
-      </w:tr>
-    </w:tbl>
-    <w:p>
-      <w:pPr>
-        <w:pStyle w:val="TWAfterTable"/>
-      </w:pPr>
+        <w:t xml:space="preserve">(사내 서버를 쓸 수 없어 GLM-5.3-Flash로 가정): 돌려 말한 부정 검출 89% → 52%, 교체 설명 바로 사용 93% → 97%·3.5 → 10.3초, 처음 보는 소명 채택 100% → 97.3%·8 → 60초, 실제 발주 자료 필요 기술 정밀도 0.78 → 0.65·13 → 74초 — 전환 때 더 큰 모델·대기 상한(40 → 300초) 조정이 필요하다. 서비스는 외부 AI로 운영하고, 실데이터는 사내 주소이거나 관리자가 명시 허용했을 때만 AI를 부른다. 모든 측정은 판정 기준을 측정 전에 먼저 정해 고정했다(사전 등록).</w:t>
+      </w:r>
     </w:p>
     <w:p>
       <w:pPr>
@@ -6366,10 +5853,10 @@
           <w:b/>
           <w:bCs/>
         </w:rPr>
-        <w:t xml:space="preserve">규칙을 측정으로 정했다.</w:t>
-      </w:r>
-      <w:r>
-        <w:t xml:space="preserve"> 보상 쌍 수·익숙한 쌍 기준·감점 방식·솔버·소명 글 방식을 대안과 같은 데이터로 비교하고, 판정 기준을 측정 전에 먼저 정해 고정했다(7장).</w:t>
+        <w:t xml:space="preserve">실제 도입을 염두에 둔 설계.</w:t>
+      </w:r>
+      <w:r>
+        <w:t xml:space="preserve"> 사내 LLM 전환 시 차이 측정(3.6), 실제 인사 자료와 같은 입력 계약·검증 리포트, 평가 원문을 화면·AI에 보내지 않고 항목 라벨만 쓰는 비공개 모드, 외부 AI 차단 규칙.</w:t>
       </w:r>
     </w:p>
     <w:p>
@@ -6385,10 +5872,10 @@
           <w:b/>
           <w:bCs/>
         </w:rPr>
-        <w:t xml:space="preserve">부서장의 판단을 지우지 않고 남긴다.</w:t>
-      </w:r>
-      <w:r>
-        <w:t xml:space="preserve"> 계산이 정하지 않는 것 — 등급 대체, 프로젝트 동시 수행 허용, 확정 취소 — 은 부서장이 사유와 함께 고르고, 데이터의 새 판(되돌리기 가능)과 인사팀 검토 자료의 잠긴 사실로 남는다. 계산 모델은 그대로 두어 부족 신호를 묻지 않는다.</w:t>
+        <w:t xml:space="preserve">설계를 감이 아니라 측정으로 정했다.</w:t>
+      </w:r>
+      <w:r>
+        <w:t xml:space="preserve"> 협업 보상 대상 쌍 수, "오래 붙어 다닌 사이"의 기준, 솔버, 소명 글 쓰는 방식 같은 선택마다 대안을 같은 데이터로 돌려 보고 결과로 골랐다(7장).</w:t>
       </w:r>
     </w:p>
     <w:p>
@@ -6404,57 +5891,10 @@
           <w:b/>
           <w:bCs/>
         </w:rPr>
-        <w:t xml:space="preserve">측정한 대로 보고한다.</w:t>
-      </w:r>
-      <w:r>
-        <w:t xml:space="preserve"> 사업 효과는 </w:t>
-      </w:r>
-      <w:r>
-        <w:rPr>
-          <w:rFonts w:ascii="Consolas" w:hAnsi="Consolas" w:eastAsia="Malgun Gothic" w:cs="Consolas"/>
-        </w:rPr>
-        <w:t xml:space="preserve">NOT_CALIBRATED</w:t>
-      </w:r>
-      <w:r>
-        <w:t xml:space="preserve">로 표시하고, 가상 성과로 효과를 "입증"하는 것은 순환 검증이라 하지 않았다. 100명 최선안이 시간 한도에서 멈춰 2.5% 여지가 남은 것, LLM이 20명에서는 솔버의 89~94%까지 낸 것처럼 불리하거나 애매한 결과도 그대로 적는다.</w:t>
-      </w:r>
-    </w:p>
-    <w:p>
-      <w:pPr>
-        <w:pStyle w:val="TWList"/>
-        <w:numPr>
-          <w:ilvl w:val="0"/>
-          <w:numId w:val="1"/>
-        </w:numPr>
-      </w:pPr>
-      <w:r>
-        <w:rPr>
-          <w:b/>
-          <w:bCs/>
-        </w:rPr>
-        <w:t xml:space="preserve">실제 도입을 염두에 둔 설계.</w:t>
-      </w:r>
-      <w:r>
-        <w:t xml:space="preserve"> 실제 인사 자료와 같은 입력 계약·검증 리포트, 평가 원문을 화면·AI에 보내지 않고 항목 라벨만 쓰는 비공개 모드, 외부 AI 차단 규칙, 사내 LLM 전환 시 차이 측정(3.6).</w:t>
-      </w:r>
-    </w:p>
-    <w:p>
-      <w:pPr>
-        <w:pStyle w:val="TWList"/>
-        <w:numPr>
-          <w:ilvl w:val="0"/>
-          <w:numId w:val="1"/>
-        </w:numPr>
-      </w:pPr>
-      <w:r>
-        <w:rPr>
-          <w:b/>
-          <w:bCs/>
-        </w:rPr>
-        <w:t xml:space="preserve">AI로 개발했다.</w:t>
-      </w:r>
-      <w:r>
-        <w:t xml:space="preserve"> Claude 두 계정과 Codex가 맡은 영역을 나눠 함께 개발했다.</w:t>
+        <w:t xml:space="preserve">결정의 근거와 책임이 남는다.</w:t>
+      </w:r>
+      <w:r>
+        <w:t xml:space="preserve"> 계산이 정하지 않는 판단 — 등급 대체, 프로젝트 동시 수행 허용, 확정 취소 — 은 부서장이 사유와 함께 정하고, 그 기록이 인사팀 검토 자료와 변경 보고서로 남아 나중에 누가 왜 그렇게 정했는지 설명할 수 있다.</w:t>
       </w:r>
     </w:p>
     <w:p>
@@ -8617,6 +8057,18 @@
       </w:pPr>
       <w:r>
         <w:t xml:space="preserve">HiGHS는 z = 1.0000000000000007 같은 값을 돌려준다 — 1e-9 안쪽의 경계 잔차만 경계로 옮기고(원본 보존), 예산의 극미세 초과(상대 1e-7 이하)는 보정 LP 뒤 다시 검증한다. 이 처리 없이는 HiGHS 해가 전부 "검증 실패"였다(실측).</w:t>
+      </w:r>
+    </w:p>
+    <w:p>
+      <w:pPr>
+        <w:pStyle w:val="TWList"/>
+        <w:numPr>
+          <w:ilvl w:val="0"/>
+          <w:numId w:val="1"/>
+        </w:numPr>
+      </w:pPr>
+      <w:r>
+        <w:t xml:space="preserve">정답 대조: 작은 사례는 가능한 사람 조합을 모두 따져 구한 정답(제품 계산 코드를 쓰지 않는 별도 구현)과 비교한다 — 13/13 통과, 모델을 바꿀 때마다 다시 돌린다.</w:t>
       </w:r>
     </w:p>
     <w:p>

</xml_diff>

<commit_message>
docs: final report says plainly that the in-house model is GLM-5.2 and that the GLM numbers were measured on the same-family GLM-5.3-Flash through the outside API (3.5 intro and row, 3.6 in-house paragraph, 5.2 stack, 7 table); numbers unchanged, still 10 pages
Co-Authored-By: Claude Opus 5.5 <noreply@anthropic.com>
Claude-Session: https://claude.ai/code/session_01XiJnTNFVeV2BokGGcyeQom
</commit_message>
<xml_diff>
--- a/outputs/final-report.docx
+++ b/outputs/final-report.docx
@@ -4141,10 +4141,10 @@
           <w:b/>
           <w:bCs/>
         </w:rPr>
-        <w:t xml:space="preserve">GLM-5.3-Flash</w:t>
-      </w:r>
-      <w:r>
-        <w:t xml:space="preserve">)를 같은 글에 돌렸다.</w:t>
+        <w:t xml:space="preserve">GLM</w:t>
+      </w:r>
+      <w:r>
+        <w:t xml:space="preserve">)를 같은 글에 돌렸다. 회사에서 쓸 수 있는 모델은 GLM-5.2이지만 사내 서버로는 잴 수 없어, 같은 계열 GLM-5.3-Flash를 외부 API로 불러 대신 쟀다.</w:t>
       </w:r>
     </w:p>
     <w:tbl>
@@ -4168,11 +4168,11 @@
         </w:tblCellMar>
       </w:tblPr>
       <w:tblGrid>
-        <w:gridCol w:w="2276"/>
-        <w:gridCol w:w="1719"/>
-        <w:gridCol w:w="2804"/>
-        <w:gridCol w:w="1164"/>
-        <w:gridCol w:w="2352"/>
+        <w:gridCol w:w="2755"/>
+        <w:gridCol w:w="1647"/>
+        <w:gridCol w:w="2707"/>
+        <w:gridCol w:w="1115"/>
+        <w:gridCol w:w="2092"/>
       </w:tblGrid>
       <w:tr>
         <w:trPr>
@@ -4181,7 +4181,7 @@
         </w:trPr>
         <w:tc>
           <w:tcPr>
-            <w:tcW w:w="2276" w:type="dxa"/>
+            <w:tcW w:w="2755" w:type="dxa"/>
             <w:shd w:val="clear" w:color="auto" w:fill="F1F3F5"/>
           </w:tcPr>
           <w:p>
@@ -4201,7 +4201,7 @@
         </w:tc>
         <w:tc>
           <w:tcPr>
-            <w:tcW w:w="1719" w:type="dxa"/>
+            <w:tcW w:w="1647" w:type="dxa"/>
             <w:shd w:val="clear" w:color="auto" w:fill="F1F3F5"/>
           </w:tcPr>
           <w:p>
@@ -4240,7 +4240,7 @@
         </w:tc>
         <w:tc>
           <w:tcPr>
-            <w:tcW w:w="2804" w:type="dxa"/>
+            <w:tcW w:w="2707" w:type="dxa"/>
             <w:shd w:val="clear" w:color="auto" w:fill="F1F3F5"/>
           </w:tcPr>
           <w:p>
@@ -4279,7 +4279,7 @@
         </w:tc>
         <w:tc>
           <w:tcPr>
-            <w:tcW w:w="1164" w:type="dxa"/>
+            <w:tcW w:w="1115" w:type="dxa"/>
             <w:shd w:val="clear" w:color="auto" w:fill="F1F3F5"/>
           </w:tcPr>
           <w:p>
@@ -4300,7 +4300,7 @@
         </w:tc>
         <w:tc>
           <w:tcPr>
-            <w:tcW w:w="2352" w:type="dxa"/>
+            <w:tcW w:w="2092" w:type="dxa"/>
             <w:shd w:val="clear" w:color="auto" w:fill="F1F3F5"/>
           </w:tcPr>
           <w:p>
@@ -4325,7 +4325,7 @@
         </w:trPr>
         <w:tc>
           <w:tcPr>
-            <w:tcW w:w="2276" w:type="dxa"/>
+            <w:tcW w:w="2755" w:type="dxa"/>
           </w:tcPr>
           <w:p>
             <w:pPr>
@@ -4342,7 +4342,7 @@
         </w:tc>
         <w:tc>
           <w:tcPr>
-            <w:tcW w:w="1719" w:type="dxa"/>
+            <w:tcW w:w="1647" w:type="dxa"/>
           </w:tcPr>
           <w:p>
             <w:pPr>
@@ -4360,7 +4360,7 @@
         </w:tc>
         <w:tc>
           <w:tcPr>
-            <w:tcW w:w="2804" w:type="dxa"/>
+            <w:tcW w:w="2707" w:type="dxa"/>
           </w:tcPr>
           <w:p>
             <w:pPr>
@@ -4378,7 +4378,7 @@
         </w:tc>
         <w:tc>
           <w:tcPr>
-            <w:tcW w:w="1164" w:type="dxa"/>
+            <w:tcW w:w="1115" w:type="dxa"/>
           </w:tcPr>
           <w:p>
             <w:pPr>
@@ -4396,7 +4396,7 @@
         </w:tc>
         <w:tc>
           <w:tcPr>
-            <w:tcW w:w="2352" w:type="dxa"/>
+            <w:tcW w:w="2092" w:type="dxa"/>
           </w:tcPr>
           <w:p>
             <w:pPr>
@@ -4418,7 +4418,7 @@
         </w:trPr>
         <w:tc>
           <w:tcPr>
-            <w:tcW w:w="2276" w:type="dxa"/>
+            <w:tcW w:w="2755" w:type="dxa"/>
           </w:tcPr>
           <w:p>
             <w:pPr>
@@ -4435,7 +4435,7 @@
         </w:tc>
         <w:tc>
           <w:tcPr>
-            <w:tcW w:w="1719" w:type="dxa"/>
+            <w:tcW w:w="1647" w:type="dxa"/>
           </w:tcPr>
           <w:p>
             <w:pPr>
@@ -4453,7 +4453,7 @@
         </w:tc>
         <w:tc>
           <w:tcPr>
-            <w:tcW w:w="2804" w:type="dxa"/>
+            <w:tcW w:w="2707" w:type="dxa"/>
           </w:tcPr>
           <w:p>
             <w:pPr>
@@ -4471,7 +4471,7 @@
         </w:tc>
         <w:tc>
           <w:tcPr>
-            <w:tcW w:w="1164" w:type="dxa"/>
+            <w:tcW w:w="1115" w:type="dxa"/>
           </w:tcPr>
           <w:p>
             <w:pPr>
@@ -4489,7 +4489,7 @@
         </w:tc>
         <w:tc>
           <w:tcPr>
-            <w:tcW w:w="2352" w:type="dxa"/>
+            <w:tcW w:w="2092" w:type="dxa"/>
           </w:tcPr>
           <w:p>
             <w:pPr>
@@ -4511,24 +4511,24 @@
         </w:trPr>
         <w:tc>
           <w:tcPr>
-            <w:tcW w:w="2276" w:type="dxa"/>
-          </w:tcPr>
-          <w:p>
-            <w:pPr>
-              <w:pStyle w:val="TWCell"/>
-            </w:pPr>
-            <w:r>
-              <w:rPr>
-                <w:sz w:val="17"/>
-                <w:szCs w:val="17"/>
-              </w:rPr>
-              <w:t xml:space="preserve">GLM-5.3-Flash(사내 후보)</w:t>
-            </w:r>
-          </w:p>
-        </w:tc>
-        <w:tc>
-          <w:tcPr>
-            <w:tcW w:w="1719" w:type="dxa"/>
+            <w:tcW w:w="2755" w:type="dxa"/>
+          </w:tcPr>
+          <w:p>
+            <w:pPr>
+              <w:pStyle w:val="TWCell"/>
+            </w:pPr>
+            <w:r>
+              <w:rPr>
+                <w:sz w:val="17"/>
+                <w:szCs w:val="17"/>
+              </w:rPr>
+              <w:t xml:space="preserve">GLM-5.3-Flash(사내 GLM-5.2 대신 측정)</w:t>
+            </w:r>
+          </w:p>
+        </w:tc>
+        <w:tc>
+          <w:tcPr>
+            <w:tcW w:w="1647" w:type="dxa"/>
           </w:tcPr>
           <w:p>
             <w:pPr>
@@ -4546,7 +4546,7 @@
         </w:tc>
         <w:tc>
           <w:tcPr>
-            <w:tcW w:w="2804" w:type="dxa"/>
+            <w:tcW w:w="2707" w:type="dxa"/>
           </w:tcPr>
           <w:p>
             <w:pPr>
@@ -4564,7 +4564,7 @@
         </w:tc>
         <w:tc>
           <w:tcPr>
-            <w:tcW w:w="1164" w:type="dxa"/>
+            <w:tcW w:w="1115" w:type="dxa"/>
           </w:tcPr>
           <w:p>
             <w:pPr>
@@ -4582,7 +4582,7 @@
         </w:tc>
         <w:tc>
           <w:tcPr>
-            <w:tcW w:w="2352" w:type="dxa"/>
+            <w:tcW w:w="2092" w:type="dxa"/>
           </w:tcPr>
           <w:p>
             <w:pPr>
@@ -4604,7 +4604,7 @@
         </w:trPr>
         <w:tc>
           <w:tcPr>
-            <w:tcW w:w="2276" w:type="dxa"/>
+            <w:tcW w:w="2755" w:type="dxa"/>
           </w:tcPr>
           <w:p>
             <w:pPr>
@@ -4623,7 +4623,7 @@
         </w:tc>
         <w:tc>
           <w:tcPr>
-            <w:tcW w:w="1719" w:type="dxa"/>
+            <w:tcW w:w="1647" w:type="dxa"/>
           </w:tcPr>
           <w:p>
             <w:pPr>
@@ -4643,7 +4643,7 @@
         </w:tc>
         <w:tc>
           <w:tcPr>
-            <w:tcW w:w="2804" w:type="dxa"/>
+            <w:tcW w:w="2707" w:type="dxa"/>
           </w:tcPr>
           <w:p>
             <w:pPr>
@@ -4663,7 +4663,7 @@
         </w:tc>
         <w:tc>
           <w:tcPr>
-            <w:tcW w:w="1164" w:type="dxa"/>
+            <w:tcW w:w="1115" w:type="dxa"/>
           </w:tcPr>
           <w:p>
             <w:pPr>
@@ -4681,7 +4681,7 @@
         </w:tc>
         <w:tc>
           <w:tcPr>
-            <w:tcW w:w="2352" w:type="dxa"/>
+            <w:tcW w:w="2092" w:type="dxa"/>
           </w:tcPr>
           <w:p>
             <w:pPr>
@@ -5791,7 +5791,7 @@
         <w:rPr>
           <w:color w:val="5B6168"/>
         </w:rPr>
-        <w:t xml:space="preserve">(사내 서버를 쓸 수 없어 GLM-5.3-Flash로 가정): 돌려 말한 부정 검출 89% → 52%, 교체 설명 바로 사용 93% → 97%·3.5 → 10.3초, 처음 보는 소명 채택 100% → 97.3%·8 → 60초, 실제 발주 자료 필요 기술 정밀도 0.78 → 0.65·13 → 74초 — 전환 때 더 큰 모델·대기 상한(40 → 300초) 조정이 필요하다. 서비스는 외부 AI로 운영하고, 실데이터는 사내 주소이거나 관리자가 명시 허용했을 때만 AI를 부른다. 모든 측정은 판정 기준을 측정 전에 먼저 정해 고정했다(사전 등록).</w:t>
+        <w:t xml:space="preserve">(회사에서 쓸 수 있는 GLM-5.2 대신 같은 계열 GLM-5.3-Flash로 쟀다 — 사내 서버로는 잴 수 없음): 돌려 말한 부정 검출 89% → 52%, 교체 설명 바로 사용 93% → 97%·3.5 → 10.3초, 처음 보는 소명 채택 100% → 97.3%·8 → 60초, 실제 발주 자료 필요 기술 정밀도 0.78 → 0.65·13 → 74초 — 전환 때 더 큰 모델·대기 상한(40 → 300초) 조정이 필요하다. 서비스는 외부 AI로 운영하고, 실데이터는 사내 주소이거나 관리자가 명시 허용했을 때만 AI를 부른다. 모든 측정은 판정 기준을 측정 전에 먼저 정해 고정했다(사전 등록).</w:t>
       </w:r>
     </w:p>
     <w:p>
@@ -6428,7 +6428,7 @@
     <w:tbl>
       <w:tblPr>
         <w:tblStyle w:val="TWTable"/>
-        <w:tblW w:w="10317" w:type="dxa"/>
+        <w:tblW w:w="10318" w:type="dxa"/>
         <w:tblBorders>
           <w:top w:val="single" w:sz="4" w:space="0" w:color="D8DCE1"/>
           <w:left w:val="single" w:sz="4" w:space="0" w:color="D8DCE1"/>
@@ -6446,10 +6446,10 @@
         </w:tblCellMar>
       </w:tblPr>
       <w:tblGrid>
-        <w:gridCol w:w="930"/>
-        <w:gridCol w:w="4390"/>
+        <w:gridCol w:w="882"/>
+        <w:gridCol w:w="3787"/>
         <w:gridCol w:w="1145"/>
-        <w:gridCol w:w="3851"/>
+        <w:gridCol w:w="4502"/>
       </w:tblGrid>
       <w:tr>
         <w:trPr>
@@ -6458,7 +6458,7 @@
         </w:trPr>
         <w:tc>
           <w:tcPr>
-            <w:tcW w:w="930" w:type="dxa"/>
+            <w:tcW w:w="882" w:type="dxa"/>
             <w:shd w:val="clear" w:color="auto" w:fill="EEF2F6"/>
           </w:tcPr>
           <w:p>
@@ -6479,7 +6479,7 @@
         </w:tc>
         <w:tc>
           <w:tcPr>
-            <w:tcW w:w="4390" w:type="dxa"/>
+            <w:tcW w:w="3787" w:type="dxa"/>
             <w:shd w:val="clear" w:color="auto" w:fill="F1F3F5"/>
           </w:tcPr>
           <w:p>
@@ -6520,7 +6520,7 @@
         </w:tc>
         <w:tc>
           <w:tcPr>
-            <w:tcW w:w="3851" w:type="dxa"/>
+            <w:tcW w:w="4502" w:type="dxa"/>
             <w:shd w:val="clear" w:color="auto" w:fill="F1F3F5"/>
           </w:tcPr>
           <w:p>
@@ -6545,7 +6545,7 @@
         </w:trPr>
         <w:tc>
           <w:tcPr>
-            <w:tcW w:w="930" w:type="dxa"/>
+            <w:tcW w:w="882" w:type="dxa"/>
             <w:shd w:val="clear" w:color="auto" w:fill="EEF2F6"/>
           </w:tcPr>
           <w:p>
@@ -6566,7 +6566,7 @@
         </w:tc>
         <w:tc>
           <w:tcPr>
-            <w:tcW w:w="4390" w:type="dxa"/>
+            <w:tcW w:w="3787" w:type="dxa"/>
           </w:tcPr>
           <w:p>
             <w:pPr>
@@ -6604,7 +6604,7 @@
         </w:tc>
         <w:tc>
           <w:tcPr>
-            <w:tcW w:w="3851" w:type="dxa"/>
+            <w:tcW w:w="4502" w:type="dxa"/>
           </w:tcPr>
           <w:p>
             <w:pPr>
@@ -6626,7 +6626,7 @@
         </w:trPr>
         <w:tc>
           <w:tcPr>
-            <w:tcW w:w="930" w:type="dxa"/>
+            <w:tcW w:w="882" w:type="dxa"/>
             <w:shd w:val="clear" w:color="auto" w:fill="EEF2F6"/>
           </w:tcPr>
           <w:p>
@@ -6647,7 +6647,7 @@
         </w:tc>
         <w:tc>
           <w:tcPr>
-            <w:tcW w:w="4390" w:type="dxa"/>
+            <w:tcW w:w="3787" w:type="dxa"/>
           </w:tcPr>
           <w:p>
             <w:pPr>
@@ -6685,18 +6685,18 @@
         </w:tc>
         <w:tc>
           <w:tcPr>
-            <w:tcW w:w="3851" w:type="dxa"/>
-          </w:tcPr>
-          <w:p>
-            <w:pPr>
-              <w:pStyle w:val="TWCell"/>
-            </w:pPr>
-            <w:r>
-              <w:rPr>
-                <w:sz w:val="17"/>
-                <w:szCs w:val="17"/>
-              </w:rPr>
-              <w:t xml:space="preserve">OpenAI 호환 API — 외부 gpt-6-luna, 사내 가정 GLM-5.3-Flash</w:t>
+            <w:tcW w:w="4502" w:type="dxa"/>
+          </w:tcPr>
+          <w:p>
+            <w:pPr>
+              <w:pStyle w:val="TWCell"/>
+            </w:pPr>
+            <w:r>
+              <w:rPr>
+                <w:sz w:val="17"/>
+                <w:szCs w:val="17"/>
+              </w:rPr>
+              <w:t xml:space="preserve">OpenAI 호환 API — 외부 gpt-6-luna, 사내 GLM-5.2(측정은 같은 계열 GLM-5.3-Flash로 대신)</w:t>
             </w:r>
           </w:p>
         </w:tc>
@@ -6707,7 +6707,7 @@
         </w:trPr>
         <w:tc>
           <w:tcPr>
-            <w:tcW w:w="930" w:type="dxa"/>
+            <w:tcW w:w="882" w:type="dxa"/>
             <w:shd w:val="clear" w:color="auto" w:fill="EEF2F6"/>
           </w:tcPr>
           <w:p>
@@ -6728,7 +6728,7 @@
         </w:tc>
         <w:tc>
           <w:tcPr>
-            <w:tcW w:w="4390" w:type="dxa"/>
+            <w:tcW w:w="3787" w:type="dxa"/>
           </w:tcPr>
           <w:p>
             <w:pPr>
@@ -6766,7 +6766,7 @@
         </w:tc>
         <w:tc>
           <w:tcPr>
-            <w:tcW w:w="3851" w:type="dxa"/>
+            <w:tcW w:w="4502" w:type="dxa"/>
           </w:tcPr>
           <w:p>
             <w:pPr>
@@ -6788,7 +6788,7 @@
         </w:trPr>
         <w:tc>
           <w:tcPr>
-            <w:tcW w:w="930" w:type="dxa"/>
+            <w:tcW w:w="882" w:type="dxa"/>
             <w:shd w:val="clear" w:color="auto" w:fill="EEF2F6"/>
           </w:tcPr>
           <w:p>
@@ -6809,7 +6809,7 @@
         </w:tc>
         <w:tc>
           <w:tcPr>
-            <w:tcW w:w="4390" w:type="dxa"/>
+            <w:tcW w:w="3787" w:type="dxa"/>
           </w:tcPr>
           <w:p>
             <w:pPr>
@@ -6847,7 +6847,7 @@
         </w:tc>
         <w:tc>
           <w:tcPr>
-            <w:tcW w:w="3851" w:type="dxa"/>
+            <w:tcW w:w="4502" w:type="dxa"/>
           </w:tcPr>
           <w:p>
             <w:pPr>
@@ -8895,10 +8895,10 @@
         </w:tblCellMar>
       </w:tblPr>
       <w:tblGrid>
-        <w:gridCol w:w="1350"/>
-        <w:gridCol w:w="2273"/>
-        <w:gridCol w:w="4451"/>
-        <w:gridCol w:w="2242"/>
+        <w:gridCol w:w="1342"/>
+        <w:gridCol w:w="2379"/>
+        <w:gridCol w:w="4379"/>
+        <w:gridCol w:w="2215"/>
       </w:tblGrid>
       <w:tr>
         <w:trPr>
@@ -8907,7 +8907,7 @@
         </w:trPr>
         <w:tc>
           <w:tcPr>
-            <w:tcW w:w="1350" w:type="dxa"/>
+            <w:tcW w:w="1342" w:type="dxa"/>
             <w:shd w:val="clear" w:color="auto" w:fill="F1F3F5"/>
           </w:tcPr>
           <w:p>
@@ -8927,7 +8927,7 @@
         </w:tc>
         <w:tc>
           <w:tcPr>
-            <w:tcW w:w="2273" w:type="dxa"/>
+            <w:tcW w:w="2379" w:type="dxa"/>
             <w:shd w:val="clear" w:color="auto" w:fill="F1F3F5"/>
           </w:tcPr>
           <w:p>
@@ -8947,7 +8947,7 @@
         </w:tc>
         <w:tc>
           <w:tcPr>
-            <w:tcW w:w="4451" w:type="dxa"/>
+            <w:tcW w:w="4379" w:type="dxa"/>
             <w:shd w:val="clear" w:color="auto" w:fill="F1F3F5"/>
           </w:tcPr>
           <w:p>
@@ -8967,7 +8967,7 @@
         </w:tc>
         <w:tc>
           <w:tcPr>
-            <w:tcW w:w="2242" w:type="dxa"/>
+            <w:tcW w:w="2215" w:type="dxa"/>
             <w:shd w:val="clear" w:color="auto" w:fill="F1F3F5"/>
           </w:tcPr>
           <w:p>
@@ -8992,7 +8992,7 @@
         </w:trPr>
         <w:tc>
           <w:tcPr>
-            <w:tcW w:w="1350" w:type="dxa"/>
+            <w:tcW w:w="1342" w:type="dxa"/>
           </w:tcPr>
           <w:p>
             <w:pPr>
@@ -9009,7 +9009,7 @@
         </w:tc>
         <w:tc>
           <w:tcPr>
-            <w:tcW w:w="2273" w:type="dxa"/>
+            <w:tcW w:w="2379" w:type="dxa"/>
           </w:tcPr>
           <w:p>
             <w:pPr>
@@ -9026,7 +9026,7 @@
         </w:tc>
         <w:tc>
           <w:tcPr>
-            <w:tcW w:w="4451" w:type="dxa"/>
+            <w:tcW w:w="4379" w:type="dxa"/>
           </w:tcPr>
           <w:p>
             <w:pPr>
@@ -9043,7 +9043,7 @@
         </w:tc>
         <w:tc>
           <w:tcPr>
-            <w:tcW w:w="2242" w:type="dxa"/>
+            <w:tcW w:w="2215" w:type="dxa"/>
           </w:tcPr>
           <w:p>
             <w:pPr>
@@ -9065,7 +9065,7 @@
         </w:trPr>
         <w:tc>
           <w:tcPr>
-            <w:tcW w:w="1350" w:type="dxa"/>
+            <w:tcW w:w="1342" w:type="dxa"/>
           </w:tcPr>
           <w:p>
             <w:pPr>
@@ -9082,7 +9082,7 @@
         </w:tc>
         <w:tc>
           <w:tcPr>
-            <w:tcW w:w="2273" w:type="dxa"/>
+            <w:tcW w:w="2379" w:type="dxa"/>
           </w:tcPr>
           <w:p>
             <w:pPr>
@@ -9099,7 +9099,7 @@
         </w:tc>
         <w:tc>
           <w:tcPr>
-            <w:tcW w:w="4451" w:type="dxa"/>
+            <w:tcW w:w="4379" w:type="dxa"/>
           </w:tcPr>
           <w:p>
             <w:pPr>
@@ -9116,7 +9116,7 @@
         </w:tc>
         <w:tc>
           <w:tcPr>
-            <w:tcW w:w="2242" w:type="dxa"/>
+            <w:tcW w:w="2215" w:type="dxa"/>
           </w:tcPr>
           <w:p>
             <w:pPr>
@@ -9138,7 +9138,7 @@
         </w:trPr>
         <w:tc>
           <w:tcPr>
-            <w:tcW w:w="1350" w:type="dxa"/>
+            <w:tcW w:w="1342" w:type="dxa"/>
           </w:tcPr>
           <w:p>
             <w:pPr>
@@ -9155,7 +9155,7 @@
         </w:tc>
         <w:tc>
           <w:tcPr>
-            <w:tcW w:w="2273" w:type="dxa"/>
+            <w:tcW w:w="2379" w:type="dxa"/>
           </w:tcPr>
           <w:p>
             <w:pPr>
@@ -9172,7 +9172,7 @@
         </w:tc>
         <w:tc>
           <w:tcPr>
-            <w:tcW w:w="4451" w:type="dxa"/>
+            <w:tcW w:w="4379" w:type="dxa"/>
           </w:tcPr>
           <w:p>
             <w:pPr>
@@ -9189,7 +9189,7 @@
         </w:tc>
         <w:tc>
           <w:tcPr>
-            <w:tcW w:w="2242" w:type="dxa"/>
+            <w:tcW w:w="2215" w:type="dxa"/>
           </w:tcPr>
           <w:p>
             <w:pPr>
@@ -9211,7 +9211,7 @@
         </w:trPr>
         <w:tc>
           <w:tcPr>
-            <w:tcW w:w="1350" w:type="dxa"/>
+            <w:tcW w:w="1342" w:type="dxa"/>
           </w:tcPr>
           <w:p>
             <w:pPr>
@@ -9228,7 +9228,7 @@
         </w:tc>
         <w:tc>
           <w:tcPr>
-            <w:tcW w:w="2273" w:type="dxa"/>
+            <w:tcW w:w="2379" w:type="dxa"/>
           </w:tcPr>
           <w:p>
             <w:pPr>
@@ -9245,7 +9245,7 @@
         </w:tc>
         <w:tc>
           <w:tcPr>
-            <w:tcW w:w="4451" w:type="dxa"/>
+            <w:tcW w:w="4379" w:type="dxa"/>
           </w:tcPr>
           <w:p>
             <w:pPr>
@@ -9262,7 +9262,7 @@
         </w:tc>
         <w:tc>
           <w:tcPr>
-            <w:tcW w:w="2242" w:type="dxa"/>
+            <w:tcW w:w="2215" w:type="dxa"/>
           </w:tcPr>
           <w:p>
             <w:pPr>
@@ -9284,7 +9284,7 @@
         </w:trPr>
         <w:tc>
           <w:tcPr>
-            <w:tcW w:w="1350" w:type="dxa"/>
+            <w:tcW w:w="1342" w:type="dxa"/>
           </w:tcPr>
           <w:p>
             <w:pPr>
@@ -9301,7 +9301,7 @@
         </w:tc>
         <w:tc>
           <w:tcPr>
-            <w:tcW w:w="2273" w:type="dxa"/>
+            <w:tcW w:w="2379" w:type="dxa"/>
           </w:tcPr>
           <w:p>
             <w:pPr>
@@ -9318,7 +9318,7 @@
         </w:tc>
         <w:tc>
           <w:tcPr>
-            <w:tcW w:w="4451" w:type="dxa"/>
+            <w:tcW w:w="4379" w:type="dxa"/>
           </w:tcPr>
           <w:p>
             <w:pPr>
@@ -9335,7 +9335,7 @@
         </w:tc>
         <w:tc>
           <w:tcPr>
-            <w:tcW w:w="2242" w:type="dxa"/>
+            <w:tcW w:w="2215" w:type="dxa"/>
           </w:tcPr>
           <w:p>
             <w:pPr>
@@ -9357,7 +9357,7 @@
         </w:trPr>
         <w:tc>
           <w:tcPr>
-            <w:tcW w:w="1350" w:type="dxa"/>
+            <w:tcW w:w="1342" w:type="dxa"/>
           </w:tcPr>
           <w:p>
             <w:pPr>
@@ -9374,7 +9374,7 @@
         </w:tc>
         <w:tc>
           <w:tcPr>
-            <w:tcW w:w="2273" w:type="dxa"/>
+            <w:tcW w:w="2379" w:type="dxa"/>
           </w:tcPr>
           <w:p>
             <w:pPr>
@@ -9391,7 +9391,7 @@
         </w:tc>
         <w:tc>
           <w:tcPr>
-            <w:tcW w:w="4451" w:type="dxa"/>
+            <w:tcW w:w="4379" w:type="dxa"/>
           </w:tcPr>
           <w:p>
             <w:pPr>
@@ -9408,7 +9408,7 @@
         </w:tc>
         <w:tc>
           <w:tcPr>
-            <w:tcW w:w="2242" w:type="dxa"/>
+            <w:tcW w:w="2215" w:type="dxa"/>
           </w:tcPr>
           <w:p>
             <w:pPr>
@@ -9430,7 +9430,7 @@
         </w:trPr>
         <w:tc>
           <w:tcPr>
-            <w:tcW w:w="1350" w:type="dxa"/>
+            <w:tcW w:w="1342" w:type="dxa"/>
           </w:tcPr>
           <w:p>
             <w:pPr>
@@ -9447,7 +9447,7 @@
         </w:tc>
         <w:tc>
           <w:tcPr>
-            <w:tcW w:w="2273" w:type="dxa"/>
+            <w:tcW w:w="2379" w:type="dxa"/>
           </w:tcPr>
           <w:p>
             <w:pPr>
@@ -9464,7 +9464,7 @@
         </w:tc>
         <w:tc>
           <w:tcPr>
-            <w:tcW w:w="4451" w:type="dxa"/>
+            <w:tcW w:w="4379" w:type="dxa"/>
           </w:tcPr>
           <w:p>
             <w:pPr>
@@ -9481,7 +9481,7 @@
         </w:tc>
         <w:tc>
           <w:tcPr>
-            <w:tcW w:w="2242" w:type="dxa"/>
+            <w:tcW w:w="2215" w:type="dxa"/>
           </w:tcPr>
           <w:p>
             <w:pPr>
@@ -9503,7 +9503,7 @@
         </w:trPr>
         <w:tc>
           <w:tcPr>
-            <w:tcW w:w="1350" w:type="dxa"/>
+            <w:tcW w:w="1342" w:type="dxa"/>
           </w:tcPr>
           <w:p>
             <w:pPr>
@@ -9520,7 +9520,7 @@
         </w:tc>
         <w:tc>
           <w:tcPr>
-            <w:tcW w:w="2273" w:type="dxa"/>
+            <w:tcW w:w="2379" w:type="dxa"/>
           </w:tcPr>
           <w:p>
             <w:pPr>
@@ -9537,7 +9537,7 @@
         </w:tc>
         <w:tc>
           <w:tcPr>
-            <w:tcW w:w="4451" w:type="dxa"/>
+            <w:tcW w:w="4379" w:type="dxa"/>
           </w:tcPr>
           <w:p>
             <w:pPr>
@@ -9554,7 +9554,7 @@
         </w:tc>
         <w:tc>
           <w:tcPr>
-            <w:tcW w:w="2242" w:type="dxa"/>
+            <w:tcW w:w="2215" w:type="dxa"/>
           </w:tcPr>
           <w:p>
             <w:pPr>
@@ -9576,7 +9576,7 @@
         </w:trPr>
         <w:tc>
           <w:tcPr>
-            <w:tcW w:w="1350" w:type="dxa"/>
+            <w:tcW w:w="1342" w:type="dxa"/>
           </w:tcPr>
           <w:p>
             <w:pPr>
@@ -9593,24 +9593,24 @@
         </w:tc>
         <w:tc>
           <w:tcPr>
-            <w:tcW w:w="2273" w:type="dxa"/>
-          </w:tcPr>
-          <w:p>
-            <w:pPr>
-              <w:pStyle w:val="TWCell"/>
-            </w:pPr>
-            <w:r>
-              <w:rPr>
-                <w:sz w:val="17"/>
-                <w:szCs w:val="17"/>
-              </w:rPr>
-              <w:t xml:space="preserve">규칙(항목만) · Jev · GLM-5.3-Flash · OpenAI</w:t>
-            </w:r>
-          </w:p>
-        </w:tc>
-        <w:tc>
-          <w:tcPr>
-            <w:tcW w:w="4451" w:type="dxa"/>
+            <w:tcW w:w="2379" w:type="dxa"/>
+          </w:tcPr>
+          <w:p>
+            <w:pPr>
+              <w:pStyle w:val="TWCell"/>
+            </w:pPr>
+            <w:r>
+              <w:rPr>
+                <w:sz w:val="17"/>
+                <w:szCs w:val="17"/>
+              </w:rPr>
+              <w:t xml:space="preserve">규칙(항목만) · Jev · GLM(5.3-Flash로 측정) · OpenAI</w:t>
+            </w:r>
+          </w:p>
+        </w:tc>
+        <w:tc>
+          <w:tcPr>
+            <w:tcW w:w="4379" w:type="dxa"/>
           </w:tcPr>
           <w:p>
             <w:pPr>
@@ -9627,7 +9627,7 @@
         </w:tc>
         <w:tc>
           <w:tcPr>
-            <w:tcW w:w="2242" w:type="dxa"/>
+            <w:tcW w:w="2215" w:type="dxa"/>
           </w:tcPr>
           <w:p>
             <w:pPr>
@@ -9649,7 +9649,7 @@
         </w:trPr>
         <w:tc>
           <w:tcPr>
-            <w:tcW w:w="1350" w:type="dxa"/>
+            <w:tcW w:w="1342" w:type="dxa"/>
           </w:tcPr>
           <w:p>
             <w:pPr>
@@ -9666,7 +9666,7 @@
         </w:tc>
         <w:tc>
           <w:tcPr>
-            <w:tcW w:w="2273" w:type="dxa"/>
+            <w:tcW w:w="2379" w:type="dxa"/>
           </w:tcPr>
           <w:p>
             <w:pPr>
@@ -9683,7 +9683,7 @@
         </w:tc>
         <w:tc>
           <w:tcPr>
-            <w:tcW w:w="4451" w:type="dxa"/>
+            <w:tcW w:w="4379" w:type="dxa"/>
           </w:tcPr>
           <w:p>
             <w:pPr>
@@ -9700,7 +9700,7 @@
         </w:tc>
         <w:tc>
           <w:tcPr>
-            <w:tcW w:w="2242" w:type="dxa"/>
+            <w:tcW w:w="2215" w:type="dxa"/>
           </w:tcPr>
           <w:p>
             <w:pPr>
@@ -9722,7 +9722,7 @@
         </w:trPr>
         <w:tc>
           <w:tcPr>
-            <w:tcW w:w="1350" w:type="dxa"/>
+            <w:tcW w:w="1342" w:type="dxa"/>
           </w:tcPr>
           <w:p>
             <w:pPr>
@@ -9739,7 +9739,7 @@
         </w:tc>
         <w:tc>
           <w:tcPr>
-            <w:tcW w:w="2273" w:type="dxa"/>
+            <w:tcW w:w="2379" w:type="dxa"/>
           </w:tcPr>
           <w:p>
             <w:pPr>
@@ -9756,7 +9756,7 @@
         </w:tc>
         <w:tc>
           <w:tcPr>
-            <w:tcW w:w="4451" w:type="dxa"/>
+            <w:tcW w:w="4379" w:type="dxa"/>
           </w:tcPr>
           <w:p>
             <w:pPr>
@@ -9773,7 +9773,7 @@
         </w:tc>
         <w:tc>
           <w:tcPr>
-            <w:tcW w:w="2242" w:type="dxa"/>
+            <w:tcW w:w="2215" w:type="dxa"/>
           </w:tcPr>
           <w:p>
             <w:pPr>
@@ -9795,7 +9795,7 @@
         </w:trPr>
         <w:tc>
           <w:tcPr>
-            <w:tcW w:w="1350" w:type="dxa"/>
+            <w:tcW w:w="1342" w:type="dxa"/>
           </w:tcPr>
           <w:p>
             <w:pPr>
@@ -9812,7 +9812,7 @@
         </w:tc>
         <w:tc>
           <w:tcPr>
-            <w:tcW w:w="2273" w:type="dxa"/>
+            <w:tcW w:w="2379" w:type="dxa"/>
           </w:tcPr>
           <w:p>
             <w:pPr>
@@ -9829,7 +9829,7 @@
         </w:tc>
         <w:tc>
           <w:tcPr>
-            <w:tcW w:w="4451" w:type="dxa"/>
+            <w:tcW w:w="4379" w:type="dxa"/>
           </w:tcPr>
           <w:p>
             <w:pPr>
@@ -9846,7 +9846,7 @@
         </w:tc>
         <w:tc>
           <w:tcPr>
-            <w:tcW w:w="2242" w:type="dxa"/>
+            <w:tcW w:w="2215" w:type="dxa"/>
           </w:tcPr>
           <w:p>
             <w:pPr>
@@ -9868,7 +9868,7 @@
         </w:trPr>
         <w:tc>
           <w:tcPr>
-            <w:tcW w:w="1350" w:type="dxa"/>
+            <w:tcW w:w="1342" w:type="dxa"/>
           </w:tcPr>
           <w:p>
             <w:pPr>
@@ -9885,7 +9885,7 @@
         </w:tc>
         <w:tc>
           <w:tcPr>
-            <w:tcW w:w="2273" w:type="dxa"/>
+            <w:tcW w:w="2379" w:type="dxa"/>
           </w:tcPr>
           <w:p>
             <w:pPr>
@@ -9902,7 +9902,7 @@
         </w:tc>
         <w:tc>
           <w:tcPr>
-            <w:tcW w:w="4451" w:type="dxa"/>
+            <w:tcW w:w="4379" w:type="dxa"/>
           </w:tcPr>
           <w:p>
             <w:pPr>
@@ -9919,7 +9919,7 @@
         </w:tc>
         <w:tc>
           <w:tcPr>
-            <w:tcW w:w="2242" w:type="dxa"/>
+            <w:tcW w:w="2215" w:type="dxa"/>
           </w:tcPr>
           <w:p>
             <w:pPr>
@@ -9941,7 +9941,7 @@
         </w:trPr>
         <w:tc>
           <w:tcPr>
-            <w:tcW w:w="1350" w:type="dxa"/>
+            <w:tcW w:w="1342" w:type="dxa"/>
           </w:tcPr>
           <w:p>
             <w:pPr>
@@ -9958,7 +9958,7 @@
         </w:tc>
         <w:tc>
           <w:tcPr>
-            <w:tcW w:w="2273" w:type="dxa"/>
+            <w:tcW w:w="2379" w:type="dxa"/>
           </w:tcPr>
           <w:p>
             <w:pPr>
@@ -9975,7 +9975,7 @@
         </w:tc>
         <w:tc>
           <w:tcPr>
-            <w:tcW w:w="4451" w:type="dxa"/>
+            <w:tcW w:w="4379" w:type="dxa"/>
           </w:tcPr>
           <w:p>
             <w:pPr>
@@ -9992,7 +9992,7 @@
         </w:tc>
         <w:tc>
           <w:tcPr>
-            <w:tcW w:w="2242" w:type="dxa"/>
+            <w:tcW w:w="2215" w:type="dxa"/>
           </w:tcPr>
           <w:p>
             <w:pPr>
@@ -10014,7 +10014,7 @@
         </w:trPr>
         <w:tc>
           <w:tcPr>
-            <w:tcW w:w="1350" w:type="dxa"/>
+            <w:tcW w:w="1342" w:type="dxa"/>
           </w:tcPr>
           <w:p>
             <w:pPr>
@@ -10031,7 +10031,7 @@
         </w:tc>
         <w:tc>
           <w:tcPr>
-            <w:tcW w:w="2273" w:type="dxa"/>
+            <w:tcW w:w="2379" w:type="dxa"/>
           </w:tcPr>
           <w:p>
             <w:pPr>
@@ -10048,7 +10048,7 @@
         </w:tc>
         <w:tc>
           <w:tcPr>
-            <w:tcW w:w="4451" w:type="dxa"/>
+            <w:tcW w:w="4379" w:type="dxa"/>
           </w:tcPr>
           <w:p>
             <w:pPr>
@@ -10065,7 +10065,7 @@
         </w:tc>
         <w:tc>
           <w:tcPr>
-            <w:tcW w:w="2242" w:type="dxa"/>
+            <w:tcW w:w="2215" w:type="dxa"/>
           </w:tcPr>
           <w:p>
             <w:pPr>
@@ -10087,7 +10087,7 @@
         </w:trPr>
         <w:tc>
           <w:tcPr>
-            <w:tcW w:w="1350" w:type="dxa"/>
+            <w:tcW w:w="1342" w:type="dxa"/>
           </w:tcPr>
           <w:p>
             <w:pPr>
@@ -10104,7 +10104,7 @@
         </w:tc>
         <w:tc>
           <w:tcPr>
-            <w:tcW w:w="2273" w:type="dxa"/>
+            <w:tcW w:w="2379" w:type="dxa"/>
           </w:tcPr>
           <w:p>
             <w:pPr>
@@ -10121,7 +10121,7 @@
         </w:tc>
         <w:tc>
           <w:tcPr>
-            <w:tcW w:w="4451" w:type="dxa"/>
+            <w:tcW w:w="4379" w:type="dxa"/>
           </w:tcPr>
           <w:p>
             <w:pPr>
@@ -10138,7 +10138,7 @@
         </w:tc>
         <w:tc>
           <w:tcPr>
-            <w:tcW w:w="2242" w:type="dxa"/>
+            <w:tcW w:w="2215" w:type="dxa"/>
           </w:tcPr>
           <w:p>
             <w:pPr>
@@ -10160,7 +10160,7 @@
         </w:trPr>
         <w:tc>
           <w:tcPr>
-            <w:tcW w:w="1350" w:type="dxa"/>
+            <w:tcW w:w="1342" w:type="dxa"/>
           </w:tcPr>
           <w:p>
             <w:pPr>
@@ -10177,7 +10177,7 @@
         </w:tc>
         <w:tc>
           <w:tcPr>
-            <w:tcW w:w="2273" w:type="dxa"/>
+            <w:tcW w:w="2379" w:type="dxa"/>
           </w:tcPr>
           <w:p>
             <w:pPr>
@@ -10194,7 +10194,7 @@
         </w:tc>
         <w:tc>
           <w:tcPr>
-            <w:tcW w:w="4451" w:type="dxa"/>
+            <w:tcW w:w="4379" w:type="dxa"/>
           </w:tcPr>
           <w:p>
             <w:pPr>
@@ -10211,7 +10211,7 @@
         </w:tc>
         <w:tc>
           <w:tcPr>
-            <w:tcW w:w="2242" w:type="dxa"/>
+            <w:tcW w:w="2215" w:type="dxa"/>
           </w:tcPr>
           <w:p>
             <w:pPr>
@@ -10233,7 +10233,7 @@
         </w:trPr>
         <w:tc>
           <w:tcPr>
-            <w:tcW w:w="1350" w:type="dxa"/>
+            <w:tcW w:w="1342" w:type="dxa"/>
           </w:tcPr>
           <w:p>
             <w:pPr>
@@ -10250,7 +10250,7 @@
         </w:tc>
         <w:tc>
           <w:tcPr>
-            <w:tcW w:w="2273" w:type="dxa"/>
+            <w:tcW w:w="2379" w:type="dxa"/>
           </w:tcPr>
           <w:p>
             <w:pPr>
@@ -10267,7 +10267,7 @@
         </w:tc>
         <w:tc>
           <w:tcPr>
-            <w:tcW w:w="4451" w:type="dxa"/>
+            <w:tcW w:w="4379" w:type="dxa"/>
           </w:tcPr>
           <w:p>
             <w:pPr>
@@ -10284,7 +10284,7 @@
         </w:tc>
         <w:tc>
           <w:tcPr>
-            <w:tcW w:w="2242" w:type="dxa"/>
+            <w:tcW w:w="2215" w:type="dxa"/>
           </w:tcPr>
           <w:p>
             <w:pPr>

</xml_diff>

<commit_message>
docs: final report fourth-round edits -- GLM named without the substitution asides (3.5 says the in-house GLM family was also measured), 5.3 resource-protection point, 6.2 undo-and-log point, 6.3 stop point and the old 6.4 removed (sections renumbered, 1.2 G2 states the oracle check inline), 6.5 sub-skill credit written as 70% / 49% instead of a superscript, 6.6 candidate recommendation cut to the two points the video does not show, 7 down to seven decisions in the asked order, 9 no longer in a yellow box; 9 pages, PDF and Word rebuilt
Co-Authored-By: Claude Opus 5.5 <noreply@anthropic.com>
Claude-Session: https://claude.ai/code/session_01XiJnTNFVeV2BokGGcyeQom
</commit_message>
<xml_diff>
--- a/outputs/final-report.docx
+++ b/outputs/final-report.docx
@@ -148,9 +148,9 @@
         </w:tblCellMar>
       </w:tblPr>
       <w:tblGrid>
-        <w:gridCol w:w="2025"/>
-        <w:gridCol w:w="3512"/>
-        <w:gridCol w:w="4780"/>
+        <w:gridCol w:w="1885"/>
+        <w:gridCol w:w="3298"/>
+        <w:gridCol w:w="5133"/>
       </w:tblGrid>
       <w:tr>
         <w:trPr>
@@ -159,7 +159,7 @@
         </w:trPr>
         <w:tc>
           <w:tcPr>
-            <w:tcW w:w="2025" w:type="dxa"/>
+            <w:tcW w:w="1885" w:type="dxa"/>
             <w:shd w:val="clear" w:color="auto" w:fill="F1F3F5"/>
           </w:tcPr>
           <w:p>
@@ -179,7 +179,7 @@
         </w:tc>
         <w:tc>
           <w:tcPr>
-            <w:tcW w:w="3512" w:type="dxa"/>
+            <w:tcW w:w="3298" w:type="dxa"/>
             <w:shd w:val="clear" w:color="auto" w:fill="F1F3F5"/>
           </w:tcPr>
           <w:p>
@@ -199,7 +199,7 @@
         </w:tc>
         <w:tc>
           <w:tcPr>
-            <w:tcW w:w="4780" w:type="dxa"/>
+            <w:tcW w:w="5133" w:type="dxa"/>
             <w:shd w:val="clear" w:color="auto" w:fill="F1F3F5"/>
           </w:tcPr>
           <w:p>
@@ -224,7 +224,7 @@
         </w:trPr>
         <w:tc>
           <w:tcPr>
-            <w:tcW w:w="2025" w:type="dxa"/>
+            <w:tcW w:w="1885" w:type="dxa"/>
           </w:tcPr>
           <w:p>
             <w:pPr>
@@ -241,7 +241,7 @@
         </w:tc>
         <w:tc>
           <w:tcPr>
-            <w:tcW w:w="3512" w:type="dxa"/>
+            <w:tcW w:w="3298" w:type="dxa"/>
           </w:tcPr>
           <w:p>
             <w:pPr>
@@ -258,7 +258,7 @@
         </w:tc>
         <w:tc>
           <w:tcPr>
-            <w:tcW w:w="4780" w:type="dxa"/>
+            <w:tcW w:w="5133" w:type="dxa"/>
           </w:tcPr>
           <w:p>
             <w:pPr>
@@ -289,7 +289,7 @@
         </w:trPr>
         <w:tc>
           <w:tcPr>
-            <w:tcW w:w="2025" w:type="dxa"/>
+            <w:tcW w:w="1885" w:type="dxa"/>
           </w:tcPr>
           <w:p>
             <w:pPr>
@@ -306,7 +306,7 @@
         </w:tc>
         <w:tc>
           <w:tcPr>
-            <w:tcW w:w="3512" w:type="dxa"/>
+            <w:tcW w:w="3298" w:type="dxa"/>
           </w:tcPr>
           <w:p>
             <w:pPr>
@@ -323,7 +323,7 @@
         </w:tc>
         <w:tc>
           <w:tcPr>
-            <w:tcW w:w="4780" w:type="dxa"/>
+            <w:tcW w:w="5133" w:type="dxa"/>
           </w:tcPr>
           <w:p>
             <w:pPr>
@@ -343,7 +343,7 @@
                 <w:sz w:val="17"/>
                 <w:szCs w:val="17"/>
               </w:rPr>
-              <w:t xml:space="preserve"> — 정답 대조 13/13, 모든 계산 결과 독립 검증, 이론상 최대치와의 거리를 화면·PDF에(6.4)</w:t>
+              <w:t xml:space="preserve"> — 작은 사례의 정답(모든 조합을 따져 구함)과 대조 13/13, 모든 계산 결과를 원자료로 다시 검증(5.1), 이론상 최대치와의 거리를 화면·PDF에</w:t>
             </w:r>
           </w:p>
         </w:tc>
@@ -354,7 +354,7 @@
         </w:trPr>
         <w:tc>
           <w:tcPr>
-            <w:tcW w:w="2025" w:type="dxa"/>
+            <w:tcW w:w="1885" w:type="dxa"/>
           </w:tcPr>
           <w:p>
             <w:pPr>
@@ -371,7 +371,7 @@
         </w:tc>
         <w:tc>
           <w:tcPr>
-            <w:tcW w:w="3512" w:type="dxa"/>
+            <w:tcW w:w="3298" w:type="dxa"/>
           </w:tcPr>
           <w:p>
             <w:pPr>
@@ -388,7 +388,7 @@
         </w:tc>
         <w:tc>
           <w:tcPr>
-            <w:tcW w:w="4780" w:type="dxa"/>
+            <w:tcW w:w="5133" w:type="dxa"/>
           </w:tcPr>
           <w:p>
             <w:pPr>
@@ -825,7 +825,7 @@
         <w:t xml:space="preserve">틀린 값도 최적화는 그대로 최적으로 푼다</w:t>
       </w:r>
       <w:r>
-        <w:t xml:space="preserve">(2장 넷째 줄). 그래서 AI 결과는 사전·원문과 대조하고, 요구 기술·기술 이름은 사람이 고른 것만 넣는다(6.5).</w:t>
+        <w:t xml:space="preserve">(2장 넷째 줄). 그래서 AI 결과는 사전·원문과 대조하고, 요구 기술·기술 이름은 사람이 고른 것만 넣는다(6.4).</w:t>
       </w:r>
     </w:p>
     <w:p>
@@ -4124,7 +4124,7 @@
         <w:t xml:space="preserve">Jev</w:t>
       </w:r>
       <w:r>
-        <w:t xml:space="preserve">, LLM 두 가지(서비스용 </w:t>
+        <w:t xml:space="preserve">, 서비스용 LLM </w:t>
       </w:r>
       <w:r>
         <w:rPr>
@@ -4134,7 +4134,7 @@
         <w:t xml:space="preserve">OpenAI gpt-6-luna</w:t>
       </w:r>
       <w:r>
-        <w:t xml:space="preserve">, 사내 후보 </w:t>
+        <w:t xml:space="preserve">를 같은 글에 돌렸고, 사내에서 사용 가능한 </w:t>
       </w:r>
       <w:r>
         <w:rPr>
@@ -4144,7 +4144,7 @@
         <w:t xml:space="preserve">GLM</w:t>
       </w:r>
       <w:r>
-        <w:t xml:space="preserve">)를 같은 글에 돌렸다. 회사에서 쓸 수 있는 모델은 GLM-5.2이지만 사내 서버로는 잴 수 없어, 같은 계열 GLM-5.3-Flash를 외부 API로 불러 대신 쟀다.</w:t>
+        <w:t xml:space="preserve"> 모델 계열로도 측정해 봤다.</w:t>
       </w:r>
     </w:p>
     <w:tbl>
@@ -4168,11 +4168,11 @@
         </w:tblCellMar>
       </w:tblPr>
       <w:tblGrid>
-        <w:gridCol w:w="2755"/>
-        <w:gridCol w:w="1647"/>
-        <w:gridCol w:w="2707"/>
-        <w:gridCol w:w="1115"/>
-        <w:gridCol w:w="2092"/>
+        <w:gridCol w:w="2270"/>
+        <w:gridCol w:w="1720"/>
+        <w:gridCol w:w="2805"/>
+        <w:gridCol w:w="1165"/>
+        <w:gridCol w:w="2355"/>
       </w:tblGrid>
       <w:tr>
         <w:trPr>
@@ -4181,7 +4181,7 @@
         </w:trPr>
         <w:tc>
           <w:tcPr>
-            <w:tcW w:w="2755" w:type="dxa"/>
+            <w:tcW w:w="2270" w:type="dxa"/>
             <w:shd w:val="clear" w:color="auto" w:fill="F1F3F5"/>
           </w:tcPr>
           <w:p>
@@ -4201,7 +4201,7 @@
         </w:tc>
         <w:tc>
           <w:tcPr>
-            <w:tcW w:w="1647" w:type="dxa"/>
+            <w:tcW w:w="1720" w:type="dxa"/>
             <w:shd w:val="clear" w:color="auto" w:fill="F1F3F5"/>
           </w:tcPr>
           <w:p>
@@ -4240,7 +4240,7 @@
         </w:tc>
         <w:tc>
           <w:tcPr>
-            <w:tcW w:w="2707" w:type="dxa"/>
+            <w:tcW w:w="2805" w:type="dxa"/>
             <w:shd w:val="clear" w:color="auto" w:fill="F1F3F5"/>
           </w:tcPr>
           <w:p>
@@ -4279,7 +4279,7 @@
         </w:tc>
         <w:tc>
           <w:tcPr>
-            <w:tcW w:w="1115" w:type="dxa"/>
+            <w:tcW w:w="1165" w:type="dxa"/>
             <w:shd w:val="clear" w:color="auto" w:fill="F1F3F5"/>
           </w:tcPr>
           <w:p>
@@ -4300,7 +4300,7 @@
         </w:tc>
         <w:tc>
           <w:tcPr>
-            <w:tcW w:w="2092" w:type="dxa"/>
+            <w:tcW w:w="2355" w:type="dxa"/>
             <w:shd w:val="clear" w:color="auto" w:fill="F1F3F5"/>
           </w:tcPr>
           <w:p>
@@ -4325,7 +4325,7 @@
         </w:trPr>
         <w:tc>
           <w:tcPr>
-            <w:tcW w:w="2755" w:type="dxa"/>
+            <w:tcW w:w="2270" w:type="dxa"/>
           </w:tcPr>
           <w:p>
             <w:pPr>
@@ -4342,7 +4342,7 @@
         </w:tc>
         <w:tc>
           <w:tcPr>
-            <w:tcW w:w="1647" w:type="dxa"/>
+            <w:tcW w:w="1720" w:type="dxa"/>
           </w:tcPr>
           <w:p>
             <w:pPr>
@@ -4360,7 +4360,7 @@
         </w:tc>
         <w:tc>
           <w:tcPr>
-            <w:tcW w:w="2707" w:type="dxa"/>
+            <w:tcW w:w="2805" w:type="dxa"/>
           </w:tcPr>
           <w:p>
             <w:pPr>
@@ -4378,7 +4378,7 @@
         </w:tc>
         <w:tc>
           <w:tcPr>
-            <w:tcW w:w="1115" w:type="dxa"/>
+            <w:tcW w:w="1165" w:type="dxa"/>
           </w:tcPr>
           <w:p>
             <w:pPr>
@@ -4396,7 +4396,7 @@
         </w:tc>
         <w:tc>
           <w:tcPr>
-            <w:tcW w:w="2092" w:type="dxa"/>
+            <w:tcW w:w="2355" w:type="dxa"/>
           </w:tcPr>
           <w:p>
             <w:pPr>
@@ -4418,7 +4418,7 @@
         </w:trPr>
         <w:tc>
           <w:tcPr>
-            <w:tcW w:w="2755" w:type="dxa"/>
+            <w:tcW w:w="2270" w:type="dxa"/>
           </w:tcPr>
           <w:p>
             <w:pPr>
@@ -4435,7 +4435,7 @@
         </w:tc>
         <w:tc>
           <w:tcPr>
-            <w:tcW w:w="1647" w:type="dxa"/>
+            <w:tcW w:w="1720" w:type="dxa"/>
           </w:tcPr>
           <w:p>
             <w:pPr>
@@ -4453,7 +4453,7 @@
         </w:tc>
         <w:tc>
           <w:tcPr>
-            <w:tcW w:w="2707" w:type="dxa"/>
+            <w:tcW w:w="2805" w:type="dxa"/>
           </w:tcPr>
           <w:p>
             <w:pPr>
@@ -4471,7 +4471,7 @@
         </w:tc>
         <w:tc>
           <w:tcPr>
-            <w:tcW w:w="1115" w:type="dxa"/>
+            <w:tcW w:w="1165" w:type="dxa"/>
           </w:tcPr>
           <w:p>
             <w:pPr>
@@ -4489,7 +4489,7 @@
         </w:tc>
         <w:tc>
           <w:tcPr>
-            <w:tcW w:w="2092" w:type="dxa"/>
+            <w:tcW w:w="2355" w:type="dxa"/>
           </w:tcPr>
           <w:p>
             <w:pPr>
@@ -4511,24 +4511,24 @@
         </w:trPr>
         <w:tc>
           <w:tcPr>
-            <w:tcW w:w="2755" w:type="dxa"/>
-          </w:tcPr>
-          <w:p>
-            <w:pPr>
-              <w:pStyle w:val="TWCell"/>
-            </w:pPr>
-            <w:r>
-              <w:rPr>
-                <w:sz w:val="17"/>
-                <w:szCs w:val="17"/>
-              </w:rPr>
-              <w:t xml:space="preserve">GLM-5.3-Flash(사내 GLM-5.2 대신 측정)</w:t>
-            </w:r>
-          </w:p>
-        </w:tc>
-        <w:tc>
-          <w:tcPr>
-            <w:tcW w:w="1647" w:type="dxa"/>
+            <w:tcW w:w="2270" w:type="dxa"/>
+          </w:tcPr>
+          <w:p>
+            <w:pPr>
+              <w:pStyle w:val="TWCell"/>
+            </w:pPr>
+            <w:r>
+              <w:rPr>
+                <w:sz w:val="17"/>
+                <w:szCs w:val="17"/>
+              </w:rPr>
+              <w:t xml:space="preserve">GLM-5.3-Flash</w:t>
+            </w:r>
+          </w:p>
+        </w:tc>
+        <w:tc>
+          <w:tcPr>
+            <w:tcW w:w="1720" w:type="dxa"/>
           </w:tcPr>
           <w:p>
             <w:pPr>
@@ -4546,7 +4546,7 @@
         </w:tc>
         <w:tc>
           <w:tcPr>
-            <w:tcW w:w="2707" w:type="dxa"/>
+            <w:tcW w:w="2805" w:type="dxa"/>
           </w:tcPr>
           <w:p>
             <w:pPr>
@@ -4564,7 +4564,7 @@
         </w:tc>
         <w:tc>
           <w:tcPr>
-            <w:tcW w:w="1115" w:type="dxa"/>
+            <w:tcW w:w="1165" w:type="dxa"/>
           </w:tcPr>
           <w:p>
             <w:pPr>
@@ -4582,7 +4582,7 @@
         </w:tc>
         <w:tc>
           <w:tcPr>
-            <w:tcW w:w="2092" w:type="dxa"/>
+            <w:tcW w:w="2355" w:type="dxa"/>
           </w:tcPr>
           <w:p>
             <w:pPr>
@@ -4604,7 +4604,7 @@
         </w:trPr>
         <w:tc>
           <w:tcPr>
-            <w:tcW w:w="2755" w:type="dxa"/>
+            <w:tcW w:w="2270" w:type="dxa"/>
           </w:tcPr>
           <w:p>
             <w:pPr>
@@ -4623,7 +4623,7 @@
         </w:tc>
         <w:tc>
           <w:tcPr>
-            <w:tcW w:w="1647" w:type="dxa"/>
+            <w:tcW w:w="1720" w:type="dxa"/>
           </w:tcPr>
           <w:p>
             <w:pPr>
@@ -4643,7 +4643,7 @@
         </w:tc>
         <w:tc>
           <w:tcPr>
-            <w:tcW w:w="2707" w:type="dxa"/>
+            <w:tcW w:w="2805" w:type="dxa"/>
           </w:tcPr>
           <w:p>
             <w:pPr>
@@ -4663,7 +4663,7 @@
         </w:tc>
         <w:tc>
           <w:tcPr>
-            <w:tcW w:w="1115" w:type="dxa"/>
+            <w:tcW w:w="1165" w:type="dxa"/>
           </w:tcPr>
           <w:p>
             <w:pPr>
@@ -4681,7 +4681,7 @@
         </w:tc>
         <w:tc>
           <w:tcPr>
-            <w:tcW w:w="2092" w:type="dxa"/>
+            <w:tcW w:w="2355" w:type="dxa"/>
           </w:tcPr>
           <w:p>
             <w:pPr>
@@ -5785,13 +5785,13 @@
           <w:bCs/>
           <w:color w:val="5B6168"/>
         </w:rPr>
-        <w:t xml:space="preserve">사내 LLM으로 바꾸면</w:t>
+        <w:t xml:space="preserve">GLM 계열(GLM-5.3-Flash)로 바꾸면</w:t>
       </w:r>
       <w:r>
         <w:rPr>
           <w:color w:val="5B6168"/>
         </w:rPr>
-        <w:t xml:space="preserve">(회사에서 쓸 수 있는 GLM-5.2 대신 같은 계열 GLM-5.3-Flash로 쟀다 — 사내 서버로는 잴 수 없음): 돌려 말한 부정 검출 89% → 52%, 교체 설명 바로 사용 93% → 97%·3.5 → 10.3초, 처음 보는 소명 채택 100% → 97.3%·8 → 60초, 실제 발주 자료 필요 기술 정밀도 0.78 → 0.65·13 → 74초 — 전환 때 더 큰 모델·대기 상한(40 → 300초) 조정이 필요하다. 서비스는 외부 AI로 운영하고, 실데이터는 사내 주소이거나 관리자가 명시 허용했을 때만 AI를 부른다. 모든 측정은 판정 기준을 측정 전에 먼저 정해 고정했다(사전 등록).</w:t>
+        <w:t xml:space="preserve">: 돌려 말한 부정 검출 89% → 52%, 교체 설명 바로 사용 93% → 97%·3.5 → 10.3초, 처음 보는 소명 채택 100% → 97.3%·8 → 60초, 실제 발주 자료 필요 기술 정밀도 0.78 → 0.65·13 → 74초 — 전환 때 더 큰 모델·대기 상한(40 → 300초) 조정이 필요하다. 서비스는 외부 AI로 운영하고, 실데이터는 사내 주소이거나 관리자가 명시 허용했을 때만 AI를 부른다. 모든 측정은 판정 기준을 측정 전에 먼저 정해 고정했다(사전 등록).</w:t>
       </w:r>
     </w:p>
     <w:p>
@@ -5875,7 +5875,7 @@
         <w:t xml:space="preserve">설계를 감이 아니라 측정으로 정했다.</w:t>
       </w:r>
       <w:r>
-        <w:t xml:space="preserve"> 협업 보상 대상 쌍 수, "오래 붙어 다닌 사이"의 기준, 솔버, 소명 글 쓰는 방식 같은 선택마다 대안을 같은 데이터로 돌려 보고 결과로 골랐다(7장).</w:t>
+        <w:t xml:space="preserve"> 그래프 저장소, AI에 맡길 일, 평가 글 판정 방식, 솔버, 투입 방식, 소명 글 쓰는 방식 같은 선택마다 대안을 같은 데이터로 돌려 보고 결과로 골랐다(7장).</w:t>
       </w:r>
     </w:p>
     <w:p>
@@ -6446,10 +6446,10 @@
         </w:tblCellMar>
       </w:tblPr>
       <w:tblGrid>
-        <w:gridCol w:w="882"/>
-        <w:gridCol w:w="3787"/>
+        <w:gridCol w:w="957"/>
+        <w:gridCol w:w="4735"/>
         <w:gridCol w:w="1145"/>
-        <w:gridCol w:w="4502"/>
+        <w:gridCol w:w="3479"/>
       </w:tblGrid>
       <w:tr>
         <w:trPr>
@@ -6458,7 +6458,7 @@
         </w:trPr>
         <w:tc>
           <w:tcPr>
-            <w:tcW w:w="882" w:type="dxa"/>
+            <w:tcW w:w="957" w:type="dxa"/>
             <w:shd w:val="clear" w:color="auto" w:fill="EEF2F6"/>
           </w:tcPr>
           <w:p>
@@ -6479,7 +6479,7 @@
         </w:tc>
         <w:tc>
           <w:tcPr>
-            <w:tcW w:w="3787" w:type="dxa"/>
+            <w:tcW w:w="4735" w:type="dxa"/>
             <w:shd w:val="clear" w:color="auto" w:fill="F1F3F5"/>
           </w:tcPr>
           <w:p>
@@ -6520,7 +6520,7 @@
         </w:tc>
         <w:tc>
           <w:tcPr>
-            <w:tcW w:w="4502" w:type="dxa"/>
+            <w:tcW w:w="3479" w:type="dxa"/>
             <w:shd w:val="clear" w:color="auto" w:fill="F1F3F5"/>
           </w:tcPr>
           <w:p>
@@ -6545,7 +6545,7 @@
         </w:trPr>
         <w:tc>
           <w:tcPr>
-            <w:tcW w:w="882" w:type="dxa"/>
+            <w:tcW w:w="957" w:type="dxa"/>
             <w:shd w:val="clear" w:color="auto" w:fill="EEF2F6"/>
           </w:tcPr>
           <w:p>
@@ -6566,7 +6566,7 @@
         </w:tc>
         <w:tc>
           <w:tcPr>
-            <w:tcW w:w="3787" w:type="dxa"/>
+            <w:tcW w:w="4735" w:type="dxa"/>
           </w:tcPr>
           <w:p>
             <w:pPr>
@@ -6604,7 +6604,7 @@
         </w:tc>
         <w:tc>
           <w:tcPr>
-            <w:tcW w:w="4502" w:type="dxa"/>
+            <w:tcW w:w="3479" w:type="dxa"/>
           </w:tcPr>
           <w:p>
             <w:pPr>
@@ -6626,7 +6626,7 @@
         </w:trPr>
         <w:tc>
           <w:tcPr>
-            <w:tcW w:w="882" w:type="dxa"/>
+            <w:tcW w:w="957" w:type="dxa"/>
             <w:shd w:val="clear" w:color="auto" w:fill="EEF2F6"/>
           </w:tcPr>
           <w:p>
@@ -6647,7 +6647,7 @@
         </w:tc>
         <w:tc>
           <w:tcPr>
-            <w:tcW w:w="3787" w:type="dxa"/>
+            <w:tcW w:w="4735" w:type="dxa"/>
           </w:tcPr>
           <w:p>
             <w:pPr>
@@ -6685,18 +6685,18 @@
         </w:tc>
         <w:tc>
           <w:tcPr>
-            <w:tcW w:w="4502" w:type="dxa"/>
-          </w:tcPr>
-          <w:p>
-            <w:pPr>
-              <w:pStyle w:val="TWCell"/>
-            </w:pPr>
-            <w:r>
-              <w:rPr>
-                <w:sz w:val="17"/>
-                <w:szCs w:val="17"/>
-              </w:rPr>
-              <w:t xml:space="preserve">OpenAI 호환 API — 외부 gpt-6-luna, 사내 GLM-5.2(측정은 같은 계열 GLM-5.3-Flash로 대신)</w:t>
+            <w:tcW w:w="3479" w:type="dxa"/>
+          </w:tcPr>
+          <w:p>
+            <w:pPr>
+              <w:pStyle w:val="TWCell"/>
+            </w:pPr>
+            <w:r>
+              <w:rPr>
+                <w:sz w:val="17"/>
+                <w:szCs w:val="17"/>
+              </w:rPr>
+              <w:t xml:space="preserve">OpenAI 호환 API — 외부 gpt-6-luna, 사내 GLM 계열</w:t>
             </w:r>
           </w:p>
         </w:tc>
@@ -6707,7 +6707,7 @@
         </w:trPr>
         <w:tc>
           <w:tcPr>
-            <w:tcW w:w="882" w:type="dxa"/>
+            <w:tcW w:w="957" w:type="dxa"/>
             <w:shd w:val="clear" w:color="auto" w:fill="EEF2F6"/>
           </w:tcPr>
           <w:p>
@@ -6728,7 +6728,7 @@
         </w:tc>
         <w:tc>
           <w:tcPr>
-            <w:tcW w:w="3787" w:type="dxa"/>
+            <w:tcW w:w="4735" w:type="dxa"/>
           </w:tcPr>
           <w:p>
             <w:pPr>
@@ -6766,7 +6766,7 @@
         </w:tc>
         <w:tc>
           <w:tcPr>
-            <w:tcW w:w="4502" w:type="dxa"/>
+            <w:tcW w:w="3479" w:type="dxa"/>
           </w:tcPr>
           <w:p>
             <w:pPr>
@@ -6788,7 +6788,7 @@
         </w:trPr>
         <w:tc>
           <w:tcPr>
-            <w:tcW w:w="882" w:type="dxa"/>
+            <w:tcW w:w="957" w:type="dxa"/>
             <w:shd w:val="clear" w:color="auto" w:fill="EEF2F6"/>
           </w:tcPr>
           <w:p>
@@ -6809,7 +6809,7 @@
         </w:tc>
         <w:tc>
           <w:tcPr>
-            <w:tcW w:w="3787" w:type="dxa"/>
+            <w:tcW w:w="4735" w:type="dxa"/>
           </w:tcPr>
           <w:p>
             <w:pPr>
@@ -6847,7 +6847,7 @@
         </w:tc>
         <w:tc>
           <w:tcPr>
-            <w:tcW w:w="4502" w:type="dxa"/>
+            <w:tcW w:w="3479" w:type="dxa"/>
           </w:tcPr>
           <w:p>
             <w:pPr>
@@ -6941,25 +6941,6 @@
       </w:r>
       <w:r>
         <w:t xml:space="preserve">: 앱 전체 로그인 — 로그인하지 않으면 모든 API가 401(HttpOnly·SameSite=Strict 세션, 5회 실패 시 1분 잠금). 시연 기본 계정은 로컬 주소에서만 뜨고, 외부 주소는 비밀번호를 정해야 서버가 시작한다.</w:t>
-      </w:r>
-    </w:p>
-    <w:p>
-      <w:pPr>
-        <w:pStyle w:val="TWList"/>
-        <w:numPr>
-          <w:ilvl w:val="0"/>
-          <w:numId w:val="1"/>
-        </w:numPr>
-      </w:pPr>
-      <w:r>
-        <w:rPr>
-          <w:b/>
-          <w:bCs/>
-        </w:rPr>
-        <w:t xml:space="preserve">자원 보호</w:t>
-      </w:r>
-      <w:r>
-        <w:t xml:space="preserve">: 새 계산 동시 2개(초과 429), 시간 한도 상한 900초, 요청 본문 2 MiB, 연결이 끊기면 시드 프로세스까지 정리, PDF 브라우저는 외부 요청 차단.</w:t>
       </w:r>
     </w:p>
     <w:p>
@@ -7926,6 +7907,14 @@
     </w:p>
     <w:p>
       <w:pPr>
+        <w:pStyle w:val="Heading2"/>
+      </w:pPr>
+      <w:r>
+        <w:t xml:space="preserve">6.3 솔버 운영</w:t>
+      </w:r>
+    </w:p>
+    <w:p>
+      <w:pPr>
         <w:pStyle w:val="TWList"/>
         <w:numPr>
           <w:ilvl w:val="0"/>
@@ -7937,18 +7926,10 @@
           <w:b/>
           <w:bCs/>
         </w:rPr>
-        <w:t xml:space="preserve">무르기와 기록</w:t>
-      </w:r>
-      <w:r>
-        <w:t xml:space="preserve">: 마지막 판부터 되돌리기와 별도로, 특정 확정 한 건만 지금 판 위에서 거꾸로 적용해 취소한다(그 뒤 바뀐 칸·고정한 배치는 건너뛰고, 원래 사업으로 돌려보내면 위반이 생기는 사람은 대기로 둔다). 모든 판 변경은 지우지 않는 변경 기록에 남아 기간을 골라 보고서 PDF로 묶이고, 사람이 새로 들어간 사업마다 인사팀 검토 자료가 생긴다 — 시스템 사실(원래 사업이 잃는 것·메움·등급 대체와 예산 증액 사유)은 만들 때 계산해 잠그고, 결론은 부서장이 쓴다.</w:t>
-      </w:r>
-    </w:p>
-    <w:p>
-      <w:pPr>
-        <w:pStyle w:val="Heading2"/>
-      </w:pPr>
-      <w:r>
-        <w:t xml:space="preserve">6.3 솔버 운영</w:t>
+        <w:t xml:space="preserve">시드 포트폴리오</w:t>
+      </w:r>
+      <w:r>
+        <w:t xml:space="preserve">: 같은 모델을 시작점(시드)만 바꾼 HiGHS 4개로 동시에 풀어 가장 좋은 해를 고른다 — 한 갈래만 풀면 조건이 빽빽한 데이터에서 서로 다른 대안이 잘 나오지 않는다.</w:t>
       </w:r>
     </w:p>
     <w:p>
@@ -7964,10 +7945,10 @@
           <w:b/>
           <w:bCs/>
         </w:rPr>
-        <w:t xml:space="preserve">시드 포트폴리오</w:t>
-      </w:r>
-      <w:r>
-        <w:t xml:space="preserve">: 같은 모델을 시작점(시드)만 바꾼 HiGHS 4개로 동시에 풀어 가장 좋은 해를 고른다 — 한 갈래만 풀면 조건이 빽빽한 데이터에서 서로 다른 대안이 잘 나오지 않는다.</w:t>
+        <w:t xml:space="preserve">이론상 최대치</w:t>
+      </w:r>
+      <w:r>
+        <w:t xml:space="preserve">(솔버가 증명한 상한)를 함께 기록해 "최적값이 최대 몇 % 높을 수 있음"으로 보여 준다. 전일 투입 권장 한도 100명 30초·200명 60초·300명 90초, 12개월은 ×4(측정 기반, 관리자 설정).</w:t>
       </w:r>
     </w:p>
     <w:p>
@@ -7983,48 +7964,10 @@
           <w:b/>
           <w:bCs/>
         </w:rPr>
-        <w:t xml:space="preserve">이론상 최대치</w:t>
-      </w:r>
-      <w:r>
-        <w:t xml:space="preserve">(솔버가 증명한 상한)를 함께 기록해 "최적값이 최대 몇 % 높을 수 있음"으로 보여 준다. 전일 투입 권장 한도 100명 30초·200명 60초·300명 90초, 12개월은 ×4(측정 기반, 관리자 설정).</w:t>
-      </w:r>
-    </w:p>
-    <w:p>
-      <w:pPr>
-        <w:pStyle w:val="TWList"/>
-        <w:numPr>
-          <w:ilvl w:val="0"/>
-          <w:numId w:val="1"/>
-        </w:numPr>
-      </w:pPr>
-      <w:r>
-        <w:rPr>
-          <w:b/>
-          <w:bCs/>
-        </w:rPr>
-        <w:t xml:space="preserve">계산 멈추기</w:t>
-      </w:r>
-      <w:r>
-        <w:t xml:space="preserve">: 사용자가 멈추면 풀던 안은 그때까지의 해로 끝나고(종료 사유 "사용자가 멈춤", 시간 한도와 구분) 다음 안은 시작하지 않는다. 연결이 끊기면 즉시 중단한다.</w:t>
-      </w:r>
-    </w:p>
-    <w:p>
-      <w:pPr>
-        <w:pStyle w:val="TWList"/>
-        <w:numPr>
-          <w:ilvl w:val="0"/>
-          <w:numId w:val="1"/>
-        </w:numPr>
-      </w:pPr>
-      <w:r>
-        <w:rPr>
-          <w:b/>
-          <w:bCs/>
-        </w:rPr>
         <w:t xml:space="preserve">편성 기록</w:t>
       </w:r>
       <w:r>
-        <w:t xml:space="preserve">: 한 번의 편성(원천 CSV · 평가 글 판정값 · 계산 설정 · 편성안 · 운영 중 K 비교)을 JSON 하나로 내보내고 다시 불러온다. 불러올 때 업로드와 같은 검증으로 다시 만들고 지금 평가기로 다시 채점해 위반이 있으면 받지 않는다. 기록이 주장하는 솔버 증명은 버린다 — 화면·PDF는 "위반 없음 · 기록에서 연 결과", 증명은 다시 계산해야 붙는다.</w:t>
+        <w:t xml:space="preserve">: 한 번의 편성(데이터·판정값·설정·편성안)을 JSON 하나로 저장하고, 불러올 때 지금 규칙으로 다시 검증·채점한다.</w:t>
       </w:r>
     </w:p>
     <w:p>
@@ -8032,63 +7975,7 @@
         <w:pStyle w:val="Heading2"/>
       </w:pPr>
       <w:r>
-        <w:t xml:space="preserve">6.4 독립 검증기와 평가기</w:t>
-      </w:r>
-    </w:p>
-    <w:p>
-      <w:pPr>
-        <w:pStyle w:val="TWList"/>
-        <w:numPr>
-          <w:ilvl w:val="0"/>
-          <w:numId w:val="1"/>
-        </w:numPr>
-      </w:pPr>
-      <w:r>
-        <w:t xml:space="preserve">솔버가 낸 결과를 제품 MILP 코드와 별개로 다시 계산한다: 결측·NaN·범위·0/1, 월별 가용률·월 예산·등급 정원·동시 사업, 쌍 범위, 목적 4항, 그리고 화면에 내보낼 명단. 검증할 수 없는 값을 0으로 채우지 않는다.</w:t>
-      </w:r>
-    </w:p>
-    <w:p>
-      <w:pPr>
-        <w:pStyle w:val="TWList"/>
-        <w:numPr>
-          <w:ilvl w:val="0"/>
-          <w:numId w:val="1"/>
-        </w:numPr>
-      </w:pPr>
-      <w:r>
-        <w:t xml:space="preserve">HiGHS는 z = 1.0000000000000007 같은 값을 돌려준다 — 1e-9 안쪽의 경계 잔차만 경계로 옮기고(원본 보존), 예산의 극미세 초과(상대 1e-7 이하)는 보정 LP 뒤 다시 검증한다. 이 처리 없이는 HiGHS 해가 전부 "검증 실패"였다(실측).</w:t>
-      </w:r>
-    </w:p>
-    <w:p>
-      <w:pPr>
-        <w:pStyle w:val="TWList"/>
-        <w:numPr>
-          <w:ilvl w:val="0"/>
-          <w:numId w:val="1"/>
-        </w:numPr>
-      </w:pPr>
-      <w:r>
-        <w:t xml:space="preserve">정답 대조: 작은 사례는 가능한 사람 조합을 모두 따져 구한 정답(제품 계산 코드를 쓰지 않는 별도 구현)과 비교한다 — 13/13 통과, 모델을 바꿀 때마다 다시 돌린다.</w:t>
-      </w:r>
-    </w:p>
-    <w:p>
-      <w:pPr>
-        <w:pStyle w:val="TWList"/>
-        <w:numPr>
-          <w:ilvl w:val="0"/>
-          <w:numId w:val="1"/>
-        </w:numPr>
-      </w:pPr>
-      <w:r>
-        <w:t xml:space="preserve">평가기는 어떤 배치든 현행 목적·제약 전체로 다시 채점한다 — 교체 검토·What-if(참고값), 확정 미리 계산, 단순 규칙 비교, 편성 기록 확인, PDF가 모두 같은 잣대를 쓴다.</w:t>
-      </w:r>
-    </w:p>
-    <w:p>
-      <w:pPr>
-        <w:pStyle w:val="Heading2"/>
-      </w:pPr>
-      <w:r>
-        <w:t xml:space="preserve">6.5 검사받는 생성형 AI</w:t>
+        <w:t xml:space="preserve">6.4 검사받는 생성형 AI</w:t>
       </w:r>
     </w:p>
     <w:tbl>
@@ -8544,7 +8431,7 @@
                 <w:sz w:val="17"/>
                 <w:szCs w:val="17"/>
               </w:rPr>
-              <w:t xml:space="preserve">필요 기술(필수·우대·요구가 아닌 언급), 사업 정보, 자료 요약을 근거 말과 함께 제안(6.8)</w:t>
+              <w:t xml:space="preserve">필요 기술(필수·우대·요구가 아닌 언급), 사업 정보, 자료 요약을 근거 말과 함께 제안(6.7)</w:t>
             </w:r>
           </w:p>
         </w:tc>
@@ -8605,7 +8492,7 @@
         <w:pStyle w:val="Heading2"/>
       </w:pPr>
       <w:r>
-        <w:t xml:space="preserve">6.6 지식 그래프와 기술 이름 사전</w:t>
+        <w:t xml:space="preserve">6.5 지식 그래프와 기술 이름 사전</w:t>
       </w:r>
     </w:p>
     <w:p>
@@ -8643,16 +8530,7 @@
         <w:t xml:space="preserve">하위 기술 부분 인정</w:t>
       </w:r>
       <w:r>
-        <w:t xml:space="preserve">: 하위 기술 경력의 0.7</w:t>
-      </w:r>
-      <w:r>
-        <w:rPr>
-          <w:vertAlign w:val="superscript"/>
-        </w:rPr>
-        <w:t xml:space="preserve">깊이</w:t>
-      </w:r>
-      <w:r>
-        <w:t xml:space="preserve">를 상위 기술에 인정(Spring → Java)하고, 인정분은 출처·개월을 따로 남겨 본인 경력과 구분한다. 사전 버전·인정 비율은 계산 버전에 들어간다.</w:t>
+        <w:t xml:space="preserve">: 하위 기술 경력을 상위 기술에 한 단계 위면 70%, 두 단계 위면 49%(0.7 × 0.7)만큼 인정(Spring → Java)하고, 인정분은 출처·개월을 따로 남겨 본인 경력과 구분한다. 사전 버전·인정 비율은 계산 버전에 들어간다.</w:t>
       </w:r>
     </w:p>
     <w:p>
@@ -8679,7 +8557,7 @@
         <w:pStyle w:val="Heading2"/>
       </w:pPr>
       <w:r>
-        <w:t xml:space="preserve">6.7 후보 추천 — 신규 사업 편성·긴급 투입</w:t>
+        <w:t xml:space="preserve">6.6 후보 추천 — 신규 사업 편성·긴급 투입</w:t>
       </w:r>
     </w:p>
     <w:p>
@@ -8695,10 +8573,10 @@
           <w:b/>
           <w:bCs/>
         </w:rPr>
-        <w:t xml:space="preserve">후보와 채점</w:t>
-      </w:r>
-      <w:r>
-        <w:t xml:space="preserve">: 후보는 대기 인력, 지금 사업이 신규 사업 시작 전에 모두 끝나는 인력, 다른 사업에서 빼 올 인력이다. 후보마다 그 사람을 넣은 전체 배치를 평가기로 다시 채점해 기술 적합·협업 변화, 메운 자리, 원래 사업이 잃는 자리를 나눠 보인다. 협업 점수는 두 사람 사이 값이라 "이 사업 팀원 누구와 +0.17"처럼 쌍으로 보인다. 진행 사업에 붙는 추가 과제는 그 사업 팀원을 맨 위에 보인다.</w:t>
+        <w:t xml:space="preserve">후보 채점</w:t>
+      </w:r>
+      <w:r>
+        <w:t xml:space="preserve">: 후보마다 그 사람을 넣은 전체 배치를 평가기로 다시 채점해, 기술 적합·협업 변화와 원래 사업이 잃는 자리까지 같은 잣대로 비교한다. 협업 점수는 두 사람 사이 값이라 "이 사업 팀원 누구와 +0.17"처럼 쌍으로 보인다.</w:t>
       </w:r>
     </w:p>
     <w:p>
@@ -8714,60 +8592,10 @@
           <w:b/>
           <w:bCs/>
         </w:rPr>
-        <w:t xml:space="preserve">고른 사람을 팀원으로</w:t>
-      </w:r>
-      <w:r>
-        <w:t xml:space="preserve">: 부서장이 한 명을 넣으면 그 사람을 팀원으로 쳐서 나머지 후보를 다시 매기고, 등급별 자리·요구 기술 충족·새 위반을 미리 보인다. 데이터는 확정 때만 바뀌고, 확정은 미리 보기와 같은 판정을 다시 거친다.</w:t>
-      </w:r>
-    </w:p>
-    <w:p>
-      <w:pPr>
-        <w:pStyle w:val="TWList"/>
-        <w:numPr>
-          <w:ilvl w:val="0"/>
-          <w:numId w:val="1"/>
-        </w:numPr>
-      </w:pPr>
-      <w:r>
-        <w:rPr>
-          <w:b/>
-          <w:bCs/>
-        </w:rPr>
-        <w:t xml:space="preserve">자동 편성</w:t>
-      </w:r>
-      <w:r>
-        <w:t xml:space="preserve">: 옮길 수 있는 인원 K = 0~5마다 허용 오차 0으로 풀어(3.2) 몇 명을 옮기면 무엇이 좋아지는지 나란히 보인다.</w:t>
-      </w:r>
-    </w:p>
-    <w:p>
-      <w:pPr>
-        <w:pStyle w:val="TWList"/>
-        <w:numPr>
-          <w:ilvl w:val="0"/>
-          <w:numId w:val="1"/>
-        </w:numPr>
-      </w:pPr>
-      <w:r>
-        <w:rPr>
-          <w:b/>
-          <w:bCs/>
-        </w:rPr>
-        <w:t xml:space="preserve">긴급 투입</w:t>
-      </w:r>
-      <w:r>
-        <w:t xml:space="preserve">: 상황 글을 요구 기술로 옮긴 뒤(6.5) 후보 순위와 최선 조합(허용 오차 0, 최대 600초)을 함께 낸다. 프로젝트 동시 수행 허용이 필요한 후보는 따로 보이고, 빼 온 자리는 같은 확정에서 메우거나 "메우지 않음"을 정한다. 밤사이 AI 없이 진행 사업마다 바로 넣을 수 있는 상위 5명을 계산해 둔다.</w:t>
-      </w:r>
-    </w:p>
-    <w:p>
-      <w:pPr>
-        <w:pStyle w:val="TWList"/>
-        <w:numPr>
-          <w:ilvl w:val="0"/>
-          <w:numId w:val="1"/>
-        </w:numPr>
-      </w:pPr>
-      <w:r>
-        <w:t xml:space="preserve">육아휴직 등으로 사업 기간에 투입할 수 없는 사람은 사유와 함께 보이되 고를 수 없다.</w:t>
+        <w:t xml:space="preserve">최적 확인과 미리 계산</w:t>
+      </w:r>
+      <w:r>
+        <w:t xml:space="preserve">: K 비교와 긴급 투입 최선 조합은 허용 오차 0으로 푼다(최대 600초). 진행 사업마다 바로 넣을 수 있는 상위 5명은 밤사이 AI 없이 미리 계산해 둔다.</w:t>
       </w:r>
     </w:p>
     <w:p>
@@ -8775,7 +8603,7 @@
         <w:pStyle w:val="Heading2"/>
       </w:pPr>
       <w:r>
-        <w:t xml:space="preserve">6.8 발주 자료 읽기</w:t>
+        <w:t xml:space="preserve">6.7 발주 자료 읽기</w:t>
       </w:r>
     </w:p>
     <w:p>
@@ -8895,10 +8723,10 @@
         </w:tblCellMar>
       </w:tblPr>
       <w:tblGrid>
-        <w:gridCol w:w="1342"/>
-        <w:gridCol w:w="2379"/>
-        <w:gridCol w:w="4379"/>
-        <w:gridCol w:w="2215"/>
+        <w:gridCol w:w="1072"/>
+        <w:gridCol w:w="2334"/>
+        <w:gridCol w:w="4861"/>
+        <w:gridCol w:w="2049"/>
       </w:tblGrid>
       <w:tr>
         <w:trPr>
@@ -8907,7 +8735,7 @@
         </w:trPr>
         <w:tc>
           <w:tcPr>
-            <w:tcW w:w="1342" w:type="dxa"/>
+            <w:tcW w:w="1072" w:type="dxa"/>
             <w:shd w:val="clear" w:color="auto" w:fill="F1F3F5"/>
           </w:tcPr>
           <w:p>
@@ -8927,7 +8755,7 @@
         </w:tc>
         <w:tc>
           <w:tcPr>
-            <w:tcW w:w="2379" w:type="dxa"/>
+            <w:tcW w:w="2334" w:type="dxa"/>
             <w:shd w:val="clear" w:color="auto" w:fill="F1F3F5"/>
           </w:tcPr>
           <w:p>
@@ -8947,7 +8775,7 @@
         </w:tc>
         <w:tc>
           <w:tcPr>
-            <w:tcW w:w="4379" w:type="dxa"/>
+            <w:tcW w:w="4861" w:type="dxa"/>
             <w:shd w:val="clear" w:color="auto" w:fill="F1F3F5"/>
           </w:tcPr>
           <w:p>
@@ -8967,7 +8795,7 @@
         </w:tc>
         <w:tc>
           <w:tcPr>
-            <w:tcW w:w="2215" w:type="dxa"/>
+            <w:tcW w:w="2049" w:type="dxa"/>
             <w:shd w:val="clear" w:color="auto" w:fill="F1F3F5"/>
           </w:tcPr>
           <w:p>
@@ -8992,69 +8820,69 @@
         </w:trPr>
         <w:tc>
           <w:tcPr>
-            <w:tcW w:w="1342" w:type="dxa"/>
-          </w:tcPr>
-          <w:p>
-            <w:pPr>
-              <w:pStyle w:val="TWCell"/>
-            </w:pPr>
-            <w:r>
-              <w:rPr>
-                <w:sz w:val="17"/>
-                <w:szCs w:val="17"/>
-              </w:rPr>
-              <w:t xml:space="preserve">서비스 솔버</w:t>
-            </w:r>
-          </w:p>
-        </w:tc>
-        <w:tc>
-          <w:tcPr>
-            <w:tcW w:w="2379" w:type="dxa"/>
-          </w:tcPr>
-          <w:p>
-            <w:pPr>
-              <w:pStyle w:val="TWCell"/>
-            </w:pPr>
-            <w:r>
-              <w:rPr>
-                <w:sz w:val="17"/>
-                <w:szCs w:val="17"/>
-              </w:rPr>
-              <w:t xml:space="preserve">CBC · SCIP · HiGHS</w:t>
-            </w:r>
-          </w:p>
-        </w:tc>
-        <w:tc>
-          <w:tcPr>
-            <w:tcW w:w="4379" w:type="dxa"/>
-          </w:tcPr>
-          <w:p>
-            <w:pPr>
-              <w:pStyle w:val="TWCell"/>
-            </w:pPr>
-            <w:r>
-              <w:rPr>
-                <w:sz w:val="17"/>
-                <w:szCs w:val="17"/>
-              </w:rPr>
-              <w:t xml:space="preserve">솔버당 112건 중 시간 안 완료 22 · 75 · 79(CBC는 품질 확인 불가). 100·200·300명 실제 규모에서 CBC는 세 규모 모두 이론상 최대치 1% 안에 못 듦</w:t>
-            </w:r>
-          </w:p>
-        </w:tc>
-        <w:tc>
-          <w:tcPr>
-            <w:tcW w:w="2215" w:type="dxa"/>
-          </w:tcPr>
-          <w:p>
-            <w:pPr>
-              <w:pStyle w:val="TWCell"/>
-            </w:pPr>
-            <w:r>
-              <w:rPr>
-                <w:sz w:val="17"/>
-                <w:szCs w:val="17"/>
-              </w:rPr>
-              <w:t xml:space="preserve">HiGHS 고정</w:t>
+            <w:tcW w:w="1072" w:type="dxa"/>
+          </w:tcPr>
+          <w:p>
+            <w:pPr>
+              <w:pStyle w:val="TWCell"/>
+            </w:pPr>
+            <w:r>
+              <w:rPr>
+                <w:sz w:val="17"/>
+                <w:szCs w:val="17"/>
+              </w:rPr>
+              <w:t xml:space="preserve">그래프 저장소</w:t>
+            </w:r>
+          </w:p>
+        </w:tc>
+        <w:tc>
+          <w:tcPr>
+            <w:tcW w:w="2334" w:type="dxa"/>
+          </w:tcPr>
+          <w:p>
+            <w:pPr>
+              <w:pStyle w:val="TWCell"/>
+            </w:pPr>
+            <w:r>
+              <w:rPr>
+                <w:sz w:val="17"/>
+                <w:szCs w:val="17"/>
+              </w:rPr>
+              <w:t xml:space="preserve">Neo4j(처음 설계) · RDF 추론 · 인메모리 그래프</w:t>
+            </w:r>
+          </w:p>
+        </w:tc>
+        <w:tc>
+          <w:tcPr>
+            <w:tcW w:w="4861" w:type="dxa"/>
+          </w:tcPr>
+          <w:p>
+            <w:pPr>
+              <w:pStyle w:val="TWCell"/>
+            </w:pPr>
+            <w:r>
+              <w:rPr>
+                <w:sz w:val="17"/>
+                <w:szCs w:val="17"/>
+              </w:rPr>
+              <w:t xml:space="preserve">설명용 질의 5종 비교 20번 중 Neo4j가 나은 경우 0, 속도는 메모리 &lt; SQLite &lt; Neo4j. RDF 추론은 "하위 기술 경력 70% 인정" 같은 가중 계산을 표현하지 못한다</w:t>
+            </w:r>
+          </w:p>
+        </w:tc>
+        <w:tc>
+          <w:tcPr>
+            <w:tcW w:w="2049" w:type="dxa"/>
+          </w:tcPr>
+          <w:p>
+            <w:pPr>
+              <w:pStyle w:val="TWCell"/>
+            </w:pPr>
+            <w:r>
+              <w:rPr>
+                <w:sz w:val="17"/>
+                <w:szCs w:val="17"/>
+              </w:rPr>
+              <w:t xml:space="preserve">인메모리 그래프 + SQLite 근거 색인</w:t>
             </w:r>
           </w:p>
         </w:tc>
@@ -9065,69 +8893,69 @@
         </w:trPr>
         <w:tc>
           <w:tcPr>
-            <w:tcW w:w="1342" w:type="dxa"/>
-          </w:tcPr>
-          <w:p>
-            <w:pPr>
-              <w:pStyle w:val="TWCell"/>
-            </w:pPr>
-            <w:r>
-              <w:rPr>
-                <w:sz w:val="17"/>
-                <w:szCs w:val="17"/>
-              </w:rPr>
-              <w:t xml:space="preserve">협업 보상 쌍 수</w:t>
-            </w:r>
-          </w:p>
-        </w:tc>
-        <w:tc>
-          <w:tcPr>
-            <w:tcW w:w="2379" w:type="dxa"/>
-          </w:tcPr>
-          <w:p>
-            <w:pPr>
-              <w:pStyle w:val="TWCell"/>
-            </w:pPr>
-            <w:r>
-              <w:rPr>
-                <w:sz w:val="17"/>
-                <w:szCs w:val="17"/>
-              </w:rPr>
-              <w:t xml:space="preserve">5,000쌍</w:t>
-            </w:r>
-          </w:p>
-        </w:tc>
-        <w:tc>
-          <w:tcPr>
-            <w:tcW w:w="4379" w:type="dxa"/>
-          </w:tcPr>
-          <w:p>
-            <w:pPr>
-              <w:pStyle w:val="TWCell"/>
-            </w:pPr>
-            <w:r>
-              <w:rPr>
-                <w:sz w:val="17"/>
-                <w:szCs w:val="17"/>
-              </w:rPr>
-              <w:t xml:space="preserve">200명 600초에도 빈자리 57석, 300명 해 없음 → 200쌍으로 모든 규모 빈자리 0</w:t>
-            </w:r>
-          </w:p>
-        </w:tc>
-        <w:tc>
-          <w:tcPr>
-            <w:tcW w:w="2215" w:type="dxa"/>
-          </w:tcPr>
-          <w:p>
-            <w:pPr>
-              <w:pStyle w:val="TWCell"/>
-            </w:pPr>
-            <w:r>
-              <w:rPr>
-                <w:sz w:val="17"/>
-                <w:szCs w:val="17"/>
-              </w:rPr>
-              <w:t xml:space="preserve">|C| 상위 200쌍</w:t>
+            <w:tcW w:w="1072" w:type="dxa"/>
+          </w:tcPr>
+          <w:p>
+            <w:pPr>
+              <w:pStyle w:val="TWCell"/>
+            </w:pPr>
+            <w:r>
+              <w:rPr>
+                <w:sz w:val="17"/>
+                <w:szCs w:val="17"/>
+              </w:rPr>
+              <w:t xml:space="preserve">AI의 역할</w:t>
+            </w:r>
+          </w:p>
+        </w:tc>
+        <w:tc>
+          <w:tcPr>
+            <w:tcW w:w="2334" w:type="dxa"/>
+          </w:tcPr>
+          <w:p>
+            <w:pPr>
+              <w:pStyle w:val="TWCell"/>
+            </w:pPr>
+            <w:r>
+              <w:rPr>
+                <w:sz w:val="17"/>
+                <w:szCs w:val="17"/>
+              </w:rPr>
+              <w:t xml:space="preserve">LLM 직접 배치</w:t>
+            </w:r>
+          </w:p>
+        </w:tc>
+        <w:tc>
+          <w:tcPr>
+            <w:tcW w:w="4861" w:type="dxa"/>
+          </w:tcPr>
+          <w:p>
+            <w:pPr>
+              <w:pStyle w:val="TWCell"/>
+            </w:pPr>
+            <w:r>
+              <w:rPr>
+                <w:sz w:val="17"/>
+                <w:szCs w:val="17"/>
+              </w:rPr>
+              <w:t xml:space="preserve">100명에서 규칙 위반 또는 솔버의 55%, 6~11분(3.4)</w:t>
+            </w:r>
+          </w:p>
+        </w:tc>
+        <w:tc>
+          <w:tcPr>
+            <w:tcW w:w="2049" w:type="dxa"/>
+          </w:tcPr>
+          <w:p>
+            <w:pPr>
+              <w:pStyle w:val="TWCell"/>
+            </w:pPr>
+            <w:r>
+              <w:rPr>
+                <w:sz w:val="17"/>
+                <w:szCs w:val="17"/>
+              </w:rPr>
+              <w:t xml:space="preserve">결정은 솔버, 방정식의 값과 근거 글은 AI(1.5)</w:t>
             </w:r>
           </w:p>
         </w:tc>
@@ -9138,69 +8966,69 @@
         </w:trPr>
         <w:tc>
           <w:tcPr>
-            <w:tcW w:w="1342" w:type="dxa"/>
-          </w:tcPr>
-          <w:p>
-            <w:pPr>
-              <w:pStyle w:val="TWCell"/>
-            </w:pPr>
-            <w:r>
-              <w:rPr>
-                <w:sz w:val="17"/>
-                <w:szCs w:val="17"/>
-              </w:rPr>
-              <w:t xml:space="preserve">"익숙한 쌍" 기준</w:t>
-            </w:r>
-          </w:p>
-        </w:tc>
-        <w:tc>
-          <w:tcPr>
-            <w:tcW w:w="2379" w:type="dxa"/>
-          </w:tcPr>
-          <w:p>
-            <w:pPr>
-              <w:pStyle w:val="TWCell"/>
-            </w:pPr>
-            <w:r>
-              <w:rPr>
-                <w:sz w:val="17"/>
-                <w:szCs w:val="17"/>
-              </w:rPr>
-              <w:t xml:space="preserve">10년 중 6개월 · 5년 중 12개월 · 3년 중 12개월</w:t>
-            </w:r>
-          </w:p>
-        </w:tc>
-        <w:tc>
-          <w:tcPr>
-            <w:tcW w:w="4379" w:type="dxa"/>
-          </w:tcPr>
-          <w:p>
-            <w:pPr>
-              <w:pStyle w:val="TWCell"/>
-            </w:pPr>
-            <w:r>
-              <w:rPr>
-                <w:sz w:val="17"/>
-                <w:szCs w:val="17"/>
-              </w:rPr>
-              <w:t xml:space="preserve">300명 익숙한 쌍 11,733 · 1,352 · 395개. 10년 기준은 200명에서 빈자리 79석</w:t>
-            </w:r>
-          </w:p>
-        </w:tc>
-        <w:tc>
-          <w:tcPr>
-            <w:tcW w:w="2215" w:type="dxa"/>
-          </w:tcPr>
-          <w:p>
-            <w:pPr>
-              <w:pStyle w:val="TWCell"/>
-            </w:pPr>
-            <w:r>
-              <w:rPr>
-                <w:sz w:val="17"/>
-                <w:szCs w:val="17"/>
-              </w:rPr>
-              <w:t xml:space="preserve">최근 3년 중 12개월</w:t>
+            <w:tcW w:w="1072" w:type="dxa"/>
+          </w:tcPr>
+          <w:p>
+            <w:pPr>
+              <w:pStyle w:val="TWCell"/>
+            </w:pPr>
+            <w:r>
+              <w:rPr>
+                <w:sz w:val="17"/>
+                <w:szCs w:val="17"/>
+              </w:rPr>
+              <w:t xml:space="preserve">평가 글 판정</w:t>
+            </w:r>
+          </w:p>
+        </w:tc>
+        <w:tc>
+          <w:tcPr>
+            <w:tcW w:w="2334" w:type="dxa"/>
+          </w:tcPr>
+          <w:p>
+            <w:pPr>
+              <w:pStyle w:val="TWCell"/>
+            </w:pPr>
+            <w:r>
+              <w:rPr>
+                <w:sz w:val="17"/>
+                <w:szCs w:val="17"/>
+              </w:rPr>
+              <w:t xml:space="preserve">규칙(항목만) · Jev · GLM · OpenAI</w:t>
+            </w:r>
+          </w:p>
+        </w:tc>
+        <w:tc>
+          <w:tcPr>
+            <w:tcW w:w="4861" w:type="dxa"/>
+          </w:tcPr>
+          <w:p>
+            <w:pPr>
+              <w:pStyle w:val="TWCell"/>
+            </w:pPr>
+            <w:r>
+              <w:rPr>
+                <w:sz w:val="17"/>
+                <w:szCs w:val="17"/>
+              </w:rPr>
+              <w:t xml:space="preserve">규칙은 글에 쓴 부정을, 감성 점수 API는 돌려 말한 지적을, 사내 후보는 그 절반을 놓친다. 규칙이면 나쁘게 쓴 사이가 협업 보상에 든다(3.5)</w:t>
+            </w:r>
+          </w:p>
+        </w:tc>
+        <w:tc>
+          <w:tcPr>
+            <w:tcW w:w="2049" w:type="dxa"/>
+          </w:tcPr>
+          <w:p>
+            <w:pPr>
+              <w:pStyle w:val="TWCell"/>
+            </w:pPr>
+            <w:r>
+              <w:rPr>
+                <w:sz w:val="17"/>
+                <w:szCs w:val="17"/>
+              </w:rPr>
+              <w:t xml:space="preserve">LLM(OpenAI) 판정</w:t>
             </w:r>
           </w:p>
         </w:tc>
@@ -9211,69 +9039,69 @@
         </w:trPr>
         <w:tc>
           <w:tcPr>
-            <w:tcW w:w="1342" w:type="dxa"/>
-          </w:tcPr>
-          <w:p>
-            <w:pPr>
-              <w:pStyle w:val="TWCell"/>
-            </w:pPr>
-            <w:r>
-              <w:rPr>
-                <w:sz w:val="17"/>
-                <w:szCs w:val="17"/>
-              </w:rPr>
-              <w:t xml:space="preserve">오래 붙어 다닌 사이</w:t>
-            </w:r>
-          </w:p>
-        </w:tc>
-        <w:tc>
-          <w:tcPr>
-            <w:tcW w:w="2379" w:type="dxa"/>
-          </w:tcPr>
-          <w:p>
-            <w:pPr>
-              <w:pStyle w:val="TWCell"/>
-            </w:pPr>
-            <w:r>
-              <w:rPr>
-                <w:sz w:val="17"/>
-                <w:szCs w:val="17"/>
-              </w:rPr>
-              <w:t xml:space="preserve">쌍 감점 · 새 동료 수 하한(문헌의 파트너 다양성)</w:t>
-            </w:r>
-          </w:p>
-        </w:tc>
-        <w:tc>
-          <w:tcPr>
-            <w:tcW w:w="4379" w:type="dxa"/>
-          </w:tcPr>
-          <w:p>
-            <w:pPr>
-              <w:pStyle w:val="TWCell"/>
-            </w:pPr>
-            <w:r>
-              <w:rPr>
-                <w:sz w:val="17"/>
-                <w:szCs w:val="17"/>
-              </w:rPr>
-              <w:t xml:space="preserve">하한은 SI 팀 크기에서 거의 걸리지 않고 200명 풀이를 망침. 감점은 익숙한 쌍을 200명 29 → 6, 300명 46 → 5로 흩고 품질 손실 −3.2% · −0.05%</w:t>
-            </w:r>
-          </w:p>
-        </w:tc>
-        <w:tc>
-          <w:tcPr>
-            <w:tcW w:w="2215" w:type="dxa"/>
-          </w:tcPr>
-          <w:p>
-            <w:pPr>
-              <w:pStyle w:val="TWCell"/>
-            </w:pPr>
-            <w:r>
-              <w:rPr>
-                <w:sz w:val="17"/>
-                <w:szCs w:val="17"/>
-              </w:rPr>
-              <w:t xml:space="preserve">쌍 감점 0.2 유지</w:t>
+            <w:tcW w:w="1072" w:type="dxa"/>
+          </w:tcPr>
+          <w:p>
+            <w:pPr>
+              <w:pStyle w:val="TWCell"/>
+            </w:pPr>
+            <w:r>
+              <w:rPr>
+                <w:sz w:val="17"/>
+                <w:szCs w:val="17"/>
+              </w:rPr>
+              <w:t xml:space="preserve">서비스 솔버</w:t>
+            </w:r>
+          </w:p>
+        </w:tc>
+        <w:tc>
+          <w:tcPr>
+            <w:tcW w:w="2334" w:type="dxa"/>
+          </w:tcPr>
+          <w:p>
+            <w:pPr>
+              <w:pStyle w:val="TWCell"/>
+            </w:pPr>
+            <w:r>
+              <w:rPr>
+                <w:sz w:val="17"/>
+                <w:szCs w:val="17"/>
+              </w:rPr>
+              <w:t xml:space="preserve">CBC · SCIP · HiGHS</w:t>
+            </w:r>
+          </w:p>
+        </w:tc>
+        <w:tc>
+          <w:tcPr>
+            <w:tcW w:w="4861" w:type="dxa"/>
+          </w:tcPr>
+          <w:p>
+            <w:pPr>
+              <w:pStyle w:val="TWCell"/>
+            </w:pPr>
+            <w:r>
+              <w:rPr>
+                <w:sz w:val="17"/>
+                <w:szCs w:val="17"/>
+              </w:rPr>
+              <w:t xml:space="preserve">솔버당 112건 중 시간 안 완료 22 · 75 · 79(CBC는 품질 확인 불가). 100·200·300명 실제 규모에서 CBC는 세 규모 모두 이론상 최대치 1% 안에 못 듦</w:t>
+            </w:r>
+          </w:p>
+        </w:tc>
+        <w:tc>
+          <w:tcPr>
+            <w:tcW w:w="2049" w:type="dxa"/>
+          </w:tcPr>
+          <w:p>
+            <w:pPr>
+              <w:pStyle w:val="TWCell"/>
+            </w:pPr>
+            <w:r>
+              <w:rPr>
+                <w:sz w:val="17"/>
+                <w:szCs w:val="17"/>
+              </w:rPr>
+              <w:t xml:space="preserve">HiGHS 고정</w:t>
             </w:r>
           </w:p>
         </w:tc>
@@ -9284,7 +9112,7 @@
         </w:trPr>
         <w:tc>
           <w:tcPr>
-            <w:tcW w:w="1342" w:type="dxa"/>
+            <w:tcW w:w="1072" w:type="dxa"/>
           </w:tcPr>
           <w:p>
             <w:pPr>
@@ -9301,7 +9129,7 @@
         </w:tc>
         <w:tc>
           <w:tcPr>
-            <w:tcW w:w="2379" w:type="dxa"/>
+            <w:tcW w:w="2334" w:type="dxa"/>
           </w:tcPr>
           <w:p>
             <w:pPr>
@@ -9318,7 +9146,7 @@
         </w:tc>
         <w:tc>
           <w:tcPr>
-            <w:tcW w:w="4379" w:type="dxa"/>
+            <w:tcW w:w="4861" w:type="dxa"/>
           </w:tcPr>
           <w:p>
             <w:pPr>
@@ -9335,7 +9163,7 @@
         </w:tc>
         <w:tc>
           <w:tcPr>
-            <w:tcW w:w="2215" w:type="dxa"/>
+            <w:tcW w:w="2049" w:type="dxa"/>
           </w:tcPr>
           <w:p>
             <w:pPr>
@@ -9357,69 +9185,69 @@
         </w:trPr>
         <w:tc>
           <w:tcPr>
-            <w:tcW w:w="1342" w:type="dxa"/>
-          </w:tcPr>
-          <w:p>
-            <w:pPr>
-              <w:pStyle w:val="TWCell"/>
-            </w:pPr>
-            <w:r>
-              <w:rPr>
-                <w:sz w:val="17"/>
-                <w:szCs w:val="17"/>
-              </w:rPr>
-              <w:t xml:space="preserve">AI의 역할</w:t>
-            </w:r>
-          </w:p>
-        </w:tc>
-        <w:tc>
-          <w:tcPr>
-            <w:tcW w:w="2379" w:type="dxa"/>
-          </w:tcPr>
-          <w:p>
-            <w:pPr>
-              <w:pStyle w:val="TWCell"/>
-            </w:pPr>
-            <w:r>
-              <w:rPr>
-                <w:sz w:val="17"/>
-                <w:szCs w:val="17"/>
-              </w:rPr>
-              <w:t xml:space="preserve">LLM 직접 배치</w:t>
-            </w:r>
-          </w:p>
-        </w:tc>
-        <w:tc>
-          <w:tcPr>
-            <w:tcW w:w="4379" w:type="dxa"/>
-          </w:tcPr>
-          <w:p>
-            <w:pPr>
-              <w:pStyle w:val="TWCell"/>
-            </w:pPr>
-            <w:r>
-              <w:rPr>
-                <w:sz w:val="17"/>
-                <w:szCs w:val="17"/>
-              </w:rPr>
-              <w:t xml:space="preserve">100명에서 규칙 위반 또는 솔버의 55%, 6~11분(3.4)</w:t>
-            </w:r>
-          </w:p>
-        </w:tc>
-        <w:tc>
-          <w:tcPr>
-            <w:tcW w:w="2215" w:type="dxa"/>
-          </w:tcPr>
-          <w:p>
-            <w:pPr>
-              <w:pStyle w:val="TWCell"/>
-            </w:pPr>
-            <w:r>
-              <w:rPr>
-                <w:sz w:val="17"/>
-                <w:szCs w:val="17"/>
-              </w:rPr>
-              <w:t xml:space="preserve">결정은 솔버, AI는 읽기·쓰기</w:t>
+            <w:tcW w:w="1072" w:type="dxa"/>
+          </w:tcPr>
+          <w:p>
+            <w:pPr>
+              <w:pStyle w:val="TWCell"/>
+            </w:pPr>
+            <w:r>
+              <w:rPr>
+                <w:sz w:val="17"/>
+                <w:szCs w:val="17"/>
+              </w:rPr>
+              <w:t xml:space="preserve">소명 글 방식</w:t>
+            </w:r>
+          </w:p>
+        </w:tc>
+        <w:tc>
+          <w:tcPr>
+            <w:tcW w:w="2334" w:type="dxa"/>
+          </w:tcPr>
+          <w:p>
+            <w:pPr>
+              <w:pStyle w:val="TWCell"/>
+            </w:pPr>
+            <w:r>
+              <w:rPr>
+                <w:sz w:val="17"/>
+                <w:szCs w:val="17"/>
+              </w:rPr>
+              <w:t xml:space="preserve">정해진 틀(템플릿) · GraphRAG</w:t>
+            </w:r>
+          </w:p>
+        </w:tc>
+        <w:tc>
+          <w:tcPr>
+            <w:tcW w:w="4861" w:type="dxa"/>
+          </w:tcPr>
+          <w:p>
+            <w:pPr>
+              <w:pStyle w:val="TWCell"/>
+            </w:pPr>
+            <w:r>
+              <w:rPr>
+                <w:sz w:val="17"/>
+                <w:szCs w:val="17"/>
+              </w:rPr>
+              <w:t xml:space="preserve">근거 오류는 둘 다 0, 읽기 쉬운 쪽으로 — 템플릿은 실패 시 대체 글로 유지</w:t>
+            </w:r>
+          </w:p>
+        </w:tc>
+        <w:tc>
+          <w:tcPr>
+            <w:tcW w:w="2049" w:type="dxa"/>
+          </w:tcPr>
+          <w:p>
+            <w:pPr>
+              <w:pStyle w:val="TWCell"/>
+            </w:pPr>
+            <w:r>
+              <w:rPr>
+                <w:sz w:val="17"/>
+                <w:szCs w:val="17"/>
+              </w:rPr>
+              <w:t xml:space="preserve">GraphRAG</w:t>
             </w:r>
           </w:p>
         </w:tc>
@@ -9430,299 +9258,7 @@
         </w:trPr>
         <w:tc>
           <w:tcPr>
-            <w:tcW w:w="1342" w:type="dxa"/>
-          </w:tcPr>
-          <w:p>
-            <w:pPr>
-              <w:pStyle w:val="TWCell"/>
-            </w:pPr>
-            <w:r>
-              <w:rPr>
-                <w:sz w:val="17"/>
-                <w:szCs w:val="17"/>
-              </w:rPr>
-              <w:t xml:space="preserve">신규 사업 편성의 허용 오차</w:t>
-            </w:r>
-          </w:p>
-        </w:tc>
-        <w:tc>
-          <w:tcPr>
-            <w:tcW w:w="2379" w:type="dxa"/>
-          </w:tcPr>
-          <w:p>
-            <w:pPr>
-              <w:pStyle w:val="TWCell"/>
-            </w:pPr>
-            <w:r>
-              <w:rPr>
-                <w:sz w:val="17"/>
-                <w:szCs w:val="17"/>
-              </w:rPr>
-              <w:t xml:space="preserve">5% · 0</w:t>
-            </w:r>
-          </w:p>
-        </w:tc>
-        <w:tc>
-          <w:tcPr>
-            <w:tcW w:w="4379" w:type="dxa"/>
-          </w:tcPr>
-          <w:p>
-            <w:pPr>
-              <w:pStyle w:val="TWCell"/>
-            </w:pPr>
-            <w:r>
-              <w:rPr>
-                <w:sz w:val="17"/>
-                <w:szCs w:val="17"/>
-              </w:rPr>
-              <w:t xml:space="preserve">빈자리 감점(자리당 100점)이 섞인 목적에서 5%는 1~2명 이동의 개선(1~2점)을 통째로 가려, "다른 사업에서 빼 오기를 허용한 쪽이 더 나쁜" 모순이 나왔다</w:t>
-            </w:r>
-          </w:p>
-        </w:tc>
-        <w:tc>
-          <w:tcPr>
-            <w:tcW w:w="2215" w:type="dxa"/>
-          </w:tcPr>
-          <w:p>
-            <w:pPr>
-              <w:pStyle w:val="TWCell"/>
-            </w:pPr>
-            <w:r>
-              <w:rPr>
-                <w:sz w:val="17"/>
-                <w:szCs w:val="17"/>
-              </w:rPr>
-              <w:t xml:space="preserve">허용 오차 0(K마다 최적 확인)</w:t>
-            </w:r>
-          </w:p>
-        </w:tc>
-      </w:tr>
-      <w:tr>
-        <w:trPr>
-          <w:cantSplit/>
-        </w:trPr>
-        <w:tc>
-          <w:tcPr>
-            <w:tcW w:w="1342" w:type="dxa"/>
-          </w:tcPr>
-          <w:p>
-            <w:pPr>
-              <w:pStyle w:val="TWCell"/>
-            </w:pPr>
-            <w:r>
-              <w:rPr>
-                <w:sz w:val="17"/>
-                <w:szCs w:val="17"/>
-              </w:rPr>
-              <w:t xml:space="preserve">그래프 저장소</w:t>
-            </w:r>
-          </w:p>
-        </w:tc>
-        <w:tc>
-          <w:tcPr>
-            <w:tcW w:w="2379" w:type="dxa"/>
-          </w:tcPr>
-          <w:p>
-            <w:pPr>
-              <w:pStyle w:val="TWCell"/>
-            </w:pPr>
-            <w:r>
-              <w:rPr>
-                <w:sz w:val="17"/>
-                <w:szCs w:val="17"/>
-              </w:rPr>
-              <w:t xml:space="preserve">Neo4j(처음 설계) · RDF 추론 · 인메모리 그래프</w:t>
-            </w:r>
-          </w:p>
-        </w:tc>
-        <w:tc>
-          <w:tcPr>
-            <w:tcW w:w="4379" w:type="dxa"/>
-          </w:tcPr>
-          <w:p>
-            <w:pPr>
-              <w:pStyle w:val="TWCell"/>
-            </w:pPr>
-            <w:r>
-              <w:rPr>
-                <w:sz w:val="17"/>
-                <w:szCs w:val="17"/>
-              </w:rPr>
-              <w:t xml:space="preserve">설명용 질의 5종 비교 20번 중 Neo4j가 나은 경우 0, 속도는 메모리 &lt; SQLite &lt; Neo4j. RDF 추론은 "하위 기술 경력 70% 인정" 같은 가중 계산을 표현하지 못한다</w:t>
-            </w:r>
-          </w:p>
-        </w:tc>
-        <w:tc>
-          <w:tcPr>
-            <w:tcW w:w="2215" w:type="dxa"/>
-          </w:tcPr>
-          <w:p>
-            <w:pPr>
-              <w:pStyle w:val="TWCell"/>
-            </w:pPr>
-            <w:r>
-              <w:rPr>
-                <w:sz w:val="17"/>
-                <w:szCs w:val="17"/>
-              </w:rPr>
-              <w:t xml:space="preserve">인메모리 그래프 + SQLite 근거 색인</w:t>
-            </w:r>
-          </w:p>
-        </w:tc>
-      </w:tr>
-      <w:tr>
-        <w:trPr>
-          <w:cantSplit/>
-        </w:trPr>
-        <w:tc>
-          <w:tcPr>
-            <w:tcW w:w="1342" w:type="dxa"/>
-          </w:tcPr>
-          <w:p>
-            <w:pPr>
-              <w:pStyle w:val="TWCell"/>
-            </w:pPr>
-            <w:r>
-              <w:rPr>
-                <w:sz w:val="17"/>
-                <w:szCs w:val="17"/>
-              </w:rPr>
-              <w:t xml:space="preserve">평가 글 판정</w:t>
-            </w:r>
-          </w:p>
-        </w:tc>
-        <w:tc>
-          <w:tcPr>
-            <w:tcW w:w="2379" w:type="dxa"/>
-          </w:tcPr>
-          <w:p>
-            <w:pPr>
-              <w:pStyle w:val="TWCell"/>
-            </w:pPr>
-            <w:r>
-              <w:rPr>
-                <w:sz w:val="17"/>
-                <w:szCs w:val="17"/>
-              </w:rPr>
-              <w:t xml:space="preserve">규칙(항목만) · Jev · GLM(5.3-Flash로 측정) · OpenAI</w:t>
-            </w:r>
-          </w:p>
-        </w:tc>
-        <w:tc>
-          <w:tcPr>
-            <w:tcW w:w="4379" w:type="dxa"/>
-          </w:tcPr>
-          <w:p>
-            <w:pPr>
-              <w:pStyle w:val="TWCell"/>
-            </w:pPr>
-            <w:r>
-              <w:rPr>
-                <w:sz w:val="17"/>
-                <w:szCs w:val="17"/>
-              </w:rPr>
-              <w:t xml:space="preserve">규칙은 글에 쓴 부정을, 감성 점수 API는 돌려 말한 지적을, 사내 후보는 그 절반을 놓친다. 규칙이면 나쁘게 쓴 사이가 협업 보상에 든다(3.5)</w:t>
-            </w:r>
-          </w:p>
-        </w:tc>
-        <w:tc>
-          <w:tcPr>
-            <w:tcW w:w="2215" w:type="dxa"/>
-          </w:tcPr>
-          <w:p>
-            <w:pPr>
-              <w:pStyle w:val="TWCell"/>
-            </w:pPr>
-            <w:r>
-              <w:rPr>
-                <w:sz w:val="17"/>
-                <w:szCs w:val="17"/>
-              </w:rPr>
-              <w:t xml:space="preserve">LLM(OpenAI) 판정</w:t>
-            </w:r>
-          </w:p>
-        </w:tc>
-      </w:tr>
-      <w:tr>
-        <w:trPr>
-          <w:cantSplit/>
-        </w:trPr>
-        <w:tc>
-          <w:tcPr>
-            <w:tcW w:w="1342" w:type="dxa"/>
-          </w:tcPr>
-          <w:p>
-            <w:pPr>
-              <w:pStyle w:val="TWCell"/>
-            </w:pPr>
-            <w:r>
-              <w:rPr>
-                <w:sz w:val="17"/>
-                <w:szCs w:val="17"/>
-              </w:rPr>
-              <w:t xml:space="preserve">상황 글 → 요구 기술</w:t>
-            </w:r>
-          </w:p>
-        </w:tc>
-        <w:tc>
-          <w:tcPr>
-            <w:tcW w:w="2379" w:type="dxa"/>
-          </w:tcPr>
-          <w:p>
-            <w:pPr>
-              <w:pStyle w:val="TWCell"/>
-            </w:pPr>
-            <w:r>
-              <w:rPr>
-                <w:sz w:val="17"/>
-                <w:szCs w:val="17"/>
-              </w:rPr>
-              <w:t xml:space="preserve">사전 이름 찾기 · AI</w:t>
-            </w:r>
-          </w:p>
-        </w:tc>
-        <w:tc>
-          <w:tcPr>
-            <w:tcW w:w="4379" w:type="dxa"/>
-          </w:tcPr>
-          <w:p>
-            <w:pPr>
-              <w:pStyle w:val="TWCell"/>
-            </w:pPr>
-            <w:r>
-              <w:rPr>
-                <w:sz w:val="17"/>
-                <w:szCs w:val="17"/>
-              </w:rPr>
-              <w:t xml:space="preserve">사전 찾기는 재현율 83.6%, 일로만 설명한 요구는 0% — AI는 100%(3.3)</w:t>
-            </w:r>
-          </w:p>
-        </w:tc>
-        <w:tc>
-          <w:tcPr>
-            <w:tcW w:w="2215" w:type="dxa"/>
-          </w:tcPr>
-          <w:p>
-            <w:pPr>
-              <w:pStyle w:val="TWCell"/>
-            </w:pPr>
-            <w:r>
-              <w:rPr>
-                <w:sz w:val="17"/>
-                <w:szCs w:val="17"/>
-              </w:rPr>
-              <w:t xml:space="preserve">AI가 사전 개념으로 옮기고 서버가 검사, 사람 정보는 보내지 않음</w:t>
-            </w:r>
-          </w:p>
-        </w:tc>
-      </w:tr>
-      <w:tr>
-        <w:trPr>
-          <w:cantSplit/>
-        </w:trPr>
-        <w:tc>
-          <w:tcPr>
-            <w:tcW w:w="1342" w:type="dxa"/>
+            <w:tcW w:w="1072" w:type="dxa"/>
           </w:tcPr>
           <w:p>
             <w:pPr>
@@ -9739,7 +9275,7 @@
         </w:tc>
         <w:tc>
           <w:tcPr>
-            <w:tcW w:w="2379" w:type="dxa"/>
+            <w:tcW w:w="2334" w:type="dxa"/>
           </w:tcPr>
           <w:p>
             <w:pPr>
@@ -9756,7 +9292,7 @@
         </w:tc>
         <w:tc>
           <w:tcPr>
-            <w:tcW w:w="4379" w:type="dxa"/>
+            <w:tcW w:w="4861" w:type="dxa"/>
           </w:tcPr>
           <w:p>
             <w:pPr>
@@ -9773,7 +9309,7 @@
         </w:tc>
         <w:tc>
           <w:tcPr>
-            <w:tcW w:w="2215" w:type="dxa"/>
+            <w:tcW w:w="2049" w:type="dxa"/>
           </w:tcPr>
           <w:p>
             <w:pPr>
@@ -9785,517 +9321,6 @@
                 <w:szCs w:val="17"/>
               </w:rPr>
               <w:t xml:space="preserve">근거 말과 함께 제안, 사람이 체크</w:t>
-            </w:r>
-          </w:p>
-        </w:tc>
-      </w:tr>
-      <w:tr>
-        <w:trPr>
-          <w:cantSplit/>
-        </w:trPr>
-        <w:tc>
-          <w:tcPr>
-            <w:tcW w:w="1342" w:type="dxa"/>
-          </w:tcPr>
-          <w:p>
-            <w:pPr>
-              <w:pStyle w:val="TWCell"/>
-            </w:pPr>
-            <w:r>
-              <w:rPr>
-                <w:sz w:val="17"/>
-                <w:szCs w:val="17"/>
-              </w:rPr>
-              <w:t xml:space="preserve">긴 발주 자료</w:t>
-            </w:r>
-          </w:p>
-        </w:tc>
-        <w:tc>
-          <w:tcPr>
-            <w:tcW w:w="2379" w:type="dxa"/>
-          </w:tcPr>
-          <w:p>
-            <w:pPr>
-              <w:pStyle w:val="TWCell"/>
-            </w:pPr>
-            <w:r>
-              <w:rPr>
-                <w:sz w:val="17"/>
-                <w:szCs w:val="17"/>
-              </w:rPr>
-              <w:t xml:space="preserve">앞 4만 자만 · 나눠 동시에 읽기</w:t>
-            </w:r>
-          </w:p>
-        </w:tc>
-        <w:tc>
-          <w:tcPr>
-            <w:tcW w:w="4379" w:type="dxa"/>
-          </w:tcPr>
-          <w:p>
-            <w:pPr>
-              <w:pStyle w:val="TWCell"/>
-            </w:pPr>
-            <w:r>
-              <w:rPr>
-                <w:sz w:val="17"/>
-                <w:szCs w:val="17"/>
-              </w:rPr>
-              <w:t xml:space="preserve">8.3만 자 가상 자료에서 요약 항목 26개 중 13개가 4만 자 뒤에 있었다. 사업명·기간·예산은 공고문 앞머리에 있다</w:t>
-            </w:r>
-          </w:p>
-        </w:tc>
-        <w:tc>
-          <w:tcPr>
-            <w:tcW w:w="2215" w:type="dxa"/>
-          </w:tcPr>
-          <w:p>
-            <w:pPr>
-              <w:pStyle w:val="TWCell"/>
-            </w:pPr>
-            <w:r>
-              <w:rPr>
-                <w:sz w:val="17"/>
-                <w:szCs w:val="17"/>
-              </w:rPr>
-              <w:t xml:space="preserve">필요 기술·요약은 나눠 읽기, 정보 채우기는 앞부분만</w:t>
-            </w:r>
-          </w:p>
-        </w:tc>
-      </w:tr>
-      <w:tr>
-        <w:trPr>
-          <w:cantSplit/>
-        </w:trPr>
-        <w:tc>
-          <w:tcPr>
-            <w:tcW w:w="1342" w:type="dxa"/>
-          </w:tcPr>
-          <w:p>
-            <w:pPr>
-              <w:pStyle w:val="TWCell"/>
-            </w:pPr>
-            <w:r>
-              <w:rPr>
-                <w:sz w:val="17"/>
-                <w:szCs w:val="17"/>
-              </w:rPr>
-              <w:t xml:space="preserve">낯선 기술 이름 정리</w:t>
-            </w:r>
-          </w:p>
-        </w:tc>
-        <w:tc>
-          <w:tcPr>
-            <w:tcW w:w="2379" w:type="dxa"/>
-          </w:tcPr>
-          <w:p>
-            <w:pPr>
-              <w:pStyle w:val="TWCell"/>
-            </w:pPr>
-            <w:r>
-              <w:rPr>
-                <w:sz w:val="17"/>
-                <w:szCs w:val="17"/>
-              </w:rPr>
-              <w:t xml:space="preserve">문자열 유사도 · AI 자동 합치기 · AI 후보 + 관리자 승인</w:t>
-            </w:r>
-          </w:p>
-        </w:tc>
-        <w:tc>
-          <w:tcPr>
-            <w:tcW w:w="4379" w:type="dxa"/>
-          </w:tcPr>
-          <w:p>
-            <w:pPr>
-              <w:pStyle w:val="TWCell"/>
-            </w:pPr>
-            <w:r>
-              <w:rPr>
-                <w:sz w:val="17"/>
-                <w:szCs w:val="17"/>
-              </w:rPr>
-              <w:t xml:space="preserve">1위 정답 문자열 27% · AI 95%(3.3) — 남은 5%와 Java↔JavaScript 같은 헷갈리는 짝 때문에 자동 승인은 두지 않음</w:t>
-            </w:r>
-          </w:p>
-        </w:tc>
-        <w:tc>
-          <w:tcPr>
-            <w:tcW w:w="2215" w:type="dxa"/>
-          </w:tcPr>
-          <w:p>
-            <w:pPr>
-              <w:pStyle w:val="TWCell"/>
-            </w:pPr>
-            <w:r>
-              <w:rPr>
-                <w:sz w:val="17"/>
-                <w:szCs w:val="17"/>
-              </w:rPr>
-              <w:t xml:space="preserve">후보 3개 중 관리자 승인</w:t>
-            </w:r>
-          </w:p>
-        </w:tc>
-      </w:tr>
-      <w:tr>
-        <w:trPr>
-          <w:cantSplit/>
-        </w:trPr>
-        <w:tc>
-          <w:tcPr>
-            <w:tcW w:w="1342" w:type="dxa"/>
-          </w:tcPr>
-          <w:p>
-            <w:pPr>
-              <w:pStyle w:val="TWCell"/>
-            </w:pPr>
-            <w:r>
-              <w:rPr>
-                <w:sz w:val="17"/>
-                <w:szCs w:val="17"/>
-              </w:rPr>
-              <w:t xml:space="preserve">소명 글 방식</w:t>
-            </w:r>
-          </w:p>
-        </w:tc>
-        <w:tc>
-          <w:tcPr>
-            <w:tcW w:w="2379" w:type="dxa"/>
-          </w:tcPr>
-          <w:p>
-            <w:pPr>
-              <w:pStyle w:val="TWCell"/>
-            </w:pPr>
-            <w:r>
-              <w:rPr>
-                <w:sz w:val="17"/>
-                <w:szCs w:val="17"/>
-              </w:rPr>
-              <w:t xml:space="preserve">정해진 틀(템플릿) · GraphRAG</w:t>
-            </w:r>
-          </w:p>
-        </w:tc>
-        <w:tc>
-          <w:tcPr>
-            <w:tcW w:w="4379" w:type="dxa"/>
-          </w:tcPr>
-          <w:p>
-            <w:pPr>
-              <w:pStyle w:val="TWCell"/>
-            </w:pPr>
-            <w:r>
-              <w:rPr>
-                <w:sz w:val="17"/>
-                <w:szCs w:val="17"/>
-              </w:rPr>
-              <w:t xml:space="preserve">근거 오류는 둘 다 0, 읽기 쉬운 쪽으로 — 템플릿은 실패 시 대체 글로 유지</w:t>
-            </w:r>
-          </w:p>
-        </w:tc>
-        <w:tc>
-          <w:tcPr>
-            <w:tcW w:w="2215" w:type="dxa"/>
-          </w:tcPr>
-          <w:p>
-            <w:pPr>
-              <w:pStyle w:val="TWCell"/>
-            </w:pPr>
-            <w:r>
-              <w:rPr>
-                <w:sz w:val="17"/>
-                <w:szCs w:val="17"/>
-              </w:rPr>
-              <w:t xml:space="preserve">GraphRAG</w:t>
-            </w:r>
-          </w:p>
-        </w:tc>
-      </w:tr>
-      <w:tr>
-        <w:trPr>
-          <w:cantSplit/>
-        </w:trPr>
-        <w:tc>
-          <w:tcPr>
-            <w:tcW w:w="1342" w:type="dxa"/>
-          </w:tcPr>
-          <w:p>
-            <w:pPr>
-              <w:pStyle w:val="TWCell"/>
-            </w:pPr>
-            <w:r>
-              <w:rPr>
-                <w:sz w:val="17"/>
-                <w:szCs w:val="17"/>
-              </w:rPr>
-              <w:t xml:space="preserve">숙련도 표현</w:t>
-            </w:r>
-          </w:p>
-        </w:tc>
-        <w:tc>
-          <w:tcPr>
-            <w:tcW w:w="2379" w:type="dxa"/>
-          </w:tcPr>
-          <w:p>
-            <w:pPr>
-              <w:pStyle w:val="TWCell"/>
-            </w:pPr>
-            <w:r>
-              <w:rPr>
-                <w:sz w:val="17"/>
-                <w:szCs w:val="17"/>
-              </w:rPr>
-              <w:t xml:space="preserve">경력 개월 비율 직접 사용</w:t>
-            </w:r>
-          </w:p>
-        </w:tc>
-        <w:tc>
-          <w:tcPr>
-            <w:tcW w:w="4379" w:type="dxa"/>
-          </w:tcPr>
-          <w:p>
-            <w:pPr>
-              <w:pStyle w:val="TWCell"/>
-            </w:pPr>
-            <w:r>
-              <w:rPr>
-                <w:sz w:val="17"/>
-                <w:szCs w:val="17"/>
-              </w:rPr>
-              <w:t xml:space="preserve">가상 데이터로는 우열을 가릴 수 없고 바꾸는 비용이 큼</w:t>
-            </w:r>
-          </w:p>
-        </w:tc>
-        <w:tc>
-          <w:tcPr>
-            <w:tcW w:w="2215" w:type="dxa"/>
-          </w:tcPr>
-          <w:p>
-            <w:pPr>
-              <w:pStyle w:val="TWCell"/>
-            </w:pPr>
-            <w:r>
-              <w:rPr>
-                <w:sz w:val="17"/>
-                <w:szCs w:val="17"/>
-              </w:rPr>
-              <w:t xml:space="preserve">대리 레벨 유지</w:t>
-            </w:r>
-          </w:p>
-        </w:tc>
-      </w:tr>
-      <w:tr>
-        <w:trPr>
-          <w:cantSplit/>
-        </w:trPr>
-        <w:tc>
-          <w:tcPr>
-            <w:tcW w:w="1342" w:type="dxa"/>
-          </w:tcPr>
-          <w:p>
-            <w:pPr>
-              <w:pStyle w:val="TWCell"/>
-            </w:pPr>
-            <w:r>
-              <w:rPr>
-                <w:sz w:val="17"/>
-                <w:szCs w:val="17"/>
-              </w:rPr>
-              <w:t xml:space="preserve">자리와 다른 등급을 넣을 때</w:t>
-            </w:r>
-          </w:p>
-        </w:tc>
-        <w:tc>
-          <w:tcPr>
-            <w:tcW w:w="2379" w:type="dxa"/>
-          </w:tcPr>
-          <w:p>
-            <w:pPr>
-              <w:pStyle w:val="TWCell"/>
-            </w:pPr>
-            <w:r>
-              <w:rPr>
-                <w:sz w:val="17"/>
-                <w:szCs w:val="17"/>
-              </w:rPr>
-              <w:t xml:space="preserve">확정 막기 · 정원을 말없이 늘리기 · 대체 + 사유</w:t>
-            </w:r>
-          </w:p>
-        </w:tc>
-        <w:tc>
-          <w:tcPr>
-            <w:tcW w:w="4379" w:type="dxa"/>
-          </w:tcPr>
-          <w:p>
-            <w:pPr>
-              <w:pStyle w:val="TWCell"/>
-            </w:pPr>
-            <w:r>
-              <w:rPr>
-                <w:sz w:val="17"/>
-                <w:szCs w:val="17"/>
-              </w:rPr>
-              <w:t xml:space="preserve">막으면 현장 관행(중급 대신 초급, 중급이 없어 고급)을 못 담고, 말없이 늘리면 부족 신호와 판단 근거가 사라진다</w:t>
-            </w:r>
-          </w:p>
-        </w:tc>
-        <w:tc>
-          <w:tcPr>
-            <w:tcW w:w="2215" w:type="dxa"/>
-          </w:tcPr>
-          <w:p>
-            <w:pPr>
-              <w:pStyle w:val="TWCell"/>
-            </w:pPr>
-            <w:r>
-              <w:rPr>
-                <w:sz w:val="17"/>
-                <w:szCs w:val="17"/>
-              </w:rPr>
-              <w:t xml:space="preserve">사용자 결정: 위·아래 허용, 사유 필수, 넘친 예산 증액</w:t>
-            </w:r>
-          </w:p>
-        </w:tc>
-      </w:tr>
-      <w:tr>
-        <w:trPr>
-          <w:cantSplit/>
-        </w:trPr>
-        <w:tc>
-          <w:tcPr>
-            <w:tcW w:w="1342" w:type="dxa"/>
-          </w:tcPr>
-          <w:p>
-            <w:pPr>
-              <w:pStyle w:val="TWCell"/>
-            </w:pPr>
-            <w:r>
-              <w:rPr>
-                <w:sz w:val="17"/>
-                <w:szCs w:val="17"/>
-              </w:rPr>
-              <w:t xml:space="preserve">확정 무르기</w:t>
-            </w:r>
-          </w:p>
-        </w:tc>
-        <w:tc>
-          <w:tcPr>
-            <w:tcW w:w="2379" w:type="dxa"/>
-          </w:tcPr>
-          <w:p>
-            <w:pPr>
-              <w:pStyle w:val="TWCell"/>
-            </w:pPr>
-            <w:r>
-              <w:rPr>
-                <w:sz w:val="17"/>
-                <w:szCs w:val="17"/>
-              </w:rPr>
-              <w:t xml:space="preserve">마지막 판부터 되돌리기만 · 그 확정 한 건만 취소</w:t>
-            </w:r>
-          </w:p>
-        </w:tc>
-        <w:tc>
-          <w:tcPr>
-            <w:tcW w:w="4379" w:type="dxa"/>
-          </w:tcPr>
-          <w:p>
-            <w:pPr>
-              <w:pStyle w:val="TWCell"/>
-            </w:pPr>
-            <w:r>
-              <w:rPr>
-                <w:sz w:val="17"/>
-                <w:szCs w:val="17"/>
-              </w:rPr>
-              <w:t xml:space="preserve">되돌리기만 있으면 그 뒤에 한 다른 확정까지 함께 사라진다</w:t>
-            </w:r>
-          </w:p>
-        </w:tc>
-        <w:tc>
-          <w:tcPr>
-            <w:tcW w:w="2215" w:type="dxa"/>
-          </w:tcPr>
-          <w:p>
-            <w:pPr>
-              <w:pStyle w:val="TWCell"/>
-            </w:pPr>
-            <w:r>
-              <w:rPr>
-                <w:sz w:val="17"/>
-                <w:szCs w:val="17"/>
-              </w:rPr>
-              <w:t xml:space="preserve">둘 다(취소는 지금 판 위에서 거꾸로 적용)</w:t>
-            </w:r>
-          </w:p>
-        </w:tc>
-      </w:tr>
-      <w:tr>
-        <w:trPr>
-          <w:cantSplit/>
-        </w:trPr>
-        <w:tc>
-          <w:tcPr>
-            <w:tcW w:w="1342" w:type="dxa"/>
-          </w:tcPr>
-          <w:p>
-            <w:pPr>
-              <w:pStyle w:val="TWCell"/>
-            </w:pPr>
-            <w:r>
-              <w:rPr>
-                <w:sz w:val="17"/>
-                <w:szCs w:val="17"/>
-              </w:rPr>
-              <w:t xml:space="preserve">What-if의 기준</w:t>
-            </w:r>
-          </w:p>
-        </w:tc>
-        <w:tc>
-          <w:tcPr>
-            <w:tcW w:w="2379" w:type="dxa"/>
-          </w:tcPr>
-          <w:p>
-            <w:pPr>
-              <w:pStyle w:val="TWCell"/>
-            </w:pPr>
-            <w:r>
-              <w:rPr>
-                <w:sz w:val="17"/>
-                <w:szCs w:val="17"/>
-              </w:rPr>
-              <w:t xml:space="preserve">계산한 안 A~D · 지금 실제 배치</w:t>
-            </w:r>
-          </w:p>
-        </w:tc>
-        <w:tc>
-          <w:tcPr>
-            <w:tcW w:w="4379" w:type="dxa"/>
-          </w:tcPr>
-          <w:p>
-            <w:pPr>
-              <w:pStyle w:val="TWCell"/>
-            </w:pPr>
-            <w:r>
-              <w:rPr>
-                <w:sz w:val="17"/>
-                <w:szCs w:val="17"/>
-              </w:rPr>
-              <w:t xml:space="preserve">부서장의 질문은 "지금 배치에서 이렇게 바꾸면"이다</w:t>
-            </w:r>
-          </w:p>
-        </w:tc>
-        <w:tc>
-          <w:tcPr>
-            <w:tcW w:w="2215" w:type="dxa"/>
-          </w:tcPr>
-          <w:p>
-            <w:pPr>
-              <w:pStyle w:val="TWCell"/>
-            </w:pPr>
-            <w:r>
-              <w:rPr>
-                <w:sz w:val="17"/>
-                <w:szCs w:val="17"/>
-              </w:rPr>
-              <w:t xml:space="preserve">연간 계획 ②와 분리</w:t>
             </w:r>
           </w:p>
         </w:tc>
@@ -11573,148 +10598,81 @@
         <w:t xml:space="preserve">9. 한계와 다음 단계</w:t>
       </w:r>
     </w:p>
-    <w:tbl>
-      <w:tblPr>
-        <w:tblStyle w:val="TWTable"/>
-        <w:tblW w:w="10318" w:type="dxa"/>
-        <w:tblBorders>
-          <w:top w:val="single" w:sz="4" w:space="0" w:color="E9C98F"/>
-          <w:left w:val="single" w:sz="4" w:space="0" w:color="E9C98F"/>
-          <w:bottom w:val="single" w:sz="4" w:space="0" w:color="E9C98F"/>
-          <w:right w:val="single" w:sz="4" w:space="0" w:color="E9C98F"/>
-          <w:insideH w:val="single" w:sz="4" w:space="0" w:color="E9C98F"/>
-          <w:insideV w:val="single" w:sz="4" w:space="0" w:color="E9C98F"/>
-        </w:tblBorders>
-        <w:tblLayout w:type="fixed"/>
-        <w:tblCellMar>
-          <w:top w:w="40" w:type="dxa"/>
-          <w:left w:w="90" w:type="dxa"/>
-          <w:bottom w:w="40" w:type="dxa"/>
-          <w:right w:w="90" w:type="dxa"/>
-        </w:tblCellMar>
-      </w:tblPr>
-      <w:tblGrid>
-        <w:gridCol w:w="10318"/>
-      </w:tblGrid>
-      <w:tr>
-        <w:trPr>
-          <w:cantSplit/>
-        </w:trPr>
-        <w:tc>
-          <w:tcPr>
-            <w:shd w:val="clear" w:color="auto" w:fill="FFF8E6"/>
-          </w:tcPr>
-          <w:p>
-            <w:pPr>
-              <w:pStyle w:val="TWListCell"/>
-              <w:numPr>
-                <w:ilvl w:val="0"/>
-                <w:numId w:val="1"/>
-              </w:numPr>
-            </w:pPr>
-            <w:r>
-              <w:rPr>
-                <w:b/>
-                <w:bCs/>
-                <w:sz w:val="18"/>
-                <w:szCs w:val="18"/>
-              </w:rPr>
-              <w:t xml:space="preserve">사업 효과는 실제 성과 자료로 확인하기 전이다</w:t>
-            </w:r>
-            <w:r>
-              <w:rPr>
-                <w:sz w:val="18"/>
-                <w:szCs w:val="18"/>
-              </w:rPr>
-              <w:t xml:space="preserve">(</w:t>
-            </w:r>
-            <w:r>
-              <w:rPr>
-                <w:rFonts w:ascii="Consolas" w:hAnsi="Consolas" w:eastAsia="Malgun Gothic" w:cs="Consolas"/>
-                <w:sz w:val="18"/>
-                <w:szCs w:val="18"/>
-              </w:rPr>
-              <w:t xml:space="preserve">NOT_CALIBRATED</w:t>
-            </w:r>
-            <w:r>
-              <w:rPr>
-                <w:sz w:val="18"/>
-                <w:szCs w:val="18"/>
-              </w:rPr>
-              <w:t xml:space="preserve">) — 모든 수치는 가상 데이터와 설계한 점수표 안의 값이고, 실제 도입 시 섀도 운영(8.4)으로 확인한다.</w:t>
-            </w:r>
-          </w:p>
-          <w:p>
-            <w:pPr>
-              <w:pStyle w:val="TWListCell"/>
-              <w:numPr>
-                <w:ilvl w:val="0"/>
-                <w:numId w:val="1"/>
-              </w:numPr>
-            </w:pPr>
-            <w:r>
-              <w:rPr>
-                <w:sz w:val="18"/>
-                <w:szCs w:val="18"/>
-              </w:rPr>
-              <w:t xml:space="preserve">점수 계수(협업 0.3·익숙한 사이 0.2·하위 기술 70%·경력 레벨 경계)는 설계값이고 평가 글도 가상 글이다 — 실제 성과·실제 글로 다시 잰다(계산 버전과 평가기를 분리해 둠).</w:t>
-            </w:r>
-          </w:p>
-          <w:p>
-            <w:pPr>
-              <w:pStyle w:val="TWListCell"/>
-              <w:numPr>
-                <w:ilvl w:val="0"/>
-                <w:numId w:val="1"/>
-              </w:numPr>
-            </w:pPr>
-            <w:r>
-              <w:rPr>
-                <w:sz w:val="18"/>
-                <w:szCs w:val="18"/>
-              </w:rPr>
-              <w:t xml:space="preserve">등급 대체·"메우지 않음"은 확정 때 정원 표를 바꾸는 손 편성 규칙이다(자동 계산은 빈자리로 보인다). 정원이 사업 전체 기간 단위라 몇 달만 비워 두기는 아직 없다.</w:t>
-            </w:r>
-          </w:p>
-          <w:p>
-            <w:pPr>
-              <w:pStyle w:val="TWListCell"/>
-              <w:numPr>
-                <w:ilvl w:val="0"/>
-                <w:numId w:val="1"/>
-              </w:numPr>
-            </w:pPr>
-            <w:r>
-              <w:rPr>
-                <w:sz w:val="18"/>
-                <w:szCs w:val="18"/>
-              </w:rPr>
-              <w:t xml:space="preserve">AI 전후 측정은 발주 자료(실제 공공 10편)를 빼면 가상 데이터·문장이고(요청 48문장은 구간이 넓다), 8.3의 시간은 추정이다. 발주 자료의 사업 정보 채우기는 AI가 앞 4만 자만 읽고(사업명·기간·예산은 앞머리에 있다), 필요 기술 읽기·요약은 20만 자까지 나눠 읽는다. 요약 검사는 근거 없는 항목을 거를 뿐 모두 막지는 못한다. 월 예산 환산(1점 = 1만 원)은 가정이다.</w:t>
-            </w:r>
-          </w:p>
-          <w:p>
-            <w:pPr>
-              <w:pStyle w:val="TWListCell"/>
-              <w:numPr>
-                <w:ilvl w:val="0"/>
-                <w:numId w:val="1"/>
-              </w:numPr>
-            </w:pPr>
-            <w:r>
-              <w:rPr>
-                <w:sz w:val="18"/>
-                <w:szCs w:val="18"/>
-              </w:rPr>
-              <w:t xml:space="preserve">운영 기능은 시제품 수준(관리자 하나·단일 서버)이고, 전일 투입은 가용률 0 또는 1을 전제로 한다.</w:t>
-            </w:r>
-          </w:p>
-        </w:tc>
-      </w:tr>
-    </w:tbl>
-    <w:p>
-      <w:pPr>
-        <w:pStyle w:val="TWAfterTable"/>
-      </w:pPr>
+    <w:p>
+      <w:pPr>
+        <w:pStyle w:val="TWList"/>
+        <w:numPr>
+          <w:ilvl w:val="0"/>
+          <w:numId w:val="1"/>
+        </w:numPr>
+      </w:pPr>
+      <w:r>
+        <w:rPr>
+          <w:b/>
+          <w:bCs/>
+        </w:rPr>
+        <w:t xml:space="preserve">사업 효과는 실제 성과 자료로 확인하기 전이다</w:t>
+      </w:r>
+      <w:r>
+        <w:t xml:space="preserve">(</w:t>
+      </w:r>
+      <w:r>
+        <w:rPr>
+          <w:rFonts w:ascii="Consolas" w:hAnsi="Consolas" w:eastAsia="Malgun Gothic" w:cs="Consolas"/>
+        </w:rPr>
+        <w:t xml:space="preserve">NOT_CALIBRATED</w:t>
+      </w:r>
+      <w:r>
+        <w:t xml:space="preserve">) — 모든 수치는 가상 데이터와 설계한 점수표 안의 값이고, 실제 도입 시 섀도 운영(8.4)으로 확인한다.</w:t>
+      </w:r>
+    </w:p>
+    <w:p>
+      <w:pPr>
+        <w:pStyle w:val="TWList"/>
+        <w:numPr>
+          <w:ilvl w:val="0"/>
+          <w:numId w:val="1"/>
+        </w:numPr>
+      </w:pPr>
+      <w:r>
+        <w:t xml:space="preserve">점수 계수(협업 0.3·익숙한 사이 0.2·하위 기술 70%·경력 레벨 경계)는 설계값이고 평가 글도 가상 글이다 — 실제 성과·실제 글로 다시 잰다(계산 버전과 평가기를 분리해 둠).</w:t>
+      </w:r>
+    </w:p>
+    <w:p>
+      <w:pPr>
+        <w:pStyle w:val="TWList"/>
+        <w:numPr>
+          <w:ilvl w:val="0"/>
+          <w:numId w:val="1"/>
+        </w:numPr>
+      </w:pPr>
+      <w:r>
+        <w:t xml:space="preserve">등급 대체·"메우지 않음"은 확정 때 정원 표를 바꾸는 손 편성 규칙이다(자동 계산은 빈자리로 보인다). 정원이 사업 전체 기간 단위라 몇 달만 비워 두기는 아직 없다.</w:t>
+      </w:r>
+    </w:p>
+    <w:p>
+      <w:pPr>
+        <w:pStyle w:val="TWList"/>
+        <w:numPr>
+          <w:ilvl w:val="0"/>
+          <w:numId w:val="1"/>
+        </w:numPr>
+      </w:pPr>
+      <w:r>
+        <w:t xml:space="preserve">AI 전후 측정은 발주 자료(실제 공공 10편)를 빼면 가상 데이터·문장이고(요청 48문장은 구간이 넓다), 8.3의 시간은 추정이다. 발주 자료의 사업 정보 채우기는 AI가 앞 4만 자만 읽고(사업명·기간·예산은 앞머리에 있다), 필요 기술 읽기·요약은 20만 자까지 나눠 읽는다. 요약 검사는 근거 없는 항목을 거를 뿐 모두 막지는 못한다. 월 예산 환산(1점 = 1만 원)은 가정이다.</w:t>
+      </w:r>
+    </w:p>
+    <w:p>
+      <w:pPr>
+        <w:pStyle w:val="TWList"/>
+        <w:numPr>
+          <w:ilvl w:val="0"/>
+          <w:numId w:val="1"/>
+        </w:numPr>
+      </w:pPr>
+      <w:r>
+        <w:t xml:space="preserve">운영 기능은 시제품 수준(관리자 하나·단일 서버)이고, 전일 투입은 가용률 0 또는 1을 전제로 한다.</w:t>
+      </w:r>
     </w:p>
     <w:sectPr>
       <w:pgSz w:w="11906" w:h="16838"/>

</xml_diff>

<commit_message>
docs: report follow-ups -- 1.6 "added beyond the proposal" row renamed and reordered as asked (annual 12-month planning, in-house GLM comparison, HR API sync, RFP reading, operating K comparison, emergency staffing first; independent verification last), 2.1 leads with the nightly batch in bold and 6.3 gains a nightly-batch bullet (window, no AI, standby list -> annual/K/day requests at 10x the day limit, unsolved batches not saved), 3.1 shows seats and the score breakdown (skill + collab - penalty; skill per seat 78~81%) so the numbers can be read against a scale; rehearsal/plan_coverage.py now builds with the demo builder (bundled judgments, server version -- evaluator totals match the stored plan A objectives) and records the breakdown; 9 pages, PDF and Word rebuilt
Co-Authored-By: Claude Fable 5.1 <noreply@anthropic.com>
Claude-Session: https://claude.ai/code/session_01XiJnTNFVeV2BokGGcyeQom
</commit_message>
<xml_diff>
--- a/outputs/final-report.docx
+++ b/outputs/final-report.docx
@@ -1599,7 +1599,7 @@
                 <w:sz w:val="17"/>
                 <w:szCs w:val="17"/>
               </w:rPr>
-              <w:t xml:space="preserve">설계서에 없던 것</w:t>
+              <w:t xml:space="preserve">설계서엔 없으나 추가 개발한 것</w:t>
             </w:r>
           </w:p>
         </w:tc>
@@ -1616,7 +1616,7 @@
                 <w:sz w:val="17"/>
                 <w:szCs w:val="17"/>
               </w:rPr>
-              <w:t xml:space="preserve">독립 검증·이론상 최대치, 운영 중 K 비교·긴급 투입, 발주 자료에서 필요 기술·사업 정보 읽기, 사내 GLM 비교, 연간 12개월, 인사 시스템 API 받기</w:t>
+              <w:t xml:space="preserve">연간 12개월 인력 배치 계산, (AI) 사내 GLM 모델과 비교, 인사 시스템 API 받기, (AI) 발주 자료에서 필요 기술·사업 정보 읽기, 운영 중 K 비교, 긴급 투입; 그리고 계산 결과의 독립 검증·이론상 최대치</w:t>
             </w:r>
           </w:p>
         </w:tc>
@@ -1633,7 +1633,7 @@
                 <w:sz w:val="17"/>
                 <w:szCs w:val="17"/>
               </w:rPr>
-              <w:t xml:space="preserve">1.3 · 3.2 · 3.3</w:t>
+              <w:t xml:space="preserve">2.1 · 3장 · 5.1 · 6.6~6.7</w:t>
             </w:r>
           </w:p>
         </w:tc>
@@ -2381,10 +2381,19 @@
             </w:pPr>
             <w:r>
               <w:rPr>
-                <w:sz w:val="17"/>
-                <w:szCs w:val="17"/>
-              </w:rPr>
-              <w:t xml:space="preserve">안이 하나 풀릴 때마다 바로 화면에 표시, 계산 중 멈추기 가능. 밤사이 AI 없이 긴급 대기 명단·연간 계획·신규 사업 비교를 미리 계산. 관리자 설정(계산 시간·익숙한 쌍 기준 등)</w:t>
+                <w:b/>
+                <w:bCs/>
+                <w:sz w:val="17"/>
+                <w:szCs w:val="17"/>
+              </w:rPr>
+              <w:t xml:space="preserve">야간 배치</w:t>
+            </w:r>
+            <w:r>
+              <w:rPr>
+                <w:sz w:val="17"/>
+                <w:szCs w:val="17"/>
+              </w:rPr>
+              <w:t xml:space="preserve"> — 관리자가 퇴근한 매일 밤(기본 00~05시) 서버가 AI 없이 지금 데이터의 긴급 대기 명단(진행 사업마다 상위 5명)·연간 계획 안 A~D·신규 사업 K 비교·낮 요청 중 결과가 없는 계산을 낮보다 긴 시간 한도로 미리 풀어 두어 아침에 열면 바로 나온다(6.3). 안이 하나 풀릴 때마다 바로 화면에 표시, 계산 중 멈추기 가능. 관리자 설정(계산 시간·익숙한 쌍 기준 등)</w:t>
             </w:r>
           </w:p>
         </w:tc>
@@ -2510,14 +2519,15 @@
         </w:tblCellMar>
       </w:tblPr>
       <w:tblGrid>
-        <w:gridCol w:w="1260"/>
-        <w:gridCol w:w="560"/>
-        <w:gridCol w:w="988"/>
-        <w:gridCol w:w="1010"/>
-        <w:gridCol w:w="1277"/>
-        <w:gridCol w:w="1201"/>
-        <w:gridCol w:w="923"/>
-        <w:gridCol w:w="3095"/>
+        <w:gridCol w:w="1209"/>
+        <w:gridCol w:w="537"/>
+        <w:gridCol w:w="537"/>
+        <w:gridCol w:w="710"/>
+        <w:gridCol w:w="1698"/>
+        <w:gridCol w:w="1056"/>
+        <w:gridCol w:w="1153"/>
+        <w:gridCol w:w="628"/>
+        <w:gridCol w:w="2785"/>
       </w:tblGrid>
       <w:tr>
         <w:trPr>
@@ -2526,7 +2536,7 @@
         </w:trPr>
         <w:tc>
           <w:tcPr>
-            <w:tcW w:w="1260" w:type="dxa"/>
+            <w:tcW w:w="1209" w:type="dxa"/>
             <w:shd w:val="clear" w:color="auto" w:fill="F1F3F5"/>
           </w:tcPr>
           <w:p>
@@ -2546,7 +2556,7 @@
         </w:tc>
         <w:tc>
           <w:tcPr>
-            <w:tcW w:w="560" w:type="dxa"/>
+            <w:tcW w:w="537" w:type="dxa"/>
             <w:shd w:val="clear" w:color="auto" w:fill="F1F3F5"/>
           </w:tcPr>
           <w:p>
@@ -2567,7 +2577,7 @@
         </w:tc>
         <w:tc>
           <w:tcPr>
-            <w:tcW w:w="988" w:type="dxa"/>
+            <w:tcW w:w="537" w:type="dxa"/>
             <w:shd w:val="clear" w:color="auto" w:fill="F1F3F5"/>
           </w:tcPr>
           <w:p>
@@ -2582,13 +2592,34 @@
                 <w:sz w:val="17"/>
                 <w:szCs w:val="17"/>
               </w:rPr>
+              <w:t xml:space="preserve">자리</w:t>
+            </w:r>
+          </w:p>
+        </w:tc>
+        <w:tc>
+          <w:tcPr>
+            <w:tcW w:w="710" w:type="dxa"/>
+            <w:shd w:val="clear" w:color="auto" w:fill="F1F3F5"/>
+          </w:tcPr>
+          <w:p>
+            <w:pPr>
+              <w:pStyle w:val="TWCell"/>
+              <w:jc w:val="right"/>
+            </w:pPr>
+            <w:r>
+              <w:rPr>
+                <w:b/>
+                <w:bCs/>
+                <w:sz w:val="17"/>
+                <w:szCs w:val="17"/>
+              </w:rPr>
               <w:t xml:space="preserve">안마다 시간 한도</w:t>
             </w:r>
           </w:p>
         </w:tc>
         <w:tc>
           <w:tcPr>
-            <w:tcW w:w="1010" w:type="dxa"/>
+            <w:tcW w:w="1698" w:type="dxa"/>
             <w:shd w:val="clear" w:color="auto" w:fill="F1F3F5"/>
           </w:tcPr>
           <w:p>
@@ -2605,11 +2636,29 @@
               </w:rPr>
               <w:t xml:space="preserve">최선안 배치 점수</w:t>
             </w:r>
-          </w:p>
-        </w:tc>
-        <w:tc>
-          <w:tcPr>
-            <w:tcW w:w="1277" w:type="dxa"/>
+            <w:r>
+              <w:rPr>
+                <w:b/>
+                <w:bCs/>
+                <w:sz w:val="17"/>
+                <w:szCs w:val="17"/>
+              </w:rPr>
+              <w:br/>
+            </w:r>
+            <w:r>
+              <w:rPr>
+                <w:b/>
+                <w:bCs/>
+                <w:sz w:val="17"/>
+                <w:szCs w:val="17"/>
+              </w:rPr>
+              <w:t xml:space="preserve">(기술 + 협업 − 감점)</w:t>
+            </w:r>
+          </w:p>
+        </w:tc>
+        <w:tc>
+          <w:tcPr>
+            <w:tcW w:w="1056" w:type="dxa"/>
             <w:shd w:val="clear" w:color="auto" w:fill="F1F3F5"/>
           </w:tcPr>
           <w:p>
@@ -2648,7 +2697,7 @@
         </w:tc>
         <w:tc>
           <w:tcPr>
-            <w:tcW w:w="1201" w:type="dxa"/>
+            <w:tcW w:w="1153" w:type="dxa"/>
             <w:shd w:val="clear" w:color="auto" w:fill="F1F3F5"/>
           </w:tcPr>
           <w:p>
@@ -2669,7 +2718,7 @@
         </w:tc>
         <w:tc>
           <w:tcPr>
-            <w:tcW w:w="923" w:type="dxa"/>
+            <w:tcW w:w="628" w:type="dxa"/>
             <w:shd w:val="clear" w:color="auto" w:fill="F1F3F5"/>
           </w:tcPr>
           <w:p>
@@ -2690,7 +2739,7 @@
         </w:tc>
         <w:tc>
           <w:tcPr>
-            <w:tcW w:w="3095" w:type="dxa"/>
+            <w:tcW w:w="2785" w:type="dxa"/>
             <w:shd w:val="clear" w:color="auto" w:fill="F1F3F5"/>
           </w:tcPr>
           <w:p>
@@ -2715,7 +2764,7 @@
         </w:trPr>
         <w:tc>
           <w:tcPr>
-            <w:tcW w:w="1260" w:type="dxa"/>
+            <w:tcW w:w="1209" w:type="dxa"/>
           </w:tcPr>
           <w:p>
             <w:pPr>
@@ -2732,7 +2781,7 @@
         </w:tc>
         <w:tc>
           <w:tcPr>
-            <w:tcW w:w="560" w:type="dxa"/>
+            <w:tcW w:w="537" w:type="dxa"/>
           </w:tcPr>
           <w:p>
             <w:pPr>
@@ -2750,7 +2799,7 @@
         </w:tc>
         <w:tc>
           <w:tcPr>
-            <w:tcW w:w="988" w:type="dxa"/>
+            <w:tcW w:w="537" w:type="dxa"/>
           </w:tcPr>
           <w:p>
             <w:pPr>
@@ -2762,13 +2811,31 @@
                 <w:sz w:val="17"/>
                 <w:szCs w:val="17"/>
               </w:rPr>
+              <w:t xml:space="preserve">67</w:t>
+            </w:r>
+          </w:p>
+        </w:tc>
+        <w:tc>
+          <w:tcPr>
+            <w:tcW w:w="710" w:type="dxa"/>
+          </w:tcPr>
+          <w:p>
+            <w:pPr>
+              <w:pStyle w:val="TWCell"/>
+              <w:jc w:val="right"/>
+            </w:pPr>
+            <w:r>
+              <w:rPr>
+                <w:sz w:val="17"/>
+                <w:szCs w:val="17"/>
+              </w:rPr>
               <w:t xml:space="preserve">30초</w:t>
             </w:r>
           </w:p>
         </w:tc>
         <w:tc>
           <w:tcPr>
-            <w:tcW w:w="1010" w:type="dxa"/>
+            <w:tcW w:w="1698" w:type="dxa"/>
           </w:tcPr>
           <w:p>
             <w:pPr>
@@ -2777,16 +2844,32 @@
             </w:pPr>
             <w:r>
               <w:rPr>
+                <w:b/>
+                <w:bCs/>
                 <w:sz w:val="17"/>
                 <w:szCs w:val="17"/>
               </w:rPr>
               <w:t xml:space="preserve">59.47</w:t>
             </w:r>
-          </w:p>
-        </w:tc>
-        <w:tc>
-          <w:tcPr>
-            <w:tcW w:w="1277" w:type="dxa"/>
+            <w:r>
+              <w:rPr>
+                <w:sz w:val="17"/>
+                <w:szCs w:val="17"/>
+              </w:rPr>
+              <w:br/>
+            </w:r>
+            <w:r>
+              <w:rPr>
+                <w:sz w:val="17"/>
+                <w:szCs w:val="17"/>
+              </w:rPr>
+              <w:t xml:space="preserve">52.4 + 7.7 − 0.6</w:t>
+            </w:r>
+          </w:p>
+        </w:tc>
+        <w:tc>
+          <w:tcPr>
+            <w:tcW w:w="1056" w:type="dxa"/>
           </w:tcPr>
           <w:p>
             <w:pPr>
@@ -2804,7 +2887,7 @@
         </w:tc>
         <w:tc>
           <w:tcPr>
-            <w:tcW w:w="1201" w:type="dxa"/>
+            <w:tcW w:w="1153" w:type="dxa"/>
           </w:tcPr>
           <w:p>
             <w:pPr>
@@ -2822,7 +2905,7 @@
         </w:tc>
         <w:tc>
           <w:tcPr>
-            <w:tcW w:w="923" w:type="dxa"/>
+            <w:tcW w:w="628" w:type="dxa"/>
           </w:tcPr>
           <w:p>
             <w:pPr>
@@ -2840,7 +2923,7 @@
         </w:tc>
         <w:tc>
           <w:tcPr>
-            <w:tcW w:w="3095" w:type="dxa"/>
+            <w:tcW w:w="2785" w:type="dxa"/>
           </w:tcPr>
           <w:p>
             <w:pPr>
@@ -2878,7 +2961,7 @@
         </w:trPr>
         <w:tc>
           <w:tcPr>
-            <w:tcW w:w="1260" w:type="dxa"/>
+            <w:tcW w:w="1209" w:type="dxa"/>
           </w:tcPr>
           <w:p>
             <w:pPr>
@@ -2895,7 +2978,7 @@
         </w:tc>
         <w:tc>
           <w:tcPr>
-            <w:tcW w:w="560" w:type="dxa"/>
+            <w:tcW w:w="537" w:type="dxa"/>
           </w:tcPr>
           <w:p>
             <w:pPr>
@@ -2913,7 +2996,7 @@
         </w:tc>
         <w:tc>
           <w:tcPr>
-            <w:tcW w:w="988" w:type="dxa"/>
+            <w:tcW w:w="537" w:type="dxa"/>
           </w:tcPr>
           <w:p>
             <w:pPr>
@@ -2925,13 +3008,31 @@
                 <w:sz w:val="17"/>
                 <w:szCs w:val="17"/>
               </w:rPr>
+              <w:t xml:space="preserve">167</w:t>
+            </w:r>
+          </w:p>
+        </w:tc>
+        <w:tc>
+          <w:tcPr>
+            <w:tcW w:w="710" w:type="dxa"/>
+          </w:tcPr>
+          <w:p>
+            <w:pPr>
+              <w:pStyle w:val="TWCell"/>
+              <w:jc w:val="right"/>
+            </w:pPr>
+            <w:r>
+              <w:rPr>
+                <w:sz w:val="17"/>
+                <w:szCs w:val="17"/>
+              </w:rPr>
               <w:t xml:space="preserve">60초</w:t>
             </w:r>
           </w:p>
         </w:tc>
         <w:tc>
           <w:tcPr>
-            <w:tcW w:w="1010" w:type="dxa"/>
+            <w:tcW w:w="1698" w:type="dxa"/>
           </w:tcPr>
           <w:p>
             <w:pPr>
@@ -2940,16 +3041,32 @@
             </w:pPr>
             <w:r>
               <w:rPr>
+                <w:b/>
+                <w:bCs/>
                 <w:sz w:val="17"/>
                 <w:szCs w:val="17"/>
               </w:rPr>
               <w:t xml:space="preserve">151.43</w:t>
             </w:r>
-          </w:p>
-        </w:tc>
-        <w:tc>
-          <w:tcPr>
-            <w:tcW w:w="1277" w:type="dxa"/>
+            <w:r>
+              <w:rPr>
+                <w:sz w:val="17"/>
+                <w:szCs w:val="17"/>
+              </w:rPr>
+              <w:br/>
+            </w:r>
+            <w:r>
+              <w:rPr>
+                <w:sz w:val="17"/>
+                <w:szCs w:val="17"/>
+              </w:rPr>
+              <w:t xml:space="preserve">135.9 + 16.4 − 0.8</w:t>
+            </w:r>
+          </w:p>
+        </w:tc>
+        <w:tc>
+          <w:tcPr>
+            <w:tcW w:w="1056" w:type="dxa"/>
           </w:tcPr>
           <w:p>
             <w:pPr>
@@ -2967,7 +3084,7 @@
         </w:tc>
         <w:tc>
           <w:tcPr>
-            <w:tcW w:w="1201" w:type="dxa"/>
+            <w:tcW w:w="1153" w:type="dxa"/>
           </w:tcPr>
           <w:p>
             <w:pPr>
@@ -2985,7 +3102,7 @@
         </w:tc>
         <w:tc>
           <w:tcPr>
-            <w:tcW w:w="923" w:type="dxa"/>
+            <w:tcW w:w="628" w:type="dxa"/>
           </w:tcPr>
           <w:p>
             <w:pPr>
@@ -3003,7 +3120,7 @@
         </w:tc>
         <w:tc>
           <w:tcPr>
-            <w:tcW w:w="3095" w:type="dxa"/>
+            <w:tcW w:w="2785" w:type="dxa"/>
           </w:tcPr>
           <w:p>
             <w:pPr>
@@ -3041,7 +3158,7 @@
         </w:trPr>
         <w:tc>
           <w:tcPr>
-            <w:tcW w:w="1260" w:type="dxa"/>
+            <w:tcW w:w="1209" w:type="dxa"/>
           </w:tcPr>
           <w:p>
             <w:pPr>
@@ -3058,7 +3175,7 @@
         </w:tc>
         <w:tc>
           <w:tcPr>
-            <w:tcW w:w="560" w:type="dxa"/>
+            <w:tcW w:w="537" w:type="dxa"/>
           </w:tcPr>
           <w:p>
             <w:pPr>
@@ -3076,7 +3193,7 @@
         </w:tc>
         <w:tc>
           <w:tcPr>
-            <w:tcW w:w="988" w:type="dxa"/>
+            <w:tcW w:w="537" w:type="dxa"/>
           </w:tcPr>
           <w:p>
             <w:pPr>
@@ -3088,13 +3205,31 @@
                 <w:sz w:val="17"/>
                 <w:szCs w:val="17"/>
               </w:rPr>
+              <w:t xml:space="preserve">260</w:t>
+            </w:r>
+          </w:p>
+        </w:tc>
+        <w:tc>
+          <w:tcPr>
+            <w:tcW w:w="710" w:type="dxa"/>
+          </w:tcPr>
+          <w:p>
+            <w:pPr>
+              <w:pStyle w:val="TWCell"/>
+              <w:jc w:val="right"/>
+            </w:pPr>
+            <w:r>
+              <w:rPr>
+                <w:sz w:val="17"/>
+                <w:szCs w:val="17"/>
+              </w:rPr>
               <w:t xml:space="preserve">90초</w:t>
             </w:r>
           </w:p>
         </w:tc>
         <w:tc>
           <w:tcPr>
-            <w:tcW w:w="1010" w:type="dxa"/>
+            <w:tcW w:w="1698" w:type="dxa"/>
           </w:tcPr>
           <w:p>
             <w:pPr>
@@ -3103,16 +3238,32 @@
             </w:pPr>
             <w:r>
               <w:rPr>
+                <w:b/>
+                <w:bCs/>
                 <w:sz w:val="17"/>
                 <w:szCs w:val="17"/>
               </w:rPr>
               <w:t xml:space="preserve">228.10</w:t>
             </w:r>
-          </w:p>
-        </w:tc>
-        <w:tc>
-          <w:tcPr>
-            <w:tcW w:w="1277" w:type="dxa"/>
+            <w:r>
+              <w:rPr>
+                <w:sz w:val="17"/>
+                <w:szCs w:val="17"/>
+              </w:rPr>
+              <w:br/>
+            </w:r>
+            <w:r>
+              <w:rPr>
+                <w:sz w:val="17"/>
+                <w:szCs w:val="17"/>
+              </w:rPr>
+              <w:t xml:space="preserve">209.3 + 19.2 − 0.4</w:t>
+            </w:r>
+          </w:p>
+        </w:tc>
+        <w:tc>
+          <w:tcPr>
+            <w:tcW w:w="1056" w:type="dxa"/>
           </w:tcPr>
           <w:p>
             <w:pPr>
@@ -3130,7 +3281,7 @@
         </w:tc>
         <w:tc>
           <w:tcPr>
-            <w:tcW w:w="1201" w:type="dxa"/>
+            <w:tcW w:w="1153" w:type="dxa"/>
           </w:tcPr>
           <w:p>
             <w:pPr>
@@ -3148,7 +3299,7 @@
         </w:tc>
         <w:tc>
           <w:tcPr>
-            <w:tcW w:w="923" w:type="dxa"/>
+            <w:tcW w:w="628" w:type="dxa"/>
           </w:tcPr>
           <w:p>
             <w:pPr>
@@ -3166,7 +3317,7 @@
         </w:tc>
         <w:tc>
           <w:tcPr>
-            <w:tcW w:w="3095" w:type="dxa"/>
+            <w:tcW w:w="2785" w:type="dxa"/>
           </w:tcPr>
           <w:p>
             <w:pPr>
@@ -3204,7 +3355,7 @@
         </w:trPr>
         <w:tc>
           <w:tcPr>
-            <w:tcW w:w="1260" w:type="dxa"/>
+            <w:tcW w:w="1209" w:type="dxa"/>
           </w:tcPr>
           <w:p>
             <w:pPr>
@@ -3235,7 +3386,7 @@
         </w:tc>
         <w:tc>
           <w:tcPr>
-            <w:tcW w:w="560" w:type="dxa"/>
+            <w:tcW w:w="537" w:type="dxa"/>
           </w:tcPr>
           <w:p>
             <w:pPr>
@@ -3253,7 +3404,7 @@
         </w:tc>
         <w:tc>
           <w:tcPr>
-            <w:tcW w:w="988" w:type="dxa"/>
+            <w:tcW w:w="537" w:type="dxa"/>
           </w:tcPr>
           <w:p>
             <w:pPr>
@@ -3265,13 +3416,31 @@
                 <w:sz w:val="17"/>
                 <w:szCs w:val="17"/>
               </w:rPr>
+              <w:t xml:space="preserve">134</w:t>
+            </w:r>
+          </w:p>
+        </w:tc>
+        <w:tc>
+          <w:tcPr>
+            <w:tcW w:w="710" w:type="dxa"/>
+          </w:tcPr>
+          <w:p>
+            <w:pPr>
+              <w:pStyle w:val="TWCell"/>
+              <w:jc w:val="right"/>
+            </w:pPr>
+            <w:r>
+              <w:rPr>
+                <w:sz w:val="17"/>
+                <w:szCs w:val="17"/>
+              </w:rPr>
               <w:t xml:space="preserve">120초</w:t>
             </w:r>
           </w:p>
         </w:tc>
         <w:tc>
           <w:tcPr>
-            <w:tcW w:w="1010" w:type="dxa"/>
+            <w:tcW w:w="1698" w:type="dxa"/>
           </w:tcPr>
           <w:p>
             <w:pPr>
@@ -3280,16 +3449,32 @@
             </w:pPr>
             <w:r>
               <w:rPr>
+                <w:b/>
+                <w:bCs/>
                 <w:sz w:val="17"/>
                 <w:szCs w:val="17"/>
               </w:rPr>
               <w:t xml:space="preserve">119.49</w:t>
             </w:r>
-          </w:p>
-        </w:tc>
-        <w:tc>
-          <w:tcPr>
-            <w:tcW w:w="1277" w:type="dxa"/>
+            <w:r>
+              <w:rPr>
+                <w:sz w:val="17"/>
+                <w:szCs w:val="17"/>
+              </w:rPr>
+              <w:br/>
+            </w:r>
+            <w:r>
+              <w:rPr>
+                <w:sz w:val="17"/>
+                <w:szCs w:val="17"/>
+              </w:rPr>
+              <w:t xml:space="preserve">105.9 + 14.0 − 0.4</w:t>
+            </w:r>
+          </w:p>
+        </w:tc>
+        <w:tc>
+          <w:tcPr>
+            <w:tcW w:w="1056" w:type="dxa"/>
           </w:tcPr>
           <w:p>
             <w:pPr>
@@ -3307,7 +3492,7 @@
         </w:tc>
         <w:tc>
           <w:tcPr>
-            <w:tcW w:w="1201" w:type="dxa"/>
+            <w:tcW w:w="1153" w:type="dxa"/>
           </w:tcPr>
           <w:p>
             <w:pPr>
@@ -3325,7 +3510,7 @@
         </w:tc>
         <w:tc>
           <w:tcPr>
-            <w:tcW w:w="923" w:type="dxa"/>
+            <w:tcW w:w="628" w:type="dxa"/>
           </w:tcPr>
           <w:p>
             <w:pPr>
@@ -3343,7 +3528,7 @@
         </w:tc>
         <w:tc>
           <w:tcPr>
-            <w:tcW w:w="3095" w:type="dxa"/>
+            <w:tcW w:w="2785" w:type="dxa"/>
           </w:tcPr>
           <w:p>
             <w:pPr>
@@ -3392,6 +3577,20 @@
           <w:color w:val="5B6168"/>
         </w:rPr>
         <w:t xml:space="preserve">이다(네 경우 모두 A안). 배치 점수 = 기술 적합 + 협업 − 익숙한 쌍 감점(빈자리 감점 제외). </w:t>
+      </w:r>
+      <w:r>
+        <w:rPr>
+          <w:b/>
+          <w:bCs/>
+          <w:color w:val="5B6168"/>
+        </w:rPr>
+        <w:t xml:space="preserve">점수의 크기는 자리 수에 비례한다</w:t>
+      </w:r>
+      <w:r>
+        <w:rPr>
+          <w:color w:val="5B6168"/>
+        </w:rPr>
+        <w:t xml:space="preserve"> — 기술 적합은 자리마다 0~1점(요구 레벨을 모두 채운 사람이면 1점)이라 만점이 자리 수와 같고(100명 67자리 = 67점 만점), 거기에 팀 안 쌍마다 협업 보상(0.3 × C, C는 −1~1)이 더해지고 익숙한 쌍마다 0.2가 빠진다. 네 규모 모두 자리당 기술 적합은 78~81%(52.4/67 · 135.9/167 · 209.3/260 · 105.9/134)로 비슷하다. "더 좋은 배치가 얼마나 남았나"는 만점이 아니라 옆의 이론상 최대치와의 차이가 말한다. </w:t>
       </w:r>
       <w:r>
         <w:rPr>
@@ -3987,7 +4186,7 @@
         <w:rPr>
           <w:color w:val="5B6168"/>
         </w:rPr>
-        <w:t xml:space="preserve">각 값은 계산 엔진이 "이보다 나은 배치가 없다"를 확인한 최적값이다(허용 오차 0). 가상 데이터에서 신규 사업의 정원은 대기 인력의 등급 구성에 맞춰 정했다 — 회사가 지금 쉬는 인력으로 꾸릴 수 있는 사업에 제안한다는 가정이라, 아무도 옮기지 않아도(K=0) 빈자리가 없다. K를 늘리면 후보가 대기 인력(100명 조직 10명)에서 이미 다른 사업에서 일하는 인력(87명)까지 넓어져, 기술이 더 맞는 사람을 데려올 수 있어 점수가 오른다.</w:t>
+        <w:t xml:space="preserve">각 값은 계산 엔진이 "이보다 나은 배치가 없다"를 확인한 최적값이다(허용 오차 0, 점수의 크기는 3.1과 같이 자리 수에 비례). 가상 데이터에서 신규 사업의 정원은 대기 인력의 등급 구성에 맞춰 정했다 — 회사가 지금 쉬는 인력으로 꾸릴 수 있는 사업에 제안한다는 가정이라, 아무도 옮기지 않아도(K=0) 빈자리가 없다. K를 늘리면 후보가 대기 인력(100명 조직 10명)에서 이미 다른 사업에서 일하는 인력(87명)까지 넓어져, 기술이 더 맞는 사람을 데려올 수 있어 점수가 오른다.</w:t>
       </w:r>
     </w:p>
     <w:p>
@@ -8802,6 +9001,25 @@
       </w:r>
       <w:r>
         <w:t xml:space="preserve">(솔버가 증명한 상한)를 함께 기록해 "최적값이 최대 몇 % 높을 수 있음"으로 보여 준다. 전일 투입 권장 한도 100명 30초·200명 60초·300명 90초, 12개월은 ×4(측정 기반, 관리자 설정).</w:t>
+      </w:r>
+    </w:p>
+    <w:p>
+      <w:pPr>
+        <w:pStyle w:val="TWList"/>
+        <w:numPr>
+          <w:ilvl w:val="0"/>
+          <w:numId w:val="1"/>
+        </w:numPr>
+      </w:pPr>
+      <w:r>
+        <w:rPr>
+          <w:b/>
+          <w:bCs/>
+        </w:rPr>
+        <w:t xml:space="preserve">야간 배치</w:t>
+      </w:r>
+      <w:r>
+        <w:t xml:space="preserve">: 매일 밤 시간대(기본 00~05시) 시작에 지금 켜져 있는 데이터 한 묶음만, AI를 쓰지 않고 돈다 — 인사 시스템 받기 → 진행 사업마다 위반 없이 바로 넣을 수 있는 상위 5명(긴급 대기 명단) → 연간 계획(현재 배치가 없는 백지 데이터일 때)·신규 사업 K 0~5 비교(채울 신규 사업이 있을 때)·낮 요청 중 결과가 없는 것을 낮 한도의 10배(5~30분, 운영 중 비교는 5배)로 푼다. 키·서명은 낮 설정 그대로라 아침에 같은 요청이 캐시에서 바로 나오고, 끝까지 풀지 못한 묶음은 저장하지 않는다. 데이터 복원·미리 계산 수용·PDF 브라우저·AI 연결 점검 결과도 보고서로 남긴다.</w:t>
       </w:r>
     </w:p>
     <w:p>

</xml_diff>

<commit_message>
docs: report appendix captions drop the video scene codes (D2~D9) -- they are the presenter's own labels, not for the submission; PDF and Word rebuilt, still 10 pages
Co-Authored-By: Claude Fable 5.1 <noreply@anthropic.com>
Claude-Session: https://claude.ai/code/session_01XiJnTNFVeV2BokGGcyeQom
</commit_message>
<xml_diff>
--- a/outputs/final-report.docx
+++ b/outputs/final-report.docx
@@ -11761,7 +11761,7 @@
         <w:rPr>
           <w:color w:val="5B6168"/>
         </w:rPr>
-        <w:t xml:space="preserve">시연 영상의 아홉 장면 가운데 여섯 — 영상에서 빠르게 지나가거나 시간이 모자라면 잘릴 수 있는 장면을 모았다(괄호는 영상 장면 번호). 모두 실제 조직을 본뜬 가상 데이터 화면(100명 · ⑥은 300명)이고, ③의 발주 자료만 나라장터 공개 자료(한국산업안전보건공단 제안요청서)다.</w:t>
+        <w:t xml:space="preserve">시연 영상의 아홉 장면 가운데 여섯 — 영상에서 빠르게 지나가거나 시간이 모자라면 잘릴 수 있는 장면을 모았다. 모두 실제 조직을 본뜬 가상 데이터 화면(100명 · ⑥은 300명)이고, ③의 발주 자료만 나라장터 공개 자료(한국산업안전보건공단 제안요청서)다.</w:t>
       </w:r>
     </w:p>
     <w:tbl>
@@ -11852,7 +11852,7 @@
                 <w:sz w:val="15"/>
                 <w:szCs w:val="15"/>
               </w:rPr>
-              <w:t xml:space="preserve">(D2) 안마다 "위반 없음 · 다시 채점" 도장과 배치 품질·빈자리·기술 적합, 편성 기록에서 연 결과임을 띠와 배지("최적인지는 다시 계산해야 확인")가 밝힌다.</w:t>
+              <w:t xml:space="preserve"> 안마다 "위반 없음 · 다시 채점" 도장과 배치 품질·빈자리·기술 적합, 편성 기록에서 연 결과임을 띠와 배지("최적인지는 다시 계산해야 확인")가 밝힌다.</w:t>
             </w:r>
           </w:p>
         </w:tc>
@@ -11916,7 +11916,7 @@
                 <w:sz w:val="15"/>
                 <w:szCs w:val="15"/>
               </w:rPr>
-              <w:t xml:space="preserve">(D5) 교체 전후 점수는 참고값(재최적화 아님), 설명은 동료 평가를 직접 인용한 근거를 단다. 오른쪽은 빠질 사람·팀원·들어올 사람의 협업 관계.</w:t>
+              <w:t xml:space="preserve"> 교체 전후 점수는 참고값(재최적화 아님), 설명은 동료 평가를 직접 인용한 근거를 단다. 오른쪽은 빠질 사람·팀원·들어올 사람의 협업 관계.</w:t>
             </w:r>
           </w:p>
         </w:tc>
@@ -11985,7 +11985,7 @@
                 <w:sz w:val="15"/>
                 <w:szCs w:val="15"/>
               </w:rPr>
-              <w:t xml:space="preserve">(D6) 왼쪽은 사업명·고객 구분 제안과 근거 문장, 오른쪽은 제안요청서에서 추정한 필요 기술(필수 · 근거). 넣을 것은 사람이 고른다.</w:t>
+              <w:t xml:space="preserve"> 왼쪽은 사업명·고객 구분 제안과 근거 문장, 오른쪽은 제안요청서에서 추정한 필요 기술(필수 · 근거). 넣을 것은 사람이 고른다.</w:t>
             </w:r>
           </w:p>
         </w:tc>
@@ -12049,7 +12049,7 @@
                 <w:sz w:val="15"/>
                 <w:szCs w:val="15"/>
               </w:rPr>
-              <w:t xml:space="preserve">(D7) 기술 이름 없이 쓴 글에서 AI가 기술 셋과 인원 2를 읽고("미루어 봄"은 부서장이 켠다), 기존 계산이 최선 조합과 빼 온 자리를 메울 사람까지 낸다.</w:t>
+              <w:t xml:space="preserve"> 기술 이름 없이 쓴 글에서 AI가 기술 셋과 인원 2를 읽고("미루어 봄"은 부서장이 켠다), 기존 계산이 최선 조합과 빼 온 자리를 메울 사람까지 낸다.</w:t>
             </w:r>
           </w:p>
         </w:tc>
@@ -12118,7 +12118,7 @@
                 <w:sz w:val="15"/>
                 <w:szCs w:val="15"/>
               </w:rPr>
-              <w:t xml:space="preserve">(D8) 서버가 계산한 사실은 잠겨 있고(🔒 수정 불가), 부서장은 판단·합의 상태를 적는다. 불리한 사실에는 지우는 대신 해명·이의만 달 수 있다.</w:t>
+              <w:t xml:space="preserve"> 서버가 계산한 사실은 잠겨 있고(🔒 수정 불가), 부서장은 판단·합의 상태를 적는다. 불리한 사실에는 지우는 대신 해명·이의만 달 수 있다.</w:t>
             </w:r>
           </w:p>
         </w:tc>
@@ -12182,7 +12182,7 @@
                 <w:sz w:val="15"/>
                 <w:szCs w:val="15"/>
               </w:rPr>
-              <w:t xml:space="preserve">(D9) 기술마다 실무 가능 인원(넓이) × 평균 경력(깊이)의 사분면. 하위 기술 인정분이 절반 넘는 기술은 점선 원으로 따로 표시한다.</w:t>
+              <w:t xml:space="preserve"> 기술마다 실무 가능 인원(넓이) × 평균 경력(깊이)의 사분면. 하위 기술 인정분이 절반 넘는 기술은 점선 원으로 따로 표시한다.</w:t>
             </w:r>
           </w:p>
         </w:tc>

</xml_diff>

<commit_message>
docs: final report Word file fits 10 pages without changing a word -- body font Apple SD Gothic Neo (present on the authoring Mac, so Pages no longer warns about a missing font) with fontTable altName Malgun Gothic for Windows Word, code font Courier New (both platforms); line spacing switched from font-relative auto to exact twips so a substituted font cannot change the vertical length; paragraph/heading spacing and table cell margins trimmed; page break before the appendix like the PDF; picture paragraphs keep auto spacing (exact would clip them). Same 25,411 characters. Chromium emulation of the docx (local tool docx_pages.py): 9 pages with Apple SD Gothic Neo, 10 with NanumGothic/AppleGothic widths (old file: 10, which Pages rendered as 11 with a substitute font)
Co-Authored-By: Claude Fable 5.1 <noreply@anthropic.com>
Claude-Session: https://claude.ai/code/session_01XiJnTNFVeV2BokGGcyeQom
</commit_message>
<xml_diff>
--- a/outputs/final-report.docx
+++ b/outputs/final-report.docx
@@ -158,9 +158,9 @@
         </w:tblBorders>
         <w:tblLayout w:type="fixed"/>
         <w:tblCellMar>
-          <w:top w:w="40" w:type="dxa"/>
+          <w:top w:w="20" w:type="dxa"/>
           <w:left w:w="90" w:type="dxa"/>
-          <w:bottom w:w="40" w:type="dxa"/>
+          <w:bottom w:w="20" w:type="dxa"/>
           <w:right w:w="90" w:type="dxa"/>
         </w:tblCellMar>
       </w:tblPr>
@@ -840,9 +840,9 @@
         </w:tblBorders>
         <w:tblLayout w:type="fixed"/>
         <w:tblCellMar>
-          <w:top w:w="40" w:type="dxa"/>
+          <w:top w:w="20" w:type="dxa"/>
           <w:left w:w="90" w:type="dxa"/>
-          <w:bottom w:w="40" w:type="dxa"/>
+          <w:bottom w:w="20" w:type="dxa"/>
           <w:right w:w="90" w:type="dxa"/>
         </w:tblCellMar>
       </w:tblPr>
@@ -1185,9 +1185,9 @@
         </w:tblBorders>
         <w:tblLayout w:type="fixed"/>
         <w:tblCellMar>
-          <w:top w:w="40" w:type="dxa"/>
+          <w:top w:w="20" w:type="dxa"/>
           <w:left w:w="90" w:type="dxa"/>
-          <w:bottom w:w="40" w:type="dxa"/>
+          <w:bottom w:w="20" w:type="dxa"/>
           <w:right w:w="90" w:type="dxa"/>
         </w:tblCellMar>
       </w:tblPr>
@@ -1691,9 +1691,9 @@
         </w:tblBorders>
         <w:tblLayout w:type="fixed"/>
         <w:tblCellMar>
-          <w:top w:w="40" w:type="dxa"/>
+          <w:top w:w="20" w:type="dxa"/>
           <w:left w:w="90" w:type="dxa"/>
-          <w:bottom w:w="40" w:type="dxa"/>
+          <w:bottom w:w="20" w:type="dxa"/>
           <w:right w:w="90" w:type="dxa"/>
         </w:tblCellMar>
       </w:tblPr>
@@ -2255,9 +2255,9 @@
         </w:tblBorders>
         <w:tblLayout w:type="fixed"/>
         <w:tblCellMar>
-          <w:top w:w="40" w:type="dxa"/>
+          <w:top w:w="20" w:type="dxa"/>
           <w:left w:w="90" w:type="dxa"/>
-          <w:bottom w:w="40" w:type="dxa"/>
+          <w:bottom w:w="20" w:type="dxa"/>
           <w:right w:w="90" w:type="dxa"/>
         </w:tblCellMar>
       </w:tblPr>
@@ -2512,9 +2512,9 @@
         </w:tblBorders>
         <w:tblLayout w:type="fixed"/>
         <w:tblCellMar>
-          <w:top w:w="40" w:type="dxa"/>
+          <w:top w:w="20" w:type="dxa"/>
           <w:left w:w="90" w:type="dxa"/>
-          <w:bottom w:w="40" w:type="dxa"/>
+          <w:bottom w:w="20" w:type="dxa"/>
           <w:right w:w="90" w:type="dxa"/>
         </w:tblCellMar>
       </w:tblPr>
@@ -3673,9 +3673,9 @@
         </w:tblBorders>
         <w:tblLayout w:type="fixed"/>
         <w:tblCellMar>
-          <w:top w:w="40" w:type="dxa"/>
+          <w:top w:w="20" w:type="dxa"/>
           <w:left w:w="90" w:type="dxa"/>
-          <w:bottom w:w="40" w:type="dxa"/>
+          <w:bottom w:w="20" w:type="dxa"/>
           <w:right w:w="90" w:type="dxa"/>
         </w:tblCellMar>
       </w:tblPr>
@@ -4216,9 +4216,9 @@
         </w:tblBorders>
         <w:tblLayout w:type="fixed"/>
         <w:tblCellMar>
-          <w:top w:w="40" w:type="dxa"/>
+          <w:top w:w="20" w:type="dxa"/>
           <w:left w:w="90" w:type="dxa"/>
-          <w:bottom w:w="40" w:type="dxa"/>
+          <w:bottom w:w="20" w:type="dxa"/>
           <w:right w:w="90" w:type="dxa"/>
         </w:tblCellMar>
       </w:tblPr>
@@ -4950,9 +4950,9 @@
         </w:tblBorders>
         <w:tblLayout w:type="fixed"/>
         <w:tblCellMar>
-          <w:top w:w="40" w:type="dxa"/>
+          <w:top w:w="20" w:type="dxa"/>
           <w:left w:w="90" w:type="dxa"/>
-          <w:bottom w:w="40" w:type="dxa"/>
+          <w:bottom w:w="20" w:type="dxa"/>
           <w:right w:w="90" w:type="dxa"/>
         </w:tblCellMar>
       </w:tblPr>
@@ -5213,9 +5213,9 @@
         </w:tblBorders>
         <w:tblLayout w:type="fixed"/>
         <w:tblCellMar>
-          <w:top w:w="40" w:type="dxa"/>
+          <w:top w:w="20" w:type="dxa"/>
           <w:left w:w="90" w:type="dxa"/>
-          <w:bottom w:w="40" w:type="dxa"/>
+          <w:bottom w:w="20" w:type="dxa"/>
           <w:right w:w="90" w:type="dxa"/>
         </w:tblCellMar>
       </w:tblPr>
@@ -5801,9 +5801,9 @@
         </w:tblBorders>
         <w:tblLayout w:type="fixed"/>
         <w:tblCellMar>
-          <w:top w:w="40" w:type="dxa"/>
+          <w:top w:w="20" w:type="dxa"/>
           <w:left w:w="90" w:type="dxa"/>
-          <w:bottom w:w="40" w:type="dxa"/>
+          <w:bottom w:w="20" w:type="dxa"/>
           <w:right w:w="90" w:type="dxa"/>
         </w:tblCellMar>
       </w:tblPr>
@@ -6353,9 +6353,9 @@
         </w:tblBorders>
         <w:tblLayout w:type="fixed"/>
         <w:tblCellMar>
-          <w:top w:w="40" w:type="dxa"/>
+          <w:top w:w="20" w:type="dxa"/>
           <w:left w:w="90" w:type="dxa"/>
-          <w:bottom w:w="40" w:type="dxa"/>
+          <w:bottom w:w="20" w:type="dxa"/>
           <w:right w:w="90" w:type="dxa"/>
         </w:tblCellMar>
       </w:tblPr>
@@ -6979,9 +6979,9 @@
         </w:tblBorders>
         <w:tblLayout w:type="fixed"/>
         <w:tblCellMar>
-          <w:top w:w="40" w:type="dxa"/>
+          <w:top w:w="20" w:type="dxa"/>
           <w:left w:w="90" w:type="dxa"/>
-          <w:bottom w:w="40" w:type="dxa"/>
+          <w:bottom w:w="20" w:type="dxa"/>
           <w:right w:w="90" w:type="dxa"/>
         </w:tblCellMar>
       </w:tblPr>
@@ -7491,9 +7491,9 @@
         </w:tblBorders>
         <w:tblLayout w:type="fixed"/>
         <w:tblCellMar>
-          <w:top w:w="40" w:type="dxa"/>
+          <w:top w:w="20" w:type="dxa"/>
           <w:left w:w="90" w:type="dxa"/>
-          <w:bottom w:w="40" w:type="dxa"/>
+          <w:bottom w:w="20" w:type="dxa"/>
           <w:right w:w="90" w:type="dxa"/>
         </w:tblCellMar>
       </w:tblPr>
@@ -7949,7 +7949,7 @@
       </w:r>
       <w:r>
         <w:rPr>
-          <w:rFonts w:ascii="Consolas" w:hAnsi="Consolas" w:eastAsia="Malgun Gothic" w:cs="Consolas"/>
+          <w:rFonts w:ascii="Courier New" w:hAnsi="Courier New" w:eastAsia="Apple SD Gothic Neo" w:cs="Courier New"/>
         </w:rPr>
         <w:t xml:space="preserve">plan_token</w:t>
       </w:r>
@@ -8025,9 +8025,9 @@
         </w:tblBorders>
         <w:tblLayout w:type="fixed"/>
         <w:tblCellMar>
-          <w:top w:w="40" w:type="dxa"/>
+          <w:top w:w="20" w:type="dxa"/>
           <w:left w:w="90" w:type="dxa"/>
-          <w:bottom w:w="40" w:type="dxa"/>
+          <w:bottom w:w="20" w:type="dxa"/>
           <w:right w:w="90" w:type="dxa"/>
         </w:tblCellMar>
       </w:tblPr>
@@ -8756,7 +8756,7 @@
       </w:r>
       <w:r>
         <w:rPr>
-          <w:rFonts w:ascii="Consolas" w:hAnsi="Consolas" w:eastAsia="Malgun Gothic" w:cs="Consolas"/>
+          <w:rFonts w:ascii="Courier New" w:hAnsi="Courier New" w:eastAsia="Apple SD Gothic Neo" w:cs="Courier New"/>
         </w:rPr>
         <w:t xml:space="preserve">z</w:t>
       </w:r>
@@ -8775,7 +8775,7 @@
       </w:r>
       <w:r>
         <w:rPr>
-          <w:rFonts w:ascii="Consolas" w:hAnsi="Consolas" w:eastAsia="Malgun Gothic" w:cs="Consolas"/>
+          <w:rFonts w:ascii="Courier New" w:hAnsi="Courier New" w:eastAsia="Apple SD Gothic Neo" w:cs="Courier New"/>
         </w:rPr>
         <w:t xml:space="preserve">y</w:t>
       </w:r>
@@ -8784,7 +8784,7 @@
       </w:r>
       <w:r>
         <w:rPr>
-          <w:rFonts w:ascii="Consolas" w:hAnsi="Consolas" w:eastAsia="Malgun Gothic" w:cs="Consolas"/>
+          <w:rFonts w:ascii="Courier New" w:hAnsi="Courier New" w:eastAsia="Apple SD Gothic Neo" w:cs="Courier New"/>
         </w:rPr>
         <w:t xml:space="preserve">slack</w:t>
       </w:r>
@@ -9063,9 +9063,9 @@
         </w:tblBorders>
         <w:tblLayout w:type="fixed"/>
         <w:tblCellMar>
-          <w:top w:w="40" w:type="dxa"/>
+          <w:top w:w="20" w:type="dxa"/>
           <w:left w:w="90" w:type="dxa"/>
-          <w:bottom w:w="40" w:type="dxa"/>
+          <w:bottom w:w="20" w:type="dxa"/>
           <w:right w:w="90" w:type="dxa"/>
         </w:tblCellMar>
       </w:tblPr>
@@ -9345,7 +9345,7 @@
             </w:r>
             <w:r>
               <w:rPr>
-                <w:rFonts w:ascii="Consolas" w:hAnsi="Consolas" w:eastAsia="Malgun Gothic" w:cs="Consolas"/>
+                <w:rFonts w:ascii="Courier New" w:hAnsi="Courier New" w:eastAsia="Apple SD Gothic Neo" w:cs="Courier New"/>
                 <w:sz w:val="17"/>
                 <w:szCs w:val="17"/>
               </w:rPr>
@@ -9787,9 +9787,9 @@
         </w:tblBorders>
         <w:tblLayout w:type="fixed"/>
         <w:tblCellMar>
-          <w:top w:w="40" w:type="dxa"/>
+          <w:top w:w="20" w:type="dxa"/>
           <w:left w:w="90" w:type="dxa"/>
-          <w:bottom w:w="40" w:type="dxa"/>
+          <w:bottom w:w="20" w:type="dxa"/>
           <w:right w:w="90" w:type="dxa"/>
         </w:tblCellMar>
       </w:tblPr>
@@ -10443,9 +10443,9 @@
         </w:tblBorders>
         <w:tblLayout w:type="fixed"/>
         <w:tblCellMar>
-          <w:top w:w="40" w:type="dxa"/>
+          <w:top w:w="20" w:type="dxa"/>
           <w:left w:w="90" w:type="dxa"/>
-          <w:bottom w:w="40" w:type="dxa"/>
+          <w:bottom w:w="20" w:type="dxa"/>
           <w:right w:w="90" w:type="dxa"/>
         </w:tblCellMar>
       </w:tblPr>
@@ -10941,9 +10941,9 @@
         </w:tblBorders>
         <w:tblLayout w:type="fixed"/>
         <w:tblCellMar>
-          <w:top w:w="40" w:type="dxa"/>
+          <w:top w:w="20" w:type="dxa"/>
           <w:left w:w="90" w:type="dxa"/>
-          <w:bottom w:w="40" w:type="dxa"/>
+          <w:bottom w:w="20" w:type="dxa"/>
           <w:right w:w="90" w:type="dxa"/>
         </w:tblCellMar>
       </w:tblPr>
@@ -11689,7 +11689,7 @@
       </w:r>
       <w:r>
         <w:rPr>
-          <w:rFonts w:ascii="Consolas" w:hAnsi="Consolas" w:eastAsia="Malgun Gothic" w:cs="Consolas"/>
+          <w:rFonts w:ascii="Courier New" w:hAnsi="Courier New" w:eastAsia="Apple SD Gothic Neo" w:cs="Courier New"/>
         </w:rPr>
         <w:t xml:space="preserve">NOT_CALIBRATED</w:t>
       </w:r>
@@ -11748,6 +11748,7 @@
     <w:p>
       <w:pPr>
         <w:pStyle w:val="Heading1"/>
+        <w:pageBreakBefore/>
       </w:pPr>
       <w:r>
         <w:t xml:space="preserve">부록. 화면 한눈에</w:t>
@@ -11778,9 +11779,9 @@
         </w:tblBorders>
         <w:tblLayout w:type="fixed"/>
         <w:tblCellMar>
-          <w:top w:w="40" w:type="dxa"/>
+          <w:top w:w="20" w:type="dxa"/>
           <w:left w:w="90" w:type="dxa"/>
-          <w:bottom w:w="40" w:type="dxa"/>
+          <w:bottom w:w="20" w:type="dxa"/>
           <w:right w:w="90" w:type="dxa"/>
         </w:tblCellMar>
       </w:tblPr>
@@ -11798,7 +11799,7 @@
           </w:tcPr>
           <w:p>
             <w:pPr>
-              <w:pStyle w:val="TWCell"/>
+              <w:pStyle w:val="TWFig"/>
             </w:pPr>
             <w:r>
               <w:drawing>
@@ -11862,7 +11863,7 @@
           </w:tcPr>
           <w:p>
             <w:pPr>
-              <w:pStyle w:val="TWCell"/>
+              <w:pStyle w:val="TWFig"/>
             </w:pPr>
             <w:r>
               <w:drawing>
@@ -11931,7 +11932,7 @@
           </w:tcPr>
           <w:p>
             <w:pPr>
-              <w:pStyle w:val="TWCell"/>
+              <w:pStyle w:val="TWFig"/>
             </w:pPr>
             <w:r>
               <w:drawing>
@@ -11995,7 +11996,7 @@
           </w:tcPr>
           <w:p>
             <w:pPr>
-              <w:pStyle w:val="TWCell"/>
+              <w:pStyle w:val="TWFig"/>
             </w:pPr>
             <w:r>
               <w:drawing>
@@ -12064,7 +12065,7 @@
           </w:tcPr>
           <w:p>
             <w:pPr>
-              <w:pStyle w:val="TWCell"/>
+              <w:pStyle w:val="TWFig"/>
             </w:pPr>
             <w:r>
               <w:drawing>
@@ -12128,7 +12129,7 @@
           </w:tcPr>
           <w:p>
             <w:pPr>
-              <w:pStyle w:val="TWCell"/>
+              <w:pStyle w:val="TWFig"/>
             </w:pPr>
             <w:r>
               <w:drawing>
@@ -12244,7 +12245,7 @@
   <w:docDefaults>
     <w:rPrDefault>
       <w:rPr>
-        <w:rFonts w:ascii="Malgun Gothic" w:hAnsi="Malgun Gothic" w:eastAsia="Malgun Gothic" w:cs="Malgun Gothic"/>
+        <w:rFonts w:ascii="Apple SD Gothic Neo" w:hAnsi="Apple SD Gothic Neo" w:eastAsia="Apple SD Gothic Neo" w:cs="Apple SD Gothic Neo"/>
         <w:color w:val="1F2328"/>
         <w:sz w:val="19"/>
         <w:szCs w:val="19"/>
@@ -12252,7 +12253,7 @@
     </w:rPrDefault>
     <w:pPrDefault>
       <w:pPr>
-        <w:spacing w:after="60" w:line="264" w:lineRule="auto"/>
+        <w:spacing w:after="40" w:line="248" w:lineRule="exact"/>
       </w:pPr>
     </w:pPrDefault>
   </w:docDefaults>
@@ -12263,7 +12264,7 @@
       <w:wordWrap w:val="0"/>
     </w:pPr>
     <w:rPr>
-      <w:rFonts w:ascii="Malgun Gothic" w:hAnsi="Malgun Gothic" w:eastAsia="Malgun Gothic" w:cs="Malgun Gothic"/>
+      <w:rFonts w:ascii="Apple SD Gothic Neo" w:hAnsi="Apple SD Gothic Neo" w:eastAsia="Apple SD Gothic Neo" w:cs="Apple SD Gothic Neo"/>
       <w:color w:val="1F2328"/>
       <w:sz w:val="19"/>
       <w:szCs w:val="19"/>
@@ -12274,10 +12275,10 @@
     <w:basedOn w:val="Normal"/>
     <w:qFormat/>
     <w:pPr>
-      <w:spacing w:before="0" w:after="60" w:line="264" w:lineRule="auto"/>
+      <w:spacing w:before="0" w:after="60" w:line="440" w:lineRule="exact"/>
     </w:pPr>
     <w:rPr>
-      <w:rFonts w:ascii="Malgun Gothic" w:hAnsi="Malgun Gothic" w:eastAsia="Malgun Gothic" w:cs="Malgun Gothic"/>
+      <w:rFonts w:ascii="Apple SD Gothic Neo" w:hAnsi="Apple SD Gothic Neo" w:eastAsia="Apple SD Gothic Neo" w:cs="Apple SD Gothic Neo"/>
       <w:b/>
       <w:bCs/>
       <w:color w:val="1F2328"/>
@@ -12294,11 +12295,11 @@
       <w:pBdr>
         <w:left w:val="single" w:sz="24" w:space="6" w:color="2F5F8A"/>
       </w:pBdr>
-      <w:spacing w:before="240" w:after="100" w:line="264" w:lineRule="auto"/>
+      <w:spacing w:before="160" w:after="60" w:line="320" w:lineRule="exact"/>
       <w:outlineLvl w:val="0"/>
     </w:pPr>
     <w:rPr>
-      <w:rFonts w:ascii="Malgun Gothic" w:hAnsi="Malgun Gothic" w:eastAsia="Malgun Gothic" w:cs="Malgun Gothic"/>
+      <w:rFonts w:ascii="Apple SD Gothic Neo" w:hAnsi="Apple SD Gothic Neo" w:eastAsia="Apple SD Gothic Neo" w:cs="Apple SD Gothic Neo"/>
       <w:b/>
       <w:bCs/>
       <w:color w:val="1F2328"/>
@@ -12312,11 +12313,11 @@
     <w:qFormat/>
     <w:pPr>
       <w:keepNext/>
-      <w:spacing w:before="140" w:after="60" w:line="264" w:lineRule="auto"/>
+      <w:spacing w:before="100" w:after="40" w:line="268" w:lineRule="exact"/>
       <w:outlineLvl w:val="1"/>
     </w:pPr>
     <w:rPr>
-      <w:rFonts w:ascii="Malgun Gothic" w:hAnsi="Malgun Gothic" w:eastAsia="Malgun Gothic" w:cs="Malgun Gothic"/>
+      <w:rFonts w:ascii="Apple SD Gothic Neo" w:hAnsi="Apple SD Gothic Neo" w:eastAsia="Apple SD Gothic Neo" w:cs="Apple SD Gothic Neo"/>
       <w:b/>
       <w:bCs/>
       <w:color w:val="2F6F5E"/>
@@ -12329,10 +12330,10 @@
     <w:basedOn w:val="Normal"/>
     <w:qFormat/>
     <w:pPr>
-      <w:spacing w:before="0" w:after="160" w:line="264" w:lineRule="auto"/>
+      <w:spacing w:before="0" w:after="160" w:line="292" w:lineRule="exact"/>
     </w:pPr>
     <w:rPr>
-      <w:rFonts w:ascii="Malgun Gothic" w:hAnsi="Malgun Gothic" w:eastAsia="Malgun Gothic" w:cs="Malgun Gothic"/>
+      <w:rFonts w:ascii="Apple SD Gothic Neo" w:hAnsi="Apple SD Gothic Neo" w:eastAsia="Apple SD Gothic Neo" w:cs="Apple SD Gothic Neo"/>
       <w:color w:val="1F2328"/>
       <w:sz w:val="22"/>
       <w:szCs w:val="22"/>
@@ -12343,10 +12344,10 @@
     <w:basedOn w:val="Normal"/>
     <w:qFormat/>
     <w:pPr>
-      <w:spacing w:before="0" w:after="60" w:line="252" w:lineRule="auto"/>
+      <w:spacing w:before="0" w:after="40" w:line="208" w:lineRule="exact"/>
     </w:pPr>
     <w:rPr>
-      <w:rFonts w:ascii="Malgun Gothic" w:hAnsi="Malgun Gothic" w:eastAsia="Malgun Gothic" w:cs="Malgun Gothic"/>
+      <w:rFonts w:ascii="Apple SD Gothic Neo" w:hAnsi="Apple SD Gothic Neo" w:eastAsia="Apple SD Gothic Neo" w:cs="Apple SD Gothic Neo"/>
       <w:color w:val="5B6168"/>
       <w:sz w:val="16"/>
       <w:szCs w:val="16"/>
@@ -12357,10 +12358,24 @@
     <w:basedOn w:val="Normal"/>
     <w:qFormat/>
     <w:pPr>
-      <w:spacing w:before="0" w:after="20" w:line="240" w:lineRule="auto"/>
+      <w:spacing w:before="0" w:after="10" w:line="220" w:lineRule="exact"/>
     </w:pPr>
     <w:rPr>
-      <w:rFonts w:ascii="Malgun Gothic" w:hAnsi="Malgun Gothic" w:eastAsia="Malgun Gothic" w:cs="Malgun Gothic"/>
+      <w:rFonts w:ascii="Apple SD Gothic Neo" w:hAnsi="Apple SD Gothic Neo" w:eastAsia="Apple SD Gothic Neo" w:cs="Apple SD Gothic Neo"/>
+      <w:color w:val="1F2328"/>
+      <w:sz w:val="17"/>
+      <w:szCs w:val="17"/>
+    </w:rPr>
+  </w:style>
+  <w:style w:type="paragraph" w:customStyle="1" w:styleId="TWFig">
+    <w:name w:val="TW Figure"/>
+    <w:basedOn w:val="Normal"/>
+    <w:qFormat/>
+    <w:pPr>
+      <w:spacing w:before="0" w:after="10" w:line="240" w:lineRule="auto"/>
+    </w:pPr>
+    <w:rPr>
+      <w:rFonts w:ascii="Apple SD Gothic Neo" w:hAnsi="Apple SD Gothic Neo" w:eastAsia="Apple SD Gothic Neo" w:cs="Apple SD Gothic Neo"/>
       <w:color w:val="1F2328"/>
       <w:sz w:val="17"/>
       <w:szCs w:val="17"/>
@@ -12371,10 +12386,10 @@
     <w:basedOn w:val="Normal"/>
     <w:qFormat/>
     <w:pPr>
-      <w:spacing w:before="0" w:after="60" w:line="120" w:lineRule="auto"/>
+      <w:spacing w:before="0" w:after="40" w:line="40" w:lineRule="exact"/>
     </w:pPr>
     <w:rPr>
-      <w:rFonts w:ascii="Malgun Gothic" w:hAnsi="Malgun Gothic" w:eastAsia="Malgun Gothic" w:cs="Malgun Gothic"/>
+      <w:rFonts w:ascii="Apple SD Gothic Neo" w:hAnsi="Apple SD Gothic Neo" w:eastAsia="Apple SD Gothic Neo" w:cs="Apple SD Gothic Neo"/>
       <w:color w:val="1F2328"/>
       <w:sz w:val="6"/>
       <w:szCs w:val="6"/>
@@ -12386,10 +12401,10 @@
     <w:qFormat/>
     <w:pPr>
       <w:ind w:left="360" w:hanging="240"/>
-      <w:spacing w:before="0" w:after="30" w:line="264" w:lineRule="auto"/>
+      <w:spacing w:before="0" w:after="20" w:line="248" w:lineRule="exact"/>
     </w:pPr>
     <w:rPr>
-      <w:rFonts w:ascii="Malgun Gothic" w:hAnsi="Malgun Gothic" w:eastAsia="Malgun Gothic" w:cs="Malgun Gothic"/>
+      <w:rFonts w:ascii="Apple SD Gothic Neo" w:hAnsi="Apple SD Gothic Neo" w:eastAsia="Apple SD Gothic Neo" w:cs="Apple SD Gothic Neo"/>
       <w:color w:val="1F2328"/>
       <w:sz w:val="19"/>
       <w:szCs w:val="19"/>
@@ -12401,10 +12416,10 @@
     <w:qFormat/>
     <w:pPr>
       <w:ind w:left="360" w:hanging="240"/>
-      <w:spacing w:before="0" w:after="20" w:line="252" w:lineRule="auto"/>
+      <w:spacing w:before="0" w:after="10" w:line="208" w:lineRule="exact"/>
     </w:pPr>
     <w:rPr>
-      <w:rFonts w:ascii="Malgun Gothic" w:hAnsi="Malgun Gothic" w:eastAsia="Malgun Gothic" w:cs="Malgun Gothic"/>
+      <w:rFonts w:ascii="Apple SD Gothic Neo" w:hAnsi="Apple SD Gothic Neo" w:eastAsia="Apple SD Gothic Neo" w:cs="Apple SD Gothic Neo"/>
       <w:color w:val="5B6168"/>
       <w:sz w:val="16"/>
       <w:szCs w:val="16"/>
@@ -12416,10 +12431,10 @@
     <w:qFormat/>
     <w:pPr>
       <w:ind w:left="300" w:hanging="200"/>
-      <w:spacing w:before="0" w:after="20" w:line="240" w:lineRule="auto"/>
+      <w:spacing w:before="0" w:after="10" w:line="220" w:lineRule="exact"/>
     </w:pPr>
     <w:rPr>
-      <w:rFonts w:ascii="Malgun Gothic" w:hAnsi="Malgun Gothic" w:eastAsia="Malgun Gothic" w:cs="Malgun Gothic"/>
+      <w:rFonts w:ascii="Apple SD Gothic Neo" w:hAnsi="Apple SD Gothic Neo" w:eastAsia="Apple SD Gothic Neo" w:cs="Apple SD Gothic Neo"/>
       <w:color w:val="1F2328"/>
       <w:sz w:val="17"/>
       <w:szCs w:val="17"/>

</xml_diff>

<commit_message>
docs: Word report measured in the real Pages app (11 pages) and refit -- Pages ignores docx cell top/bottom margins (tblCellMar, tcMar, table style all tested: one-line row = line height + 8.85pt, about 0.9 page over 105 rows) and never splits rows, so the Chromium estimate was a page optimistic; page margins 14/15 -> 13mm, table line height 11 -> 10.5pt, heading spacing trimmed, cantSplit dropped (Word may now split a tall row instead of pushing it). Same 25,411 characters, 6 figures. Pages: 10 pages, body ends at 68% of page 9, appendix page 10 (AppleScript export via pages_measure.sh); Word-like emulation 9 pages with NanumGothic width, 10 with AppleGothic
Co-Authored-By: Claude Fable 5.1 <noreply@anthropic.com>
Claude-Session: https://claude.ai/code/session_01XiJnTNFVeV2BokGGcyeQom
</commit_message>
<xml_diff>
--- a/outputs/final-report.docx
+++ b/outputs/final-report.docx
@@ -147,7 +147,7 @@
     <w:tbl>
       <w:tblPr>
         <w:tblStyle w:val="TWTable"/>
-        <w:tblW w:w="10318" w:type="dxa"/>
+        <w:tblW w:w="10432" w:type="dxa"/>
         <w:tblBorders>
           <w:top w:val="single" w:sz="4" w:space="0" w:color="D8DCE1"/>
           <w:left w:val="single" w:sz="4" w:space="0" w:color="D8DCE1"/>
@@ -165,19 +165,18 @@
         </w:tblCellMar>
       </w:tblPr>
       <w:tblGrid>
-        <w:gridCol w:w="1650"/>
-        <w:gridCol w:w="2166"/>
-        <w:gridCol w:w="5674"/>
-        <w:gridCol w:w="825"/>
+        <w:gridCol w:w="1669"/>
+        <w:gridCol w:w="2190"/>
+        <w:gridCol w:w="5737"/>
+        <w:gridCol w:w="834"/>
       </w:tblGrid>
       <w:tr>
         <w:trPr>
-          <w:cantSplit/>
           <w:tblHeader/>
         </w:trPr>
         <w:tc>
           <w:tcPr>
-            <w:tcW w:w="1650" w:type="dxa"/>
+            <w:tcW w:w="1669" w:type="dxa"/>
             <w:shd w:val="clear" w:color="auto" w:fill="F1F3F5"/>
           </w:tcPr>
           <w:p>
@@ -197,7 +196,7 @@
         </w:tc>
         <w:tc>
           <w:tcPr>
-            <w:tcW w:w="2166" w:type="dxa"/>
+            <w:tcW w:w="2190" w:type="dxa"/>
             <w:shd w:val="clear" w:color="auto" w:fill="F1F3F5"/>
           </w:tcPr>
           <w:p>
@@ -217,7 +216,7 @@
         </w:tc>
         <w:tc>
           <w:tcPr>
-            <w:tcW w:w="5674" w:type="dxa"/>
+            <w:tcW w:w="5737" w:type="dxa"/>
             <w:shd w:val="clear" w:color="auto" w:fill="F1F3F5"/>
           </w:tcPr>
           <w:p>
@@ -237,7 +236,7 @@
         </w:tc>
         <w:tc>
           <w:tcPr>
-            <w:tcW w:w="825" w:type="dxa"/>
+            <w:tcW w:w="834" w:type="dxa"/>
             <w:shd w:val="clear" w:color="auto" w:fill="F1F3F5"/>
           </w:tcPr>
           <w:p>
@@ -257,12 +256,9 @@
         </w:tc>
       </w:tr>
       <w:tr>
-        <w:trPr>
-          <w:cantSplit/>
-        </w:trPr>
-        <w:tc>
-          <w:tcPr>
-            <w:tcW w:w="1650" w:type="dxa"/>
+        <w:tc>
+          <w:tcPr>
+            <w:tcW w:w="1669" w:type="dxa"/>
           </w:tcPr>
           <w:p>
             <w:pPr>
@@ -279,7 +275,7 @@
         </w:tc>
         <w:tc>
           <w:tcPr>
-            <w:tcW w:w="2166" w:type="dxa"/>
+            <w:tcW w:w="2190" w:type="dxa"/>
           </w:tcPr>
           <w:p>
             <w:pPr>
@@ -296,7 +292,7 @@
         </w:tc>
         <w:tc>
           <w:tcPr>
-            <w:tcW w:w="5674" w:type="dxa"/>
+            <w:tcW w:w="5737" w:type="dxa"/>
           </w:tcPr>
           <w:p>
             <w:pPr>
@@ -322,7 +318,7 @@
         </w:tc>
         <w:tc>
           <w:tcPr>
-            <w:tcW w:w="825" w:type="dxa"/>
+            <w:tcW w:w="834" w:type="dxa"/>
           </w:tcPr>
           <w:p>
             <w:pPr>
@@ -339,12 +335,9 @@
         </w:tc>
       </w:tr>
       <w:tr>
-        <w:trPr>
-          <w:cantSplit/>
-        </w:trPr>
-        <w:tc>
-          <w:tcPr>
-            <w:tcW w:w="1650" w:type="dxa"/>
+        <w:tc>
+          <w:tcPr>
+            <w:tcW w:w="1669" w:type="dxa"/>
           </w:tcPr>
           <w:p>
             <w:pPr>
@@ -361,7 +354,7 @@
         </w:tc>
         <w:tc>
           <w:tcPr>
-            <w:tcW w:w="2166" w:type="dxa"/>
+            <w:tcW w:w="2190" w:type="dxa"/>
           </w:tcPr>
           <w:p>
             <w:pPr>
@@ -378,7 +371,7 @@
         </w:tc>
         <w:tc>
           <w:tcPr>
-            <w:tcW w:w="5674" w:type="dxa"/>
+            <w:tcW w:w="5737" w:type="dxa"/>
           </w:tcPr>
           <w:p>
             <w:pPr>
@@ -404,7 +397,7 @@
         </w:tc>
         <w:tc>
           <w:tcPr>
-            <w:tcW w:w="825" w:type="dxa"/>
+            <w:tcW w:w="834" w:type="dxa"/>
           </w:tcPr>
           <w:p>
             <w:pPr>
@@ -421,12 +414,9 @@
         </w:tc>
       </w:tr>
       <w:tr>
-        <w:trPr>
-          <w:cantSplit/>
-        </w:trPr>
-        <w:tc>
-          <w:tcPr>
-            <w:tcW w:w="1650" w:type="dxa"/>
+        <w:tc>
+          <w:tcPr>
+            <w:tcW w:w="1669" w:type="dxa"/>
           </w:tcPr>
           <w:p>
             <w:pPr>
@@ -443,7 +433,7 @@
         </w:tc>
         <w:tc>
           <w:tcPr>
-            <w:tcW w:w="2166" w:type="dxa"/>
+            <w:tcW w:w="2190" w:type="dxa"/>
           </w:tcPr>
           <w:p>
             <w:pPr>
@@ -460,7 +450,7 @@
         </w:tc>
         <w:tc>
           <w:tcPr>
-            <w:tcW w:w="5674" w:type="dxa"/>
+            <w:tcW w:w="5737" w:type="dxa"/>
           </w:tcPr>
           <w:p>
             <w:pPr>
@@ -486,7 +476,7 @@
         </w:tc>
         <w:tc>
           <w:tcPr>
-            <w:tcW w:w="825" w:type="dxa"/>
+            <w:tcW w:w="834" w:type="dxa"/>
           </w:tcPr>
           <w:p>
             <w:pPr>
@@ -503,12 +493,9 @@
         </w:tc>
       </w:tr>
       <w:tr>
-        <w:trPr>
-          <w:cantSplit/>
-        </w:trPr>
-        <w:tc>
-          <w:tcPr>
-            <w:tcW w:w="1650" w:type="dxa"/>
+        <w:tc>
+          <w:tcPr>
+            <w:tcW w:w="1669" w:type="dxa"/>
           </w:tcPr>
           <w:p>
             <w:pPr>
@@ -525,7 +512,7 @@
         </w:tc>
         <w:tc>
           <w:tcPr>
-            <w:tcW w:w="2166" w:type="dxa"/>
+            <w:tcW w:w="2190" w:type="dxa"/>
           </w:tcPr>
           <w:p>
             <w:pPr>
@@ -542,7 +529,7 @@
         </w:tc>
         <w:tc>
           <w:tcPr>
-            <w:tcW w:w="5674" w:type="dxa"/>
+            <w:tcW w:w="5737" w:type="dxa"/>
           </w:tcPr>
           <w:p>
             <w:pPr>
@@ -568,7 +555,7 @@
         </w:tc>
         <w:tc>
           <w:tcPr>
-            <w:tcW w:w="825" w:type="dxa"/>
+            <w:tcW w:w="834" w:type="dxa"/>
           </w:tcPr>
           <w:p>
             <w:pPr>
@@ -585,12 +572,9 @@
         </w:tc>
       </w:tr>
       <w:tr>
-        <w:trPr>
-          <w:cantSplit/>
-        </w:trPr>
-        <w:tc>
-          <w:tcPr>
-            <w:tcW w:w="1650" w:type="dxa"/>
+        <w:tc>
+          <w:tcPr>
+            <w:tcW w:w="1669" w:type="dxa"/>
           </w:tcPr>
           <w:p>
             <w:pPr>
@@ -607,7 +591,7 @@
         </w:tc>
         <w:tc>
           <w:tcPr>
-            <w:tcW w:w="2166" w:type="dxa"/>
+            <w:tcW w:w="2190" w:type="dxa"/>
           </w:tcPr>
           <w:p>
             <w:pPr>
@@ -624,7 +608,7 @@
         </w:tc>
         <w:tc>
           <w:tcPr>
-            <w:tcW w:w="5674" w:type="dxa"/>
+            <w:tcW w:w="5737" w:type="dxa"/>
           </w:tcPr>
           <w:p>
             <w:pPr>
@@ -650,7 +634,7 @@
         </w:tc>
         <w:tc>
           <w:tcPr>
-            <w:tcW w:w="825" w:type="dxa"/>
+            <w:tcW w:w="834" w:type="dxa"/>
           </w:tcPr>
           <w:p>
             <w:pPr>
@@ -667,12 +651,9 @@
         </w:tc>
       </w:tr>
       <w:tr>
-        <w:trPr>
-          <w:cantSplit/>
-        </w:trPr>
-        <w:tc>
-          <w:tcPr>
-            <w:tcW w:w="1650" w:type="dxa"/>
+        <w:tc>
+          <w:tcPr>
+            <w:tcW w:w="1669" w:type="dxa"/>
           </w:tcPr>
           <w:p>
             <w:pPr>
@@ -689,7 +670,7 @@
         </w:tc>
         <w:tc>
           <w:tcPr>
-            <w:tcW w:w="2166" w:type="dxa"/>
+            <w:tcW w:w="2190" w:type="dxa"/>
           </w:tcPr>
           <w:p>
             <w:pPr>
@@ -706,7 +687,7 @@
         </w:tc>
         <w:tc>
           <w:tcPr>
-            <w:tcW w:w="5674" w:type="dxa"/>
+            <w:tcW w:w="5737" w:type="dxa"/>
           </w:tcPr>
           <w:p>
             <w:pPr>
@@ -732,7 +713,7 @@
         </w:tc>
         <w:tc>
           <w:tcPr>
-            <w:tcW w:w="825" w:type="dxa"/>
+            <w:tcW w:w="834" w:type="dxa"/>
           </w:tcPr>
           <w:p>
             <w:pPr>
@@ -829,7 +810,7 @@
     <w:tbl>
       <w:tblPr>
         <w:tblStyle w:val="TWTable"/>
-        <w:tblW w:w="10318" w:type="dxa"/>
+        <w:tblW w:w="10432" w:type="dxa"/>
         <w:tblBorders>
           <w:top w:val="single" w:sz="4" w:space="0" w:color="D8DCE1"/>
           <w:left w:val="single" w:sz="4" w:space="0" w:color="D8DCE1"/>
@@ -847,17 +828,16 @@
         </w:tblCellMar>
       </w:tblPr>
       <w:tblGrid>
-        <w:gridCol w:w="2099"/>
-        <w:gridCol w:w="8218"/>
+        <w:gridCol w:w="2101"/>
+        <w:gridCol w:w="8330"/>
       </w:tblGrid>
       <w:tr>
         <w:trPr>
-          <w:cantSplit/>
           <w:tblHeader/>
         </w:trPr>
         <w:tc>
           <w:tcPr>
-            <w:tcW w:w="2099" w:type="dxa"/>
+            <w:tcW w:w="2101" w:type="dxa"/>
             <w:shd w:val="clear" w:color="auto" w:fill="F1F3F5"/>
           </w:tcPr>
           <w:p>
@@ -877,7 +857,7 @@
         </w:tc>
         <w:tc>
           <w:tcPr>
-            <w:tcW w:w="8218" w:type="dxa"/>
+            <w:tcW w:w="8330" w:type="dxa"/>
             <w:shd w:val="clear" w:color="auto" w:fill="F1F3F5"/>
           </w:tcPr>
           <w:p>
@@ -897,12 +877,9 @@
         </w:tc>
       </w:tr>
       <w:tr>
-        <w:trPr>
-          <w:cantSplit/>
-        </w:trPr>
-        <w:tc>
-          <w:tcPr>
-            <w:tcW w:w="2099" w:type="dxa"/>
+        <w:tc>
+          <w:tcPr>
+            <w:tcW w:w="2101" w:type="dxa"/>
           </w:tcPr>
           <w:p>
             <w:pPr>
@@ -919,7 +896,7 @@
         </w:tc>
         <w:tc>
           <w:tcPr>
-            <w:tcW w:w="8218" w:type="dxa"/>
+            <w:tcW w:w="8330" w:type="dxa"/>
           </w:tcPr>
           <w:p>
             <w:pPr>
@@ -936,12 +913,9 @@
         </w:tc>
       </w:tr>
       <w:tr>
-        <w:trPr>
-          <w:cantSplit/>
-        </w:trPr>
-        <w:tc>
-          <w:tcPr>
-            <w:tcW w:w="2099" w:type="dxa"/>
+        <w:tc>
+          <w:tcPr>
+            <w:tcW w:w="2101" w:type="dxa"/>
           </w:tcPr>
           <w:p>
             <w:pPr>
@@ -958,7 +932,7 @@
         </w:tc>
         <w:tc>
           <w:tcPr>
-            <w:tcW w:w="8218" w:type="dxa"/>
+            <w:tcW w:w="8330" w:type="dxa"/>
           </w:tcPr>
           <w:p>
             <w:pPr>
@@ -975,12 +949,9 @@
         </w:tc>
       </w:tr>
       <w:tr>
-        <w:trPr>
-          <w:cantSplit/>
-        </w:trPr>
-        <w:tc>
-          <w:tcPr>
-            <w:tcW w:w="2099" w:type="dxa"/>
+        <w:tc>
+          <w:tcPr>
+            <w:tcW w:w="2101" w:type="dxa"/>
           </w:tcPr>
           <w:p>
             <w:pPr>
@@ -997,7 +968,7 @@
         </w:tc>
         <w:tc>
           <w:tcPr>
-            <w:tcW w:w="8218" w:type="dxa"/>
+            <w:tcW w:w="8330" w:type="dxa"/>
           </w:tcPr>
           <w:p>
             <w:pPr>
@@ -1014,12 +985,9 @@
         </w:tc>
       </w:tr>
       <w:tr>
-        <w:trPr>
-          <w:cantSplit/>
-        </w:trPr>
-        <w:tc>
-          <w:tcPr>
-            <w:tcW w:w="2099" w:type="dxa"/>
+        <w:tc>
+          <w:tcPr>
+            <w:tcW w:w="2101" w:type="dxa"/>
           </w:tcPr>
           <w:p>
             <w:pPr>
@@ -1036,7 +1004,7 @@
         </w:tc>
         <w:tc>
           <w:tcPr>
-            <w:tcW w:w="8218" w:type="dxa"/>
+            <w:tcW w:w="8330" w:type="dxa"/>
           </w:tcPr>
           <w:p>
             <w:pPr>
@@ -1174,7 +1142,7 @@
     <w:tbl>
       <w:tblPr>
         <w:tblStyle w:val="TWTable"/>
-        <w:tblW w:w="10318" w:type="dxa"/>
+        <w:tblW w:w="10432" w:type="dxa"/>
         <w:tblBorders>
           <w:top w:val="single" w:sz="4" w:space="0" w:color="D8DCE1"/>
           <w:left w:val="single" w:sz="4" w:space="0" w:color="D8DCE1"/>
@@ -1192,18 +1160,17 @@
         </w:tblCellMar>
       </w:tblPr>
       <w:tblGrid>
-        <w:gridCol w:w="2579"/>
-        <w:gridCol w:w="6913"/>
-        <w:gridCol w:w="825"/>
+        <w:gridCol w:w="2608"/>
+        <w:gridCol w:w="6989"/>
+        <w:gridCol w:w="834"/>
       </w:tblGrid>
       <w:tr>
         <w:trPr>
-          <w:cantSplit/>
           <w:tblHeader/>
         </w:trPr>
         <w:tc>
           <w:tcPr>
-            <w:tcW w:w="2579" w:type="dxa"/>
+            <w:tcW w:w="2608" w:type="dxa"/>
             <w:shd w:val="clear" w:color="auto" w:fill="F1F3F5"/>
           </w:tcPr>
           <w:p>
@@ -1223,7 +1190,7 @@
         </w:tc>
         <w:tc>
           <w:tcPr>
-            <w:tcW w:w="6913" w:type="dxa"/>
+            <w:tcW w:w="6989" w:type="dxa"/>
             <w:shd w:val="clear" w:color="auto" w:fill="F1F3F5"/>
           </w:tcPr>
           <w:p>
@@ -1243,7 +1210,7 @@
         </w:tc>
         <w:tc>
           <w:tcPr>
-            <w:tcW w:w="825" w:type="dxa"/>
+            <w:tcW w:w="834" w:type="dxa"/>
             <w:shd w:val="clear" w:color="auto" w:fill="F1F3F5"/>
           </w:tcPr>
           <w:p>
@@ -1263,12 +1230,9 @@
         </w:tc>
       </w:tr>
       <w:tr>
-        <w:trPr>
-          <w:cantSplit/>
-        </w:trPr>
-        <w:tc>
-          <w:tcPr>
-            <w:tcW w:w="2579" w:type="dxa"/>
+        <w:tc>
+          <w:tcPr>
+            <w:tcW w:w="2608" w:type="dxa"/>
           </w:tcPr>
           <w:p>
             <w:pPr>
@@ -1285,7 +1249,7 @@
         </w:tc>
         <w:tc>
           <w:tcPr>
-            <w:tcW w:w="6913" w:type="dxa"/>
+            <w:tcW w:w="6989" w:type="dxa"/>
           </w:tcPr>
           <w:p>
             <w:pPr>
@@ -1334,7 +1298,7 @@
         </w:tc>
         <w:tc>
           <w:tcPr>
-            <w:tcW w:w="825" w:type="dxa"/>
+            <w:tcW w:w="834" w:type="dxa"/>
           </w:tcPr>
           <w:p>
             <w:pPr>
@@ -1351,12 +1315,9 @@
         </w:tc>
       </w:tr>
       <w:tr>
-        <w:trPr>
-          <w:cantSplit/>
-        </w:trPr>
-        <w:tc>
-          <w:tcPr>
-            <w:tcW w:w="2579" w:type="dxa"/>
+        <w:tc>
+          <w:tcPr>
+            <w:tcW w:w="2608" w:type="dxa"/>
           </w:tcPr>
           <w:p>
             <w:pPr>
@@ -1373,7 +1334,7 @@
         </w:tc>
         <w:tc>
           <w:tcPr>
-            <w:tcW w:w="6913" w:type="dxa"/>
+            <w:tcW w:w="6989" w:type="dxa"/>
           </w:tcPr>
           <w:p>
             <w:pPr>
@@ -1406,7 +1367,7 @@
         </w:tc>
         <w:tc>
           <w:tcPr>
-            <w:tcW w:w="825" w:type="dxa"/>
+            <w:tcW w:w="834" w:type="dxa"/>
           </w:tcPr>
           <w:p>
             <w:pPr>
@@ -1423,12 +1384,9 @@
         </w:tc>
       </w:tr>
       <w:tr>
-        <w:trPr>
-          <w:cantSplit/>
-        </w:trPr>
-        <w:tc>
-          <w:tcPr>
-            <w:tcW w:w="2579" w:type="dxa"/>
+        <w:tc>
+          <w:tcPr>
+            <w:tcW w:w="2608" w:type="dxa"/>
           </w:tcPr>
           <w:p>
             <w:pPr>
@@ -1445,7 +1403,7 @@
         </w:tc>
         <w:tc>
           <w:tcPr>
-            <w:tcW w:w="6913" w:type="dxa"/>
+            <w:tcW w:w="6989" w:type="dxa"/>
           </w:tcPr>
           <w:p>
             <w:pPr>
@@ -1494,7 +1452,7 @@
         </w:tc>
         <w:tc>
           <w:tcPr>
-            <w:tcW w:w="825" w:type="dxa"/>
+            <w:tcW w:w="834" w:type="dxa"/>
           </w:tcPr>
           <w:p>
             <w:pPr>
@@ -1511,12 +1469,9 @@
         </w:tc>
       </w:tr>
       <w:tr>
-        <w:trPr>
-          <w:cantSplit/>
-        </w:trPr>
-        <w:tc>
-          <w:tcPr>
-            <w:tcW w:w="2579" w:type="dxa"/>
+        <w:tc>
+          <w:tcPr>
+            <w:tcW w:w="2608" w:type="dxa"/>
           </w:tcPr>
           <w:p>
             <w:pPr>
@@ -1533,7 +1488,7 @@
         </w:tc>
         <w:tc>
           <w:tcPr>
-            <w:tcW w:w="6913" w:type="dxa"/>
+            <w:tcW w:w="6989" w:type="dxa"/>
           </w:tcPr>
           <w:p>
             <w:pPr>
@@ -1566,7 +1521,7 @@
         </w:tc>
         <w:tc>
           <w:tcPr>
-            <w:tcW w:w="825" w:type="dxa"/>
+            <w:tcW w:w="834" w:type="dxa"/>
           </w:tcPr>
           <w:p>
             <w:pPr>
@@ -1583,12 +1538,9 @@
         </w:tc>
       </w:tr>
       <w:tr>
-        <w:trPr>
-          <w:cantSplit/>
-        </w:trPr>
-        <w:tc>
-          <w:tcPr>
-            <w:tcW w:w="2579" w:type="dxa"/>
+        <w:tc>
+          <w:tcPr>
+            <w:tcW w:w="2608" w:type="dxa"/>
           </w:tcPr>
           <w:p>
             <w:pPr>
@@ -1605,7 +1557,7 @@
         </w:tc>
         <w:tc>
           <w:tcPr>
-            <w:tcW w:w="6913" w:type="dxa"/>
+            <w:tcW w:w="6989" w:type="dxa"/>
           </w:tcPr>
           <w:p>
             <w:pPr>
@@ -1622,7 +1574,7 @@
         </w:tc>
         <w:tc>
           <w:tcPr>
-            <w:tcW w:w="825" w:type="dxa"/>
+            <w:tcW w:w="834" w:type="dxa"/>
           </w:tcPr>
           <w:p>
             <w:pPr>
@@ -1680,7 +1632,7 @@
     <w:tbl>
       <w:tblPr>
         <w:tblStyle w:val="TWTable"/>
-        <w:tblW w:w="10318" w:type="dxa"/>
+        <w:tblW w:w="10432" w:type="dxa"/>
         <w:tblBorders>
           <w:top w:val="single" w:sz="4" w:space="0" w:color="D8DCE1"/>
           <w:left w:val="single" w:sz="4" w:space="0" w:color="D8DCE1"/>
@@ -1698,19 +1650,18 @@
         </w:tblCellMar>
       </w:tblPr>
       <w:tblGrid>
-        <w:gridCol w:w="1754"/>
-        <w:gridCol w:w="1134"/>
-        <w:gridCol w:w="6603"/>
-        <w:gridCol w:w="825"/>
+        <w:gridCol w:w="1773"/>
+        <w:gridCol w:w="1147"/>
+        <w:gridCol w:w="6676"/>
+        <w:gridCol w:w="834"/>
       </w:tblGrid>
       <w:tr>
         <w:trPr>
-          <w:cantSplit/>
           <w:tblHeader/>
         </w:trPr>
         <w:tc>
           <w:tcPr>
-            <w:tcW w:w="1754" w:type="dxa"/>
+            <w:tcW w:w="1773" w:type="dxa"/>
             <w:shd w:val="clear" w:color="auto" w:fill="F1F3F5"/>
           </w:tcPr>
           <w:p>
@@ -1730,7 +1681,7 @@
         </w:tc>
         <w:tc>
           <w:tcPr>
-            <w:tcW w:w="1134" w:type="dxa"/>
+            <w:tcW w:w="1147" w:type="dxa"/>
             <w:shd w:val="clear" w:color="auto" w:fill="F1F3F5"/>
           </w:tcPr>
           <w:p>
@@ -1750,7 +1701,7 @@
         </w:tc>
         <w:tc>
           <w:tcPr>
-            <w:tcW w:w="6603" w:type="dxa"/>
+            <w:tcW w:w="6676" w:type="dxa"/>
             <w:shd w:val="clear" w:color="auto" w:fill="F1F3F5"/>
           </w:tcPr>
           <w:p>
@@ -1770,7 +1721,7 @@
         </w:tc>
         <w:tc>
           <w:tcPr>
-            <w:tcW w:w="825" w:type="dxa"/>
+            <w:tcW w:w="834" w:type="dxa"/>
             <w:shd w:val="clear" w:color="auto" w:fill="F1F3F5"/>
           </w:tcPr>
           <w:p>
@@ -1790,12 +1741,9 @@
         </w:tc>
       </w:tr>
       <w:tr>
-        <w:trPr>
-          <w:cantSplit/>
-        </w:trPr>
-        <w:tc>
-          <w:tcPr>
-            <w:tcW w:w="1754" w:type="dxa"/>
+        <w:tc>
+          <w:tcPr>
+            <w:tcW w:w="1773" w:type="dxa"/>
           </w:tcPr>
           <w:p>
             <w:pPr>
@@ -1812,7 +1760,7 @@
         </w:tc>
         <w:tc>
           <w:tcPr>
-            <w:tcW w:w="1134" w:type="dxa"/>
+            <w:tcW w:w="1147" w:type="dxa"/>
           </w:tcPr>
           <w:p>
             <w:pPr>
@@ -1829,7 +1777,7 @@
         </w:tc>
         <w:tc>
           <w:tcPr>
-            <w:tcW w:w="6603" w:type="dxa"/>
+            <w:tcW w:w="6676" w:type="dxa"/>
           </w:tcPr>
           <w:p>
             <w:pPr>
@@ -1846,7 +1794,7 @@
         </w:tc>
         <w:tc>
           <w:tcPr>
-            <w:tcW w:w="825" w:type="dxa"/>
+            <w:tcW w:w="834" w:type="dxa"/>
           </w:tcPr>
           <w:p>
             <w:pPr>
@@ -1863,12 +1811,9 @@
         </w:tc>
       </w:tr>
       <w:tr>
-        <w:trPr>
-          <w:cantSplit/>
-        </w:trPr>
-        <w:tc>
-          <w:tcPr>
-            <w:tcW w:w="1754" w:type="dxa"/>
+        <w:tc>
+          <w:tcPr>
+            <w:tcW w:w="1773" w:type="dxa"/>
           </w:tcPr>
           <w:p>
             <w:pPr>
@@ -1885,7 +1830,7 @@
         </w:tc>
         <w:tc>
           <w:tcPr>
-            <w:tcW w:w="1134" w:type="dxa"/>
+            <w:tcW w:w="1147" w:type="dxa"/>
           </w:tcPr>
           <w:p>
             <w:pPr>
@@ -1902,7 +1847,7 @@
         </w:tc>
         <w:tc>
           <w:tcPr>
-            <w:tcW w:w="6603" w:type="dxa"/>
+            <w:tcW w:w="6676" w:type="dxa"/>
           </w:tcPr>
           <w:p>
             <w:pPr>
@@ -1919,7 +1864,7 @@
         </w:tc>
         <w:tc>
           <w:tcPr>
-            <w:tcW w:w="825" w:type="dxa"/>
+            <w:tcW w:w="834" w:type="dxa"/>
           </w:tcPr>
           <w:p>
             <w:pPr>
@@ -1936,12 +1881,9 @@
         </w:tc>
       </w:tr>
       <w:tr>
-        <w:trPr>
-          <w:cantSplit/>
-        </w:trPr>
-        <w:tc>
-          <w:tcPr>
-            <w:tcW w:w="1754" w:type="dxa"/>
+        <w:tc>
+          <w:tcPr>
+            <w:tcW w:w="1773" w:type="dxa"/>
           </w:tcPr>
           <w:p>
             <w:pPr>
@@ -1958,7 +1900,7 @@
         </w:tc>
         <w:tc>
           <w:tcPr>
-            <w:tcW w:w="1134" w:type="dxa"/>
+            <w:tcW w:w="1147" w:type="dxa"/>
           </w:tcPr>
           <w:p>
             <w:pPr>
@@ -1975,7 +1917,7 @@
         </w:tc>
         <w:tc>
           <w:tcPr>
-            <w:tcW w:w="6603" w:type="dxa"/>
+            <w:tcW w:w="6676" w:type="dxa"/>
           </w:tcPr>
           <w:p>
             <w:pPr>
@@ -1992,7 +1934,7 @@
         </w:tc>
         <w:tc>
           <w:tcPr>
-            <w:tcW w:w="825" w:type="dxa"/>
+            <w:tcW w:w="834" w:type="dxa"/>
           </w:tcPr>
           <w:p>
             <w:pPr>
@@ -2009,12 +1951,9 @@
         </w:tc>
       </w:tr>
       <w:tr>
-        <w:trPr>
-          <w:cantSplit/>
-        </w:trPr>
-        <w:tc>
-          <w:tcPr>
-            <w:tcW w:w="1754" w:type="dxa"/>
+        <w:tc>
+          <w:tcPr>
+            <w:tcW w:w="1773" w:type="dxa"/>
           </w:tcPr>
           <w:p>
             <w:pPr>
@@ -2031,7 +1970,7 @@
         </w:tc>
         <w:tc>
           <w:tcPr>
-            <w:tcW w:w="1134" w:type="dxa"/>
+            <w:tcW w:w="1147" w:type="dxa"/>
           </w:tcPr>
           <w:p>
             <w:pPr>
@@ -2048,7 +1987,7 @@
         </w:tc>
         <w:tc>
           <w:tcPr>
-            <w:tcW w:w="6603" w:type="dxa"/>
+            <w:tcW w:w="6676" w:type="dxa"/>
           </w:tcPr>
           <w:p>
             <w:pPr>
@@ -2065,7 +2004,7 @@
         </w:tc>
         <w:tc>
           <w:tcPr>
-            <w:tcW w:w="825" w:type="dxa"/>
+            <w:tcW w:w="834" w:type="dxa"/>
           </w:tcPr>
           <w:p>
             <w:pPr>
@@ -2082,12 +2021,9 @@
         </w:tc>
       </w:tr>
       <w:tr>
-        <w:trPr>
-          <w:cantSplit/>
-        </w:trPr>
-        <w:tc>
-          <w:tcPr>
-            <w:tcW w:w="1754" w:type="dxa"/>
+        <w:tc>
+          <w:tcPr>
+            <w:tcW w:w="1773" w:type="dxa"/>
           </w:tcPr>
           <w:p>
             <w:pPr>
@@ -2104,7 +2040,7 @@
         </w:tc>
         <w:tc>
           <w:tcPr>
-            <w:tcW w:w="1134" w:type="dxa"/>
+            <w:tcW w:w="1147" w:type="dxa"/>
           </w:tcPr>
           <w:p>
             <w:pPr>
@@ -2121,7 +2057,7 @@
         </w:tc>
         <w:tc>
           <w:tcPr>
-            <w:tcW w:w="6603" w:type="dxa"/>
+            <w:tcW w:w="6676" w:type="dxa"/>
           </w:tcPr>
           <w:p>
             <w:pPr>
@@ -2138,7 +2074,7 @@
         </w:tc>
         <w:tc>
           <w:tcPr>
-            <w:tcW w:w="825" w:type="dxa"/>
+            <w:tcW w:w="834" w:type="dxa"/>
           </w:tcPr>
           <w:p>
             <w:pPr>
@@ -2155,12 +2091,9 @@
         </w:tc>
       </w:tr>
       <w:tr>
-        <w:trPr>
-          <w:cantSplit/>
-        </w:trPr>
-        <w:tc>
-          <w:tcPr>
-            <w:tcW w:w="1754" w:type="dxa"/>
+        <w:tc>
+          <w:tcPr>
+            <w:tcW w:w="1773" w:type="dxa"/>
           </w:tcPr>
           <w:p>
             <w:pPr>
@@ -2177,7 +2110,7 @@
         </w:tc>
         <w:tc>
           <w:tcPr>
-            <w:tcW w:w="1134" w:type="dxa"/>
+            <w:tcW w:w="1147" w:type="dxa"/>
           </w:tcPr>
           <w:p>
             <w:pPr>
@@ -2194,7 +2127,7 @@
         </w:tc>
         <w:tc>
           <w:tcPr>
-            <w:tcW w:w="6603" w:type="dxa"/>
+            <w:tcW w:w="6676" w:type="dxa"/>
           </w:tcPr>
           <w:p>
             <w:pPr>
@@ -2211,7 +2144,7 @@
         </w:tc>
         <w:tc>
           <w:tcPr>
-            <w:tcW w:w="825" w:type="dxa"/>
+            <w:tcW w:w="834" w:type="dxa"/>
           </w:tcPr>
           <w:p>
             <w:pPr>
@@ -2244,7 +2177,7 @@
     <w:tbl>
       <w:tblPr>
         <w:tblStyle w:val="TWTable"/>
-        <w:tblW w:w="10318" w:type="dxa"/>
+        <w:tblW w:w="10432" w:type="dxa"/>
         <w:tblBorders>
           <w:top w:val="single" w:sz="4" w:space="0" w:color="D8DCE1"/>
           <w:left w:val="single" w:sz="4" w:space="0" w:color="D8DCE1"/>
@@ -2263,11 +2196,10 @@
       </w:tblPr>
       <w:tblGrid>
         <w:gridCol w:w="975"/>
-        <w:gridCol w:w="9342"/>
+        <w:gridCol w:w="9456"/>
       </w:tblGrid>
       <w:tr>
         <w:trPr>
-          <w:cantSplit/>
           <w:tblHeader/>
         </w:trPr>
         <w:tc>
@@ -2292,7 +2224,7 @@
         </w:tc>
         <w:tc>
           <w:tcPr>
-            <w:tcW w:w="9342" w:type="dxa"/>
+            <w:tcW w:w="9456" w:type="dxa"/>
             <w:shd w:val="clear" w:color="auto" w:fill="F1F3F5"/>
           </w:tcPr>
           <w:p>
@@ -2312,9 +2244,6 @@
         </w:tc>
       </w:tr>
       <w:tr>
-        <w:trPr>
-          <w:cantSplit/>
-        </w:trPr>
         <w:tc>
           <w:tcPr>
             <w:tcW w:w="975" w:type="dxa"/>
@@ -2334,7 +2263,7 @@
         </w:tc>
         <w:tc>
           <w:tcPr>
-            <w:tcW w:w="9342" w:type="dxa"/>
+            <w:tcW w:w="9456" w:type="dxa"/>
           </w:tcPr>
           <w:p>
             <w:pPr>
@@ -2351,9 +2280,6 @@
         </w:tc>
       </w:tr>
       <w:tr>
-        <w:trPr>
-          <w:cantSplit/>
-        </w:trPr>
         <w:tc>
           <w:tcPr>
             <w:tcW w:w="975" w:type="dxa"/>
@@ -2373,7 +2299,7 @@
         </w:tc>
         <w:tc>
           <w:tcPr>
-            <w:tcW w:w="9342" w:type="dxa"/>
+            <w:tcW w:w="9456" w:type="dxa"/>
           </w:tcPr>
           <w:p>
             <w:pPr>
@@ -2399,9 +2325,6 @@
         </w:tc>
       </w:tr>
       <w:tr>
-        <w:trPr>
-          <w:cantSplit/>
-        </w:trPr>
         <w:tc>
           <w:tcPr>
             <w:tcW w:w="975" w:type="dxa"/>
@@ -2421,7 +2344,7 @@
         </w:tc>
         <w:tc>
           <w:tcPr>
-            <w:tcW w:w="9342" w:type="dxa"/>
+            <w:tcW w:w="9456" w:type="dxa"/>
           </w:tcPr>
           <w:p>
             <w:pPr>
@@ -2438,9 +2361,6 @@
         </w:tc>
       </w:tr>
       <w:tr>
-        <w:trPr>
-          <w:cantSplit/>
-        </w:trPr>
         <w:tc>
           <w:tcPr>
             <w:tcW w:w="975" w:type="dxa"/>
@@ -2460,7 +2380,7 @@
         </w:tc>
         <w:tc>
           <w:tcPr>
-            <w:tcW w:w="9342" w:type="dxa"/>
+            <w:tcW w:w="9456" w:type="dxa"/>
           </w:tcPr>
           <w:p>
             <w:pPr>
@@ -2501,7 +2421,7 @@
     <w:tbl>
       <w:tblPr>
         <w:tblStyle w:val="TWTable"/>
-        <w:tblW w:w="10318" w:type="dxa"/>
+        <w:tblW w:w="10432" w:type="dxa"/>
         <w:tblBorders>
           <w:top w:val="single" w:sz="4" w:space="0" w:color="D8DCE1"/>
           <w:left w:val="single" w:sz="4" w:space="0" w:color="D8DCE1"/>
@@ -2519,24 +2439,23 @@
         </w:tblCellMar>
       </w:tblPr>
       <w:tblGrid>
-        <w:gridCol w:w="1209"/>
-        <w:gridCol w:w="537"/>
-        <w:gridCol w:w="537"/>
-        <w:gridCol w:w="710"/>
-        <w:gridCol w:w="1698"/>
-        <w:gridCol w:w="1056"/>
-        <w:gridCol w:w="1153"/>
-        <w:gridCol w:w="628"/>
-        <w:gridCol w:w="2785"/>
+        <w:gridCol w:w="1222"/>
+        <w:gridCol w:w="543"/>
+        <w:gridCol w:w="543"/>
+        <w:gridCol w:w="718"/>
+        <w:gridCol w:w="1717"/>
+        <w:gridCol w:w="1067"/>
+        <w:gridCol w:w="1165"/>
+        <w:gridCol w:w="635"/>
+        <w:gridCol w:w="2816"/>
       </w:tblGrid>
       <w:tr>
         <w:trPr>
-          <w:cantSplit/>
           <w:tblHeader/>
         </w:trPr>
         <w:tc>
           <w:tcPr>
-            <w:tcW w:w="1209" w:type="dxa"/>
+            <w:tcW w:w="1222" w:type="dxa"/>
             <w:shd w:val="clear" w:color="auto" w:fill="F1F3F5"/>
           </w:tcPr>
           <w:p>
@@ -2556,7 +2475,7 @@
         </w:tc>
         <w:tc>
           <w:tcPr>
-            <w:tcW w:w="537" w:type="dxa"/>
+            <w:tcW w:w="543" w:type="dxa"/>
             <w:shd w:val="clear" w:color="auto" w:fill="F1F3F5"/>
           </w:tcPr>
           <w:p>
@@ -2577,7 +2496,7 @@
         </w:tc>
         <w:tc>
           <w:tcPr>
-            <w:tcW w:w="537" w:type="dxa"/>
+            <w:tcW w:w="543" w:type="dxa"/>
             <w:shd w:val="clear" w:color="auto" w:fill="F1F3F5"/>
           </w:tcPr>
           <w:p>
@@ -2598,7 +2517,7 @@
         </w:tc>
         <w:tc>
           <w:tcPr>
-            <w:tcW w:w="710" w:type="dxa"/>
+            <w:tcW w:w="718" w:type="dxa"/>
             <w:shd w:val="clear" w:color="auto" w:fill="F1F3F5"/>
           </w:tcPr>
           <w:p>
@@ -2619,7 +2538,7 @@
         </w:tc>
         <w:tc>
           <w:tcPr>
-            <w:tcW w:w="1698" w:type="dxa"/>
+            <w:tcW w:w="1717" w:type="dxa"/>
             <w:shd w:val="clear" w:color="auto" w:fill="F1F3F5"/>
           </w:tcPr>
           <w:p>
@@ -2658,7 +2577,7 @@
         </w:tc>
         <w:tc>
           <w:tcPr>
-            <w:tcW w:w="1056" w:type="dxa"/>
+            <w:tcW w:w="1067" w:type="dxa"/>
             <w:shd w:val="clear" w:color="auto" w:fill="F1F3F5"/>
           </w:tcPr>
           <w:p>
@@ -2697,7 +2616,7 @@
         </w:tc>
         <w:tc>
           <w:tcPr>
-            <w:tcW w:w="1153" w:type="dxa"/>
+            <w:tcW w:w="1165" w:type="dxa"/>
             <w:shd w:val="clear" w:color="auto" w:fill="F1F3F5"/>
           </w:tcPr>
           <w:p>
@@ -2718,7 +2637,7 @@
         </w:tc>
         <w:tc>
           <w:tcPr>
-            <w:tcW w:w="628" w:type="dxa"/>
+            <w:tcW w:w="635" w:type="dxa"/>
             <w:shd w:val="clear" w:color="auto" w:fill="F1F3F5"/>
           </w:tcPr>
           <w:p>
@@ -2739,7 +2658,7 @@
         </w:tc>
         <w:tc>
           <w:tcPr>
-            <w:tcW w:w="2785" w:type="dxa"/>
+            <w:tcW w:w="2816" w:type="dxa"/>
             <w:shd w:val="clear" w:color="auto" w:fill="F1F3F5"/>
           </w:tcPr>
           <w:p>
@@ -2759,12 +2678,9 @@
         </w:tc>
       </w:tr>
       <w:tr>
-        <w:trPr>
-          <w:cantSplit/>
-        </w:trPr>
-        <w:tc>
-          <w:tcPr>
-            <w:tcW w:w="1209" w:type="dxa"/>
+        <w:tc>
+          <w:tcPr>
+            <w:tcW w:w="1222" w:type="dxa"/>
           </w:tcPr>
           <w:p>
             <w:pPr>
@@ -2781,7 +2697,7 @@
         </w:tc>
         <w:tc>
           <w:tcPr>
-            <w:tcW w:w="537" w:type="dxa"/>
+            <w:tcW w:w="543" w:type="dxa"/>
           </w:tcPr>
           <w:p>
             <w:pPr>
@@ -2799,7 +2715,7 @@
         </w:tc>
         <w:tc>
           <w:tcPr>
-            <w:tcW w:w="537" w:type="dxa"/>
+            <w:tcW w:w="543" w:type="dxa"/>
           </w:tcPr>
           <w:p>
             <w:pPr>
@@ -2817,7 +2733,7 @@
         </w:tc>
         <w:tc>
           <w:tcPr>
-            <w:tcW w:w="710" w:type="dxa"/>
+            <w:tcW w:w="718" w:type="dxa"/>
           </w:tcPr>
           <w:p>
             <w:pPr>
@@ -2835,7 +2751,7 @@
         </w:tc>
         <w:tc>
           <w:tcPr>
-            <w:tcW w:w="1698" w:type="dxa"/>
+            <w:tcW w:w="1717" w:type="dxa"/>
           </w:tcPr>
           <w:p>
             <w:pPr>
@@ -2869,7 +2785,7 @@
         </w:tc>
         <w:tc>
           <w:tcPr>
-            <w:tcW w:w="1056" w:type="dxa"/>
+            <w:tcW w:w="1067" w:type="dxa"/>
           </w:tcPr>
           <w:p>
             <w:pPr>
@@ -2887,7 +2803,7 @@
         </w:tc>
         <w:tc>
           <w:tcPr>
-            <w:tcW w:w="1153" w:type="dxa"/>
+            <w:tcW w:w="1165" w:type="dxa"/>
           </w:tcPr>
           <w:p>
             <w:pPr>
@@ -2905,7 +2821,7 @@
         </w:tc>
         <w:tc>
           <w:tcPr>
-            <w:tcW w:w="628" w:type="dxa"/>
+            <w:tcW w:w="635" w:type="dxa"/>
           </w:tcPr>
           <w:p>
             <w:pPr>
@@ -2923,7 +2839,7 @@
         </w:tc>
         <w:tc>
           <w:tcPr>
-            <w:tcW w:w="2785" w:type="dxa"/>
+            <w:tcW w:w="2816" w:type="dxa"/>
           </w:tcPr>
           <w:p>
             <w:pPr>
@@ -2956,12 +2872,9 @@
         </w:tc>
       </w:tr>
       <w:tr>
-        <w:trPr>
-          <w:cantSplit/>
-        </w:trPr>
-        <w:tc>
-          <w:tcPr>
-            <w:tcW w:w="1209" w:type="dxa"/>
+        <w:tc>
+          <w:tcPr>
+            <w:tcW w:w="1222" w:type="dxa"/>
           </w:tcPr>
           <w:p>
             <w:pPr>
@@ -2978,7 +2891,7 @@
         </w:tc>
         <w:tc>
           <w:tcPr>
-            <w:tcW w:w="537" w:type="dxa"/>
+            <w:tcW w:w="543" w:type="dxa"/>
           </w:tcPr>
           <w:p>
             <w:pPr>
@@ -2996,7 +2909,7 @@
         </w:tc>
         <w:tc>
           <w:tcPr>
-            <w:tcW w:w="537" w:type="dxa"/>
+            <w:tcW w:w="543" w:type="dxa"/>
           </w:tcPr>
           <w:p>
             <w:pPr>
@@ -3014,7 +2927,7 @@
         </w:tc>
         <w:tc>
           <w:tcPr>
-            <w:tcW w:w="710" w:type="dxa"/>
+            <w:tcW w:w="718" w:type="dxa"/>
           </w:tcPr>
           <w:p>
             <w:pPr>
@@ -3032,7 +2945,7 @@
         </w:tc>
         <w:tc>
           <w:tcPr>
-            <w:tcW w:w="1698" w:type="dxa"/>
+            <w:tcW w:w="1717" w:type="dxa"/>
           </w:tcPr>
           <w:p>
             <w:pPr>
@@ -3066,7 +2979,7 @@
         </w:tc>
         <w:tc>
           <w:tcPr>
-            <w:tcW w:w="1056" w:type="dxa"/>
+            <w:tcW w:w="1067" w:type="dxa"/>
           </w:tcPr>
           <w:p>
             <w:pPr>
@@ -3084,7 +2997,7 @@
         </w:tc>
         <w:tc>
           <w:tcPr>
-            <w:tcW w:w="1153" w:type="dxa"/>
+            <w:tcW w:w="1165" w:type="dxa"/>
           </w:tcPr>
           <w:p>
             <w:pPr>
@@ -3102,7 +3015,7 @@
         </w:tc>
         <w:tc>
           <w:tcPr>
-            <w:tcW w:w="628" w:type="dxa"/>
+            <w:tcW w:w="635" w:type="dxa"/>
           </w:tcPr>
           <w:p>
             <w:pPr>
@@ -3120,7 +3033,7 @@
         </w:tc>
         <w:tc>
           <w:tcPr>
-            <w:tcW w:w="2785" w:type="dxa"/>
+            <w:tcW w:w="2816" w:type="dxa"/>
           </w:tcPr>
           <w:p>
             <w:pPr>
@@ -3153,12 +3066,9 @@
         </w:tc>
       </w:tr>
       <w:tr>
-        <w:trPr>
-          <w:cantSplit/>
-        </w:trPr>
-        <w:tc>
-          <w:tcPr>
-            <w:tcW w:w="1209" w:type="dxa"/>
+        <w:tc>
+          <w:tcPr>
+            <w:tcW w:w="1222" w:type="dxa"/>
           </w:tcPr>
           <w:p>
             <w:pPr>
@@ -3175,7 +3085,7 @@
         </w:tc>
         <w:tc>
           <w:tcPr>
-            <w:tcW w:w="537" w:type="dxa"/>
+            <w:tcW w:w="543" w:type="dxa"/>
           </w:tcPr>
           <w:p>
             <w:pPr>
@@ -3193,7 +3103,7 @@
         </w:tc>
         <w:tc>
           <w:tcPr>
-            <w:tcW w:w="537" w:type="dxa"/>
+            <w:tcW w:w="543" w:type="dxa"/>
           </w:tcPr>
           <w:p>
             <w:pPr>
@@ -3211,7 +3121,7 @@
         </w:tc>
         <w:tc>
           <w:tcPr>
-            <w:tcW w:w="710" w:type="dxa"/>
+            <w:tcW w:w="718" w:type="dxa"/>
           </w:tcPr>
           <w:p>
             <w:pPr>
@@ -3229,7 +3139,7 @@
         </w:tc>
         <w:tc>
           <w:tcPr>
-            <w:tcW w:w="1698" w:type="dxa"/>
+            <w:tcW w:w="1717" w:type="dxa"/>
           </w:tcPr>
           <w:p>
             <w:pPr>
@@ -3263,7 +3173,7 @@
         </w:tc>
         <w:tc>
           <w:tcPr>
-            <w:tcW w:w="1056" w:type="dxa"/>
+            <w:tcW w:w="1067" w:type="dxa"/>
           </w:tcPr>
           <w:p>
             <w:pPr>
@@ -3281,7 +3191,7 @@
         </w:tc>
         <w:tc>
           <w:tcPr>
-            <w:tcW w:w="1153" w:type="dxa"/>
+            <w:tcW w:w="1165" w:type="dxa"/>
           </w:tcPr>
           <w:p>
             <w:pPr>
@@ -3299,7 +3209,7 @@
         </w:tc>
         <w:tc>
           <w:tcPr>
-            <w:tcW w:w="628" w:type="dxa"/>
+            <w:tcW w:w="635" w:type="dxa"/>
           </w:tcPr>
           <w:p>
             <w:pPr>
@@ -3317,7 +3227,7 @@
         </w:tc>
         <w:tc>
           <w:tcPr>
-            <w:tcW w:w="2785" w:type="dxa"/>
+            <w:tcW w:w="2816" w:type="dxa"/>
           </w:tcPr>
           <w:p>
             <w:pPr>
@@ -3350,12 +3260,9 @@
         </w:tc>
       </w:tr>
       <w:tr>
-        <w:trPr>
-          <w:cantSplit/>
-        </w:trPr>
-        <w:tc>
-          <w:tcPr>
-            <w:tcW w:w="1209" w:type="dxa"/>
+        <w:tc>
+          <w:tcPr>
+            <w:tcW w:w="1222" w:type="dxa"/>
           </w:tcPr>
           <w:p>
             <w:pPr>
@@ -3386,7 +3293,7 @@
         </w:tc>
         <w:tc>
           <w:tcPr>
-            <w:tcW w:w="537" w:type="dxa"/>
+            <w:tcW w:w="543" w:type="dxa"/>
           </w:tcPr>
           <w:p>
             <w:pPr>
@@ -3404,7 +3311,7 @@
         </w:tc>
         <w:tc>
           <w:tcPr>
-            <w:tcW w:w="537" w:type="dxa"/>
+            <w:tcW w:w="543" w:type="dxa"/>
           </w:tcPr>
           <w:p>
             <w:pPr>
@@ -3422,7 +3329,7 @@
         </w:tc>
         <w:tc>
           <w:tcPr>
-            <w:tcW w:w="710" w:type="dxa"/>
+            <w:tcW w:w="718" w:type="dxa"/>
           </w:tcPr>
           <w:p>
             <w:pPr>
@@ -3440,7 +3347,7 @@
         </w:tc>
         <w:tc>
           <w:tcPr>
-            <w:tcW w:w="1698" w:type="dxa"/>
+            <w:tcW w:w="1717" w:type="dxa"/>
           </w:tcPr>
           <w:p>
             <w:pPr>
@@ -3474,7 +3381,7 @@
         </w:tc>
         <w:tc>
           <w:tcPr>
-            <w:tcW w:w="1056" w:type="dxa"/>
+            <w:tcW w:w="1067" w:type="dxa"/>
           </w:tcPr>
           <w:p>
             <w:pPr>
@@ -3492,7 +3399,7 @@
         </w:tc>
         <w:tc>
           <w:tcPr>
-            <w:tcW w:w="1153" w:type="dxa"/>
+            <w:tcW w:w="1165" w:type="dxa"/>
           </w:tcPr>
           <w:p>
             <w:pPr>
@@ -3510,7 +3417,7 @@
         </w:tc>
         <w:tc>
           <w:tcPr>
-            <w:tcW w:w="628" w:type="dxa"/>
+            <w:tcW w:w="635" w:type="dxa"/>
           </w:tcPr>
           <w:p>
             <w:pPr>
@@ -3528,7 +3435,7 @@
         </w:tc>
         <w:tc>
           <w:tcPr>
-            <w:tcW w:w="2785" w:type="dxa"/>
+            <w:tcW w:w="2816" w:type="dxa"/>
           </w:tcPr>
           <w:p>
             <w:pPr>
@@ -3662,7 +3569,7 @@
     <w:tbl>
       <w:tblPr>
         <w:tblStyle w:val="TWTable"/>
-        <w:tblW w:w="10318" w:type="dxa"/>
+        <w:tblW w:w="10432" w:type="dxa"/>
         <w:tblBorders>
           <w:top w:val="single" w:sz="4" w:space="0" w:color="D8DCE1"/>
           <w:left w:val="single" w:sz="4" w:space="0" w:color="D8DCE1"/>
@@ -3680,21 +3587,20 @@
         </w:tblCellMar>
       </w:tblPr>
       <w:tblGrid>
-        <w:gridCol w:w="2785"/>
-        <w:gridCol w:w="4528"/>
-        <w:gridCol w:w="1026"/>
-        <w:gridCol w:w="713"/>
-        <w:gridCol w:w="540"/>
-        <w:gridCol w:w="723"/>
+        <w:gridCol w:w="2816"/>
+        <w:gridCol w:w="4578"/>
+        <w:gridCol w:w="1037"/>
+        <w:gridCol w:w="721"/>
+        <w:gridCol w:w="546"/>
+        <w:gridCol w:w="731"/>
       </w:tblGrid>
       <w:tr>
         <w:trPr>
-          <w:cantSplit/>
           <w:tblHeader/>
         </w:trPr>
         <w:tc>
           <w:tcPr>
-            <w:tcW w:w="2785" w:type="dxa"/>
+            <w:tcW w:w="2816" w:type="dxa"/>
             <w:shd w:val="clear" w:color="auto" w:fill="F1F3F5"/>
           </w:tcPr>
           <w:p>
@@ -3714,7 +3620,7 @@
         </w:tc>
         <w:tc>
           <w:tcPr>
-            <w:tcW w:w="4528" w:type="dxa"/>
+            <w:tcW w:w="4578" w:type="dxa"/>
             <w:shd w:val="clear" w:color="auto" w:fill="F1F3F5"/>
           </w:tcPr>
           <w:p>
@@ -3753,7 +3659,7 @@
         </w:tc>
         <w:tc>
           <w:tcPr>
-            <w:tcW w:w="1026" w:type="dxa"/>
+            <w:tcW w:w="1037" w:type="dxa"/>
             <w:shd w:val="clear" w:color="auto" w:fill="F1F3F5"/>
           </w:tcPr>
           <w:p>
@@ -3774,7 +3680,7 @@
         </w:tc>
         <w:tc>
           <w:tcPr>
-            <w:tcW w:w="713" w:type="dxa"/>
+            <w:tcW w:w="721" w:type="dxa"/>
             <w:shd w:val="clear" w:color="auto" w:fill="F1F3F5"/>
           </w:tcPr>
           <w:p>
@@ -3795,7 +3701,7 @@
         </w:tc>
         <w:tc>
           <w:tcPr>
-            <w:tcW w:w="540" w:type="dxa"/>
+            <w:tcW w:w="546" w:type="dxa"/>
             <w:shd w:val="clear" w:color="auto" w:fill="F1F3F5"/>
           </w:tcPr>
           <w:p>
@@ -3816,7 +3722,7 @@
         </w:tc>
         <w:tc>
           <w:tcPr>
-            <w:tcW w:w="723" w:type="dxa"/>
+            <w:tcW w:w="731" w:type="dxa"/>
             <w:shd w:val="clear" w:color="auto" w:fill="F1F3F5"/>
           </w:tcPr>
           <w:p>
@@ -3837,12 +3743,9 @@
         </w:tc>
       </w:tr>
       <w:tr>
-        <w:trPr>
-          <w:cantSplit/>
-        </w:trPr>
-        <w:tc>
-          <w:tcPr>
-            <w:tcW w:w="2785" w:type="dxa"/>
+        <w:tc>
+          <w:tcPr>
+            <w:tcW w:w="2816" w:type="dxa"/>
           </w:tcPr>
           <w:p>
             <w:pPr>
@@ -3859,7 +3762,7 @@
         </w:tc>
         <w:tc>
           <w:tcPr>
-            <w:tcW w:w="4528" w:type="dxa"/>
+            <w:tcW w:w="4578" w:type="dxa"/>
           </w:tcPr>
           <w:p>
             <w:pPr>
@@ -3877,7 +3780,7 @@
         </w:tc>
         <w:tc>
           <w:tcPr>
-            <w:tcW w:w="1026" w:type="dxa"/>
+            <w:tcW w:w="1037" w:type="dxa"/>
           </w:tcPr>
           <w:p>
             <w:pPr>
@@ -3895,7 +3798,7 @@
         </w:tc>
         <w:tc>
           <w:tcPr>
-            <w:tcW w:w="713" w:type="dxa"/>
+            <w:tcW w:w="721" w:type="dxa"/>
           </w:tcPr>
           <w:p>
             <w:pPr>
@@ -3913,7 +3816,7 @@
         </w:tc>
         <w:tc>
           <w:tcPr>
-            <w:tcW w:w="540" w:type="dxa"/>
+            <w:tcW w:w="546" w:type="dxa"/>
           </w:tcPr>
           <w:p>
             <w:pPr>
@@ -3931,7 +3834,7 @@
         </w:tc>
         <w:tc>
           <w:tcPr>
-            <w:tcW w:w="723" w:type="dxa"/>
+            <w:tcW w:w="731" w:type="dxa"/>
           </w:tcPr>
           <w:p>
             <w:pPr>
@@ -3949,12 +3852,9 @@
         </w:tc>
       </w:tr>
       <w:tr>
-        <w:trPr>
-          <w:cantSplit/>
-        </w:trPr>
-        <w:tc>
-          <w:tcPr>
-            <w:tcW w:w="2785" w:type="dxa"/>
+        <w:tc>
+          <w:tcPr>
+            <w:tcW w:w="2816" w:type="dxa"/>
           </w:tcPr>
           <w:p>
             <w:pPr>
@@ -3971,7 +3871,7 @@
         </w:tc>
         <w:tc>
           <w:tcPr>
-            <w:tcW w:w="4528" w:type="dxa"/>
+            <w:tcW w:w="4578" w:type="dxa"/>
           </w:tcPr>
           <w:p>
             <w:pPr>
@@ -3989,7 +3889,7 @@
         </w:tc>
         <w:tc>
           <w:tcPr>
-            <w:tcW w:w="1026" w:type="dxa"/>
+            <w:tcW w:w="1037" w:type="dxa"/>
           </w:tcPr>
           <w:p>
             <w:pPr>
@@ -4007,7 +3907,7 @@
         </w:tc>
         <w:tc>
           <w:tcPr>
-            <w:tcW w:w="713" w:type="dxa"/>
+            <w:tcW w:w="721" w:type="dxa"/>
           </w:tcPr>
           <w:p>
             <w:pPr>
@@ -4025,7 +3925,7 @@
         </w:tc>
         <w:tc>
           <w:tcPr>
-            <w:tcW w:w="540" w:type="dxa"/>
+            <w:tcW w:w="546" w:type="dxa"/>
           </w:tcPr>
           <w:p>
             <w:pPr>
@@ -4043,7 +3943,7 @@
         </w:tc>
         <w:tc>
           <w:tcPr>
-            <w:tcW w:w="723" w:type="dxa"/>
+            <w:tcW w:w="731" w:type="dxa"/>
           </w:tcPr>
           <w:p>
             <w:pPr>
@@ -4061,12 +3961,9 @@
         </w:tc>
       </w:tr>
       <w:tr>
-        <w:trPr>
-          <w:cantSplit/>
-        </w:trPr>
-        <w:tc>
-          <w:tcPr>
-            <w:tcW w:w="2785" w:type="dxa"/>
+        <w:tc>
+          <w:tcPr>
+            <w:tcW w:w="2816" w:type="dxa"/>
           </w:tcPr>
           <w:p>
             <w:pPr>
@@ -4083,7 +3980,7 @@
         </w:tc>
         <w:tc>
           <w:tcPr>
-            <w:tcW w:w="4528" w:type="dxa"/>
+            <w:tcW w:w="4578" w:type="dxa"/>
           </w:tcPr>
           <w:p>
             <w:pPr>
@@ -4101,7 +3998,7 @@
         </w:tc>
         <w:tc>
           <w:tcPr>
-            <w:tcW w:w="1026" w:type="dxa"/>
+            <w:tcW w:w="1037" w:type="dxa"/>
           </w:tcPr>
           <w:p>
             <w:pPr>
@@ -4119,7 +4016,7 @@
         </w:tc>
         <w:tc>
           <w:tcPr>
-            <w:tcW w:w="713" w:type="dxa"/>
+            <w:tcW w:w="721" w:type="dxa"/>
           </w:tcPr>
           <w:p>
             <w:pPr>
@@ -4137,7 +4034,7 @@
         </w:tc>
         <w:tc>
           <w:tcPr>
-            <w:tcW w:w="540" w:type="dxa"/>
+            <w:tcW w:w="546" w:type="dxa"/>
           </w:tcPr>
           <w:p>
             <w:pPr>
@@ -4155,7 +4052,7 @@
         </w:tc>
         <w:tc>
           <w:tcPr>
-            <w:tcW w:w="723" w:type="dxa"/>
+            <w:tcW w:w="731" w:type="dxa"/>
           </w:tcPr>
           <w:p>
             <w:pPr>
@@ -4205,7 +4102,7 @@
     <w:tbl>
       <w:tblPr>
         <w:tblStyle w:val="TWTable"/>
-        <w:tblW w:w="10318" w:type="dxa"/>
+        <w:tblW w:w="10432" w:type="dxa"/>
         <w:tblBorders>
           <w:top w:val="single" w:sz="4" w:space="0" w:color="D8DCE1"/>
           <w:left w:val="single" w:sz="4" w:space="0" w:color="D8DCE1"/>
@@ -4223,19 +4120,18 @@
         </w:tblCellMar>
       </w:tblPr>
       <w:tblGrid>
-        <w:gridCol w:w="1547"/>
-        <w:gridCol w:w="3342"/>
-        <w:gridCol w:w="4292"/>
-        <w:gridCol w:w="1134"/>
+        <w:gridCol w:w="1564"/>
+        <w:gridCol w:w="3377"/>
+        <w:gridCol w:w="4342"/>
+        <w:gridCol w:w="1147"/>
       </w:tblGrid>
       <w:tr>
         <w:trPr>
-          <w:cantSplit/>
           <w:tblHeader/>
         </w:trPr>
         <w:tc>
           <w:tcPr>
-            <w:tcW w:w="1547" w:type="dxa"/>
+            <w:tcW w:w="1564" w:type="dxa"/>
             <w:shd w:val="clear" w:color="auto" w:fill="F1F3F5"/>
           </w:tcPr>
           <w:p>
@@ -4255,7 +4151,7 @@
         </w:tc>
         <w:tc>
           <w:tcPr>
-            <w:tcW w:w="3342" w:type="dxa"/>
+            <w:tcW w:w="3377" w:type="dxa"/>
             <w:shd w:val="clear" w:color="auto" w:fill="F1F3F5"/>
           </w:tcPr>
           <w:p>
@@ -4275,7 +4171,7 @@
         </w:tc>
         <w:tc>
           <w:tcPr>
-            <w:tcW w:w="4292" w:type="dxa"/>
+            <w:tcW w:w="4342" w:type="dxa"/>
             <w:shd w:val="clear" w:color="auto" w:fill="F1F3F5"/>
           </w:tcPr>
           <w:p>
@@ -4295,7 +4191,7 @@
         </w:tc>
         <w:tc>
           <w:tcPr>
-            <w:tcW w:w="1134" w:type="dxa"/>
+            <w:tcW w:w="1147" w:type="dxa"/>
             <w:shd w:val="clear" w:color="auto" w:fill="F1F3F5"/>
           </w:tcPr>
           <w:p>
@@ -4315,12 +4211,9 @@
         </w:tc>
       </w:tr>
       <w:tr>
-        <w:trPr>
-          <w:cantSplit/>
-        </w:trPr>
-        <w:tc>
-          <w:tcPr>
-            <w:tcW w:w="1547" w:type="dxa"/>
+        <w:tc>
+          <w:tcPr>
+            <w:tcW w:w="1564" w:type="dxa"/>
           </w:tcPr>
           <w:p>
             <w:pPr>
@@ -4337,7 +4230,7 @@
         </w:tc>
         <w:tc>
           <w:tcPr>
-            <w:tcW w:w="3342" w:type="dxa"/>
+            <w:tcW w:w="3377" w:type="dxa"/>
           </w:tcPr>
           <w:p>
             <w:pPr>
@@ -4354,7 +4247,7 @@
         </w:tc>
         <w:tc>
           <w:tcPr>
-            <w:tcW w:w="4292" w:type="dxa"/>
+            <w:tcW w:w="4342" w:type="dxa"/>
           </w:tcPr>
           <w:p>
             <w:pPr>
@@ -4403,7 +4296,7 @@
         </w:tc>
         <w:tc>
           <w:tcPr>
-            <w:tcW w:w="1134" w:type="dxa"/>
+            <w:tcW w:w="1147" w:type="dxa"/>
           </w:tcPr>
           <w:p>
             <w:pPr>
@@ -4420,12 +4313,9 @@
         </w:tc>
       </w:tr>
       <w:tr>
-        <w:trPr>
-          <w:cantSplit/>
-        </w:trPr>
-        <w:tc>
-          <w:tcPr>
-            <w:tcW w:w="1547" w:type="dxa"/>
+        <w:tc>
+          <w:tcPr>
+            <w:tcW w:w="1564" w:type="dxa"/>
           </w:tcPr>
           <w:p>
             <w:pPr>
@@ -4442,7 +4332,7 @@
         </w:tc>
         <w:tc>
           <w:tcPr>
-            <w:tcW w:w="3342" w:type="dxa"/>
+            <w:tcW w:w="3377" w:type="dxa"/>
           </w:tcPr>
           <w:p>
             <w:pPr>
@@ -4459,7 +4349,7 @@
         </w:tc>
         <w:tc>
           <w:tcPr>
-            <w:tcW w:w="4292" w:type="dxa"/>
+            <w:tcW w:w="4342" w:type="dxa"/>
           </w:tcPr>
           <w:p>
             <w:pPr>
@@ -4508,7 +4398,7 @@
         </w:tc>
         <w:tc>
           <w:tcPr>
-            <w:tcW w:w="1134" w:type="dxa"/>
+            <w:tcW w:w="1147" w:type="dxa"/>
           </w:tcPr>
           <w:p>
             <w:pPr>
@@ -4525,12 +4415,9 @@
         </w:tc>
       </w:tr>
       <w:tr>
-        <w:trPr>
-          <w:cantSplit/>
-        </w:trPr>
-        <w:tc>
-          <w:tcPr>
-            <w:tcW w:w="1547" w:type="dxa"/>
+        <w:tc>
+          <w:tcPr>
+            <w:tcW w:w="1564" w:type="dxa"/>
           </w:tcPr>
           <w:p>
             <w:pPr>
@@ -4547,7 +4434,7 @@
         </w:tc>
         <w:tc>
           <w:tcPr>
-            <w:tcW w:w="3342" w:type="dxa"/>
+            <w:tcW w:w="3377" w:type="dxa"/>
           </w:tcPr>
           <w:p>
             <w:pPr>
@@ -4564,7 +4451,7 @@
         </w:tc>
         <w:tc>
           <w:tcPr>
-            <w:tcW w:w="4292" w:type="dxa"/>
+            <w:tcW w:w="4342" w:type="dxa"/>
           </w:tcPr>
           <w:p>
             <w:pPr>
@@ -4597,7 +4484,7 @@
         </w:tc>
         <w:tc>
           <w:tcPr>
-            <w:tcW w:w="1134" w:type="dxa"/>
+            <w:tcW w:w="1147" w:type="dxa"/>
           </w:tcPr>
           <w:p>
             <w:pPr>
@@ -4614,12 +4501,9 @@
         </w:tc>
       </w:tr>
       <w:tr>
-        <w:trPr>
-          <w:cantSplit/>
-        </w:trPr>
-        <w:tc>
-          <w:tcPr>
-            <w:tcW w:w="1547" w:type="dxa"/>
+        <w:tc>
+          <w:tcPr>
+            <w:tcW w:w="1564" w:type="dxa"/>
           </w:tcPr>
           <w:p>
             <w:pPr>
@@ -4636,7 +4520,7 @@
         </w:tc>
         <w:tc>
           <w:tcPr>
-            <w:tcW w:w="3342" w:type="dxa"/>
+            <w:tcW w:w="3377" w:type="dxa"/>
           </w:tcPr>
           <w:p>
             <w:pPr>
@@ -4662,7 +4546,7 @@
         </w:tc>
         <w:tc>
           <w:tcPr>
-            <w:tcW w:w="4292" w:type="dxa"/>
+            <w:tcW w:w="4342" w:type="dxa"/>
           </w:tcPr>
           <w:p>
             <w:pPr>
@@ -4695,7 +4579,7 @@
         </w:tc>
         <w:tc>
           <w:tcPr>
-            <w:tcW w:w="1134" w:type="dxa"/>
+            <w:tcW w:w="1147" w:type="dxa"/>
           </w:tcPr>
           <w:p>
             <w:pPr>
@@ -4712,12 +4596,9 @@
         </w:tc>
       </w:tr>
       <w:tr>
-        <w:trPr>
-          <w:cantSplit/>
-        </w:trPr>
-        <w:tc>
-          <w:tcPr>
-            <w:tcW w:w="1547" w:type="dxa"/>
+        <w:tc>
+          <w:tcPr>
+            <w:tcW w:w="1564" w:type="dxa"/>
           </w:tcPr>
           <w:p>
             <w:pPr>
@@ -4734,7 +4615,7 @@
         </w:tc>
         <w:tc>
           <w:tcPr>
-            <w:tcW w:w="3342" w:type="dxa"/>
+            <w:tcW w:w="3377" w:type="dxa"/>
           </w:tcPr>
           <w:p>
             <w:pPr>
@@ -4751,7 +4632,7 @@
         </w:tc>
         <w:tc>
           <w:tcPr>
-            <w:tcW w:w="4292" w:type="dxa"/>
+            <w:tcW w:w="4342" w:type="dxa"/>
           </w:tcPr>
           <w:p>
             <w:pPr>
@@ -4809,7 +4690,7 @@
         </w:tc>
         <w:tc>
           <w:tcPr>
-            <w:tcW w:w="1134" w:type="dxa"/>
+            <w:tcW w:w="1147" w:type="dxa"/>
           </w:tcPr>
           <w:p>
             <w:pPr>
@@ -4826,12 +4707,9 @@
         </w:tc>
       </w:tr>
       <w:tr>
-        <w:trPr>
-          <w:cantSplit/>
-        </w:trPr>
-        <w:tc>
-          <w:tcPr>
-            <w:tcW w:w="1547" w:type="dxa"/>
+        <w:tc>
+          <w:tcPr>
+            <w:tcW w:w="1564" w:type="dxa"/>
           </w:tcPr>
           <w:p>
             <w:pPr>
@@ -4848,7 +4726,7 @@
         </w:tc>
         <w:tc>
           <w:tcPr>
-            <w:tcW w:w="3342" w:type="dxa"/>
+            <w:tcW w:w="3377" w:type="dxa"/>
           </w:tcPr>
           <w:p>
             <w:pPr>
@@ -4881,7 +4759,7 @@
         </w:tc>
         <w:tc>
           <w:tcPr>
-            <w:tcW w:w="4292" w:type="dxa"/>
+            <w:tcW w:w="4342" w:type="dxa"/>
           </w:tcPr>
           <w:p>
             <w:pPr>
@@ -4914,7 +4792,7 @@
         </w:tc>
         <w:tc>
           <w:tcPr>
-            <w:tcW w:w="1134" w:type="dxa"/>
+            <w:tcW w:w="1147" w:type="dxa"/>
           </w:tcPr>
           <w:p>
             <w:pPr>
@@ -4939,7 +4817,7 @@
     <w:tbl>
       <w:tblPr>
         <w:tblStyle w:val="TWTable"/>
-        <w:tblW w:w="10318" w:type="dxa"/>
+        <w:tblW w:w="10432" w:type="dxa"/>
         <w:tblBorders>
           <w:top w:val="single" w:sz="4" w:space="0" w:color="D8DCE1"/>
           <w:left w:val="single" w:sz="4" w:space="0" w:color="D8DCE1"/>
@@ -4957,13 +4835,10 @@
         </w:tblCellMar>
       </w:tblPr>
       <w:tblGrid>
-        <w:gridCol w:w="5159"/>
-        <w:gridCol w:w="5159"/>
+        <w:gridCol w:w="5216"/>
+        <w:gridCol w:w="5216"/>
       </w:tblGrid>
       <w:tr>
-        <w:trPr>
-          <w:cantSplit/>
-        </w:trPr>
         <w:tc>
           <w:tcPr>
             <w:tcW w:w="2500" w:type="pct"/>
@@ -5202,7 +5077,7 @@
     <w:tbl>
       <w:tblPr>
         <w:tblStyle w:val="TWTable"/>
-        <w:tblW w:w="10318" w:type="dxa"/>
+        <w:tblW w:w="10432" w:type="dxa"/>
         <w:tblBorders>
           <w:top w:val="single" w:sz="4" w:space="0" w:color="D8DCE1"/>
           <w:left w:val="single" w:sz="4" w:space="0" w:color="D8DCE1"/>
@@ -5220,20 +5095,19 @@
         </w:tblCellMar>
       </w:tblPr>
       <w:tblGrid>
-        <w:gridCol w:w="2270"/>
-        <w:gridCol w:w="1720"/>
-        <w:gridCol w:w="2805"/>
-        <w:gridCol w:w="1165"/>
-        <w:gridCol w:w="2355"/>
+        <w:gridCol w:w="2285"/>
+        <w:gridCol w:w="1735"/>
+        <w:gridCol w:w="2825"/>
+        <w:gridCol w:w="1175"/>
+        <w:gridCol w:w="2409"/>
       </w:tblGrid>
       <w:tr>
         <w:trPr>
-          <w:cantSplit/>
           <w:tblHeader/>
         </w:trPr>
         <w:tc>
           <w:tcPr>
-            <w:tcW w:w="2270" w:type="dxa"/>
+            <w:tcW w:w="2285" w:type="dxa"/>
             <w:shd w:val="clear" w:color="auto" w:fill="F1F3F5"/>
           </w:tcPr>
           <w:p>
@@ -5253,7 +5127,7 @@
         </w:tc>
         <w:tc>
           <w:tcPr>
-            <w:tcW w:w="1720" w:type="dxa"/>
+            <w:tcW w:w="1735" w:type="dxa"/>
             <w:shd w:val="clear" w:color="auto" w:fill="F1F3F5"/>
           </w:tcPr>
           <w:p>
@@ -5292,7 +5166,7 @@
         </w:tc>
         <w:tc>
           <w:tcPr>
-            <w:tcW w:w="2805" w:type="dxa"/>
+            <w:tcW w:w="2825" w:type="dxa"/>
             <w:shd w:val="clear" w:color="auto" w:fill="F1F3F5"/>
           </w:tcPr>
           <w:p>
@@ -5331,7 +5205,7 @@
         </w:tc>
         <w:tc>
           <w:tcPr>
-            <w:tcW w:w="1165" w:type="dxa"/>
+            <w:tcW w:w="1175" w:type="dxa"/>
             <w:shd w:val="clear" w:color="auto" w:fill="F1F3F5"/>
           </w:tcPr>
           <w:p>
@@ -5352,7 +5226,7 @@
         </w:tc>
         <w:tc>
           <w:tcPr>
-            <w:tcW w:w="2355" w:type="dxa"/>
+            <w:tcW w:w="2409" w:type="dxa"/>
             <w:shd w:val="clear" w:color="auto" w:fill="F1F3F5"/>
           </w:tcPr>
           <w:p>
@@ -5372,12 +5246,9 @@
         </w:tc>
       </w:tr>
       <w:tr>
-        <w:trPr>
-          <w:cantSplit/>
-        </w:trPr>
-        <w:tc>
-          <w:tcPr>
-            <w:tcW w:w="2270" w:type="dxa"/>
+        <w:tc>
+          <w:tcPr>
+            <w:tcW w:w="2285" w:type="dxa"/>
           </w:tcPr>
           <w:p>
             <w:pPr>
@@ -5394,7 +5265,7 @@
         </w:tc>
         <w:tc>
           <w:tcPr>
-            <w:tcW w:w="1720" w:type="dxa"/>
+            <w:tcW w:w="1735" w:type="dxa"/>
           </w:tcPr>
           <w:p>
             <w:pPr>
@@ -5412,7 +5283,7 @@
         </w:tc>
         <w:tc>
           <w:tcPr>
-            <w:tcW w:w="2805" w:type="dxa"/>
+            <w:tcW w:w="2825" w:type="dxa"/>
           </w:tcPr>
           <w:p>
             <w:pPr>
@@ -5430,7 +5301,7 @@
         </w:tc>
         <w:tc>
           <w:tcPr>
-            <w:tcW w:w="1165" w:type="dxa"/>
+            <w:tcW w:w="1175" w:type="dxa"/>
           </w:tcPr>
           <w:p>
             <w:pPr>
@@ -5448,7 +5319,7 @@
         </w:tc>
         <w:tc>
           <w:tcPr>
-            <w:tcW w:w="2355" w:type="dxa"/>
+            <w:tcW w:w="2409" w:type="dxa"/>
           </w:tcPr>
           <w:p>
             <w:pPr>
@@ -5465,12 +5336,9 @@
         </w:tc>
       </w:tr>
       <w:tr>
-        <w:trPr>
-          <w:cantSplit/>
-        </w:trPr>
-        <w:tc>
-          <w:tcPr>
-            <w:tcW w:w="2270" w:type="dxa"/>
+        <w:tc>
+          <w:tcPr>
+            <w:tcW w:w="2285" w:type="dxa"/>
           </w:tcPr>
           <w:p>
             <w:pPr>
@@ -5487,7 +5355,7 @@
         </w:tc>
         <w:tc>
           <w:tcPr>
-            <w:tcW w:w="1720" w:type="dxa"/>
+            <w:tcW w:w="1735" w:type="dxa"/>
           </w:tcPr>
           <w:p>
             <w:pPr>
@@ -5505,7 +5373,7 @@
         </w:tc>
         <w:tc>
           <w:tcPr>
-            <w:tcW w:w="2805" w:type="dxa"/>
+            <w:tcW w:w="2825" w:type="dxa"/>
           </w:tcPr>
           <w:p>
             <w:pPr>
@@ -5523,7 +5391,7 @@
         </w:tc>
         <w:tc>
           <w:tcPr>
-            <w:tcW w:w="1165" w:type="dxa"/>
+            <w:tcW w:w="1175" w:type="dxa"/>
           </w:tcPr>
           <w:p>
             <w:pPr>
@@ -5541,7 +5409,7 @@
         </w:tc>
         <w:tc>
           <w:tcPr>
-            <w:tcW w:w="2355" w:type="dxa"/>
+            <w:tcW w:w="2409" w:type="dxa"/>
           </w:tcPr>
           <w:p>
             <w:pPr>
@@ -5558,12 +5426,9 @@
         </w:tc>
       </w:tr>
       <w:tr>
-        <w:trPr>
-          <w:cantSplit/>
-        </w:trPr>
-        <w:tc>
-          <w:tcPr>
-            <w:tcW w:w="2270" w:type="dxa"/>
+        <w:tc>
+          <w:tcPr>
+            <w:tcW w:w="2285" w:type="dxa"/>
           </w:tcPr>
           <w:p>
             <w:pPr>
@@ -5580,7 +5445,7 @@
         </w:tc>
         <w:tc>
           <w:tcPr>
-            <w:tcW w:w="1720" w:type="dxa"/>
+            <w:tcW w:w="1735" w:type="dxa"/>
           </w:tcPr>
           <w:p>
             <w:pPr>
@@ -5598,7 +5463,7 @@
         </w:tc>
         <w:tc>
           <w:tcPr>
-            <w:tcW w:w="2805" w:type="dxa"/>
+            <w:tcW w:w="2825" w:type="dxa"/>
           </w:tcPr>
           <w:p>
             <w:pPr>
@@ -5616,7 +5481,7 @@
         </w:tc>
         <w:tc>
           <w:tcPr>
-            <w:tcW w:w="1165" w:type="dxa"/>
+            <w:tcW w:w="1175" w:type="dxa"/>
           </w:tcPr>
           <w:p>
             <w:pPr>
@@ -5634,7 +5499,7 @@
         </w:tc>
         <w:tc>
           <w:tcPr>
-            <w:tcW w:w="2355" w:type="dxa"/>
+            <w:tcW w:w="2409" w:type="dxa"/>
           </w:tcPr>
           <w:p>
             <w:pPr>
@@ -5651,12 +5516,9 @@
         </w:tc>
       </w:tr>
       <w:tr>
-        <w:trPr>
-          <w:cantSplit/>
-        </w:trPr>
-        <w:tc>
-          <w:tcPr>
-            <w:tcW w:w="2270" w:type="dxa"/>
+        <w:tc>
+          <w:tcPr>
+            <w:tcW w:w="2285" w:type="dxa"/>
           </w:tcPr>
           <w:p>
             <w:pPr>
@@ -5675,7 +5537,7 @@
         </w:tc>
         <w:tc>
           <w:tcPr>
-            <w:tcW w:w="1720" w:type="dxa"/>
+            <w:tcW w:w="1735" w:type="dxa"/>
           </w:tcPr>
           <w:p>
             <w:pPr>
@@ -5695,7 +5557,7 @@
         </w:tc>
         <w:tc>
           <w:tcPr>
-            <w:tcW w:w="2805" w:type="dxa"/>
+            <w:tcW w:w="2825" w:type="dxa"/>
           </w:tcPr>
           <w:p>
             <w:pPr>
@@ -5715,7 +5577,7 @@
         </w:tc>
         <w:tc>
           <w:tcPr>
-            <w:tcW w:w="1165" w:type="dxa"/>
+            <w:tcW w:w="1175" w:type="dxa"/>
           </w:tcPr>
           <w:p>
             <w:pPr>
@@ -5733,7 +5595,7 @@
         </w:tc>
         <w:tc>
           <w:tcPr>
-            <w:tcW w:w="2355" w:type="dxa"/>
+            <w:tcW w:w="2409" w:type="dxa"/>
           </w:tcPr>
           <w:p>
             <w:pPr>
@@ -5790,7 +5652,7 @@
     <w:tbl>
       <w:tblPr>
         <w:tblStyle w:val="TWTable"/>
-        <w:tblW w:w="10318" w:type="dxa"/>
+        <w:tblW w:w="10432" w:type="dxa"/>
         <w:tblBorders>
           <w:top w:val="single" w:sz="4" w:space="0" w:color="D8DCE1"/>
           <w:left w:val="single" w:sz="4" w:space="0" w:color="D8DCE1"/>
@@ -5808,20 +5670,19 @@
         </w:tblCellMar>
       </w:tblPr>
       <w:tblGrid>
-        <w:gridCol w:w="679"/>
-        <w:gridCol w:w="2270"/>
-        <w:gridCol w:w="3213"/>
-        <w:gridCol w:w="2084"/>
-        <w:gridCol w:w="2069"/>
+        <w:gridCol w:w="686"/>
+        <w:gridCol w:w="2295"/>
+        <w:gridCol w:w="3249"/>
+        <w:gridCol w:w="2107"/>
+        <w:gridCol w:w="2092"/>
       </w:tblGrid>
       <w:tr>
         <w:trPr>
-          <w:cantSplit/>
           <w:tblHeader/>
         </w:trPr>
         <w:tc>
           <w:tcPr>
-            <w:tcW w:w="679" w:type="dxa"/>
+            <w:tcW w:w="686" w:type="dxa"/>
             <w:shd w:val="clear" w:color="auto" w:fill="F1F3F5"/>
           </w:tcPr>
           <w:p>
@@ -5841,7 +5702,7 @@
         </w:tc>
         <w:tc>
           <w:tcPr>
-            <w:tcW w:w="2270" w:type="dxa"/>
+            <w:tcW w:w="2295" w:type="dxa"/>
             <w:shd w:val="clear" w:color="auto" w:fill="F1F3F5"/>
           </w:tcPr>
           <w:p>
@@ -5862,7 +5723,7 @@
         </w:tc>
         <w:tc>
           <w:tcPr>
-            <w:tcW w:w="3213" w:type="dxa"/>
+            <w:tcW w:w="3249" w:type="dxa"/>
             <w:shd w:val="clear" w:color="auto" w:fill="F1F3F5"/>
           </w:tcPr>
           <w:p>
@@ -5901,7 +5762,7 @@
         </w:tc>
         <w:tc>
           <w:tcPr>
-            <w:tcW w:w="2084" w:type="dxa"/>
+            <w:tcW w:w="2107" w:type="dxa"/>
             <w:shd w:val="clear" w:color="auto" w:fill="F1F3F5"/>
           </w:tcPr>
           <w:p>
@@ -5940,7 +5801,7 @@
         </w:tc>
         <w:tc>
           <w:tcPr>
-            <w:tcW w:w="2069" w:type="dxa"/>
+            <w:tcW w:w="2092" w:type="dxa"/>
             <w:shd w:val="clear" w:color="auto" w:fill="F1F3F5"/>
           </w:tcPr>
           <w:p>
@@ -5979,12 +5840,9 @@
         </w:tc>
       </w:tr>
       <w:tr>
-        <w:trPr>
-          <w:cantSplit/>
-        </w:trPr>
-        <w:tc>
-          <w:tcPr>
-            <w:tcW w:w="679" w:type="dxa"/>
+        <w:tc>
+          <w:tcPr>
+            <w:tcW w:w="686" w:type="dxa"/>
           </w:tcPr>
           <w:p>
             <w:pPr>
@@ -6001,7 +5859,7 @@
         </w:tc>
         <w:tc>
           <w:tcPr>
-            <w:tcW w:w="2270" w:type="dxa"/>
+            <w:tcW w:w="2295" w:type="dxa"/>
           </w:tcPr>
           <w:p>
             <w:pPr>
@@ -6019,7 +5877,7 @@
         </w:tc>
         <w:tc>
           <w:tcPr>
-            <w:tcW w:w="3213" w:type="dxa"/>
+            <w:tcW w:w="3249" w:type="dxa"/>
           </w:tcPr>
           <w:p>
             <w:pPr>
@@ -6046,7 +5904,7 @@
         </w:tc>
         <w:tc>
           <w:tcPr>
-            <w:tcW w:w="2084" w:type="dxa"/>
+            <w:tcW w:w="2107" w:type="dxa"/>
           </w:tcPr>
           <w:p>
             <w:pPr>
@@ -6073,7 +5931,7 @@
         </w:tc>
         <w:tc>
           <w:tcPr>
-            <w:tcW w:w="2069" w:type="dxa"/>
+            <w:tcW w:w="2092" w:type="dxa"/>
           </w:tcPr>
           <w:p>
             <w:pPr>
@@ -6091,12 +5949,9 @@
         </w:tc>
       </w:tr>
       <w:tr>
-        <w:trPr>
-          <w:cantSplit/>
-        </w:trPr>
-        <w:tc>
-          <w:tcPr>
-            <w:tcW w:w="679" w:type="dxa"/>
+        <w:tc>
+          <w:tcPr>
+            <w:tcW w:w="686" w:type="dxa"/>
           </w:tcPr>
           <w:p>
             <w:pPr>
@@ -6113,7 +5968,7 @@
         </w:tc>
         <w:tc>
           <w:tcPr>
-            <w:tcW w:w="2270" w:type="dxa"/>
+            <w:tcW w:w="2295" w:type="dxa"/>
           </w:tcPr>
           <w:p>
             <w:pPr>
@@ -6131,7 +5986,7 @@
         </w:tc>
         <w:tc>
           <w:tcPr>
-            <w:tcW w:w="3213" w:type="dxa"/>
+            <w:tcW w:w="3249" w:type="dxa"/>
           </w:tcPr>
           <w:p>
             <w:pPr>
@@ -6158,7 +6013,7 @@
         </w:tc>
         <w:tc>
           <w:tcPr>
-            <w:tcW w:w="2084" w:type="dxa"/>
+            <w:tcW w:w="2107" w:type="dxa"/>
           </w:tcPr>
           <w:p>
             <w:pPr>
@@ -6185,7 +6040,7 @@
         </w:tc>
         <w:tc>
           <w:tcPr>
-            <w:tcW w:w="2069" w:type="dxa"/>
+            <w:tcW w:w="2092" w:type="dxa"/>
           </w:tcPr>
           <w:p>
             <w:pPr>
@@ -6203,12 +6058,9 @@
         </w:tc>
       </w:tr>
       <w:tr>
-        <w:trPr>
-          <w:cantSplit/>
-        </w:trPr>
-        <w:tc>
-          <w:tcPr>
-            <w:tcW w:w="679" w:type="dxa"/>
+        <w:tc>
+          <w:tcPr>
+            <w:tcW w:w="686" w:type="dxa"/>
           </w:tcPr>
           <w:p>
             <w:pPr>
@@ -6225,7 +6077,7 @@
         </w:tc>
         <w:tc>
           <w:tcPr>
-            <w:tcW w:w="2270" w:type="dxa"/>
+            <w:tcW w:w="2295" w:type="dxa"/>
           </w:tcPr>
           <w:p>
             <w:pPr>
@@ -6243,7 +6095,7 @@
         </w:tc>
         <w:tc>
           <w:tcPr>
-            <w:tcW w:w="3213" w:type="dxa"/>
+            <w:tcW w:w="3249" w:type="dxa"/>
           </w:tcPr>
           <w:p>
             <w:pPr>
@@ -6270,7 +6122,7 @@
         </w:tc>
         <w:tc>
           <w:tcPr>
-            <w:tcW w:w="2084" w:type="dxa"/>
+            <w:tcW w:w="2107" w:type="dxa"/>
           </w:tcPr>
           <w:p>
             <w:pPr>
@@ -6297,7 +6149,7 @@
         </w:tc>
         <w:tc>
           <w:tcPr>
-            <w:tcW w:w="2069" w:type="dxa"/>
+            <w:tcW w:w="2092" w:type="dxa"/>
           </w:tcPr>
           <w:p>
             <w:pPr>
@@ -6342,7 +6194,7 @@
     <w:tbl>
       <w:tblPr>
         <w:tblStyle w:val="TWTable"/>
-        <w:tblW w:w="10318" w:type="dxa"/>
+        <w:tblW w:w="10432" w:type="dxa"/>
         <w:tblBorders>
           <w:top w:val="single" w:sz="4" w:space="0" w:color="D8DCE1"/>
           <w:left w:val="single" w:sz="4" w:space="0" w:color="D8DCE1"/>
@@ -6360,19 +6212,18 @@
         </w:tblCellMar>
       </w:tblPr>
       <w:tblGrid>
-        <w:gridCol w:w="1444"/>
-        <w:gridCol w:w="2785"/>
-        <w:gridCol w:w="3886"/>
+        <w:gridCol w:w="1460"/>
+        <w:gridCol w:w="2816"/>
+        <w:gridCol w:w="3953"/>
         <w:gridCol w:w="2200"/>
       </w:tblGrid>
       <w:tr>
         <w:trPr>
-          <w:cantSplit/>
           <w:tblHeader/>
         </w:trPr>
         <w:tc>
           <w:tcPr>
-            <w:tcW w:w="1444" w:type="dxa"/>
+            <w:tcW w:w="1460" w:type="dxa"/>
             <w:shd w:val="clear" w:color="auto" w:fill="F1F3F5"/>
           </w:tcPr>
           <w:p>
@@ -6392,7 +6243,7 @@
         </w:tc>
         <w:tc>
           <w:tcPr>
-            <w:tcW w:w="2785" w:type="dxa"/>
+            <w:tcW w:w="2816" w:type="dxa"/>
             <w:shd w:val="clear" w:color="auto" w:fill="F1F3F5"/>
           </w:tcPr>
           <w:p>
@@ -6412,7 +6263,7 @@
         </w:tc>
         <w:tc>
           <w:tcPr>
-            <w:tcW w:w="3886" w:type="dxa"/>
+            <w:tcW w:w="3953" w:type="dxa"/>
             <w:shd w:val="clear" w:color="auto" w:fill="F1F3F5"/>
           </w:tcPr>
           <w:p>
@@ -6453,12 +6304,9 @@
         </w:tc>
       </w:tr>
       <w:tr>
-        <w:trPr>
-          <w:cantSplit/>
-        </w:trPr>
-        <w:tc>
-          <w:tcPr>
-            <w:tcW w:w="1444" w:type="dxa"/>
+        <w:tc>
+          <w:tcPr>
+            <w:tcW w:w="1460" w:type="dxa"/>
           </w:tcPr>
           <w:p>
             <w:pPr>
@@ -6475,7 +6323,7 @@
         </w:tc>
         <w:tc>
           <w:tcPr>
-            <w:tcW w:w="2785" w:type="dxa"/>
+            <w:tcW w:w="2816" w:type="dxa"/>
           </w:tcPr>
           <w:p>
             <w:pPr>
@@ -6492,7 +6340,7 @@
         </w:tc>
         <w:tc>
           <w:tcPr>
-            <w:tcW w:w="3886" w:type="dxa"/>
+            <w:tcW w:w="3953" w:type="dxa"/>
           </w:tcPr>
           <w:p>
             <w:pPr>
@@ -6536,12 +6384,9 @@
         </w:tc>
       </w:tr>
       <w:tr>
-        <w:trPr>
-          <w:cantSplit/>
-        </w:trPr>
-        <w:tc>
-          <w:tcPr>
-            <w:tcW w:w="1444" w:type="dxa"/>
+        <w:tc>
+          <w:tcPr>
+            <w:tcW w:w="1460" w:type="dxa"/>
           </w:tcPr>
           <w:p>
             <w:pPr>
@@ -6558,7 +6403,7 @@
         </w:tc>
         <w:tc>
           <w:tcPr>
-            <w:tcW w:w="2785" w:type="dxa"/>
+            <w:tcW w:w="2816" w:type="dxa"/>
           </w:tcPr>
           <w:p>
             <w:pPr>
@@ -6575,7 +6420,7 @@
         </w:tc>
         <w:tc>
           <w:tcPr>
-            <w:tcW w:w="3886" w:type="dxa"/>
+            <w:tcW w:w="3953" w:type="dxa"/>
           </w:tcPr>
           <w:p>
             <w:pPr>
@@ -6658,12 +6503,9 @@
         </w:tc>
       </w:tr>
       <w:tr>
-        <w:trPr>
-          <w:cantSplit/>
-        </w:trPr>
-        <w:tc>
-          <w:tcPr>
-            <w:tcW w:w="1444" w:type="dxa"/>
+        <w:tc>
+          <w:tcPr>
+            <w:tcW w:w="1460" w:type="dxa"/>
           </w:tcPr>
           <w:p>
             <w:pPr>
@@ -6680,7 +6522,7 @@
         </w:tc>
         <w:tc>
           <w:tcPr>
-            <w:tcW w:w="2785" w:type="dxa"/>
+            <w:tcW w:w="2816" w:type="dxa"/>
           </w:tcPr>
           <w:p>
             <w:pPr>
@@ -6697,7 +6539,7 @@
         </w:tc>
         <w:tc>
           <w:tcPr>
-            <w:tcW w:w="3886" w:type="dxa"/>
+            <w:tcW w:w="3953" w:type="dxa"/>
           </w:tcPr>
           <w:p>
             <w:pPr>
@@ -6748,12 +6590,9 @@
         </w:tc>
       </w:tr>
       <w:tr>
-        <w:trPr>
-          <w:cantSplit/>
-        </w:trPr>
-        <w:tc>
-          <w:tcPr>
-            <w:tcW w:w="1444" w:type="dxa"/>
+        <w:tc>
+          <w:tcPr>
+            <w:tcW w:w="1460" w:type="dxa"/>
           </w:tcPr>
           <w:p>
             <w:pPr>
@@ -6770,7 +6609,7 @@
         </w:tc>
         <w:tc>
           <w:tcPr>
-            <w:tcW w:w="2785" w:type="dxa"/>
+            <w:tcW w:w="2816" w:type="dxa"/>
           </w:tcPr>
           <w:p>
             <w:pPr>
@@ -6787,7 +6626,7 @@
         </w:tc>
         <w:tc>
           <w:tcPr>
-            <w:tcW w:w="3886" w:type="dxa"/>
+            <w:tcW w:w="3953" w:type="dxa"/>
           </w:tcPr>
           <w:p>
             <w:pPr>
@@ -6968,7 +6807,7 @@
     <w:tbl>
       <w:tblPr>
         <w:tblStyle w:val="TWTable"/>
-        <w:tblW w:w="10318" w:type="dxa"/>
+        <w:tblW w:w="10432" w:type="dxa"/>
         <w:tblBorders>
           <w:top w:val="single" w:sz="4" w:space="0" w:color="D8DCE1"/>
           <w:left w:val="single" w:sz="4" w:space="0" w:color="D8DCE1"/>
@@ -6986,13 +6825,10 @@
         </w:tblCellMar>
       </w:tblPr>
       <w:tblGrid>
-        <w:gridCol w:w="1238"/>
-        <w:gridCol w:w="9079"/>
+        <w:gridCol w:w="1251"/>
+        <w:gridCol w:w="9180"/>
       </w:tblGrid>
       <w:tr>
-        <w:trPr>
-          <w:cantSplit/>
-        </w:trPr>
         <w:tc>
           <w:tcPr>
             <w:tcW w:w="600" w:type="pct"/>
@@ -7065,9 +6901,6 @@
         </w:tc>
       </w:tr>
       <w:tr>
-        <w:trPr>
-          <w:cantSplit/>
-        </w:trPr>
         <w:tc>
           <w:tcPr>
             <w:tcW w:w="600" w:type="pct"/>
@@ -7161,9 +6994,6 @@
         </w:tc>
       </w:tr>
       <w:tr>
-        <w:trPr>
-          <w:cantSplit/>
-        </w:trPr>
         <w:tc>
           <w:tcPr>
             <w:tcW w:w="600" w:type="pct"/>
@@ -7258,9 +7088,6 @@
         </w:tc>
       </w:tr>
       <w:tr>
-        <w:trPr>
-          <w:cantSplit/>
-        </w:trPr>
         <w:tc>
           <w:tcPr>
             <w:tcW w:w="600" w:type="pct"/>
@@ -7357,9 +7184,6 @@
         </w:tc>
       </w:tr>
       <w:tr>
-        <w:trPr>
-          <w:cantSplit/>
-        </w:trPr>
         <w:tc>
           <w:tcPr>
             <w:tcW w:w="600" w:type="pct"/>
@@ -7480,7 +7304,7 @@
     <w:tbl>
       <w:tblPr>
         <w:tblStyle w:val="TWTable"/>
-        <w:tblW w:w="10318" w:type="dxa"/>
+        <w:tblW w:w="10432" w:type="dxa"/>
         <w:tblBorders>
           <w:top w:val="single" w:sz="4" w:space="0" w:color="D8DCE1"/>
           <w:left w:val="single" w:sz="4" w:space="0" w:color="D8DCE1"/>
@@ -7498,19 +7322,18 @@
         </w:tblCellMar>
       </w:tblPr>
       <w:tblGrid>
-        <w:gridCol w:w="957"/>
-        <w:gridCol w:w="4735"/>
+        <w:gridCol w:w="963"/>
+        <w:gridCol w:w="4810"/>
         <w:gridCol w:w="1145"/>
-        <w:gridCol w:w="3479"/>
+        <w:gridCol w:w="3512"/>
       </w:tblGrid>
       <w:tr>
         <w:trPr>
-          <w:cantSplit/>
           <w:tblHeader/>
         </w:trPr>
         <w:tc>
           <w:tcPr>
-            <w:tcW w:w="957" w:type="dxa"/>
+            <w:tcW w:w="963" w:type="dxa"/>
             <w:shd w:val="clear" w:color="auto" w:fill="EEF2F6"/>
           </w:tcPr>
           <w:p>
@@ -7531,7 +7354,7 @@
         </w:tc>
         <w:tc>
           <w:tcPr>
-            <w:tcW w:w="4735" w:type="dxa"/>
+            <w:tcW w:w="4810" w:type="dxa"/>
             <w:shd w:val="clear" w:color="auto" w:fill="F1F3F5"/>
           </w:tcPr>
           <w:p>
@@ -7572,7 +7395,7 @@
         </w:tc>
         <w:tc>
           <w:tcPr>
-            <w:tcW w:w="3479" w:type="dxa"/>
+            <w:tcW w:w="3512" w:type="dxa"/>
             <w:shd w:val="clear" w:color="auto" w:fill="F1F3F5"/>
           </w:tcPr>
           <w:p>
@@ -7592,12 +7415,9 @@
         </w:tc>
       </w:tr>
       <w:tr>
-        <w:trPr>
-          <w:cantSplit/>
-        </w:trPr>
-        <w:tc>
-          <w:tcPr>
-            <w:tcW w:w="957" w:type="dxa"/>
+        <w:tc>
+          <w:tcPr>
+            <w:tcW w:w="963" w:type="dxa"/>
             <w:shd w:val="clear" w:color="auto" w:fill="EEF2F6"/>
           </w:tcPr>
           <w:p>
@@ -7618,7 +7438,7 @@
         </w:tc>
         <w:tc>
           <w:tcPr>
-            <w:tcW w:w="4735" w:type="dxa"/>
+            <w:tcW w:w="4810" w:type="dxa"/>
           </w:tcPr>
           <w:p>
             <w:pPr>
@@ -7656,7 +7476,7 @@
         </w:tc>
         <w:tc>
           <w:tcPr>
-            <w:tcW w:w="3479" w:type="dxa"/>
+            <w:tcW w:w="3512" w:type="dxa"/>
           </w:tcPr>
           <w:p>
             <w:pPr>
@@ -7673,12 +7493,9 @@
         </w:tc>
       </w:tr>
       <w:tr>
-        <w:trPr>
-          <w:cantSplit/>
-        </w:trPr>
-        <w:tc>
-          <w:tcPr>
-            <w:tcW w:w="957" w:type="dxa"/>
+        <w:tc>
+          <w:tcPr>
+            <w:tcW w:w="963" w:type="dxa"/>
             <w:shd w:val="clear" w:color="auto" w:fill="EEF2F6"/>
           </w:tcPr>
           <w:p>
@@ -7699,7 +7516,7 @@
         </w:tc>
         <w:tc>
           <w:tcPr>
-            <w:tcW w:w="4735" w:type="dxa"/>
+            <w:tcW w:w="4810" w:type="dxa"/>
           </w:tcPr>
           <w:p>
             <w:pPr>
@@ -7737,7 +7554,7 @@
         </w:tc>
         <w:tc>
           <w:tcPr>
-            <w:tcW w:w="3479" w:type="dxa"/>
+            <w:tcW w:w="3512" w:type="dxa"/>
           </w:tcPr>
           <w:p>
             <w:pPr>
@@ -7754,12 +7571,9 @@
         </w:tc>
       </w:tr>
       <w:tr>
-        <w:trPr>
-          <w:cantSplit/>
-        </w:trPr>
-        <w:tc>
-          <w:tcPr>
-            <w:tcW w:w="957" w:type="dxa"/>
+        <w:tc>
+          <w:tcPr>
+            <w:tcW w:w="963" w:type="dxa"/>
             <w:shd w:val="clear" w:color="auto" w:fill="EEF2F6"/>
           </w:tcPr>
           <w:p>
@@ -7780,7 +7594,7 @@
         </w:tc>
         <w:tc>
           <w:tcPr>
-            <w:tcW w:w="4735" w:type="dxa"/>
+            <w:tcW w:w="4810" w:type="dxa"/>
           </w:tcPr>
           <w:p>
             <w:pPr>
@@ -7818,7 +7632,7 @@
         </w:tc>
         <w:tc>
           <w:tcPr>
-            <w:tcW w:w="3479" w:type="dxa"/>
+            <w:tcW w:w="3512" w:type="dxa"/>
           </w:tcPr>
           <w:p>
             <w:pPr>
@@ -7835,12 +7649,9 @@
         </w:tc>
       </w:tr>
       <w:tr>
-        <w:trPr>
-          <w:cantSplit/>
-        </w:trPr>
-        <w:tc>
-          <w:tcPr>
-            <w:tcW w:w="957" w:type="dxa"/>
+        <w:tc>
+          <w:tcPr>
+            <w:tcW w:w="963" w:type="dxa"/>
             <w:shd w:val="clear" w:color="auto" w:fill="EEF2F6"/>
           </w:tcPr>
           <w:p>
@@ -7861,7 +7672,7 @@
         </w:tc>
         <w:tc>
           <w:tcPr>
-            <w:tcW w:w="4735" w:type="dxa"/>
+            <w:tcW w:w="4810" w:type="dxa"/>
           </w:tcPr>
           <w:p>
             <w:pPr>
@@ -7899,7 +7710,7 @@
         </w:tc>
         <w:tc>
           <w:tcPr>
-            <w:tcW w:w="3479" w:type="dxa"/>
+            <w:tcW w:w="3512" w:type="dxa"/>
           </w:tcPr>
           <w:p>
             <w:pPr>
@@ -8014,7 +7825,7 @@
     <w:tbl>
       <w:tblPr>
         <w:tblStyle w:val="TWTable"/>
-        <w:tblW w:w="10318" w:type="dxa"/>
+        <w:tblW w:w="10432" w:type="dxa"/>
         <w:tblBorders>
           <w:top w:val="single" w:sz="4" w:space="0" w:color="D8DCE1"/>
           <w:left w:val="single" w:sz="4" w:space="0" w:color="D8DCE1"/>
@@ -8032,16 +7843,13 @@
         </w:tblCellMar>
       </w:tblPr>
       <w:tblGrid>
-        <w:gridCol w:w="1675"/>
-        <w:gridCol w:w="8642"/>
+        <w:gridCol w:w="1688"/>
+        <w:gridCol w:w="8743"/>
       </w:tblGrid>
       <w:tr>
-        <w:trPr>
-          <w:cantSplit/>
-        </w:trPr>
-        <w:tc>
-          <w:tcPr>
-            <w:tcW w:w="1675" w:type="dxa"/>
+        <w:tc>
+          <w:tcPr>
+            <w:tcW w:w="1688" w:type="dxa"/>
             <w:shd w:val="clear" w:color="auto" w:fill="F6F7F8"/>
           </w:tcPr>
           <w:p>
@@ -8061,7 +7869,7 @@
         </w:tc>
         <w:tc>
           <w:tcPr>
-            <w:tcW w:w="8642" w:type="dxa"/>
+            <w:tcW w:w="8743" w:type="dxa"/>
           </w:tcPr>
           <w:p>
             <w:pPr>
@@ -8228,12 +8036,9 @@
         </w:tc>
       </w:tr>
       <w:tr>
-        <w:trPr>
-          <w:cantSplit/>
-        </w:trPr>
-        <w:tc>
-          <w:tcPr>
-            <w:tcW w:w="1675" w:type="dxa"/>
+        <w:tc>
+          <w:tcPr>
+            <w:tcW w:w="1688" w:type="dxa"/>
             <w:shd w:val="clear" w:color="auto" w:fill="F6F7F8"/>
           </w:tcPr>
           <w:p>
@@ -8253,7 +8058,7 @@
         </w:tc>
         <w:tc>
           <w:tcPr>
-            <w:tcW w:w="8642" w:type="dxa"/>
+            <w:tcW w:w="8743" w:type="dxa"/>
           </w:tcPr>
           <w:p>
             <w:pPr>
@@ -8300,12 +8105,9 @@
         </w:tc>
       </w:tr>
       <w:tr>
-        <w:trPr>
-          <w:cantSplit/>
-        </w:trPr>
-        <w:tc>
-          <w:tcPr>
-            <w:tcW w:w="1675" w:type="dxa"/>
+        <w:tc>
+          <w:tcPr>
+            <w:tcW w:w="1688" w:type="dxa"/>
             <w:shd w:val="clear" w:color="auto" w:fill="F6F7F8"/>
           </w:tcPr>
           <w:p>
@@ -8325,7 +8127,7 @@
         </w:tc>
         <w:tc>
           <w:tcPr>
-            <w:tcW w:w="8642" w:type="dxa"/>
+            <w:tcW w:w="8743" w:type="dxa"/>
           </w:tcPr>
           <w:p>
             <w:pPr>
@@ -8387,12 +8189,9 @@
         </w:tc>
       </w:tr>
       <w:tr>
-        <w:trPr>
-          <w:cantSplit/>
-        </w:trPr>
-        <w:tc>
-          <w:tcPr>
-            <w:tcW w:w="1675" w:type="dxa"/>
+        <w:tc>
+          <w:tcPr>
+            <w:tcW w:w="1688" w:type="dxa"/>
             <w:shd w:val="clear" w:color="auto" w:fill="F6F7F8"/>
           </w:tcPr>
           <w:p>
@@ -8412,7 +8211,7 @@
         </w:tc>
         <w:tc>
           <w:tcPr>
-            <w:tcW w:w="8642" w:type="dxa"/>
+            <w:tcW w:w="8743" w:type="dxa"/>
           </w:tcPr>
           <w:p>
             <w:pPr>
@@ -8489,12 +8288,9 @@
         </w:tc>
       </w:tr>
       <w:tr>
-        <w:trPr>
-          <w:cantSplit/>
-        </w:trPr>
-        <w:tc>
-          <w:tcPr>
-            <w:tcW w:w="1675" w:type="dxa"/>
+        <w:tc>
+          <w:tcPr>
+            <w:tcW w:w="1688" w:type="dxa"/>
             <w:shd w:val="clear" w:color="auto" w:fill="F6F7F8"/>
           </w:tcPr>
           <w:p>
@@ -8514,7 +8310,7 @@
         </w:tc>
         <w:tc>
           <w:tcPr>
-            <w:tcW w:w="8642" w:type="dxa"/>
+            <w:tcW w:w="8743" w:type="dxa"/>
           </w:tcPr>
           <w:p>
             <w:pPr>
@@ -8591,12 +8387,9 @@
         </w:tc>
       </w:tr>
       <w:tr>
-        <w:trPr>
-          <w:cantSplit/>
-        </w:trPr>
-        <w:tc>
-          <w:tcPr>
-            <w:tcW w:w="1675" w:type="dxa"/>
+        <w:tc>
+          <w:tcPr>
+            <w:tcW w:w="1688" w:type="dxa"/>
             <w:shd w:val="clear" w:color="auto" w:fill="F6F7F8"/>
           </w:tcPr>
           <w:p>
@@ -8616,7 +8409,7 @@
         </w:tc>
         <w:tc>
           <w:tcPr>
-            <w:tcW w:w="8642" w:type="dxa"/>
+            <w:tcW w:w="8743" w:type="dxa"/>
           </w:tcPr>
           <w:p>
             <w:pPr>
@@ -9052,7 +8845,7 @@
     <w:tbl>
       <w:tblPr>
         <w:tblStyle w:val="TWTable"/>
-        <w:tblW w:w="10318" w:type="dxa"/>
+        <w:tblW w:w="10432" w:type="dxa"/>
         <w:tblBorders>
           <w:top w:val="single" w:sz="4" w:space="0" w:color="D8DCE1"/>
           <w:left w:val="single" w:sz="4" w:space="0" w:color="D8DCE1"/>
@@ -9070,19 +8863,18 @@
         </w:tblCellMar>
       </w:tblPr>
       <w:tblGrid>
-        <w:gridCol w:w="1525"/>
-        <w:gridCol w:w="3678"/>
-        <w:gridCol w:w="3730"/>
-        <w:gridCol w:w="1384"/>
+        <w:gridCol w:w="1531"/>
+        <w:gridCol w:w="3726"/>
+        <w:gridCol w:w="3783"/>
+        <w:gridCol w:w="1390"/>
       </w:tblGrid>
       <w:tr>
         <w:trPr>
-          <w:cantSplit/>
           <w:tblHeader/>
         </w:trPr>
         <w:tc>
           <w:tcPr>
-            <w:tcW w:w="1525" w:type="dxa"/>
+            <w:tcW w:w="1531" w:type="dxa"/>
             <w:shd w:val="clear" w:color="auto" w:fill="F1F3F5"/>
           </w:tcPr>
           <w:p>
@@ -9102,7 +8894,7 @@
         </w:tc>
         <w:tc>
           <w:tcPr>
-            <w:tcW w:w="3678" w:type="dxa"/>
+            <w:tcW w:w="3726" w:type="dxa"/>
             <w:shd w:val="clear" w:color="auto" w:fill="F1F3F5"/>
           </w:tcPr>
           <w:p>
@@ -9122,7 +8914,7 @@
         </w:tc>
         <w:tc>
           <w:tcPr>
-            <w:tcW w:w="3730" w:type="dxa"/>
+            <w:tcW w:w="3783" w:type="dxa"/>
             <w:shd w:val="clear" w:color="auto" w:fill="F1F3F5"/>
           </w:tcPr>
           <w:p>
@@ -9142,7 +8934,7 @@
         </w:tc>
         <w:tc>
           <w:tcPr>
-            <w:tcW w:w="1384" w:type="dxa"/>
+            <w:tcW w:w="1390" w:type="dxa"/>
             <w:shd w:val="clear" w:color="auto" w:fill="F1F3F5"/>
           </w:tcPr>
           <w:p>
@@ -9162,12 +8954,9 @@
         </w:tc>
       </w:tr>
       <w:tr>
-        <w:trPr>
-          <w:cantSplit/>
-        </w:trPr>
-        <w:tc>
-          <w:tcPr>
-            <w:tcW w:w="1525" w:type="dxa"/>
+        <w:tc>
+          <w:tcPr>
+            <w:tcW w:w="1531" w:type="dxa"/>
           </w:tcPr>
           <w:p>
             <w:pPr>
@@ -9184,7 +8973,7 @@
         </w:tc>
         <w:tc>
           <w:tcPr>
-            <w:tcW w:w="3678" w:type="dxa"/>
+            <w:tcW w:w="3726" w:type="dxa"/>
           </w:tcPr>
           <w:p>
             <w:pPr>
@@ -9201,7 +8990,7 @@
         </w:tc>
         <w:tc>
           <w:tcPr>
-            <w:tcW w:w="3730" w:type="dxa"/>
+            <w:tcW w:w="3783" w:type="dxa"/>
           </w:tcPr>
           <w:p>
             <w:pPr>
@@ -9218,7 +9007,7 @@
         </w:tc>
         <w:tc>
           <w:tcPr>
-            <w:tcW w:w="1384" w:type="dxa"/>
+            <w:tcW w:w="1390" w:type="dxa"/>
           </w:tcPr>
           <w:p>
             <w:pPr>
@@ -9235,12 +9024,9 @@
         </w:tc>
       </w:tr>
       <w:tr>
-        <w:trPr>
-          <w:cantSplit/>
-        </w:trPr>
-        <w:tc>
-          <w:tcPr>
-            <w:tcW w:w="1525" w:type="dxa"/>
+        <w:tc>
+          <w:tcPr>
+            <w:tcW w:w="1531" w:type="dxa"/>
           </w:tcPr>
           <w:p>
             <w:pPr>
@@ -9257,7 +9043,7 @@
         </w:tc>
         <w:tc>
           <w:tcPr>
-            <w:tcW w:w="3678" w:type="dxa"/>
+            <w:tcW w:w="3726" w:type="dxa"/>
           </w:tcPr>
           <w:p>
             <w:pPr>
@@ -9274,7 +9060,7 @@
         </w:tc>
         <w:tc>
           <w:tcPr>
-            <w:tcW w:w="3730" w:type="dxa"/>
+            <w:tcW w:w="3783" w:type="dxa"/>
           </w:tcPr>
           <w:p>
             <w:pPr>
@@ -9291,7 +9077,7 @@
         </w:tc>
         <w:tc>
           <w:tcPr>
-            <w:tcW w:w="1384" w:type="dxa"/>
+            <w:tcW w:w="1390" w:type="dxa"/>
           </w:tcPr>
           <w:p>
             <w:pPr>
@@ -9308,12 +9094,9 @@
         </w:tc>
       </w:tr>
       <w:tr>
-        <w:trPr>
-          <w:cantSplit/>
-        </w:trPr>
-        <w:tc>
-          <w:tcPr>
-            <w:tcW w:w="1525" w:type="dxa"/>
+        <w:tc>
+          <w:tcPr>
+            <w:tcW w:w="1531" w:type="dxa"/>
           </w:tcPr>
           <w:p>
             <w:pPr>
@@ -9330,7 +9113,7 @@
         </w:tc>
         <w:tc>
           <w:tcPr>
-            <w:tcW w:w="3678" w:type="dxa"/>
+            <w:tcW w:w="3726" w:type="dxa"/>
           </w:tcPr>
           <w:p>
             <w:pPr>
@@ -9362,7 +9145,7 @@
         </w:tc>
         <w:tc>
           <w:tcPr>
-            <w:tcW w:w="3730" w:type="dxa"/>
+            <w:tcW w:w="3783" w:type="dxa"/>
           </w:tcPr>
           <w:p>
             <w:pPr>
@@ -9379,7 +9162,7 @@
         </w:tc>
         <w:tc>
           <w:tcPr>
-            <w:tcW w:w="1384" w:type="dxa"/>
+            <w:tcW w:w="1390" w:type="dxa"/>
           </w:tcPr>
           <w:p>
             <w:pPr>
@@ -9396,12 +9179,9 @@
         </w:tc>
       </w:tr>
       <w:tr>
-        <w:trPr>
-          <w:cantSplit/>
-        </w:trPr>
-        <w:tc>
-          <w:tcPr>
-            <w:tcW w:w="1525" w:type="dxa"/>
+        <w:tc>
+          <w:tcPr>
+            <w:tcW w:w="1531" w:type="dxa"/>
           </w:tcPr>
           <w:p>
             <w:pPr>
@@ -9418,7 +9198,7 @@
         </w:tc>
         <w:tc>
           <w:tcPr>
-            <w:tcW w:w="3678" w:type="dxa"/>
+            <w:tcW w:w="3726" w:type="dxa"/>
           </w:tcPr>
           <w:p>
             <w:pPr>
@@ -9435,7 +9215,7 @@
         </w:tc>
         <w:tc>
           <w:tcPr>
-            <w:tcW w:w="3730" w:type="dxa"/>
+            <w:tcW w:w="3783" w:type="dxa"/>
           </w:tcPr>
           <w:p>
             <w:pPr>
@@ -9452,7 +9232,7 @@
         </w:tc>
         <w:tc>
           <w:tcPr>
-            <w:tcW w:w="1384" w:type="dxa"/>
+            <w:tcW w:w="1390" w:type="dxa"/>
           </w:tcPr>
           <w:p>
             <w:pPr>
@@ -9469,12 +9249,9 @@
         </w:tc>
       </w:tr>
       <w:tr>
-        <w:trPr>
-          <w:cantSplit/>
-        </w:trPr>
-        <w:tc>
-          <w:tcPr>
-            <w:tcW w:w="1525" w:type="dxa"/>
+        <w:tc>
+          <w:tcPr>
+            <w:tcW w:w="1531" w:type="dxa"/>
           </w:tcPr>
           <w:p>
             <w:pPr>
@@ -9491,7 +9268,7 @@
         </w:tc>
         <w:tc>
           <w:tcPr>
-            <w:tcW w:w="3678" w:type="dxa"/>
+            <w:tcW w:w="3726" w:type="dxa"/>
           </w:tcPr>
           <w:p>
             <w:pPr>
@@ -9508,7 +9285,7 @@
         </w:tc>
         <w:tc>
           <w:tcPr>
-            <w:tcW w:w="3730" w:type="dxa"/>
+            <w:tcW w:w="3783" w:type="dxa"/>
           </w:tcPr>
           <w:p>
             <w:pPr>
@@ -9525,7 +9302,7 @@
         </w:tc>
         <w:tc>
           <w:tcPr>
-            <w:tcW w:w="1384" w:type="dxa"/>
+            <w:tcW w:w="1390" w:type="dxa"/>
           </w:tcPr>
           <w:p>
             <w:pPr>
@@ -9776,7 +9553,7 @@
     <w:tbl>
       <w:tblPr>
         <w:tblStyle w:val="TWTable"/>
-        <w:tblW w:w="10318" w:type="dxa"/>
+        <w:tblW w:w="10432" w:type="dxa"/>
         <w:tblBorders>
           <w:top w:val="single" w:sz="4" w:space="0" w:color="D8DCE1"/>
           <w:left w:val="single" w:sz="4" w:space="0" w:color="D8DCE1"/>
@@ -9794,19 +9571,18 @@
         </w:tblCellMar>
       </w:tblPr>
       <w:tblGrid>
-        <w:gridCol w:w="929"/>
-        <w:gridCol w:w="1905"/>
-        <w:gridCol w:w="5748"/>
-        <w:gridCol w:w="1734"/>
+        <w:gridCol w:w="934"/>
+        <w:gridCol w:w="1918"/>
+        <w:gridCol w:w="5834"/>
+        <w:gridCol w:w="1744"/>
       </w:tblGrid>
       <w:tr>
         <w:trPr>
-          <w:cantSplit/>
           <w:tblHeader/>
         </w:trPr>
         <w:tc>
           <w:tcPr>
-            <w:tcW w:w="929" w:type="dxa"/>
+            <w:tcW w:w="934" w:type="dxa"/>
             <w:shd w:val="clear" w:color="auto" w:fill="F1F3F5"/>
           </w:tcPr>
           <w:p>
@@ -9826,7 +9602,7 @@
         </w:tc>
         <w:tc>
           <w:tcPr>
-            <w:tcW w:w="1905" w:type="dxa"/>
+            <w:tcW w:w="1918" w:type="dxa"/>
             <w:shd w:val="clear" w:color="auto" w:fill="F1F3F5"/>
           </w:tcPr>
           <w:p>
@@ -9846,7 +9622,7 @@
         </w:tc>
         <w:tc>
           <w:tcPr>
-            <w:tcW w:w="5748" w:type="dxa"/>
+            <w:tcW w:w="5834" w:type="dxa"/>
             <w:shd w:val="clear" w:color="auto" w:fill="F1F3F5"/>
           </w:tcPr>
           <w:p>
@@ -9866,7 +9642,7 @@
         </w:tc>
         <w:tc>
           <w:tcPr>
-            <w:tcW w:w="1734" w:type="dxa"/>
+            <w:tcW w:w="1744" w:type="dxa"/>
             <w:shd w:val="clear" w:color="auto" w:fill="F1F3F5"/>
           </w:tcPr>
           <w:p>
@@ -9886,12 +9662,9 @@
         </w:tc>
       </w:tr>
       <w:tr>
-        <w:trPr>
-          <w:cantSplit/>
-        </w:trPr>
-        <w:tc>
-          <w:tcPr>
-            <w:tcW w:w="929" w:type="dxa"/>
+        <w:tc>
+          <w:tcPr>
+            <w:tcW w:w="934" w:type="dxa"/>
           </w:tcPr>
           <w:p>
             <w:pPr>
@@ -9908,7 +9681,7 @@
         </w:tc>
         <w:tc>
           <w:tcPr>
-            <w:tcW w:w="1905" w:type="dxa"/>
+            <w:tcW w:w="1918" w:type="dxa"/>
           </w:tcPr>
           <w:p>
             <w:pPr>
@@ -9925,7 +9698,7 @@
         </w:tc>
         <w:tc>
           <w:tcPr>
-            <w:tcW w:w="5748" w:type="dxa"/>
+            <w:tcW w:w="5834" w:type="dxa"/>
           </w:tcPr>
           <w:p>
             <w:pPr>
@@ -9942,7 +9715,7 @@
         </w:tc>
         <w:tc>
           <w:tcPr>
-            <w:tcW w:w="1734" w:type="dxa"/>
+            <w:tcW w:w="1744" w:type="dxa"/>
           </w:tcPr>
           <w:p>
             <w:pPr>
@@ -9959,12 +9732,9 @@
         </w:tc>
       </w:tr>
       <w:tr>
-        <w:trPr>
-          <w:cantSplit/>
-        </w:trPr>
-        <w:tc>
-          <w:tcPr>
-            <w:tcW w:w="929" w:type="dxa"/>
+        <w:tc>
+          <w:tcPr>
+            <w:tcW w:w="934" w:type="dxa"/>
           </w:tcPr>
           <w:p>
             <w:pPr>
@@ -9981,7 +9751,7 @@
         </w:tc>
         <w:tc>
           <w:tcPr>
-            <w:tcW w:w="1905" w:type="dxa"/>
+            <w:tcW w:w="1918" w:type="dxa"/>
           </w:tcPr>
           <w:p>
             <w:pPr>
@@ -9998,7 +9768,7 @@
         </w:tc>
         <w:tc>
           <w:tcPr>
-            <w:tcW w:w="5748" w:type="dxa"/>
+            <w:tcW w:w="5834" w:type="dxa"/>
           </w:tcPr>
           <w:p>
             <w:pPr>
@@ -10015,7 +9785,7 @@
         </w:tc>
         <w:tc>
           <w:tcPr>
-            <w:tcW w:w="1734" w:type="dxa"/>
+            <w:tcW w:w="1744" w:type="dxa"/>
           </w:tcPr>
           <w:p>
             <w:pPr>
@@ -10032,12 +9802,9 @@
         </w:tc>
       </w:tr>
       <w:tr>
-        <w:trPr>
-          <w:cantSplit/>
-        </w:trPr>
-        <w:tc>
-          <w:tcPr>
-            <w:tcW w:w="929" w:type="dxa"/>
+        <w:tc>
+          <w:tcPr>
+            <w:tcW w:w="934" w:type="dxa"/>
           </w:tcPr>
           <w:p>
             <w:pPr>
@@ -10054,7 +9821,7 @@
         </w:tc>
         <w:tc>
           <w:tcPr>
-            <w:tcW w:w="1905" w:type="dxa"/>
+            <w:tcW w:w="1918" w:type="dxa"/>
           </w:tcPr>
           <w:p>
             <w:pPr>
@@ -10071,7 +9838,7 @@
         </w:tc>
         <w:tc>
           <w:tcPr>
-            <w:tcW w:w="5748" w:type="dxa"/>
+            <w:tcW w:w="5834" w:type="dxa"/>
           </w:tcPr>
           <w:p>
             <w:pPr>
@@ -10088,7 +9855,7 @@
         </w:tc>
         <w:tc>
           <w:tcPr>
-            <w:tcW w:w="1734" w:type="dxa"/>
+            <w:tcW w:w="1744" w:type="dxa"/>
           </w:tcPr>
           <w:p>
             <w:pPr>
@@ -10105,12 +9872,9 @@
         </w:tc>
       </w:tr>
       <w:tr>
-        <w:trPr>
-          <w:cantSplit/>
-        </w:trPr>
-        <w:tc>
-          <w:tcPr>
-            <w:tcW w:w="929" w:type="dxa"/>
+        <w:tc>
+          <w:tcPr>
+            <w:tcW w:w="934" w:type="dxa"/>
           </w:tcPr>
           <w:p>
             <w:pPr>
@@ -10127,7 +9891,7 @@
         </w:tc>
         <w:tc>
           <w:tcPr>
-            <w:tcW w:w="1905" w:type="dxa"/>
+            <w:tcW w:w="1918" w:type="dxa"/>
           </w:tcPr>
           <w:p>
             <w:pPr>
@@ -10144,7 +9908,7 @@
         </w:tc>
         <w:tc>
           <w:tcPr>
-            <w:tcW w:w="5748" w:type="dxa"/>
+            <w:tcW w:w="5834" w:type="dxa"/>
           </w:tcPr>
           <w:p>
             <w:pPr>
@@ -10161,7 +9925,7 @@
         </w:tc>
         <w:tc>
           <w:tcPr>
-            <w:tcW w:w="1734" w:type="dxa"/>
+            <w:tcW w:w="1744" w:type="dxa"/>
           </w:tcPr>
           <w:p>
             <w:pPr>
@@ -10178,12 +9942,9 @@
         </w:tc>
       </w:tr>
       <w:tr>
-        <w:trPr>
-          <w:cantSplit/>
-        </w:trPr>
-        <w:tc>
-          <w:tcPr>
-            <w:tcW w:w="929" w:type="dxa"/>
+        <w:tc>
+          <w:tcPr>
+            <w:tcW w:w="934" w:type="dxa"/>
           </w:tcPr>
           <w:p>
             <w:pPr>
@@ -10200,7 +9961,7 @@
         </w:tc>
         <w:tc>
           <w:tcPr>
-            <w:tcW w:w="1905" w:type="dxa"/>
+            <w:tcW w:w="1918" w:type="dxa"/>
           </w:tcPr>
           <w:p>
             <w:pPr>
@@ -10217,7 +9978,7 @@
         </w:tc>
         <w:tc>
           <w:tcPr>
-            <w:tcW w:w="5748" w:type="dxa"/>
+            <w:tcW w:w="5834" w:type="dxa"/>
           </w:tcPr>
           <w:p>
             <w:pPr>
@@ -10234,7 +9995,7 @@
         </w:tc>
         <w:tc>
           <w:tcPr>
-            <w:tcW w:w="1734" w:type="dxa"/>
+            <w:tcW w:w="1744" w:type="dxa"/>
           </w:tcPr>
           <w:p>
             <w:pPr>
@@ -10251,12 +10012,9 @@
         </w:tc>
       </w:tr>
       <w:tr>
-        <w:trPr>
-          <w:cantSplit/>
-        </w:trPr>
-        <w:tc>
-          <w:tcPr>
-            <w:tcW w:w="929" w:type="dxa"/>
+        <w:tc>
+          <w:tcPr>
+            <w:tcW w:w="934" w:type="dxa"/>
           </w:tcPr>
           <w:p>
             <w:pPr>
@@ -10273,7 +10031,7 @@
         </w:tc>
         <w:tc>
           <w:tcPr>
-            <w:tcW w:w="1905" w:type="dxa"/>
+            <w:tcW w:w="1918" w:type="dxa"/>
           </w:tcPr>
           <w:p>
             <w:pPr>
@@ -10290,7 +10048,7 @@
         </w:tc>
         <w:tc>
           <w:tcPr>
-            <w:tcW w:w="5748" w:type="dxa"/>
+            <w:tcW w:w="5834" w:type="dxa"/>
           </w:tcPr>
           <w:p>
             <w:pPr>
@@ -10307,7 +10065,7 @@
         </w:tc>
         <w:tc>
           <w:tcPr>
-            <w:tcW w:w="1734" w:type="dxa"/>
+            <w:tcW w:w="1744" w:type="dxa"/>
           </w:tcPr>
           <w:p>
             <w:pPr>
@@ -10324,12 +10082,9 @@
         </w:tc>
       </w:tr>
       <w:tr>
-        <w:trPr>
-          <w:cantSplit/>
-        </w:trPr>
-        <w:tc>
-          <w:tcPr>
-            <w:tcW w:w="929" w:type="dxa"/>
+        <w:tc>
+          <w:tcPr>
+            <w:tcW w:w="934" w:type="dxa"/>
           </w:tcPr>
           <w:p>
             <w:pPr>
@@ -10346,7 +10101,7 @@
         </w:tc>
         <w:tc>
           <w:tcPr>
-            <w:tcW w:w="1905" w:type="dxa"/>
+            <w:tcW w:w="1918" w:type="dxa"/>
           </w:tcPr>
           <w:p>
             <w:pPr>
@@ -10363,7 +10118,7 @@
         </w:tc>
         <w:tc>
           <w:tcPr>
-            <w:tcW w:w="5748" w:type="dxa"/>
+            <w:tcW w:w="5834" w:type="dxa"/>
           </w:tcPr>
           <w:p>
             <w:pPr>
@@ -10380,7 +10135,7 @@
         </w:tc>
         <w:tc>
           <w:tcPr>
-            <w:tcW w:w="1734" w:type="dxa"/>
+            <w:tcW w:w="1744" w:type="dxa"/>
           </w:tcPr>
           <w:p>
             <w:pPr>
@@ -10432,7 +10187,7 @@
     <w:tbl>
       <w:tblPr>
         <w:tblStyle w:val="TWTable"/>
-        <w:tblW w:w="10318" w:type="dxa"/>
+        <w:tblW w:w="10432" w:type="dxa"/>
         <w:tblBorders>
           <w:top w:val="single" w:sz="4" w:space="0" w:color="D8DCE1"/>
           <w:left w:val="single" w:sz="4" w:space="0" w:color="D8DCE1"/>
@@ -10450,19 +10205,18 @@
         </w:tblCellMar>
       </w:tblPr>
       <w:tblGrid>
-        <w:gridCol w:w="1718"/>
-        <w:gridCol w:w="1696"/>
-        <w:gridCol w:w="1829"/>
-        <w:gridCol w:w="5073"/>
+        <w:gridCol w:w="1727"/>
+        <w:gridCol w:w="1705"/>
+        <w:gridCol w:w="1843"/>
+        <w:gridCol w:w="5156"/>
       </w:tblGrid>
       <w:tr>
         <w:trPr>
-          <w:cantSplit/>
           <w:tblHeader/>
         </w:trPr>
         <w:tc>
           <w:tcPr>
-            <w:tcW w:w="1718" w:type="dxa"/>
+            <w:tcW w:w="1727" w:type="dxa"/>
             <w:shd w:val="clear" w:color="auto" w:fill="F1F3F5"/>
           </w:tcPr>
           <w:p>
@@ -10482,7 +10236,7 @@
         </w:tc>
         <w:tc>
           <w:tcPr>
-            <w:tcW w:w="1696" w:type="dxa"/>
+            <w:tcW w:w="1705" w:type="dxa"/>
             <w:shd w:val="clear" w:color="auto" w:fill="F1F3F5"/>
           </w:tcPr>
           <w:p>
@@ -10502,7 +10256,7 @@
         </w:tc>
         <w:tc>
           <w:tcPr>
-            <w:tcW w:w="1829" w:type="dxa"/>
+            <w:tcW w:w="1843" w:type="dxa"/>
             <w:shd w:val="clear" w:color="auto" w:fill="F1F3F5"/>
           </w:tcPr>
           <w:p>
@@ -10522,7 +10276,7 @@
         </w:tc>
         <w:tc>
           <w:tcPr>
-            <w:tcW w:w="5073" w:type="dxa"/>
+            <w:tcW w:w="5156" w:type="dxa"/>
             <w:shd w:val="clear" w:color="auto" w:fill="F1F3F5"/>
           </w:tcPr>
           <w:p>
@@ -10542,12 +10296,9 @@
         </w:tc>
       </w:tr>
       <w:tr>
-        <w:trPr>
-          <w:cantSplit/>
-        </w:trPr>
-        <w:tc>
-          <w:tcPr>
-            <w:tcW w:w="1718" w:type="dxa"/>
+        <w:tc>
+          <w:tcPr>
+            <w:tcW w:w="1727" w:type="dxa"/>
           </w:tcPr>
           <w:p>
             <w:pPr>
@@ -10564,7 +10315,7 @@
         </w:tc>
         <w:tc>
           <w:tcPr>
-            <w:tcW w:w="1696" w:type="dxa"/>
+            <w:tcW w:w="1705" w:type="dxa"/>
           </w:tcPr>
           <w:p>
             <w:pPr>
@@ -10581,7 +10332,7 @@
         </w:tc>
         <w:tc>
           <w:tcPr>
-            <w:tcW w:w="1829" w:type="dxa"/>
+            <w:tcW w:w="1843" w:type="dxa"/>
           </w:tcPr>
           <w:p>
             <w:pPr>
@@ -10598,7 +10349,7 @@
         </w:tc>
         <w:tc>
           <w:tcPr>
-            <w:tcW w:w="5073" w:type="dxa"/>
+            <w:tcW w:w="5156" w:type="dxa"/>
           </w:tcPr>
           <w:p>
             <w:pPr>
@@ -10615,12 +10366,9 @@
         </w:tc>
       </w:tr>
       <w:tr>
-        <w:trPr>
-          <w:cantSplit/>
-        </w:trPr>
-        <w:tc>
-          <w:tcPr>
-            <w:tcW w:w="1718" w:type="dxa"/>
+        <w:tc>
+          <w:tcPr>
+            <w:tcW w:w="1727" w:type="dxa"/>
           </w:tcPr>
           <w:p>
             <w:pPr>
@@ -10637,7 +10385,7 @@
         </w:tc>
         <w:tc>
           <w:tcPr>
-            <w:tcW w:w="1696" w:type="dxa"/>
+            <w:tcW w:w="1705" w:type="dxa"/>
           </w:tcPr>
           <w:p>
             <w:pPr>
@@ -10654,7 +10402,7 @@
         </w:tc>
         <w:tc>
           <w:tcPr>
-            <w:tcW w:w="1829" w:type="dxa"/>
+            <w:tcW w:w="1843" w:type="dxa"/>
           </w:tcPr>
           <w:p>
             <w:pPr>
@@ -10671,7 +10419,7 @@
         </w:tc>
         <w:tc>
           <w:tcPr>
-            <w:tcW w:w="5073" w:type="dxa"/>
+            <w:tcW w:w="5156" w:type="dxa"/>
           </w:tcPr>
           <w:p>
             <w:pPr>
@@ -10688,12 +10436,9 @@
         </w:tc>
       </w:tr>
       <w:tr>
-        <w:trPr>
-          <w:cantSplit/>
-        </w:trPr>
-        <w:tc>
-          <w:tcPr>
-            <w:tcW w:w="1718" w:type="dxa"/>
+        <w:tc>
+          <w:tcPr>
+            <w:tcW w:w="1727" w:type="dxa"/>
           </w:tcPr>
           <w:p>
             <w:pPr>
@@ -10710,7 +10455,7 @@
         </w:tc>
         <w:tc>
           <w:tcPr>
-            <w:tcW w:w="1696" w:type="dxa"/>
+            <w:tcW w:w="1705" w:type="dxa"/>
           </w:tcPr>
           <w:p>
             <w:pPr>
@@ -10727,7 +10472,7 @@
         </w:tc>
         <w:tc>
           <w:tcPr>
-            <w:tcW w:w="1829" w:type="dxa"/>
+            <w:tcW w:w="1843" w:type="dxa"/>
           </w:tcPr>
           <w:p>
             <w:pPr>
@@ -10744,7 +10489,7 @@
         </w:tc>
         <w:tc>
           <w:tcPr>
-            <w:tcW w:w="5073" w:type="dxa"/>
+            <w:tcW w:w="5156" w:type="dxa"/>
           </w:tcPr>
           <w:p>
             <w:pPr>
@@ -10761,12 +10506,9 @@
         </w:tc>
       </w:tr>
       <w:tr>
-        <w:trPr>
-          <w:cantSplit/>
-        </w:trPr>
-        <w:tc>
-          <w:tcPr>
-            <w:tcW w:w="1718" w:type="dxa"/>
+        <w:tc>
+          <w:tcPr>
+            <w:tcW w:w="1727" w:type="dxa"/>
           </w:tcPr>
           <w:p>
             <w:pPr>
@@ -10783,7 +10525,7 @@
         </w:tc>
         <w:tc>
           <w:tcPr>
-            <w:tcW w:w="1696" w:type="dxa"/>
+            <w:tcW w:w="1705" w:type="dxa"/>
           </w:tcPr>
           <w:p>
             <w:pPr>
@@ -10800,7 +10542,7 @@
         </w:tc>
         <w:tc>
           <w:tcPr>
-            <w:tcW w:w="1829" w:type="dxa"/>
+            <w:tcW w:w="1843" w:type="dxa"/>
           </w:tcPr>
           <w:p>
             <w:pPr>
@@ -10817,7 +10559,7 @@
         </w:tc>
         <w:tc>
           <w:tcPr>
-            <w:tcW w:w="5073" w:type="dxa"/>
+            <w:tcW w:w="5156" w:type="dxa"/>
           </w:tcPr>
           <w:p>
             <w:pPr>
@@ -10930,7 +10672,7 @@
     <w:tbl>
       <w:tblPr>
         <w:tblStyle w:val="TWTable"/>
-        <w:tblW w:w="10318" w:type="dxa"/>
+        <w:tblW w:w="10432" w:type="dxa"/>
         <w:tblBorders>
           <w:top w:val="single" w:sz="4" w:space="0" w:color="D8DCE1"/>
           <w:left w:val="single" w:sz="4" w:space="0" w:color="D8DCE1"/>
@@ -10948,20 +10690,19 @@
         </w:tblCellMar>
       </w:tblPr>
       <w:tblGrid>
-        <w:gridCol w:w="1479"/>
-        <w:gridCol w:w="1778"/>
-        <w:gridCol w:w="1757"/>
+        <w:gridCol w:w="1502"/>
+        <w:gridCol w:w="1790"/>
+        <w:gridCol w:w="1772"/>
         <w:gridCol w:w="1781"/>
-        <w:gridCol w:w="3521"/>
+        <w:gridCol w:w="3585"/>
       </w:tblGrid>
       <w:tr>
         <w:trPr>
-          <w:cantSplit/>
           <w:tblHeader/>
         </w:trPr>
         <w:tc>
           <w:tcPr>
-            <w:tcW w:w="1479" w:type="dxa"/>
+            <w:tcW w:w="1502" w:type="dxa"/>
             <w:shd w:val="clear" w:color="auto" w:fill="F1F3F5"/>
           </w:tcPr>
           <w:p>
@@ -10981,7 +10722,7 @@
         </w:tc>
         <w:tc>
           <w:tcPr>
-            <w:tcW w:w="1778" w:type="dxa"/>
+            <w:tcW w:w="1790" w:type="dxa"/>
             <w:shd w:val="clear" w:color="auto" w:fill="F1F3F5"/>
           </w:tcPr>
           <w:p>
@@ -11001,7 +10742,7 @@
         </w:tc>
         <w:tc>
           <w:tcPr>
-            <w:tcW w:w="1757" w:type="dxa"/>
+            <w:tcW w:w="1772" w:type="dxa"/>
             <w:shd w:val="clear" w:color="auto" w:fill="F1F3F5"/>
           </w:tcPr>
           <w:p>
@@ -11042,7 +10783,7 @@
         </w:tc>
         <w:tc>
           <w:tcPr>
-            <w:tcW w:w="3521" w:type="dxa"/>
+            <w:tcW w:w="3585" w:type="dxa"/>
             <w:shd w:val="clear" w:color="auto" w:fill="F1F3F5"/>
           </w:tcPr>
           <w:p>
@@ -11062,12 +10803,9 @@
         </w:tc>
       </w:tr>
       <w:tr>
-        <w:trPr>
-          <w:cantSplit/>
-        </w:trPr>
-        <w:tc>
-          <w:tcPr>
-            <w:tcW w:w="1479" w:type="dxa"/>
+        <w:tc>
+          <w:tcPr>
+            <w:tcW w:w="1502" w:type="dxa"/>
           </w:tcPr>
           <w:p>
             <w:pPr>
@@ -11084,7 +10822,7 @@
         </w:tc>
         <w:tc>
           <w:tcPr>
-            <w:tcW w:w="1778" w:type="dxa"/>
+            <w:tcW w:w="1790" w:type="dxa"/>
           </w:tcPr>
           <w:p>
             <w:pPr>
@@ -11101,7 +10839,7 @@
         </w:tc>
         <w:tc>
           <w:tcPr>
-            <w:tcW w:w="1757" w:type="dxa"/>
+            <w:tcW w:w="1772" w:type="dxa"/>
           </w:tcPr>
           <w:p>
             <w:pPr>
@@ -11136,7 +10874,7 @@
         </w:tc>
         <w:tc>
           <w:tcPr>
-            <w:tcW w:w="3521" w:type="dxa"/>
+            <w:tcW w:w="3585" w:type="dxa"/>
           </w:tcPr>
           <w:p>
             <w:pPr>
@@ -11153,12 +10891,9 @@
         </w:tc>
       </w:tr>
       <w:tr>
-        <w:trPr>
-          <w:cantSplit/>
-        </w:trPr>
-        <w:tc>
-          <w:tcPr>
-            <w:tcW w:w="1479" w:type="dxa"/>
+        <w:tc>
+          <w:tcPr>
+            <w:tcW w:w="1502" w:type="dxa"/>
           </w:tcPr>
           <w:p>
             <w:pPr>
@@ -11175,7 +10910,7 @@
         </w:tc>
         <w:tc>
           <w:tcPr>
-            <w:tcW w:w="1778" w:type="dxa"/>
+            <w:tcW w:w="1790" w:type="dxa"/>
           </w:tcPr>
           <w:p>
             <w:pPr>
@@ -11192,7 +10927,7 @@
         </w:tc>
         <w:tc>
           <w:tcPr>
-            <w:tcW w:w="1757" w:type="dxa"/>
+            <w:tcW w:w="1772" w:type="dxa"/>
           </w:tcPr>
           <w:p>
             <w:pPr>
@@ -11227,7 +10962,7 @@
         </w:tc>
         <w:tc>
           <w:tcPr>
-            <w:tcW w:w="3521" w:type="dxa"/>
+            <w:tcW w:w="3585" w:type="dxa"/>
           </w:tcPr>
           <w:p>
             <w:pPr>
@@ -11259,12 +10994,9 @@
         </w:tc>
       </w:tr>
       <w:tr>
-        <w:trPr>
-          <w:cantSplit/>
-        </w:trPr>
-        <w:tc>
-          <w:tcPr>
-            <w:tcW w:w="1479" w:type="dxa"/>
+        <w:tc>
+          <w:tcPr>
+            <w:tcW w:w="1502" w:type="dxa"/>
           </w:tcPr>
           <w:p>
             <w:pPr>
@@ -11281,7 +11013,7 @@
         </w:tc>
         <w:tc>
           <w:tcPr>
-            <w:tcW w:w="1778" w:type="dxa"/>
+            <w:tcW w:w="1790" w:type="dxa"/>
           </w:tcPr>
           <w:p>
             <w:pPr>
@@ -11298,7 +11030,7 @@
         </w:tc>
         <w:tc>
           <w:tcPr>
-            <w:tcW w:w="1757" w:type="dxa"/>
+            <w:tcW w:w="1772" w:type="dxa"/>
           </w:tcPr>
           <w:p>
             <w:pPr>
@@ -11333,7 +11065,7 @@
         </w:tc>
         <w:tc>
           <w:tcPr>
-            <w:tcW w:w="3521" w:type="dxa"/>
+            <w:tcW w:w="3585" w:type="dxa"/>
           </w:tcPr>
           <w:p>
             <w:pPr>
@@ -11350,12 +11082,9 @@
         </w:tc>
       </w:tr>
       <w:tr>
-        <w:trPr>
-          <w:cantSplit/>
-        </w:trPr>
-        <w:tc>
-          <w:tcPr>
-            <w:tcW w:w="1479" w:type="dxa"/>
+        <w:tc>
+          <w:tcPr>
+            <w:tcW w:w="1502" w:type="dxa"/>
           </w:tcPr>
           <w:p>
             <w:pPr>
@@ -11372,7 +11101,7 @@
         </w:tc>
         <w:tc>
           <w:tcPr>
-            <w:tcW w:w="1778" w:type="dxa"/>
+            <w:tcW w:w="1790" w:type="dxa"/>
           </w:tcPr>
           <w:p>
             <w:pPr>
@@ -11389,7 +11118,7 @@
         </w:tc>
         <w:tc>
           <w:tcPr>
-            <w:tcW w:w="1757" w:type="dxa"/>
+            <w:tcW w:w="1772" w:type="dxa"/>
           </w:tcPr>
           <w:p>
             <w:pPr>
@@ -11424,7 +11153,7 @@
         </w:tc>
         <w:tc>
           <w:tcPr>
-            <w:tcW w:w="3521" w:type="dxa"/>
+            <w:tcW w:w="3585" w:type="dxa"/>
           </w:tcPr>
           <w:p>
             <w:pPr>
@@ -11441,12 +11170,9 @@
         </w:tc>
       </w:tr>
       <w:tr>
-        <w:trPr>
-          <w:cantSplit/>
-        </w:trPr>
-        <w:tc>
-          <w:tcPr>
-            <w:tcW w:w="1479" w:type="dxa"/>
+        <w:tc>
+          <w:tcPr>
+            <w:tcW w:w="1502" w:type="dxa"/>
           </w:tcPr>
           <w:p>
             <w:pPr>
@@ -11463,7 +11189,7 @@
         </w:tc>
         <w:tc>
           <w:tcPr>
-            <w:tcW w:w="1778" w:type="dxa"/>
+            <w:tcW w:w="1790" w:type="dxa"/>
           </w:tcPr>
           <w:p>
             <w:pPr>
@@ -11480,7 +11206,7 @@
         </w:tc>
         <w:tc>
           <w:tcPr>
-            <w:tcW w:w="1757" w:type="dxa"/>
+            <w:tcW w:w="1772" w:type="dxa"/>
           </w:tcPr>
           <w:p>
             <w:pPr>
@@ -11515,7 +11241,7 @@
         </w:tc>
         <w:tc>
           <w:tcPr>
-            <w:tcW w:w="3521" w:type="dxa"/>
+            <w:tcW w:w="3585" w:type="dxa"/>
           </w:tcPr>
           <w:p>
             <w:pPr>
@@ -11768,7 +11494,7 @@
     <w:tbl>
       <w:tblPr>
         <w:tblStyle w:val="TWTable"/>
-        <w:tblW w:w="10318" w:type="dxa"/>
+        <w:tblW w:w="10432" w:type="dxa"/>
         <w:tblBorders>
           <w:top w:val="single" w:sz="4" w:space="0" w:color="FFFFFF"/>
           <w:left w:val="single" w:sz="4" w:space="0" w:color="FFFFFF"/>
@@ -11786,16 +11512,13 @@
         </w:tblCellMar>
       </w:tblPr>
       <w:tblGrid>
-        <w:gridCol w:w="5159"/>
-        <w:gridCol w:w="5159"/>
+        <w:gridCol w:w="5216"/>
+        <w:gridCol w:w="5216"/>
       </w:tblGrid>
       <w:tr>
-        <w:trPr>
-          <w:cantSplit/>
-        </w:trPr>
-        <w:tc>
-          <w:tcPr>
-            <w:tcW w:w="5159" w:type="dxa"/>
+        <w:tc>
+          <w:tcPr>
+            <w:tcW w:w="5216" w:type="dxa"/>
           </w:tcPr>
           <w:p>
             <w:pPr>
@@ -11804,7 +11527,7 @@
             <w:r>
               <w:drawing>
                 <wp:inline distT="0" distB="0" distL="0" distR="0">
-                  <wp:extent cx="3136265" cy="1367760"/>
+                  <wp:extent cx="3172460" cy="1383545"/>
                   <wp:docPr id="1" name="Picture 1"/>
                   <a:graphic xmlns:a="http://schemas.openxmlformats.org/drawingml/2006/main">
                     <a:graphicData uri="http://schemas.openxmlformats.org/drawingml/2006/picture">
@@ -11822,7 +11545,7 @@
                         <pic:spPr>
                           <a:xfrm>
                             <a:off x="0" y="0"/>
-                            <a:ext cx="3136265" cy="1367760"/>
+                            <a:ext cx="3172460" cy="1383545"/>
                           </a:xfrm>
                           <a:prstGeom prst="rect">
                             <a:avLst/>
@@ -11859,7 +11582,7 @@
         </w:tc>
         <w:tc>
           <w:tcPr>
-            <w:tcW w:w="5159" w:type="dxa"/>
+            <w:tcW w:w="5216" w:type="dxa"/>
           </w:tcPr>
           <w:p>
             <w:pPr>
@@ -11868,7 +11591,7 @@
             <w:r>
               <w:drawing>
                 <wp:inline distT="0" distB="0" distL="0" distR="0">
-                  <wp:extent cx="3136265" cy="1519346"/>
+                  <wp:extent cx="3172460" cy="1536880"/>
                   <wp:docPr id="2" name="Picture 2"/>
                   <a:graphic xmlns:a="http://schemas.openxmlformats.org/drawingml/2006/main">
                     <a:graphicData uri="http://schemas.openxmlformats.org/drawingml/2006/picture">
@@ -11886,7 +11609,7 @@
                         <pic:spPr>
                           <a:xfrm>
                             <a:off x="0" y="0"/>
-                            <a:ext cx="3136265" cy="1519346"/>
+                            <a:ext cx="3172460" cy="1536880"/>
                           </a:xfrm>
                           <a:prstGeom prst="rect">
                             <a:avLst/>
@@ -11923,12 +11646,9 @@
         </w:tc>
       </w:tr>
       <w:tr>
-        <w:trPr>
-          <w:cantSplit/>
-        </w:trPr>
-        <w:tc>
-          <w:tcPr>
-            <w:tcW w:w="5159" w:type="dxa"/>
+        <w:tc>
+          <w:tcPr>
+            <w:tcW w:w="5216" w:type="dxa"/>
           </w:tcPr>
           <w:p>
             <w:pPr>
@@ -11937,7 +11657,7 @@
             <w:r>
               <w:drawing>
                 <wp:inline distT="0" distB="0" distL="0" distR="0">
-                  <wp:extent cx="3136265" cy="1604722"/>
+                  <wp:extent cx="3172460" cy="1623242"/>
                   <wp:docPr id="3" name="Picture 3"/>
                   <a:graphic xmlns:a="http://schemas.openxmlformats.org/drawingml/2006/main">
                     <a:graphicData uri="http://schemas.openxmlformats.org/drawingml/2006/picture">
@@ -11955,7 +11675,7 @@
                         <pic:spPr>
                           <a:xfrm>
                             <a:off x="0" y="0"/>
-                            <a:ext cx="3136265" cy="1604722"/>
+                            <a:ext cx="3172460" cy="1623242"/>
                           </a:xfrm>
                           <a:prstGeom prst="rect">
                             <a:avLst/>
@@ -11992,7 +11712,7 @@
         </w:tc>
         <w:tc>
           <w:tcPr>
-            <w:tcW w:w="5159" w:type="dxa"/>
+            <w:tcW w:w="5216" w:type="dxa"/>
           </w:tcPr>
           <w:p>
             <w:pPr>
@@ -12001,7 +11721,7 @@
             <w:r>
               <w:drawing>
                 <wp:inline distT="0" distB="0" distL="0" distR="0">
-                  <wp:extent cx="3136265" cy="2130917"/>
+                  <wp:extent cx="3172460" cy="2155510"/>
                   <wp:docPr id="4" name="Picture 4"/>
                   <a:graphic xmlns:a="http://schemas.openxmlformats.org/drawingml/2006/main">
                     <a:graphicData uri="http://schemas.openxmlformats.org/drawingml/2006/picture">
@@ -12019,7 +11739,7 @@
                         <pic:spPr>
                           <a:xfrm>
                             <a:off x="0" y="0"/>
-                            <a:ext cx="3136265" cy="2130917"/>
+                            <a:ext cx="3172460" cy="2155510"/>
                           </a:xfrm>
                           <a:prstGeom prst="rect">
                             <a:avLst/>
@@ -12056,12 +11776,9 @@
         </w:tc>
       </w:tr>
       <w:tr>
-        <w:trPr>
-          <w:cantSplit/>
-        </w:trPr>
-        <w:tc>
-          <w:tcPr>
-            <w:tcW w:w="5159" w:type="dxa"/>
+        <w:tc>
+          <w:tcPr>
+            <w:tcW w:w="5216" w:type="dxa"/>
           </w:tcPr>
           <w:p>
             <w:pPr>
@@ -12070,7 +11787,7 @@
             <w:r>
               <w:drawing>
                 <wp:inline distT="0" distB="0" distL="0" distR="0">
-                  <wp:extent cx="3136265" cy="2104782"/>
+                  <wp:extent cx="3172460" cy="2129073"/>
                   <wp:docPr id="5" name="Picture 5"/>
                   <a:graphic xmlns:a="http://schemas.openxmlformats.org/drawingml/2006/main">
                     <a:graphicData uri="http://schemas.openxmlformats.org/drawingml/2006/picture">
@@ -12088,7 +11805,7 @@
                         <pic:spPr>
                           <a:xfrm>
                             <a:off x="0" y="0"/>
-                            <a:ext cx="3136265" cy="2104782"/>
+                            <a:ext cx="3172460" cy="2129073"/>
                           </a:xfrm>
                           <a:prstGeom prst="rect">
                             <a:avLst/>
@@ -12125,7 +11842,7 @@
         </w:tc>
         <w:tc>
           <w:tcPr>
-            <w:tcW w:w="5159" w:type="dxa"/>
+            <w:tcW w:w="5216" w:type="dxa"/>
           </w:tcPr>
           <w:p>
             <w:pPr>
@@ -12134,7 +11851,7 @@
             <w:r>
               <w:drawing>
                 <wp:inline distT="0" distB="0" distL="0" distR="0">
-                  <wp:extent cx="3136265" cy="1845169"/>
+                  <wp:extent cx="3172460" cy="1866463"/>
                   <wp:docPr id="6" name="Picture 6"/>
                   <a:graphic xmlns:a="http://schemas.openxmlformats.org/drawingml/2006/main">
                     <a:graphicData uri="http://schemas.openxmlformats.org/drawingml/2006/picture">
@@ -12152,7 +11869,7 @@
                         <pic:spPr>
                           <a:xfrm>
                             <a:off x="0" y="0"/>
-                            <a:ext cx="3136265" cy="1845169"/>
+                            <a:ext cx="3172460" cy="1866463"/>
                           </a:xfrm>
                           <a:prstGeom prst="rect">
                             <a:avLst/>
@@ -12196,7 +11913,7 @@
     </w:p>
     <w:sectPr>
       <w:pgSz w:w="11906" w:h="16838"/>
-      <w:pgMar w:top="794" w:right="794" w:bottom="850" w:left="794" w:header="425" w:footer="425" w:gutter="0"/>
+      <w:pgMar w:top="737" w:right="737" w:bottom="737" w:left="737" w:header="425" w:footer="425" w:gutter="0"/>
     </w:sectPr>
   </w:body>
 </w:document>
@@ -12295,7 +12012,7 @@
       <w:pBdr>
         <w:left w:val="single" w:sz="24" w:space="6" w:color="2F5F8A"/>
       </w:pBdr>
-      <w:spacing w:before="160" w:after="60" w:line="320" w:lineRule="exact"/>
+      <w:spacing w:before="120" w:after="40" w:line="320" w:lineRule="exact"/>
       <w:outlineLvl w:val="0"/>
     </w:pPr>
     <w:rPr>
@@ -12313,7 +12030,7 @@
     <w:qFormat/>
     <w:pPr>
       <w:keepNext/>
-      <w:spacing w:before="100" w:after="40" w:line="268" w:lineRule="exact"/>
+      <w:spacing w:before="80" w:after="30" w:line="268" w:lineRule="exact"/>
       <w:outlineLvl w:val="1"/>
     </w:pPr>
     <w:rPr>
@@ -12358,7 +12075,7 @@
     <w:basedOn w:val="Normal"/>
     <w:qFormat/>
     <w:pPr>
-      <w:spacing w:before="0" w:after="10" w:line="220" w:lineRule="exact"/>
+      <w:spacing w:before="0" w:after="10" w:line="210" w:lineRule="exact"/>
     </w:pPr>
     <w:rPr>
       <w:rFonts w:ascii="Apple SD Gothic Neo" w:hAnsi="Apple SD Gothic Neo" w:eastAsia="Apple SD Gothic Neo" w:cs="Apple SD Gothic Neo"/>
@@ -12431,7 +12148,7 @@
     <w:qFormat/>
     <w:pPr>
       <w:ind w:left="300" w:hanging="200"/>
-      <w:spacing w:before="0" w:after="10" w:line="220" w:lineRule="exact"/>
+      <w:spacing w:before="0" w:after="10" w:line="210" w:lineRule="exact"/>
     </w:pPr>
     <w:rPr>
       <w:rFonts w:ascii="Apple SD Gothic Neo" w:hAnsi="Apple SD Gothic Neo" w:eastAsia="Apple SD Gothic Neo" w:cs="Apple SD Gothic Neo"/>

</xml_diff>